<commit_message>
Update final report and deck: n8n trial dates after moving to the new n8n Cloud account
Co-Authored-By: Claude Sonnet 5.5 <noreply@anthropic.com>
</commit_message>
<xml_diff>
--- a/docs/final/Final_Project_Report.docx
+++ b/docs/final/Final_Project_Report.docx
@@ -80,13 +80,7 @@
         <w:rPr>
           <w:color w:val="5A6470"/>
         </w:rPr>
-        <w:t>TalentSprint capstone p</w:t>
-      </w:r>
-      <w:r>
-        <w:rPr>
-          <w:color w:val="5A6470"/>
-        </w:rPr>
-        <w:t>roject, final presentation on Sunday 11 October 2026</w:t>
+        <w:t>TalentSprint capstone project, final presentation on Sunday 11 October 2026</w:t>
       </w:r>
     </w:p>
     <w:p>
@@ -105,7 +99,7 @@
         <w:pStyle w:val="Heading1"/>
         <w:pageBreakBefore/>
       </w:pPr>
-      <w:bookmarkStart w:id="1" w:name="_Toc241336237"/>
+      <w:bookmarkStart w:id="1" w:name="_Toc241868365"/>
       <w:r>
         <w:lastRenderedPageBreak/>
         <w:t>Team</w:t>
@@ -142,12 +136,6 @@
         <w:gridCol w:w="5438"/>
       </w:tblGrid>
       <w:tr>
-        <w:tblPrEx>
-          <w:tblCellMar>
-            <w:top w:w="0" w:type="dxa"/>
-            <w:bottom w:w="0" w:type="dxa"/>
-          </w:tblCellMar>
-        </w:tblPrEx>
         <w:trPr>
           <w:cantSplit/>
           <w:tblHeader/>
@@ -208,26 +196,10 @@
               <w:keepNext/>
               <w:spacing w:after="20"/>
             </w:pPr>
-            <w:r>
-              <w:rPr>
-                <w:b/>
-                <w:bCs/>
-                <w:color w:val="FFFFFF"/>
-                <w:sz w:val="19"/>
-                <w:szCs w:val="19"/>
-              </w:rPr>
-              <w:t>Role and contribution</w:t>
-            </w:r>
           </w:p>
         </w:tc>
       </w:tr>
       <w:tr>
-        <w:tblPrEx>
-          <w:tblCellMar>
-            <w:top w:w="0" w:type="dxa"/>
-            <w:bottom w:w="0" w:type="dxa"/>
-          </w:tblCellMar>
-        </w:tblPrEx>
         <w:trPr>
           <w:cantSplit/>
         </w:trPr>
@@ -286,12 +258,6 @@
         </w:tc>
       </w:tr>
       <w:tr>
-        <w:tblPrEx>
-          <w:tblCellMar>
-            <w:top w:w="0" w:type="dxa"/>
-            <w:bottom w:w="0" w:type="dxa"/>
-          </w:tblCellMar>
-        </w:tblPrEx>
         <w:trPr>
           <w:cantSplit/>
         </w:trPr>
@@ -352,12 +318,6 @@
         </w:tc>
       </w:tr>
       <w:tr>
-        <w:tblPrEx>
-          <w:tblCellMar>
-            <w:top w:w="0" w:type="dxa"/>
-            <w:bottom w:w="0" w:type="dxa"/>
-          </w:tblCellMar>
-        </w:tblPrEx>
         <w:trPr>
           <w:cantSplit/>
         </w:trPr>
@@ -416,12 +376,6 @@
         </w:tc>
       </w:tr>
       <w:tr>
-        <w:tblPrEx>
-          <w:tblCellMar>
-            <w:top w:w="0" w:type="dxa"/>
-            <w:bottom w:w="0" w:type="dxa"/>
-          </w:tblCellMar>
-        </w:tblPrEx>
         <w:trPr>
           <w:cantSplit/>
         </w:trPr>
@@ -482,12 +436,6 @@
         </w:tc>
       </w:tr>
       <w:tr>
-        <w:tblPrEx>
-          <w:tblCellMar>
-            <w:top w:w="0" w:type="dxa"/>
-            <w:bottom w:w="0" w:type="dxa"/>
-          </w:tblCellMar>
-        </w:tblPrEx>
         <w:trPr>
           <w:cantSplit/>
         </w:trPr>
@@ -546,12 +494,6 @@
         </w:tc>
       </w:tr>
       <w:tr>
-        <w:tblPrEx>
-          <w:tblCellMar>
-            <w:top w:w="0" w:type="dxa"/>
-            <w:bottom w:w="0" w:type="dxa"/>
-          </w:tblCellMar>
-        </w:tblPrEx>
         <w:trPr>
           <w:cantSplit/>
         </w:trPr>
@@ -612,12 +554,6 @@
         </w:tc>
       </w:tr>
       <w:tr>
-        <w:tblPrEx>
-          <w:tblCellMar>
-            <w:top w:w="0" w:type="dxa"/>
-            <w:bottom w:w="0" w:type="dxa"/>
-          </w:tblCellMar>
-        </w:tblPrEx>
         <w:trPr>
           <w:cantSplit/>
         </w:trPr>
@@ -676,35 +612,9 @@
     </w:tbl>
     <w:p>
       <w:pPr>
-        <w:pBdr>
-          <w:left w:val="single" w:sz="18" w:space="8" w:color="E9A23B"/>
-        </w:pBdr>
-        <w:shd w:val="clear" w:color="auto" w:fill="FFF4DC"/>
-        <w:spacing w:before="80" w:after="160"/>
-        <w:ind w:left="120" w:right="120"/>
-      </w:pPr>
-      <w:r>
-        <w:rPr>
-          <w:b/>
-          <w:bCs/>
-          <w:sz w:val="20"/>
-          <w:szCs w:val="20"/>
-        </w:rPr>
-        <w:t>Before submitting:</w:t>
-      </w:r>
-      <w:r>
-        <w:rPr>
-          <w:sz w:val="20"/>
-          <w:szCs w:val="20"/>
-        </w:rPr>
-        <w:t xml:space="preserve"> fill in the Role and contribution column. The cover page has no date line yet. Everything else in this report is taken from the project’s experiment log and code.</w:t>
-      </w:r>
-    </w:p>
-    <w:p>
-      <w:pPr>
         <w:pStyle w:val="Heading2"/>
       </w:pPr>
-      <w:bookmarkStart w:id="2" w:name="_Toc241336238"/>
+      <w:bookmarkStart w:id="2" w:name="_Toc241868366"/>
       <w:r>
         <w:t>How this report is organised</w:t>
       </w:r>
@@ -715,13 +625,7 @@
         <w:spacing w:after="120" w:line="276" w:lineRule="auto"/>
       </w:pPr>
       <w:r>
-        <w:t xml:space="preserve">The sections follow the order of the final presentation so the </w:t>
-      </w:r>
-      <w:r>
-        <w:t xml:space="preserve">two documents can be read side by side: problem, proposed solution, components, methods tried and challenges, demo plan, limitations, future scope and the business view. Section 10 explains how to run the application and Section 8 holds the test cases and </w:t>
-      </w:r>
-      <w:r>
-        <w:t>results. Every number in the report comes from the experiment log in the repository (</w:t>
+        <w:t>The sections follow the order of the final presentation so the two documents can be read side by side: problem, proposed solution, components, methods tried and challenges, demo plan, limitations, future scope and the business view. Section 10 explains how to run the application and Section 8 holds the test cases and results. Every number in the report comes from the experiment log in the repository (</w:t>
       </w:r>
       <w:r>
         <w:rPr>
@@ -783,7 +687,7 @@
           <w:r>
             <w:fldChar w:fldCharType="separate"/>
           </w:r>
-          <w:hyperlink w:anchor="_Toc241336237" w:history="1">
+          <w:hyperlink w:anchor="_Toc241868365" w:history="1">
             <w:r>
               <w:rPr>
                 <w:rStyle w:val="Hyperlink"/>
@@ -807,7 +711,7 @@
               <w:rPr>
                 <w:noProof/>
               </w:rPr>
-              <w:instrText xml:space="preserve"> PAGEREF _Toc241336237 \h </w:instrText>
+              <w:instrText xml:space="preserve"> PAGEREF _Toc241868365 \h </w:instrText>
             </w:r>
             <w:r>
               <w:rPr>
@@ -845,7 +749,7 @@
               <w:noProof/>
             </w:rPr>
           </w:pPr>
-          <w:hyperlink w:anchor="_Toc241336238" w:history="1">
+          <w:hyperlink w:anchor="_Toc241868366" w:history="1">
             <w:r>
               <w:rPr>
                 <w:rStyle w:val="Hyperlink"/>
@@ -869,7 +773,7 @@
               <w:rPr>
                 <w:noProof/>
               </w:rPr>
-              <w:instrText xml:space="preserve"> PAGEREF _Toc241336238 \h </w:instrText>
+              <w:instrText xml:space="preserve"> PAGEREF _Toc241868366 \h </w:instrText>
             </w:r>
             <w:r>
               <w:rPr>
@@ -907,7 +811,7 @@
               <w:noProof/>
             </w:rPr>
           </w:pPr>
-          <w:hyperlink w:anchor="_Toc241336239" w:history="1">
+          <w:hyperlink w:anchor="_Toc241868367" w:history="1">
             <w:r>
               <w:rPr>
                 <w:rStyle w:val="Hyperlink"/>
@@ -931,7 +835,7 @@
               <w:rPr>
                 <w:noProof/>
               </w:rPr>
-              <w:instrText xml:space="preserve"> PAGEREF _Toc241336239 \h </w:instrText>
+              <w:instrText xml:space="preserve"> PAGEREF _Toc241868367 \h </w:instrText>
             </w:r>
             <w:r>
               <w:rPr>
@@ -969,7 +873,7 @@
               <w:noProof/>
             </w:rPr>
           </w:pPr>
-          <w:hyperlink w:anchor="_Toc241336240" w:history="1">
+          <w:hyperlink w:anchor="_Toc241868368" w:history="1">
             <w:r>
               <w:rPr>
                 <w:rStyle w:val="Hyperlink"/>
@@ -993,7 +897,7 @@
               <w:rPr>
                 <w:noProof/>
               </w:rPr>
-              <w:instrText xml:space="preserve"> PAGEREF _Toc241336240 \h </w:instrText>
+              <w:instrText xml:space="preserve"> PAGEREF _Toc241868368 \h </w:instrText>
             </w:r>
             <w:r>
               <w:rPr>
@@ -1031,7 +935,7 @@
               <w:noProof/>
             </w:rPr>
           </w:pPr>
-          <w:hyperlink w:anchor="_Toc241336241" w:history="1">
+          <w:hyperlink w:anchor="_Toc241868369" w:history="1">
             <w:r>
               <w:rPr>
                 <w:rStyle w:val="Hyperlink"/>
@@ -1055,7 +959,7 @@
               <w:rPr>
                 <w:noProof/>
               </w:rPr>
-              <w:instrText xml:space="preserve"> PAGEREF _Toc241336241 \h </w:instrText>
+              <w:instrText xml:space="preserve"> PAGEREF _Toc241868369 \h </w:instrText>
             </w:r>
             <w:r>
               <w:rPr>
@@ -1093,7 +997,7 @@
               <w:noProof/>
             </w:rPr>
           </w:pPr>
-          <w:hyperlink w:anchor="_Toc241336242" w:history="1">
+          <w:hyperlink w:anchor="_Toc241868370" w:history="1">
             <w:r>
               <w:rPr>
                 <w:rStyle w:val="Hyperlink"/>
@@ -1117,7 +1021,7 @@
               <w:rPr>
                 <w:noProof/>
               </w:rPr>
-              <w:instrText xml:space="preserve"> PAGEREF _Toc241336242 \h </w:instrText>
+              <w:instrText xml:space="preserve"> PAGEREF _Toc241868370 \h </w:instrText>
             </w:r>
             <w:r>
               <w:rPr>
@@ -1155,7 +1059,7 @@
               <w:noProof/>
             </w:rPr>
           </w:pPr>
-          <w:hyperlink w:anchor="_Toc241336243" w:history="1">
+          <w:hyperlink w:anchor="_Toc241868371" w:history="1">
             <w:r>
               <w:rPr>
                 <w:rStyle w:val="Hyperlink"/>
@@ -1179,7 +1083,7 @@
               <w:rPr>
                 <w:noProof/>
               </w:rPr>
-              <w:instrText xml:space="preserve"> PAGEREF _Toc241336243 \h </w:instrText>
+              <w:instrText xml:space="preserve"> PAGEREF _Toc241868371 \h </w:instrText>
             </w:r>
             <w:r>
               <w:rPr>
@@ -1217,7 +1121,7 @@
               <w:noProof/>
             </w:rPr>
           </w:pPr>
-          <w:hyperlink w:anchor="_Toc241336244" w:history="1">
+          <w:hyperlink w:anchor="_Toc241868372" w:history="1">
             <w:r>
               <w:rPr>
                 <w:rStyle w:val="Hyperlink"/>
@@ -1241,7 +1145,7 @@
               <w:rPr>
                 <w:noProof/>
               </w:rPr>
-              <w:instrText xml:space="preserve"> PAGEREF _Toc241336244 \h </w:instrText>
+              <w:instrText xml:space="preserve"> PAGEREF _Toc241868372 \h </w:instrText>
             </w:r>
             <w:r>
               <w:rPr>
@@ -1279,7 +1183,7 @@
               <w:noProof/>
             </w:rPr>
           </w:pPr>
-          <w:hyperlink w:anchor="_Toc241336245" w:history="1">
+          <w:hyperlink w:anchor="_Toc241868373" w:history="1">
             <w:r>
               <w:rPr>
                 <w:rStyle w:val="Hyperlink"/>
@@ -1303,7 +1207,7 @@
               <w:rPr>
                 <w:noProof/>
               </w:rPr>
-              <w:instrText xml:space="preserve"> PAGEREF _Toc241336245 \h </w:instrText>
+              <w:instrText xml:space="preserve"> PAGEREF _Toc241868373 \h </w:instrText>
             </w:r>
             <w:r>
               <w:rPr>
@@ -1341,7 +1245,7 @@
               <w:noProof/>
             </w:rPr>
           </w:pPr>
-          <w:hyperlink w:anchor="_Toc241336246" w:history="1">
+          <w:hyperlink w:anchor="_Toc241868374" w:history="1">
             <w:r>
               <w:rPr>
                 <w:rStyle w:val="Hyperlink"/>
@@ -1365,7 +1269,7 @@
               <w:rPr>
                 <w:noProof/>
               </w:rPr>
-              <w:instrText xml:space="preserve"> PAGEREF _Toc241336246 \h </w:instrText>
+              <w:instrText xml:space="preserve"> PAGEREF _Toc241868374 \h </w:instrText>
             </w:r>
             <w:r>
               <w:rPr>
@@ -1403,7 +1307,7 @@
               <w:noProof/>
             </w:rPr>
           </w:pPr>
-          <w:hyperlink w:anchor="_Toc241336247" w:history="1">
+          <w:hyperlink w:anchor="_Toc241868375" w:history="1">
             <w:r>
               <w:rPr>
                 <w:rStyle w:val="Hyperlink"/>
@@ -1427,7 +1331,7 @@
               <w:rPr>
                 <w:noProof/>
               </w:rPr>
-              <w:instrText xml:space="preserve"> PAGEREF _Toc241336247 \h </w:instrText>
+              <w:instrText xml:space="preserve"> PAGEREF _Toc241868375 \h </w:instrText>
             </w:r>
             <w:r>
               <w:rPr>
@@ -1465,7 +1369,7 @@
               <w:noProof/>
             </w:rPr>
           </w:pPr>
-          <w:hyperlink w:anchor="_Toc241336248" w:history="1">
+          <w:hyperlink w:anchor="_Toc241868376" w:history="1">
             <w:r>
               <w:rPr>
                 <w:rStyle w:val="Hyperlink"/>
@@ -1489,7 +1393,7 @@
               <w:rPr>
                 <w:noProof/>
               </w:rPr>
-              <w:instrText xml:space="preserve"> PAGEREF _Toc241336248 \h </w:instrText>
+              <w:instrText xml:space="preserve"> PAGEREF _Toc241868376 \h </w:instrText>
             </w:r>
             <w:r>
               <w:rPr>
@@ -1527,7 +1431,7 @@
               <w:noProof/>
             </w:rPr>
           </w:pPr>
-          <w:hyperlink w:anchor="_Toc241336249" w:history="1">
+          <w:hyperlink w:anchor="_Toc241868377" w:history="1">
             <w:r>
               <w:rPr>
                 <w:rStyle w:val="Hyperlink"/>
@@ -1551,7 +1455,7 @@
               <w:rPr>
                 <w:noProof/>
               </w:rPr>
-              <w:instrText xml:space="preserve"> PAGEREF _Toc241336249 \h </w:instrText>
+              <w:instrText xml:space="preserve"> PAGEREF _Toc241868377 \h </w:instrText>
             </w:r>
             <w:r>
               <w:rPr>
@@ -1589,7 +1493,7 @@
               <w:noProof/>
             </w:rPr>
           </w:pPr>
-          <w:hyperlink w:anchor="_Toc241336250" w:history="1">
+          <w:hyperlink w:anchor="_Toc241868378" w:history="1">
             <w:r>
               <w:rPr>
                 <w:rStyle w:val="Hyperlink"/>
@@ -1613,7 +1517,7 @@
               <w:rPr>
                 <w:noProof/>
               </w:rPr>
-              <w:instrText xml:space="preserve"> PAGEREF _Toc241336250 \h </w:instrText>
+              <w:instrText xml:space="preserve"> PAGEREF _Toc241868378 \h </w:instrText>
             </w:r>
             <w:r>
               <w:rPr>
@@ -1651,7 +1555,7 @@
               <w:noProof/>
             </w:rPr>
           </w:pPr>
-          <w:hyperlink w:anchor="_Toc241336251" w:history="1">
+          <w:hyperlink w:anchor="_Toc241868379" w:history="1">
             <w:r>
               <w:rPr>
                 <w:rStyle w:val="Hyperlink"/>
@@ -1675,7 +1579,7 @@
               <w:rPr>
                 <w:noProof/>
               </w:rPr>
-              <w:instrText xml:space="preserve"> PAGEREF _Toc241336251 \h </w:instrText>
+              <w:instrText xml:space="preserve"> PAGEREF _Toc241868379 \h </w:instrText>
             </w:r>
             <w:r>
               <w:rPr>
@@ -1713,7 +1617,7 @@
               <w:noProof/>
             </w:rPr>
           </w:pPr>
-          <w:hyperlink w:anchor="_Toc241336252" w:history="1">
+          <w:hyperlink w:anchor="_Toc241868380" w:history="1">
             <w:r>
               <w:rPr>
                 <w:rStyle w:val="Hyperlink"/>
@@ -1737,7 +1641,7 @@
               <w:rPr>
                 <w:noProof/>
               </w:rPr>
-              <w:instrText xml:space="preserve"> PAGEREF _Toc241336252 \h </w:instrText>
+              <w:instrText xml:space="preserve"> PAGEREF _Toc241868380 \h </w:instrText>
             </w:r>
             <w:r>
               <w:rPr>
@@ -1775,7 +1679,7 @@
               <w:noProof/>
             </w:rPr>
           </w:pPr>
-          <w:hyperlink w:anchor="_Toc241336253" w:history="1">
+          <w:hyperlink w:anchor="_Toc241868381" w:history="1">
             <w:r>
               <w:rPr>
                 <w:rStyle w:val="Hyperlink"/>
@@ -1799,7 +1703,7 @@
               <w:rPr>
                 <w:noProof/>
               </w:rPr>
-              <w:instrText xml:space="preserve"> PAGEREF _Toc241336253 \h </w:instrText>
+              <w:instrText xml:space="preserve"> PAGEREF _Toc241868381 \h </w:instrText>
             </w:r>
             <w:r>
               <w:rPr>
@@ -1837,7 +1741,7 @@
               <w:noProof/>
             </w:rPr>
           </w:pPr>
-          <w:hyperlink w:anchor="_Toc241336254" w:history="1">
+          <w:hyperlink w:anchor="_Toc241868382" w:history="1">
             <w:r>
               <w:rPr>
                 <w:rStyle w:val="Hyperlink"/>
@@ -1861,7 +1765,7 @@
               <w:rPr>
                 <w:noProof/>
               </w:rPr>
-              <w:instrText xml:space="preserve"> PAGEREF _Toc241336254 \h </w:instrText>
+              <w:instrText xml:space="preserve"> PAGEREF _Toc241868382 \h </w:instrText>
             </w:r>
             <w:r>
               <w:rPr>
@@ -1899,7 +1803,7 @@
               <w:noProof/>
             </w:rPr>
           </w:pPr>
-          <w:hyperlink w:anchor="_Toc241336255" w:history="1">
+          <w:hyperlink w:anchor="_Toc241868383" w:history="1">
             <w:r>
               <w:rPr>
                 <w:rStyle w:val="Hyperlink"/>
@@ -1923,7 +1827,7 @@
               <w:rPr>
                 <w:noProof/>
               </w:rPr>
-              <w:instrText xml:space="preserve"> PAGEREF _Toc241336255 \h </w:instrText>
+              <w:instrText xml:space="preserve"> PAGEREF _Toc241868383 \h </w:instrText>
             </w:r>
             <w:r>
               <w:rPr>
@@ -1961,7 +1865,7 @@
               <w:noProof/>
             </w:rPr>
           </w:pPr>
-          <w:hyperlink w:anchor="_Toc241336256" w:history="1">
+          <w:hyperlink w:anchor="_Toc241868384" w:history="1">
             <w:r>
               <w:rPr>
                 <w:rStyle w:val="Hyperlink"/>
@@ -1985,7 +1889,7 @@
               <w:rPr>
                 <w:noProof/>
               </w:rPr>
-              <w:instrText xml:space="preserve"> PAGEREF _Toc241336256 \h </w:instrText>
+              <w:instrText xml:space="preserve"> PAGEREF _Toc241868384 \h </w:instrText>
             </w:r>
             <w:r>
               <w:rPr>
@@ -2023,7 +1927,7 @@
               <w:noProof/>
             </w:rPr>
           </w:pPr>
-          <w:hyperlink w:anchor="_Toc241336257" w:history="1">
+          <w:hyperlink w:anchor="_Toc241868385" w:history="1">
             <w:r>
               <w:rPr>
                 <w:rStyle w:val="Hyperlink"/>
@@ -2047,7 +1951,7 @@
               <w:rPr>
                 <w:noProof/>
               </w:rPr>
-              <w:instrText xml:space="preserve"> PAGEREF _Toc241336257 \h </w:instrText>
+              <w:instrText xml:space="preserve"> PAGEREF _Toc241868385 \h </w:instrText>
             </w:r>
             <w:r>
               <w:rPr>
@@ -2085,7 +1989,7 @@
               <w:noProof/>
             </w:rPr>
           </w:pPr>
-          <w:hyperlink w:anchor="_Toc241336258" w:history="1">
+          <w:hyperlink w:anchor="_Toc241868386" w:history="1">
             <w:r>
               <w:rPr>
                 <w:rStyle w:val="Hyperlink"/>
@@ -2109,7 +2013,7 @@
               <w:rPr>
                 <w:noProof/>
               </w:rPr>
-              <w:instrText xml:space="preserve"> PAGEREF _Toc241336258 \h </w:instrText>
+              <w:instrText xml:space="preserve"> PAGEREF _Toc241868386 \h </w:instrText>
             </w:r>
             <w:r>
               <w:rPr>
@@ -2147,7 +2051,7 @@
               <w:noProof/>
             </w:rPr>
           </w:pPr>
-          <w:hyperlink w:anchor="_Toc241336259" w:history="1">
+          <w:hyperlink w:anchor="_Toc241868387" w:history="1">
             <w:r>
               <w:rPr>
                 <w:rStyle w:val="Hyperlink"/>
@@ -2171,7 +2075,7 @@
               <w:rPr>
                 <w:noProof/>
               </w:rPr>
-              <w:instrText xml:space="preserve"> PAGEREF _Toc241336259 \h </w:instrText>
+              <w:instrText xml:space="preserve"> PAGEREF _Toc241868387 \h </w:instrText>
             </w:r>
             <w:r>
               <w:rPr>
@@ -2209,7 +2113,7 @@
               <w:noProof/>
             </w:rPr>
           </w:pPr>
-          <w:hyperlink w:anchor="_Toc241336260" w:history="1">
+          <w:hyperlink w:anchor="_Toc241868388" w:history="1">
             <w:r>
               <w:rPr>
                 <w:rStyle w:val="Hyperlink"/>
@@ -2233,7 +2137,7 @@
               <w:rPr>
                 <w:noProof/>
               </w:rPr>
-              <w:instrText xml:space="preserve"> PAGEREF _Toc241336260 \h </w:instrText>
+              <w:instrText xml:space="preserve"> PAGEREF _Toc241868388 \h </w:instrText>
             </w:r>
             <w:r>
               <w:rPr>
@@ -2271,7 +2175,7 @@
               <w:noProof/>
             </w:rPr>
           </w:pPr>
-          <w:hyperlink w:anchor="_Toc241336261" w:history="1">
+          <w:hyperlink w:anchor="_Toc241868389" w:history="1">
             <w:r>
               <w:rPr>
                 <w:rStyle w:val="Hyperlink"/>
@@ -2295,7 +2199,7 @@
               <w:rPr>
                 <w:noProof/>
               </w:rPr>
-              <w:instrText xml:space="preserve"> PAGEREF _Toc241336261 \h </w:instrText>
+              <w:instrText xml:space="preserve"> PAGEREF _Toc241868389 \h </w:instrText>
             </w:r>
             <w:r>
               <w:rPr>
@@ -2333,7 +2237,7 @@
               <w:noProof/>
             </w:rPr>
           </w:pPr>
-          <w:hyperlink w:anchor="_Toc241336262" w:history="1">
+          <w:hyperlink w:anchor="_Toc241868390" w:history="1">
             <w:r>
               <w:rPr>
                 <w:rStyle w:val="Hyperlink"/>
@@ -2357,7 +2261,7 @@
               <w:rPr>
                 <w:noProof/>
               </w:rPr>
-              <w:instrText xml:space="preserve"> PAGEREF _Toc241336262 \h </w:instrText>
+              <w:instrText xml:space="preserve"> PAGEREF _Toc241868390 \h </w:instrText>
             </w:r>
             <w:r>
               <w:rPr>
@@ -2395,7 +2299,7 @@
               <w:noProof/>
             </w:rPr>
           </w:pPr>
-          <w:hyperlink w:anchor="_Toc241336263" w:history="1">
+          <w:hyperlink w:anchor="_Toc241868391" w:history="1">
             <w:r>
               <w:rPr>
                 <w:rStyle w:val="Hyperlink"/>
@@ -2419,7 +2323,7 @@
               <w:rPr>
                 <w:noProof/>
               </w:rPr>
-              <w:instrText xml:space="preserve"> PAGEREF _Toc241336263 \h </w:instrText>
+              <w:instrText xml:space="preserve"> PAGEREF _Toc241868391 \h </w:instrText>
             </w:r>
             <w:r>
               <w:rPr>
@@ -2457,7 +2361,7 @@
               <w:noProof/>
             </w:rPr>
           </w:pPr>
-          <w:hyperlink w:anchor="_Toc241336264" w:history="1">
+          <w:hyperlink w:anchor="_Toc241868392" w:history="1">
             <w:r>
               <w:rPr>
                 <w:rStyle w:val="Hyperlink"/>
@@ -2481,7 +2385,7 @@
               <w:rPr>
                 <w:noProof/>
               </w:rPr>
-              <w:instrText xml:space="preserve"> PAGEREF _Toc241336264 \h </w:instrText>
+              <w:instrText xml:space="preserve"> PAGEREF _Toc241868392 \h </w:instrText>
             </w:r>
             <w:r>
               <w:rPr>
@@ -2519,7 +2423,7 @@
               <w:noProof/>
             </w:rPr>
           </w:pPr>
-          <w:hyperlink w:anchor="_Toc241336265" w:history="1">
+          <w:hyperlink w:anchor="_Toc241868393" w:history="1">
             <w:r>
               <w:rPr>
                 <w:rStyle w:val="Hyperlink"/>
@@ -2543,7 +2447,7 @@
               <w:rPr>
                 <w:noProof/>
               </w:rPr>
-              <w:instrText xml:space="preserve"> PAGEREF _Toc241336265 \h </w:instrText>
+              <w:instrText xml:space="preserve"> PAGEREF _Toc241868393 \h </w:instrText>
             </w:r>
             <w:r>
               <w:rPr>
@@ -2581,7 +2485,7 @@
               <w:noProof/>
             </w:rPr>
           </w:pPr>
-          <w:hyperlink w:anchor="_Toc241336266" w:history="1">
+          <w:hyperlink w:anchor="_Toc241868394" w:history="1">
             <w:r>
               <w:rPr>
                 <w:rStyle w:val="Hyperlink"/>
@@ -2605,7 +2509,7 @@
               <w:rPr>
                 <w:noProof/>
               </w:rPr>
-              <w:instrText xml:space="preserve"> PAGEREF _Toc241336266 \h </w:instrText>
+              <w:instrText xml:space="preserve"> PAGEREF _Toc241868394 \h </w:instrText>
             </w:r>
             <w:r>
               <w:rPr>
@@ -2643,7 +2547,7 @@
               <w:noProof/>
             </w:rPr>
           </w:pPr>
-          <w:hyperlink w:anchor="_Toc241336267" w:history="1">
+          <w:hyperlink w:anchor="_Toc241868395" w:history="1">
             <w:r>
               <w:rPr>
                 <w:rStyle w:val="Hyperlink"/>
@@ -2667,7 +2571,7 @@
               <w:rPr>
                 <w:noProof/>
               </w:rPr>
-              <w:instrText xml:space="preserve"> PAGEREF _Toc241336267 \h </w:instrText>
+              <w:instrText xml:space="preserve"> PAGEREF _Toc241868395 \h </w:instrText>
             </w:r>
             <w:r>
               <w:rPr>
@@ -2705,7 +2609,7 @@
               <w:noProof/>
             </w:rPr>
           </w:pPr>
-          <w:hyperlink w:anchor="_Toc241336268" w:history="1">
+          <w:hyperlink w:anchor="_Toc241868396" w:history="1">
             <w:r>
               <w:rPr>
                 <w:rStyle w:val="Hyperlink"/>
@@ -2729,7 +2633,7 @@
               <w:rPr>
                 <w:noProof/>
               </w:rPr>
-              <w:instrText xml:space="preserve"> PAGEREF _Toc241336268 \h </w:instrText>
+              <w:instrText xml:space="preserve"> PAGEREF _Toc241868396 \h </w:instrText>
             </w:r>
             <w:r>
               <w:rPr>
@@ -2767,7 +2671,7 @@
               <w:noProof/>
             </w:rPr>
           </w:pPr>
-          <w:hyperlink w:anchor="_Toc241336269" w:history="1">
+          <w:hyperlink w:anchor="_Toc241868397" w:history="1">
             <w:r>
               <w:rPr>
                 <w:rStyle w:val="Hyperlink"/>
@@ -2791,7 +2695,7 @@
               <w:rPr>
                 <w:noProof/>
               </w:rPr>
-              <w:instrText xml:space="preserve"> PAGEREF _Toc241336269 \h </w:instrText>
+              <w:instrText xml:space="preserve"> PAGEREF _Toc241868397 \h </w:instrText>
             </w:r>
             <w:r>
               <w:rPr>
@@ -2829,7 +2733,7 @@
               <w:noProof/>
             </w:rPr>
           </w:pPr>
-          <w:hyperlink w:anchor="_Toc241336270" w:history="1">
+          <w:hyperlink w:anchor="_Toc241868398" w:history="1">
             <w:r>
               <w:rPr>
                 <w:rStyle w:val="Hyperlink"/>
@@ -2853,7 +2757,7 @@
               <w:rPr>
                 <w:noProof/>
               </w:rPr>
-              <w:instrText xml:space="preserve"> PAGEREF _Toc241336270 \h </w:instrText>
+              <w:instrText xml:space="preserve"> PAGEREF _Toc241868398 \h </w:instrText>
             </w:r>
             <w:r>
               <w:rPr>
@@ -2891,7 +2795,7 @@
               <w:noProof/>
             </w:rPr>
           </w:pPr>
-          <w:hyperlink w:anchor="_Toc241336271" w:history="1">
+          <w:hyperlink w:anchor="_Toc241868399" w:history="1">
             <w:r>
               <w:rPr>
                 <w:rStyle w:val="Hyperlink"/>
@@ -2915,7 +2819,7 @@
               <w:rPr>
                 <w:noProof/>
               </w:rPr>
-              <w:instrText xml:space="preserve"> PAGEREF _Toc241336271 \h </w:instrText>
+              <w:instrText xml:space="preserve"> PAGEREF _Toc241868399 \h </w:instrText>
             </w:r>
             <w:r>
               <w:rPr>
@@ -2953,7 +2857,7 @@
               <w:noProof/>
             </w:rPr>
           </w:pPr>
-          <w:hyperlink w:anchor="_Toc241336272" w:history="1">
+          <w:hyperlink w:anchor="_Toc241868400" w:history="1">
             <w:r>
               <w:rPr>
                 <w:rStyle w:val="Hyperlink"/>
@@ -2977,7 +2881,7 @@
               <w:rPr>
                 <w:noProof/>
               </w:rPr>
-              <w:instrText xml:space="preserve"> PAGEREF _Toc241336272 \h </w:instrText>
+              <w:instrText xml:space="preserve"> PAGEREF _Toc241868400 \h </w:instrText>
             </w:r>
             <w:r>
               <w:rPr>
@@ -3015,7 +2919,7 @@
               <w:noProof/>
             </w:rPr>
           </w:pPr>
-          <w:hyperlink w:anchor="_Toc241336273" w:history="1">
+          <w:hyperlink w:anchor="_Toc241868401" w:history="1">
             <w:r>
               <w:rPr>
                 <w:rStyle w:val="Hyperlink"/>
@@ -3039,7 +2943,7 @@
               <w:rPr>
                 <w:noProof/>
               </w:rPr>
-              <w:instrText xml:space="preserve"> PAGEREF _Toc241336273 \h </w:instrText>
+              <w:instrText xml:space="preserve"> PAGEREF _Toc241868401 \h </w:instrText>
             </w:r>
             <w:r>
               <w:rPr>
@@ -3077,7 +2981,7 @@
               <w:noProof/>
             </w:rPr>
           </w:pPr>
-          <w:hyperlink w:anchor="_Toc241336274" w:history="1">
+          <w:hyperlink w:anchor="_Toc241868402" w:history="1">
             <w:r>
               <w:rPr>
                 <w:rStyle w:val="Hyperlink"/>
@@ -3101,7 +3005,7 @@
               <w:rPr>
                 <w:noProof/>
               </w:rPr>
-              <w:instrText xml:space="preserve"> PAGEREF _Toc241336274 \h </w:instrText>
+              <w:instrText xml:space="preserve"> PAGEREF _Toc241868402 \h </w:instrText>
             </w:r>
             <w:r>
               <w:rPr>
@@ -3139,7 +3043,7 @@
               <w:noProof/>
             </w:rPr>
           </w:pPr>
-          <w:hyperlink w:anchor="_Toc241336275" w:history="1">
+          <w:hyperlink w:anchor="_Toc241868403" w:history="1">
             <w:r>
               <w:rPr>
                 <w:rStyle w:val="Hyperlink"/>
@@ -3163,7 +3067,7 @@
               <w:rPr>
                 <w:noProof/>
               </w:rPr>
-              <w:instrText xml:space="preserve"> PAGEREF _Toc241336275 \h </w:instrText>
+              <w:instrText xml:space="preserve"> PAGEREF _Toc241868403 \h </w:instrText>
             </w:r>
             <w:r>
               <w:rPr>
@@ -3201,7 +3105,7 @@
               <w:noProof/>
             </w:rPr>
           </w:pPr>
-          <w:hyperlink w:anchor="_Toc241336276" w:history="1">
+          <w:hyperlink w:anchor="_Toc241868404" w:history="1">
             <w:r>
               <w:rPr>
                 <w:rStyle w:val="Hyperlink"/>
@@ -3225,7 +3129,7 @@
               <w:rPr>
                 <w:noProof/>
               </w:rPr>
-              <w:instrText xml:space="preserve"> PAGEREF _Toc241336276 \h </w:instrText>
+              <w:instrText xml:space="preserve"> PAGEREF _Toc241868404 \h </w:instrText>
             </w:r>
             <w:r>
               <w:rPr>
@@ -3263,7 +3167,7 @@
               <w:noProof/>
             </w:rPr>
           </w:pPr>
-          <w:hyperlink w:anchor="_Toc241336277" w:history="1">
+          <w:hyperlink w:anchor="_Toc241868405" w:history="1">
             <w:r>
               <w:rPr>
                 <w:rStyle w:val="Hyperlink"/>
@@ -3287,7 +3191,7 @@
               <w:rPr>
                 <w:noProof/>
               </w:rPr>
-              <w:instrText xml:space="preserve"> PAGEREF _Toc241336277 \h </w:instrText>
+              <w:instrText xml:space="preserve"> PAGEREF _Toc241868405 \h </w:instrText>
             </w:r>
             <w:r>
               <w:rPr>
@@ -3325,7 +3229,7 @@
               <w:noProof/>
             </w:rPr>
           </w:pPr>
-          <w:hyperlink w:anchor="_Toc241336278" w:history="1">
+          <w:hyperlink w:anchor="_Toc241868406" w:history="1">
             <w:r>
               <w:rPr>
                 <w:rStyle w:val="Hyperlink"/>
@@ -3349,7 +3253,7 @@
               <w:rPr>
                 <w:noProof/>
               </w:rPr>
-              <w:instrText xml:space="preserve"> PAGEREF _Toc241336278 \h </w:instrText>
+              <w:instrText xml:space="preserve"> PAGEREF _Toc241868406 \h </w:instrText>
             </w:r>
             <w:r>
               <w:rPr>
@@ -3387,7 +3291,7 @@
               <w:noProof/>
             </w:rPr>
           </w:pPr>
-          <w:hyperlink w:anchor="_Toc241336279" w:history="1">
+          <w:hyperlink w:anchor="_Toc241868407" w:history="1">
             <w:r>
               <w:rPr>
                 <w:rStyle w:val="Hyperlink"/>
@@ -3411,7 +3315,7 @@
               <w:rPr>
                 <w:noProof/>
               </w:rPr>
-              <w:instrText xml:space="preserve"> PAGEREF _Toc241336279 \h </w:instrText>
+              <w:instrText xml:space="preserve"> PAGEREF _Toc241868407 \h </w:instrText>
             </w:r>
             <w:r>
               <w:rPr>
@@ -3449,7 +3353,7 @@
               <w:noProof/>
             </w:rPr>
           </w:pPr>
-          <w:hyperlink w:anchor="_Toc241336280" w:history="1">
+          <w:hyperlink w:anchor="_Toc241868408" w:history="1">
             <w:r>
               <w:rPr>
                 <w:rStyle w:val="Hyperlink"/>
@@ -3473,7 +3377,7 @@
               <w:rPr>
                 <w:noProof/>
               </w:rPr>
-              <w:instrText xml:space="preserve"> PAGEREF _Toc241336280 \h </w:instrText>
+              <w:instrText xml:space="preserve"> PAGEREF _Toc241868408 \h </w:instrText>
             </w:r>
             <w:r>
               <w:rPr>
@@ -3511,7 +3415,7 @@
               <w:noProof/>
             </w:rPr>
           </w:pPr>
-          <w:hyperlink w:anchor="_Toc241336281" w:history="1">
+          <w:hyperlink w:anchor="_Toc241868409" w:history="1">
             <w:r>
               <w:rPr>
                 <w:rStyle w:val="Hyperlink"/>
@@ -3535,7 +3439,7 @@
               <w:rPr>
                 <w:noProof/>
               </w:rPr>
-              <w:instrText xml:space="preserve"> PAGEREF _Toc241336281 \h </w:instrText>
+              <w:instrText xml:space="preserve"> PAGEREF _Toc241868409 \h </w:instrText>
             </w:r>
             <w:r>
               <w:rPr>
@@ -3573,7 +3477,7 @@
               <w:noProof/>
             </w:rPr>
           </w:pPr>
-          <w:hyperlink w:anchor="_Toc241336282" w:history="1">
+          <w:hyperlink w:anchor="_Toc241868410" w:history="1">
             <w:r>
               <w:rPr>
                 <w:rStyle w:val="Hyperlink"/>
@@ -3597,7 +3501,7 @@
               <w:rPr>
                 <w:noProof/>
               </w:rPr>
-              <w:instrText xml:space="preserve"> PAGEREF _Toc241336282 \h </w:instrText>
+              <w:instrText xml:space="preserve"> PAGEREF _Toc241868410 \h </w:instrText>
             </w:r>
             <w:r>
               <w:rPr>
@@ -3636,7 +3540,7 @@
         <w:pStyle w:val="Heading1"/>
         <w:pageBreakBefore/>
       </w:pPr>
-      <w:bookmarkStart w:id="3" w:name="_Toc241336239"/>
+      <w:bookmarkStart w:id="3" w:name="_Toc241868367"/>
       <w:r>
         <w:lastRenderedPageBreak/>
         <w:t>1. Executive summary</w:t>
@@ -3648,13 +3552,7 @@
         <w:spacing w:after="120" w:line="276" w:lineRule="auto"/>
       </w:pPr>
       <w:r>
-        <w:t>Companies that sell in several countries receive reviews in many languages. Reading them by hand is slow, so problems such as late deliveries or damaged packaging are found after many customers have already been upset, and replies are late, inconsistent or</w:t>
-      </w:r>
-      <w:r>
-        <w:t xml:space="preserve"> missing. Our project builds an automated pipeline that reads reviews in English, German, Spanish, French, Japanese and Chinese, translates them, scores sentiment, groups negative reviews into named issue categories, alerts the team when one issue suddenly</w:t>
-      </w:r>
-      <w:r>
-        <w:t xml:space="preserve"> grows, and drafts a reply in the customer’s own language.</w:t>
+        <w:t>Companies that sell in several countries receive reviews in many languages. Reading them by hand is slow, so problems such as late deliveries or damaged packaging are found after many customers have already been upset, and replies are late, inconsistent or missing. Our project builds an automated pipeline that reads reviews in English, German, Spanish, French, Japanese and Chinese, translates them, scores sentiment, groups negative reviews into named issue categories, alerts the team when one issue suddenly grows, and drafts a reply in the customer’s own language.</w:t>
       </w:r>
     </w:p>
     <w:p>
@@ -3662,17 +3560,14 @@
         <w:spacing w:after="120" w:line="276" w:lineRule="auto"/>
       </w:pPr>
       <w:r>
-        <w:t>We built and tested every stage with Claude Haiku 4.5 as the only language model for the pipeline and Claude Sonnet 5 as an independent judge of reply quality. The workflow runs in n8n, the analysi</w:t>
-      </w:r>
-      <w:r>
-        <w:t>s code and the API service run in Python, results are shown in a Google Sheets dashboard, and spike alerts go to Slack. The whole project used about $2.5 to $3.7 of the $5 Claude budget.</w:t>
+        <w:t>We built and tested every stage with Claude Haiku 4.5 as the only language model for the pipeline and Claude Sonnet 5 as an independent judge of reply quality. The workflow runs in n8n, the analysis code and the API service run in Python, results are shown in a Google Sheets dashboard, and spike alerts go to Slack. The whole project used about $2.5 to $3.7 of the $5 Claude budget.</w:t>
       </w:r>
     </w:p>
     <w:p>
       <w:pPr>
         <w:pStyle w:val="Heading2"/>
       </w:pPr>
-      <w:bookmarkStart w:id="4" w:name="_Toc241336240"/>
+      <w:bookmarkStart w:id="4" w:name="_Toc241868368"/>
       <w:r>
         <w:t>Results against the targets</w:t>
       </w:r>
@@ -3701,12 +3596,6 @@
         <w:gridCol w:w="1700"/>
       </w:tblGrid>
       <w:tr>
-        <w:tblPrEx>
-          <w:tblCellMar>
-            <w:top w:w="0" w:type="dxa"/>
-            <w:bottom w:w="0" w:type="dxa"/>
-          </w:tblCellMar>
-        </w:tblPrEx>
         <w:trPr>
           <w:cantSplit/>
           <w:tblHeader/>
@@ -3815,12 +3704,6 @@
         </w:tc>
       </w:tr>
       <w:tr>
-        <w:tblPrEx>
-          <w:tblCellMar>
-            <w:top w:w="0" w:type="dxa"/>
-            <w:bottom w:w="0" w:type="dxa"/>
-          </w:tblCellMar>
-        </w:tblPrEx>
         <w:trPr>
           <w:cantSplit/>
         </w:trPr>
@@ -3916,12 +3799,6 @@
         </w:tc>
       </w:tr>
       <w:tr>
-        <w:tblPrEx>
-          <w:tblCellMar>
-            <w:top w:w="0" w:type="dxa"/>
-            <w:bottom w:w="0" w:type="dxa"/>
-          </w:tblCellMar>
-        </w:tblPrEx>
         <w:trPr>
           <w:cantSplit/>
         </w:trPr>
@@ -4052,12 +3929,6 @@
         </w:tc>
       </w:tr>
       <w:tr>
-        <w:tblPrEx>
-          <w:tblCellMar>
-            <w:top w:w="0" w:type="dxa"/>
-            <w:bottom w:w="0" w:type="dxa"/>
-          </w:tblCellMar>
-        </w:tblPrEx>
         <w:trPr>
           <w:cantSplit/>
         </w:trPr>
@@ -4153,12 +4024,6 @@
         </w:tc>
       </w:tr>
       <w:tr>
-        <w:tblPrEx>
-          <w:tblCellMar>
-            <w:top w:w="0" w:type="dxa"/>
-            <w:bottom w:w="0" w:type="dxa"/>
-          </w:tblCellMar>
-        </w:tblPrEx>
         <w:trPr>
           <w:cantSplit/>
         </w:trPr>
@@ -4257,12 +4122,6 @@
         </w:tc>
       </w:tr>
       <w:tr>
-        <w:tblPrEx>
-          <w:tblCellMar>
-            <w:top w:w="0" w:type="dxa"/>
-            <w:bottom w:w="0" w:type="dxa"/>
-          </w:tblCellMar>
-        </w:tblPrEx>
         <w:trPr>
           <w:cantSplit/>
         </w:trPr>
@@ -4358,12 +4217,6 @@
         </w:tc>
       </w:tr>
       <w:tr>
-        <w:tblPrEx>
-          <w:tblCellMar>
-            <w:top w:w="0" w:type="dxa"/>
-            <w:bottom w:w="0" w:type="dxa"/>
-          </w:tblCellMar>
-        </w:tblPrEx>
         <w:trPr>
           <w:cantSplit/>
         </w:trPr>
@@ -4462,12 +4315,6 @@
         </w:tc>
       </w:tr>
       <w:tr>
-        <w:tblPrEx>
-          <w:tblCellMar>
-            <w:top w:w="0" w:type="dxa"/>
-            <w:bottom w:w="0" w:type="dxa"/>
-          </w:tblCellMar>
-        </w:tblPrEx>
         <w:trPr>
           <w:cantSplit/>
         </w:trPr>
@@ -4577,17 +4424,14 @@
         <w:t>What the results mean.</w:t>
       </w:r>
       <w:r>
-        <w:t xml:space="preserve"> The pipeline works end to end and is cheap and fast enough for the target volume. Its weak point is the neutral, three-star class, where even a strong language model agrees with the star rating only about a third of the time, because a three-star review i</w:t>
-      </w:r>
-      <w:r>
-        <w:t>s often genuinely mixed. We report this honestly instead of tuning until the number looked better.</w:t>
+        <w:t xml:space="preserve"> The pipeline works end to end and is cheap and fast enough for the target volume. Its weak point is the neutral, three-star class, where even a strong language model agrees with the star rating only about a third of the time, because a three-star review is often genuinely mixed. We report this honestly instead of tuning until the number looked better.</w:t>
       </w:r>
     </w:p>
     <w:p>
       <w:pPr>
         <w:pStyle w:val="Heading1"/>
       </w:pPr>
-      <w:bookmarkStart w:id="5" w:name="_Toc241336241"/>
+      <w:bookmarkStart w:id="5" w:name="_Toc241868369"/>
       <w:r>
         <w:t>2. Problem statement</w:t>
       </w:r>
@@ -4598,10 +4442,7 @@
         <w:spacing w:after="120" w:line="276" w:lineRule="auto"/>
       </w:pPr>
       <w:r>
-        <w:t>An online seller with customers in several countries gets thousands of reviews a week in different languages. The team that has to act o</w:t>
-      </w:r>
-      <w:r>
-        <w:t>n them faces four connected problems:</w:t>
+        <w:t>An online seller with customers in several countries gets thousands of reviews a week in different languages. The team that has to act on them faces four connected problems:</w:t>
       </w:r>
     </w:p>
     <w:p>
@@ -4641,10 +4482,7 @@
         <w:t>Stars hide the reason.</w:t>
       </w:r>
       <w:r>
-        <w:t xml:space="preserve"> An average of 3.8 stars does not say whether customers are unhappy with delivery, pric</w:t>
-      </w:r>
-      <w:r>
-        <w:t>e or quality.</w:t>
+        <w:t xml:space="preserve"> An average of 3.8 stars does not say whether customers are unhappy with delivery, price or quality.</w:t>
       </w:r>
     </w:p>
     <w:p>
@@ -4685,17 +4523,14 @@
         <w:t>Replies are slow and generic.</w:t>
       </w:r>
       <w:r>
-        <w:t xml:space="preserve"> Support answers in about a day, with template text that ignores what the customer actual</w:t>
-      </w:r>
-      <w:r>
-        <w:t>ly wrote.</w:t>
+        <w:t xml:space="preserve"> Support answers in about a day, with template text that ignores what the customer actually wrote.</w:t>
       </w:r>
     </w:p>
     <w:p>
       <w:pPr>
         <w:pStyle w:val="Heading2"/>
       </w:pPr>
-      <w:bookmarkStart w:id="6" w:name="_Toc241336242"/>
+      <w:bookmarkStart w:id="6" w:name="_Toc241868370"/>
       <w:r>
         <w:t>Current methods and where they fail</w:t>
       </w:r>
@@ -4724,12 +4559,6 @@
         <w:gridCol w:w="3538"/>
       </w:tblGrid>
       <w:tr>
-        <w:tblPrEx>
-          <w:tblCellMar>
-            <w:top w:w="0" w:type="dxa"/>
-            <w:bottom w:w="0" w:type="dxa"/>
-          </w:tblCellMar>
-        </w:tblPrEx>
         <w:trPr>
           <w:cantSplit/>
           <w:tblHeader/>
@@ -4838,12 +4667,6 @@
         </w:tc>
       </w:tr>
       <w:tr>
-        <w:tblPrEx>
-          <w:tblCellMar>
-            <w:top w:w="0" w:type="dxa"/>
-            <w:bottom w:w="0" w:type="dxa"/>
-          </w:tblCellMar>
-        </w:tblPrEx>
         <w:trPr>
           <w:cantSplit/>
         </w:trPr>
@@ -4939,12 +4762,6 @@
         </w:tc>
       </w:tr>
       <w:tr>
-        <w:tblPrEx>
-          <w:tblCellMar>
-            <w:top w:w="0" w:type="dxa"/>
-            <w:bottom w:w="0" w:type="dxa"/>
-          </w:tblCellMar>
-        </w:tblPrEx>
         <w:trPr>
           <w:cantSplit/>
         </w:trPr>
@@ -5043,12 +4860,6 @@
         </w:tc>
       </w:tr>
       <w:tr>
-        <w:tblPrEx>
-          <w:tblCellMar>
-            <w:top w:w="0" w:type="dxa"/>
-            <w:bottom w:w="0" w:type="dxa"/>
-          </w:tblCellMar>
-        </w:tblPrEx>
         <w:trPr>
           <w:cantSplit/>
         </w:trPr>
@@ -5144,12 +4955,6 @@
         </w:tc>
       </w:tr>
       <w:tr>
-        <w:tblPrEx>
-          <w:tblCellMar>
-            <w:top w:w="0" w:type="dxa"/>
-            <w:bottom w:w="0" w:type="dxa"/>
-          </w:tblCellMar>
-        </w:tblPrEx>
         <w:trPr>
           <w:cantSplit/>
         </w:trPr>
@@ -5262,7 +5067,7 @@
       <w:pPr>
         <w:pStyle w:val="Heading1"/>
       </w:pPr>
-      <w:bookmarkStart w:id="7" w:name="_Toc241336243"/>
+      <w:bookmarkStart w:id="7" w:name="_Toc241868371"/>
       <w:r>
         <w:t>3. Objectives and success metrics</w:t>
       </w:r>
@@ -5273,10 +5078,7 @@
         <w:spacing w:after="120" w:line="276" w:lineRule="auto"/>
       </w:pPr>
       <w:r>
-        <w:t xml:space="preserve">The project brief asks for a working prototype of the workflow (aggregation, translation, analysis, response generation), a detailed report, and dashboard screenshots with a business-impact summary. Our objectives and how </w:t>
-      </w:r>
-      <w:r>
-        <w:t>we check them:</w:t>
+        <w:t>The project brief asks for a working prototype of the workflow (aggregation, translation, analysis, response generation), a detailed report, and dashboard screenshots with a business-impact summary. Our objectives and how we check them:</w:t>
       </w:r>
     </w:p>
     <w:tbl>
@@ -5302,12 +5104,6 @@
         <w:gridCol w:w="2000"/>
       </w:tblGrid>
       <w:tr>
-        <w:tblPrEx>
-          <w:tblCellMar>
-            <w:top w:w="0" w:type="dxa"/>
-            <w:bottom w:w="0" w:type="dxa"/>
-          </w:tblCellMar>
-        </w:tblPrEx>
         <w:trPr>
           <w:cantSplit/>
           <w:tblHeader/>
@@ -5416,12 +5212,6 @@
         </w:tc>
       </w:tr>
       <w:tr>
-        <w:tblPrEx>
-          <w:tblCellMar>
-            <w:top w:w="0" w:type="dxa"/>
-            <w:bottom w:w="0" w:type="dxa"/>
-          </w:tblCellMar>
-        </w:tblPrEx>
         <w:trPr>
           <w:cantSplit/>
         </w:trPr>
@@ -5517,12 +5307,6 @@
         </w:tc>
       </w:tr>
       <w:tr>
-        <w:tblPrEx>
-          <w:tblCellMar>
-            <w:top w:w="0" w:type="dxa"/>
-            <w:bottom w:w="0" w:type="dxa"/>
-          </w:tblCellMar>
-        </w:tblPrEx>
         <w:trPr>
           <w:cantSplit/>
         </w:trPr>
@@ -5621,12 +5405,6 @@
         </w:tc>
       </w:tr>
       <w:tr>
-        <w:tblPrEx>
-          <w:tblCellMar>
-            <w:top w:w="0" w:type="dxa"/>
-            <w:bottom w:w="0" w:type="dxa"/>
-          </w:tblCellMar>
-        </w:tblPrEx>
         <w:trPr>
           <w:cantSplit/>
         </w:trPr>
@@ -5722,12 +5500,6 @@
         </w:tc>
       </w:tr>
       <w:tr>
-        <w:tblPrEx>
-          <w:tblCellMar>
-            <w:top w:w="0" w:type="dxa"/>
-            <w:bottom w:w="0" w:type="dxa"/>
-          </w:tblCellMar>
-        </w:tblPrEx>
         <w:trPr>
           <w:cantSplit/>
         </w:trPr>
@@ -5826,12 +5598,6 @@
         </w:tc>
       </w:tr>
       <w:tr>
-        <w:tblPrEx>
-          <w:tblCellMar>
-            <w:top w:w="0" w:type="dxa"/>
-            <w:bottom w:w="0" w:type="dxa"/>
-          </w:tblCellMar>
-        </w:tblPrEx>
         <w:trPr>
           <w:cantSplit/>
         </w:trPr>
@@ -5927,12 +5693,6 @@
         </w:tc>
       </w:tr>
       <w:tr>
-        <w:tblPrEx>
-          <w:tblCellMar>
-            <w:top w:w="0" w:type="dxa"/>
-            <w:bottom w:w="0" w:type="dxa"/>
-          </w:tblCellMar>
-        </w:tblPrEx>
         <w:trPr>
           <w:cantSplit/>
         </w:trPr>
@@ -6031,12 +5791,6 @@
         </w:tc>
       </w:tr>
       <w:tr>
-        <w:tblPrEx>
-          <w:tblCellMar>
-            <w:top w:w="0" w:type="dxa"/>
-            <w:bottom w:w="0" w:type="dxa"/>
-          </w:tblCellMar>
-        </w:tblPrEx>
         <w:trPr>
           <w:cantSplit/>
         </w:trPr>
@@ -6132,12 +5886,6 @@
         </w:tc>
       </w:tr>
       <w:tr>
-        <w:tblPrEx>
-          <w:tblCellMar>
-            <w:top w:w="0" w:type="dxa"/>
-            <w:bottom w:w="0" w:type="dxa"/>
-          </w:tblCellMar>
-        </w:tblPrEx>
         <w:trPr>
           <w:cantSplit/>
         </w:trPr>
@@ -6237,7 +5985,7 @@
       <w:pPr>
         <w:pStyle w:val="Heading1"/>
       </w:pPr>
-      <w:bookmarkStart w:id="8" w:name="_Toc241336244"/>
+      <w:bookmarkStart w:id="8" w:name="_Toc241868372"/>
       <w:r>
         <w:lastRenderedPageBreak/>
         <w:t>4. Proposed solution and architecture</w:t>
@@ -6263,7 +6011,7 @@
           <w:noProof/>
         </w:rPr>
         <w:drawing>
-          <wp:inline distT="0" distB="0" distL="0" distR="0" wp14:anchorId="031E37CA" wp14:editId="394EF6DB">
+          <wp:inline distT="0" distB="0" distL="0" distR="0" wp14:anchorId="630DC6AD" wp14:editId="228BB450">
             <wp:extent cx="6096000" cy="3152775"/>
             <wp:effectExtent l="0" t="0" r="0" b="0"/>
             <wp:docPr id="1" name="fig_architecture.png" descr="Figure 1. Architecture: the n8n pipeline (top), outputs (middle) and supporting services (bottom)." title="Figure 1. Architecture: the n8n pipeline (top), outputs (middle) and supporting services (bottom)."/>
@@ -6322,7 +6070,7 @@
       <w:pPr>
         <w:pStyle w:val="Heading2"/>
       </w:pPr>
-      <w:bookmarkStart w:id="9" w:name="_Toc241336245"/>
+      <w:bookmarkStart w:id="9" w:name="_Toc241868373"/>
       <w:r>
         <w:t>Design principles</w:t>
       </w:r>
@@ -6345,10 +6093,7 @@
         <w:t>One model family.</w:t>
       </w:r>
       <w:r>
-        <w:t xml:space="preserve"> Claude Haiku 4.5 does translation, classification, issue labelling and drafting because it is fast and cheap ($1 per mill</w:t>
-      </w:r>
-      <w:r>
-        <w:t>ion input tokens, $5 per million output). A different, stronger model (Sonnet 5) judges the drafts so that a model does not grade its own work.</w:t>
+        <w:t xml:space="preserve"> Claude Haiku 4.5 does translation, classification, issue labelling and drafting because it is fast and cheap ($1 per million input tokens, $5 per million output). A different, stronger model (Sonnet 5) judges the drafts so that a model does not grade its own work.</w:t>
       </w:r>
     </w:p>
     <w:p>
@@ -6368,10 +6113,7 @@
         <w:t>Human in the loop.</w:t>
       </w:r>
       <w:r>
-        <w:t xml:space="preserve"> A reply to a negative review is never sent automatically. It always goes to a human approval </w:t>
-      </w:r>
-      <w:r>
-        <w:t>queue. Neutral and positive replies are marked ready only if the judge accepts them.</w:t>
+        <w:t xml:space="preserve"> A reply to a negative review is never sent automatically. It always goes to a human approval queue. Neutral and positive replies are marked ready only if the judge accepts them.</w:t>
       </w:r>
     </w:p>
     <w:p>
@@ -6391,10 +6133,7 @@
         <w:t>Guardrails in the prompt.</w:t>
       </w:r>
       <w:r>
-        <w:t xml:space="preserve"> Replies must be in the reviewer’s language, use only facts from the review, promise no refund, replacement, discount or date, make no legal admis</w:t>
-      </w:r>
-      <w:r>
-        <w:t>sions, request no personal data and stay within 40 to 90 words.</w:t>
+        <w:t xml:space="preserve"> Replies must be in the reviewer’s language, use only facts from the review, promise no refund, replacement, discount or date, make no legal admissions, request no personal data and stay within 40 to 90 words.</w:t>
       </w:r>
     </w:p>
     <w:p>
@@ -6442,14 +6181,7 @@
           <w:b/>
           <w:bCs/>
         </w:rPr>
-        <w:t xml:space="preserve">Cost </w:t>
-      </w:r>
-      <w:r>
-        <w:rPr>
-          <w:b/>
-          <w:bCs/>
-        </w:rPr>
-        <w:t>control.</w:t>
+        <w:t>Cost control.</w:t>
       </w:r>
       <w:r>
         <w:t xml:space="preserve"> The API service has a hard spend cap and logs every call with tokens, cost and latency.</w:t>
@@ -6459,7 +6191,7 @@
       <w:pPr>
         <w:pStyle w:val="Heading2"/>
       </w:pPr>
-      <w:bookmarkStart w:id="10" w:name="_Toc241336246"/>
+      <w:bookmarkStart w:id="10" w:name="_Toc241868374"/>
       <w:r>
         <w:lastRenderedPageBreak/>
         <w:t>Tools and technology</w:t>
@@ -6489,12 +6221,6 @@
         <w:gridCol w:w="3638"/>
       </w:tblGrid>
       <w:tr>
-        <w:tblPrEx>
-          <w:tblCellMar>
-            <w:top w:w="0" w:type="dxa"/>
-            <w:bottom w:w="0" w:type="dxa"/>
-          </w:tblCellMar>
-        </w:tblPrEx>
         <w:trPr>
           <w:cantSplit/>
           <w:tblHeader/>
@@ -6603,12 +6329,6 @@
         </w:tc>
       </w:tr>
       <w:tr>
-        <w:tblPrEx>
-          <w:tblCellMar>
-            <w:top w:w="0" w:type="dxa"/>
-            <w:bottom w:w="0" w:type="dxa"/>
-          </w:tblCellMar>
-        </w:tblPrEx>
         <w:trPr>
           <w:cantSplit/>
         </w:trPr>
@@ -6704,12 +6424,6 @@
         </w:tc>
       </w:tr>
       <w:tr>
-        <w:tblPrEx>
-          <w:tblCellMar>
-            <w:top w:w="0" w:type="dxa"/>
-            <w:bottom w:w="0" w:type="dxa"/>
-          </w:tblCellMar>
-        </w:tblPrEx>
         <w:trPr>
           <w:cantSplit/>
         </w:trPr>
@@ -6808,12 +6522,6 @@
         </w:tc>
       </w:tr>
       <w:tr>
-        <w:tblPrEx>
-          <w:tblCellMar>
-            <w:top w:w="0" w:type="dxa"/>
-            <w:bottom w:w="0" w:type="dxa"/>
-          </w:tblCellMar>
-        </w:tblPrEx>
         <w:trPr>
           <w:cantSplit/>
         </w:trPr>
@@ -6909,12 +6617,6 @@
         </w:tc>
       </w:tr>
       <w:tr>
-        <w:tblPrEx>
-          <w:tblCellMar>
-            <w:top w:w="0" w:type="dxa"/>
-            <w:bottom w:w="0" w:type="dxa"/>
-          </w:tblCellMar>
-        </w:tblPrEx>
         <w:trPr>
           <w:cantSplit/>
         </w:trPr>
@@ -7013,12 +6715,6 @@
         </w:tc>
       </w:tr>
       <w:tr>
-        <w:tblPrEx>
-          <w:tblCellMar>
-            <w:top w:w="0" w:type="dxa"/>
-            <w:bottom w:w="0" w:type="dxa"/>
-          </w:tblCellMar>
-        </w:tblPrEx>
         <w:trPr>
           <w:cantSplit/>
         </w:trPr>
@@ -7114,12 +6810,6 @@
         </w:tc>
       </w:tr>
       <w:tr>
-        <w:tblPrEx>
-          <w:tblCellMar>
-            <w:top w:w="0" w:type="dxa"/>
-            <w:bottom w:w="0" w:type="dxa"/>
-          </w:tblCellMar>
-        </w:tblPrEx>
         <w:trPr>
           <w:cantSplit/>
         </w:trPr>
@@ -7218,12 +6908,6 @@
         </w:tc>
       </w:tr>
       <w:tr>
-        <w:tblPrEx>
-          <w:tblCellMar>
-            <w:top w:w="0" w:type="dxa"/>
-            <w:bottom w:w="0" w:type="dxa"/>
-          </w:tblCellMar>
-        </w:tblPrEx>
         <w:trPr>
           <w:cantSplit/>
         </w:trPr>
@@ -7320,7 +7004,7 @@
       <w:pPr>
         <w:pStyle w:val="Heading1"/>
       </w:pPr>
-      <w:bookmarkStart w:id="11" w:name="_Toc241336247"/>
+      <w:bookmarkStart w:id="11" w:name="_Toc241868375"/>
       <w:r>
         <w:t>5. Data and pipeline design</w:t>
       </w:r>
@@ -7330,7 +7014,7 @@
       <w:pPr>
         <w:pStyle w:val="Heading2"/>
       </w:pPr>
-      <w:bookmarkStart w:id="12" w:name="_Toc241336248"/>
+      <w:bookmarkStart w:id="12" w:name="_Toc241868376"/>
       <w:r>
         <w:t>5.1 Dataset</w:t>
       </w:r>
@@ -7341,10 +7025,7 @@
         <w:spacing w:after="120" w:line="276" w:lineRule="auto"/>
       </w:pPr>
       <w:r>
-        <w:t>We use the Multilingual Amazon Reviews Corpus (MARC, Keung et al., EMNLP 2020): real Amazon product reviews in English, German, Spanish, French, Japanese and Chinese, with a 1 to 5 star rating, a product category and a review text (title and body). The tea</w:t>
-      </w:r>
-      <w:r>
-        <w:t>m downloaded the Kaggle copy (</w:t>
+        <w:t>We use the Multilingual Amazon Reviews Corpus (MARC, Keung et al., EMNLP 2020): real Amazon product reviews in English, German, Spanish, French, Japanese and Chinese, with a 1 to 5 star rating, a product category and a review text (title and body). The team downloaded the Kaggle copy (</w:t>
       </w:r>
       <w:r>
         <w:rPr>
@@ -7362,7 +7043,7 @@
       <w:pPr>
         <w:pStyle w:val="Heading2"/>
       </w:pPr>
-      <w:bookmarkStart w:id="13" w:name="_Toc241336249"/>
+      <w:bookmarkStart w:id="13" w:name="_Toc241868377"/>
       <w:r>
         <w:t>5.2 Unified schema</w:t>
       </w:r>
@@ -7408,7 +7089,7 @@
       <w:pPr>
         <w:pStyle w:val="Heading2"/>
       </w:pPr>
-      <w:bookmarkStart w:id="14" w:name="_Toc241336250"/>
+      <w:bookmarkStart w:id="14" w:name="_Toc241868378"/>
       <w:r>
         <w:t>5.3 Samples and splits</w:t>
       </w:r>
@@ -7437,12 +7118,6 @@
         <w:gridCol w:w="3538"/>
       </w:tblGrid>
       <w:tr>
-        <w:tblPrEx>
-          <w:tblCellMar>
-            <w:top w:w="0" w:type="dxa"/>
-            <w:bottom w:w="0" w:type="dxa"/>
-          </w:tblCellMar>
-        </w:tblPrEx>
         <w:trPr>
           <w:cantSplit/>
           <w:tblHeader/>
@@ -7551,12 +7226,6 @@
         </w:tc>
       </w:tr>
       <w:tr>
-        <w:tblPrEx>
-          <w:tblCellMar>
-            <w:top w:w="0" w:type="dxa"/>
-            <w:bottom w:w="0" w:type="dxa"/>
-          </w:tblCellMar>
-        </w:tblPrEx>
         <w:trPr>
           <w:cantSplit/>
         </w:trPr>
@@ -7652,12 +7321,6 @@
         </w:tc>
       </w:tr>
       <w:tr>
-        <w:tblPrEx>
-          <w:tblCellMar>
-            <w:top w:w="0" w:type="dxa"/>
-            <w:bottom w:w="0" w:type="dxa"/>
-          </w:tblCellMar>
-        </w:tblPrEx>
         <w:trPr>
           <w:cantSplit/>
         </w:trPr>
@@ -7756,12 +7419,6 @@
         </w:tc>
       </w:tr>
       <w:tr>
-        <w:tblPrEx>
-          <w:tblCellMar>
-            <w:top w:w="0" w:type="dxa"/>
-            <w:bottom w:w="0" w:type="dxa"/>
-          </w:tblCellMar>
-        </w:tblPrEx>
         <w:trPr>
           <w:cantSplit/>
         </w:trPr>
@@ -7857,12 +7514,6 @@
         </w:tc>
       </w:tr>
       <w:tr>
-        <w:tblPrEx>
-          <w:tblCellMar>
-            <w:top w:w="0" w:type="dxa"/>
-            <w:bottom w:w="0" w:type="dxa"/>
-          </w:tblCellMar>
-        </w:tblPrEx>
         <w:trPr>
           <w:cantSplit/>
         </w:trPr>
@@ -7961,12 +7612,6 @@
         </w:tc>
       </w:tr>
       <w:tr>
-        <w:tblPrEx>
-          <w:tblCellMar>
-            <w:top w:w="0" w:type="dxa"/>
-            <w:bottom w:w="0" w:type="dxa"/>
-          </w:tblCellMar>
-        </w:tblPrEx>
         <w:trPr>
           <w:cantSplit/>
         </w:trPr>
@@ -8062,12 +7707,6 @@
         </w:tc>
       </w:tr>
       <w:tr>
-        <w:tblPrEx>
-          <w:tblCellMar>
-            <w:top w:w="0" w:type="dxa"/>
-            <w:bottom w:w="0" w:type="dxa"/>
-          </w:tblCellMar>
-        </w:tblPrEx>
         <w:trPr>
           <w:cantSplit/>
         </w:trPr>
@@ -8172,7 +7811,7 @@
       <w:pPr>
         <w:pStyle w:val="Heading2"/>
       </w:pPr>
-      <w:bookmarkStart w:id="15" w:name="_Toc241336251"/>
+      <w:bookmarkStart w:id="15" w:name="_Toc241868379"/>
       <w:r>
         <w:t>5.4 Ground truth and its limits</w:t>
       </w:r>
@@ -8187,10 +7826,7 @@
       </w:r>
       <w:r>
         <w:lastRenderedPageBreak/>
-        <w:t>dataset also has no review dates, so the</w:t>
-      </w:r>
-      <w:r>
-        <w:t xml:space="preserve"> trend stage uses simulated dates (12 weeks from 6 July 2026) with planted spikes. Trend results therefore show that the detector works, not how real customers behave.</w:t>
+        <w:t>dataset also has no review dates, so the trend stage uses simulated dates (12 weeks from 6 July 2026) with planted spikes. Trend results therefore show that the detector works, not how real customers behave.</w:t>
       </w:r>
     </w:p>
     <w:p>
@@ -8198,7 +7834,7 @@
         <w:pStyle w:val="Heading1"/>
         <w:pageBreakBefore/>
       </w:pPr>
-      <w:bookmarkStart w:id="16" w:name="_Toc241336252"/>
+      <w:bookmarkStart w:id="16" w:name="_Toc241868380"/>
       <w:r>
         <w:lastRenderedPageBreak/>
         <w:t>6. Components in detail</w:t>
@@ -8209,7 +7845,7 @@
       <w:pPr>
         <w:pStyle w:val="Heading2"/>
       </w:pPr>
-      <w:bookmarkStart w:id="17" w:name="_Toc241336253"/>
+      <w:bookmarkStart w:id="17" w:name="_Toc241868381"/>
       <w:r>
         <w:t>6.1 Ingestion (n8n workflow 01)</w:t>
       </w:r>
@@ -8220,20 +7856,14 @@
         <w:spacing w:after="120" w:line="276" w:lineRule="auto"/>
       </w:pPr>
       <w:r>
-        <w:t xml:space="preserve">The workflow downloads the MARC </w:t>
-      </w:r>
-      <w:r>
-        <w:t xml:space="preserve">review files, takes an even sample per star rating and language, and outputs the unified schema. It was verified by a headless run: 1,200 items, 200 per language, 240 per star, unique ids, no encoding damage in any language. The default run uses 4 reviews </w:t>
-      </w:r>
-      <w:r>
-        <w:t>per star per language (about 100 translations) so that test runs cost pennies; a setting scales it up.</w:t>
+        <w:t>The workflow downloads the MARC review files, takes an even sample per star rating and language, and outputs the unified schema. It was verified by a headless run: 1,200 items, 200 per language, 240 per star, unique ids, no encoding damage in any language. The default run uses 4 reviews per star per language (about 100 translations) so that test runs cost pennies; a setting scales it up.</w:t>
       </w:r>
     </w:p>
     <w:p>
       <w:pPr>
         <w:pStyle w:val="Heading2"/>
       </w:pPr>
-      <w:bookmarkStart w:id="18" w:name="_Toc241336254"/>
+      <w:bookmarkStart w:id="18" w:name="_Toc241868382"/>
       <w:r>
         <w:t>6.2 Translation (n8n workflow 02)</w:t>
       </w:r>
@@ -8244,10 +7874,7 @@
         <w:spacing w:after="120" w:line="276" w:lineRule="auto"/>
       </w:pPr>
       <w:r>
-        <w:t>Non-English reviews are translated to English in batches of eight with Claude. The prompt returns JSON with the detecte</w:t>
-      </w:r>
-      <w:r>
-        <w:t xml:space="preserve">d language and translation for each id. Each call is retried three times; a failed batch marks its reviews </w:t>
+        <w:t xml:space="preserve">Non-English reviews are translated to English in batches of eight with Claude. The prompt returns JSON with the detected language and translation for each id. Each call is retried three times; a failed batch marks its reviews </w:t>
       </w:r>
       <w:r>
         <w:rPr>
@@ -8284,12 +7911,6 @@
         <w:gridCol w:w="3038"/>
       </w:tblGrid>
       <w:tr>
-        <w:tblPrEx>
-          <w:tblCellMar>
-            <w:top w:w="0" w:type="dxa"/>
-            <w:bottom w:w="0" w:type="dxa"/>
-          </w:tblCellMar>
-        </w:tblPrEx>
         <w:trPr>
           <w:cantSplit/>
           <w:tblHeader/>
@@ -8388,12 +8009,6 @@
         </w:tc>
       </w:tr>
       <w:tr>
-        <w:tblPrEx>
-          <w:tblCellMar>
-            <w:top w:w="0" w:type="dxa"/>
-            <w:bottom w:w="0" w:type="dxa"/>
-          </w:tblCellMar>
-        </w:tblPrEx>
         <w:trPr>
           <w:cantSplit/>
         </w:trPr>
@@ -8489,12 +8104,6 @@
         </w:tc>
       </w:tr>
       <w:tr>
-        <w:tblPrEx>
-          <w:tblCellMar>
-            <w:top w:w="0" w:type="dxa"/>
-            <w:bottom w:w="0" w:type="dxa"/>
-          </w:tblCellMar>
-        </w:tblPrEx>
         <w:trPr>
           <w:cantSplit/>
         </w:trPr>
@@ -8593,12 +8202,6 @@
         </w:tc>
       </w:tr>
       <w:tr>
-        <w:tblPrEx>
-          <w:tblCellMar>
-            <w:top w:w="0" w:type="dxa"/>
-            <w:bottom w:w="0" w:type="dxa"/>
-          </w:tblCellMar>
-        </w:tblPrEx>
         <w:trPr>
           <w:cantSplit/>
         </w:trPr>
@@ -8701,17 +8304,14 @@
         <w:spacing w:after="120" w:line="276" w:lineRule="auto"/>
       </w:pPr>
       <w:r>
-        <w:t>We chose Claude only. Both models translated all 40 test reviews correctly, but Groq’s latency was unpredictable and Groq no longer offers the Llama chat models that our early plan assumed. Cloud and local runs of the workflow agree: 120 reviews, 100 trans</w:t>
-      </w:r>
-      <w:r>
-        <w:t>lated, 20 English (not needed), 0 failed, about $0.06. With an invalid API key the run still finishes and records all 100 as failed with the error message.</w:t>
+        <w:t>We chose Claude only. Both models translated all 40 test reviews correctly, but Groq’s latency was unpredictable and Groq no longer offers the Llama chat models that our early plan assumed. Cloud and local runs of the workflow agree: 120 reviews, 100 translated, 20 English (not needed), 0 failed, about $0.06. With an invalid API key the run still finishes and records all 100 as failed with the error message.</w:t>
       </w:r>
     </w:p>
     <w:p>
       <w:pPr>
         <w:pStyle w:val="Heading2"/>
       </w:pPr>
-      <w:bookmarkStart w:id="19" w:name="_Toc241336255"/>
+      <w:bookmarkStart w:id="19" w:name="_Toc241868383"/>
       <w:r>
         <w:t>6.3 Sentiment, topic and estimated stars</w:t>
       </w:r>
@@ -8722,13 +8322,7 @@
         <w:spacing w:after="120" w:line="276" w:lineRule="auto"/>
       </w:pPr>
       <w:r>
-        <w:t>One Claude call per review returns the sentiment, a topic (</w:t>
-      </w:r>
-      <w:r>
-        <w:t>quality, features, shipping, price, ux, support or other), a confidence and an estimated star rating from 1 to 5. Three prompt versions were tried; version 3 adds the star estimate and is used in production, with the label taken from the estimated stars. W</w:t>
-      </w:r>
-      <w:r>
-        <w:t>e compared it with a classic baseline.</w:t>
+        <w:t>One Claude call per review returns the sentiment, a topic (quality, features, shipping, price, ux, support or other), a confidence and an estimated star rating from 1 to 5. Three prompt versions were tried; version 3 adds the star estimate and is used in production, with the label taken from the estimated stars. We compared it with a classic baseline.</w:t>
       </w:r>
     </w:p>
     <w:p>
@@ -8742,7 +8336,7 @@
           <w:noProof/>
         </w:rPr>
         <w:drawing>
-          <wp:inline distT="0" distB="0" distL="0" distR="0" wp14:anchorId="25610B6D" wp14:editId="1700133E">
+          <wp:inline distT="0" distB="0" distL="0" distR="0" wp14:anchorId="64913641" wp14:editId="31DB499C">
             <wp:extent cx="4476750" cy="2266950"/>
             <wp:effectExtent l="0" t="0" r="0" b="0"/>
             <wp:docPr id="2" name="fig_sentiment.png" descr="Figure 2. Sentiment accuracy on the 960 held-out test reviews." title="Figure 2. Sentiment accuracy on the 960 held-out test reviews."/>
@@ -8822,12 +8416,6 @@
         <w:gridCol w:w="1738"/>
       </w:tblGrid>
       <w:tr>
-        <w:tblPrEx>
-          <w:tblCellMar>
-            <w:top w:w="0" w:type="dxa"/>
-            <w:bottom w:w="0" w:type="dxa"/>
-          </w:tblCellMar>
-        </w:tblPrEx>
         <w:trPr>
           <w:cantSplit/>
           <w:tblHeader/>
@@ -9005,12 +8593,6 @@
         </w:tc>
       </w:tr>
       <w:tr>
-        <w:tblPrEx>
-          <w:tblCellMar>
-            <w:top w:w="0" w:type="dxa"/>
-            <w:bottom w:w="0" w:type="dxa"/>
-          </w:tblCellMar>
-        </w:tblPrEx>
         <w:trPr>
           <w:cantSplit/>
         </w:trPr>
@@ -9166,12 +8748,6 @@
         </w:tc>
       </w:tr>
       <w:tr>
-        <w:tblPrEx>
-          <w:tblCellMar>
-            <w:top w:w="0" w:type="dxa"/>
-            <w:bottom w:w="0" w:type="dxa"/>
-          </w:tblCellMar>
-        </w:tblPrEx>
         <w:trPr>
           <w:cantSplit/>
         </w:trPr>
@@ -9332,12 +8908,6 @@
         </w:tc>
       </w:tr>
       <w:tr>
-        <w:tblPrEx>
-          <w:tblCellMar>
-            <w:top w:w="0" w:type="dxa"/>
-            <w:bottom w:w="0" w:type="dxa"/>
-          </w:tblCellMar>
-        </w:tblPrEx>
         <w:trPr>
           <w:cantSplit/>
         </w:trPr>
@@ -9493,12 +9063,6 @@
         </w:tc>
       </w:tr>
       <w:tr>
-        <w:tblPrEx>
-          <w:tblCellMar>
-            <w:top w:w="0" w:type="dxa"/>
-            <w:bottom w:w="0" w:type="dxa"/>
-          </w:tblCellMar>
-        </w:tblPrEx>
         <w:trPr>
           <w:cantSplit/>
         </w:trPr>
@@ -9667,12 +9231,6 @@
         </w:tc>
       </w:tr>
       <w:tr>
-        <w:tblPrEx>
-          <w:tblCellMar>
-            <w:top w:w="0" w:type="dxa"/>
-            <w:bottom w:w="0" w:type="dxa"/>
-          </w:tblCellMar>
-        </w:tblPrEx>
         <w:trPr>
           <w:cantSplit/>
         </w:trPr>
@@ -9828,12 +9386,6 @@
         </w:tc>
       </w:tr>
       <w:tr>
-        <w:tblPrEx>
-          <w:tblCellMar>
-            <w:top w:w="0" w:type="dxa"/>
-            <w:bottom w:w="0" w:type="dxa"/>
-          </w:tblCellMar>
-        </w:tblPrEx>
         <w:trPr>
           <w:cantSplit/>
         </w:trPr>
@@ -10033,12 +9585,6 @@
         <w:gridCol w:w="2238"/>
       </w:tblGrid>
       <w:tr>
-        <w:tblPrEx>
-          <w:tblCellMar>
-            <w:top w:w="0" w:type="dxa"/>
-            <w:bottom w:w="0" w:type="dxa"/>
-          </w:tblCellMar>
-        </w:tblPrEx>
         <w:trPr>
           <w:cantSplit/>
           <w:tblHeader/>
@@ -10181,12 +9727,6 @@
         </w:tc>
       </w:tr>
       <w:tr>
-        <w:tblPrEx>
-          <w:tblCellMar>
-            <w:top w:w="0" w:type="dxa"/>
-            <w:bottom w:w="0" w:type="dxa"/>
-          </w:tblCellMar>
-        </w:tblPrEx>
         <w:trPr>
           <w:cantSplit/>
         </w:trPr>
@@ -10312,12 +9852,6 @@
         </w:tc>
       </w:tr>
       <w:tr>
-        <w:tblPrEx>
-          <w:tblCellMar>
-            <w:top w:w="0" w:type="dxa"/>
-            <w:bottom w:w="0" w:type="dxa"/>
-          </w:tblCellMar>
-        </w:tblPrEx>
         <w:trPr>
           <w:cantSplit/>
         </w:trPr>
@@ -10447,12 +9981,6 @@
         </w:tc>
       </w:tr>
       <w:tr>
-        <w:tblPrEx>
-          <w:tblCellMar>
-            <w:top w:w="0" w:type="dxa"/>
-            <w:bottom w:w="0" w:type="dxa"/>
-          </w:tblCellMar>
-        </w:tblPrEx>
         <w:trPr>
           <w:cantSplit/>
         </w:trPr>
@@ -10592,10 +10120,7 @@
         <w:pStyle w:val="Heading3"/>
       </w:pPr>
       <w:r>
-        <w:t>Why three-way accuracy stays</w:t>
-      </w:r>
-      <w:r>
-        <w:t xml:space="preserve"> near 78%</w:t>
+        <w:t>Why three-way accuracy stays near 78%</w:t>
       </w:r>
     </w:p>
     <w:p>
@@ -10621,10 +10146,7 @@
         <w:spacing w:after="60" w:line="264" w:lineRule="auto"/>
       </w:pPr>
       <w:r>
-        <w:t>A three-star review is often genuinely mixed (“I love the sound but it turns itself back on”). Star ratings</w:t>
-      </w:r>
-      <w:r>
-        <w:t xml:space="preserve"> are a noisy proxy for text sentiment, and the published fine-grained MARC results also stop at about 59 to 70% exact-star accuracy.</w:t>
+        <w:t>A three-star review is often genuinely mixed (“I love the sound but it turns itself back on”). Star ratings are a noisy proxy for text sentiment, and the published fine-grained MARC results also stop at about 59 to 70% exact-star accuracy.</w:t>
       </w:r>
     </w:p>
     <w:p>
@@ -10637,13 +10159,7 @@
         <w:spacing w:after="60" w:line="264" w:lineRule="auto"/>
       </w:pPr>
       <w:r>
-        <w:t xml:space="preserve">We tried to lift the neutral class with a small logistic-regression stacker over Claude’s label, confidence, star estimate </w:t>
-      </w:r>
-      <w:r>
-        <w:t>and the baseline’s probabilities. Everything landed at 75 to 78%. A “balanced” stacker finds more neutrals (recall up to 58%) but pushes borderline reviews out of the positive and negative classes, and positive-vs-negative accuracy falls from 88% to 80%, b</w:t>
-      </w:r>
-      <w:r>
-        <w:t>elow the target. We therefore kept the simple, cheaper classifier and offer the balanced stacker only as an optional “flag borderline reviews” mode.</w:t>
+        <w:t>We tried to lift the neutral class with a small logistic-regression stacker over Claude’s label, confidence, star estimate and the baseline’s probabilities. Everything landed at 75 to 78%. A “balanced” stacker finds more neutrals (recall up to 58%) but pushes borderline reviews out of the positive and negative classes, and positive-vs-negative accuracy falls from 88% to 80%, below the target. We therefore kept the simple, cheaper classifier and offer the balanced stacker only as an optional “flag borderline reviews” mode.</w:t>
       </w:r>
     </w:p>
     <w:p>
@@ -10656,10 +10172,7 @@
         <w:spacing w:after="60" w:line="264" w:lineRule="auto"/>
       </w:pPr>
       <w:r>
-        <w:t>Star estimate versus true stars: MAE 0.47, exact match 58.0%, within one star 95.6% (Chinese weakest, MAE 0</w:t>
-      </w:r>
-      <w:r>
-        <w:t>.63). The proposal’s MAE target of 0.15 is not realistic for this data.</w:t>
+        <w:t>Star estimate versus true stars: MAE 0.47, exact match 58.0%, within one star 95.6% (Chinese weakest, MAE 0.63). The proposal’s MAE target of 0.15 is not realistic for this data.</w:t>
       </w:r>
     </w:p>
     <w:p>
@@ -10667,17 +10180,14 @@
         <w:spacing w:after="120" w:line="276" w:lineRule="auto"/>
       </w:pPr>
       <w:r>
-        <w:t>Topic labels were produced for every review but could not be checked against ground truth, because the data has none. The distribution on the test set was quality 536, features 199, sh</w:t>
-      </w:r>
-      <w:r>
-        <w:t>ipping 104, price 49, other 37, ux 19, support 16.</w:t>
+        <w:t>Topic labels were produced for every review but could not be checked against ground truth, because the data has none. The distribution on the test set was quality 536, features 199, shipping 104, price 49, other 37, ux 19, support 16.</w:t>
       </w:r>
     </w:p>
     <w:p>
       <w:pPr>
         <w:pStyle w:val="Heading2"/>
       </w:pPr>
-      <w:bookmarkStart w:id="20" w:name="_Toc241336256"/>
+      <w:bookmarkStart w:id="20" w:name="_Toc241868384"/>
       <w:r>
         <w:t>6.4 Issue clustering</w:t>
       </w:r>
@@ -10688,10 +10198,7 @@
         <w:spacing w:after="120" w:line="276" w:lineRule="auto"/>
       </w:pPr>
       <w:r>
-        <w:t>For the 765 reviews classified negative in the 1,560-review dashboard set, we compared two ways of grouping them. Method A embeds the native review text with a multilingual sentence mo</w:t>
-      </w:r>
-      <w:r>
-        <w:t>del and clusters it. Method B first asks Claude for a short English “issue phrase” (what went wrong, in a few words), then embeds and clusters those phrases. This is the proposal’s “translate-then-analyze versus native” comparison.</w:t>
+        <w:t>For the 765 reviews classified negative in the 1,560-review dashboard set, we compared two ways of grouping them. Method A embeds the native review text with a multilingual sentence model and clusters it. Method B first asks Claude for a short English “issue phrase” (what went wrong, in a few words), then embeds and clusters those phrases. This is the proposal’s “translate-then-analyze versus native” comparison.</w:t>
       </w:r>
     </w:p>
     <w:tbl>
@@ -10718,12 +10225,6 @@
         <w:gridCol w:w="2238"/>
       </w:tblGrid>
       <w:tr>
-        <w:tblPrEx>
-          <w:tblCellMar>
-            <w:top w:w="0" w:type="dxa"/>
-            <w:bottom w:w="0" w:type="dxa"/>
-          </w:tblCellMar>
-        </w:tblPrEx>
         <w:trPr>
           <w:cantSplit/>
           <w:tblHeader/>
@@ -10867,12 +10368,6 @@
         </w:tc>
       </w:tr>
       <w:tr>
-        <w:tblPrEx>
-          <w:tblCellMar>
-            <w:top w:w="0" w:type="dxa"/>
-            <w:bottom w:w="0" w:type="dxa"/>
-          </w:tblCellMar>
-        </w:tblPrEx>
         <w:trPr>
           <w:cantSplit/>
         </w:trPr>
@@ -10998,12 +10493,6 @@
         </w:tc>
       </w:tr>
       <w:tr>
-        <w:tblPrEx>
-          <w:tblCellMar>
-            <w:top w:w="0" w:type="dxa"/>
-            <w:bottom w:w="0" w:type="dxa"/>
-          </w:tblCellMar>
-        </w:tblPrEx>
         <w:trPr>
           <w:cantSplit/>
         </w:trPr>
@@ -11139,10 +10628,7 @@
         <w:spacing w:after="120" w:line="276" w:lineRule="auto"/>
       </w:pPr>
       <w:r>
-        <w:t>Translate-then-analyze wins: the silhouette rises about 1.6 times and clusters mix languages evenly, which is the goal of grouping across languages. The absolute score (0.07) is low, as is normal for short phrases about very different products, so we treat</w:t>
-      </w:r>
-      <w:r>
-        <w:t xml:space="preserve"> it as a coarse measure and rely on the fact that the clusters read clearly. HDBSCAN produced almost only noise, so we use k-means with k = 13.</w:t>
+        <w:t>Translate-then-analyze wins: the silhouette rises about 1.6 times and clusters mix languages evenly, which is the goal of grouping across languages. The absolute score (0.07) is low, as is normal for short phrases about very different products, so we treat it as a coarse measure and rely on the fact that the clusters read clearly. HDBSCAN produced almost only noise, so we use k-means with k = 13.</w:t>
       </w:r>
     </w:p>
     <w:p>
@@ -11150,13 +10636,7 @@
         <w:spacing w:after="120" w:line="276" w:lineRule="auto"/>
       </w:pPr>
       <w:r>
-        <w:t>The 13 categories, named by Claude from the cluster contents: delayed or missing shipments and poor support; dam</w:t>
-      </w:r>
-      <w:r>
-        <w:t>aged packaging and product during shipping; wrong item received or non-functional; missing parts and assembly defects; product fails or breaks shortly after purchase; defective or malfunctioning components; poor overall quality and durability; connectivity</w:t>
-      </w:r>
-      <w:r>
-        <w:t xml:space="preserve"> and performance issues; design flaws and uncomfortable fit; wrong size sent or undersized; poor content quality and printing errors; product does not work as advertised; overpriced and rapid price drops.</w:t>
+        <w:t>The 13 categories, named by Claude from the cluster contents: delayed or missing shipments and poor support; damaged packaging and product during shipping; wrong item received or non-functional; missing parts and assembly defects; product fails or breaks shortly after purchase; defective or malfunctioning components; poor overall quality and durability; connectivity and performance issues; design flaws and uncomfortable fit; wrong size sent or undersized; poor content quality and printing errors; product does not work as advertised; overpriced and rapid price drops.</w:t>
       </w:r>
     </w:p>
     <w:p>
@@ -11164,20 +10644,14 @@
         <w:spacing w:after="120" w:line="276" w:lineRule="auto"/>
       </w:pPr>
       <w:r>
-        <w:t>n8n Cloud cannot run the embedding model, so inside</w:t>
-      </w:r>
-      <w:r>
-        <w:t xml:space="preserve"> n8n a Claude call assigns each negative review to one of these 13 categories. On 100 negatives its choice matched the k-means cluster 43% of the time. That is not an accuracy figure, since k-means is not ground truth; the disagreements were mostly reasona</w:t>
-      </w:r>
-      <w:r>
-        <w:t>ble re-assignments (for example, “misleading description” going to “does not work as advertised”). Only 2% of reviews got “none fits”.</w:t>
+        <w:t>n8n Cloud cannot run the embedding model, so inside n8n a Claude call assigns each negative review to one of these 13 categories. On 100 negatives its choice matched the k-means cluster 43% of the time. That is not an accuracy figure, since k-means is not ground truth; the disagreements were mostly reasonable re-assignments (for example, “misleading description” going to “does not work as advertised”). Only 2% of reviews got “none fits”.</w:t>
       </w:r>
     </w:p>
     <w:p>
       <w:pPr>
         <w:pStyle w:val="Heading2"/>
       </w:pPr>
-      <w:bookmarkStart w:id="21" w:name="_Toc241336257"/>
+      <w:bookmarkStart w:id="21" w:name="_Toc241868385"/>
       <w:r>
         <w:t>6.5 Trend detection and alerts</w:t>
       </w:r>
@@ -11188,10 +10662,7 @@
         <w:spacing w:after="120" w:line="276" w:lineRule="auto"/>
       </w:pPr>
       <w:r>
-        <w:t>The detector counts negative reviews per issue category per week and compares each week with the trailing four weeks. A week is flagged when its z-score is at least 3.5 and it has at least 8 reviews. The spread is floored at the Poisson value (the square r</w:t>
-      </w:r>
-      <w:r>
-        <w:t>oot of the mean) so that quiet categories do not flag on noise. An EWMA control chart is available as an alternative.</w:t>
+        <w:t>The detector counts negative reviews per issue category per week and compares each week with the trailing four weeks. A week is flagged when its z-score is at least 3.5 and it has at least 8 reviews. The spread is floored at the Poisson value (the square root of the mean) so that quiet categories do not flag on noise. An EWMA control chart is available as an alternative.</w:t>
       </w:r>
     </w:p>
     <w:p>
@@ -11199,10 +10670,7 @@
         <w:spacing w:after="120" w:line="276" w:lineRule="auto"/>
       </w:pPr>
       <w:r>
-        <w:t>Because the data has no dates, we assigned each review a simulated week and planted three spikes: delayed shipments five times normal in w</w:t>
-      </w:r>
-      <w:r>
-        <w:t>eek 8, damaged packaging four times in week 10 and price complaints three times in week 11 (weeks counted from 1). Results are averaged over 200 random timelines.</w:t>
+        <w:t>Because the data has no dates, we assigned each review a simulated week and planted three spikes: delayed shipments five times normal in week 8, damaged packaging four times in week 10 and price complaints three times in week 11 (weeks counted from 1). Results are averaged over 200 random timelines.</w:t>
       </w:r>
     </w:p>
     <w:tbl>
@@ -11230,12 +10698,6 @@
         <w:gridCol w:w="2038"/>
       </w:tblGrid>
       <w:tr>
-        <w:tblPrEx>
-          <w:tblCellMar>
-            <w:top w:w="0" w:type="dxa"/>
-            <w:bottom w:w="0" w:type="dxa"/>
-          </w:tblCellMar>
-        </w:tblPrEx>
         <w:trPr>
           <w:cantSplit/>
           <w:tblHeader/>
@@ -11412,12 +10874,6 @@
         </w:tc>
       </w:tr>
       <w:tr>
-        <w:tblPrEx>
-          <w:tblCellMar>
-            <w:top w:w="0" w:type="dxa"/>
-            <w:bottom w:w="0" w:type="dxa"/>
-          </w:tblCellMar>
-        </w:tblPrEx>
         <w:trPr>
           <w:cantSplit/>
         </w:trPr>
@@ -11573,12 +11029,6 @@
         </w:tc>
       </w:tr>
       <w:tr>
-        <w:tblPrEx>
-          <w:tblCellMar>
-            <w:top w:w="0" w:type="dxa"/>
-            <w:bottom w:w="0" w:type="dxa"/>
-          </w:tblCellMar>
-        </w:tblPrEx>
         <w:trPr>
           <w:cantSplit/>
         </w:trPr>
@@ -11744,10 +11194,7 @@
         <w:spacing w:after="120" w:line="276" w:lineRule="auto"/>
       </w:pPr>
       <w:r>
-        <w:t>Threshold sweep for the z-score rule: z 3.0 gives recall 97% but precision 77% and 1.07 false alarms; z 4.0 gives recall 90.7%, precision 91.6% and 0.32 false alarms; z 5.0 gives recall 75% and precision 97%. These numbers are optimistic because the thresh</w:t>
-      </w:r>
-      <w:r>
-        <w:t>old was tuned on the same simulation. Precision@5, the proposal’s metric, cannot exceed 0.6 with three planted spikes, so Precision@3 is reported.</w:t>
+        <w:t>Threshold sweep for the z-score rule: z 3.0 gives recall 97% but precision 77% and 1.07 false alarms; z 4.0 gives recall 90.7%, precision 91.6% and 0.32 false alarms; z 5.0 gives recall 75% and precision 97%. These numbers are optimistic because the threshold was tuned on the same simulation. Precision@5, the proposal’s metric, cannot exceed 0.6 with three planted spikes, so Precision@3 is reported.</w:t>
       </w:r>
     </w:p>
     <w:p>
@@ -11762,7 +11209,7 @@
         </w:rPr>
         <w:lastRenderedPageBreak/>
         <w:drawing>
-          <wp:inline distT="0" distB="0" distL="0" distR="0" wp14:anchorId="78EEDF4D" wp14:editId="7EF98C7F">
+          <wp:inline distT="0" distB="0" distL="0" distR="0" wp14:anchorId="44A3B206" wp14:editId="56F16D8A">
             <wp:extent cx="5334000" cy="2533650"/>
             <wp:effectExtent l="0" t="0" r="0" b="0"/>
             <wp:docPr id="3" name="fig_spikes.png" descr="Figure 3. Weekly negative reviews for four issue categories in the dashboard data. Circles mark the four alerts sent to Slack." title="Figure 3. Weekly negative reviews for four issue categories in the dashboard data. Circles mark the four alerts sent to Slack."/>
@@ -11814,17 +11261,7 @@
           <w:sz w:val="19"/>
           <w:szCs w:val="19"/>
         </w:rPr>
-        <w:t>Figure 3. Weekly negative reviews for four issue categories in the dashboard data. Circles mark the four al</w:t>
-      </w:r>
-      <w:r>
-        <w:rPr>
-          <w:i/>
-          <w:iCs/>
-          <w:color w:val="5A6470"/>
-          <w:sz w:val="19"/>
-          <w:szCs w:val="19"/>
-        </w:rPr>
-        <w:t>erts sent to Slack.</w:t>
+        <w:t>Figure 3. Weekly negative reviews for four issue categories in the dashboard data. Circles mark the four alerts sent to Slack.</w:t>
       </w:r>
     </w:p>
     <w:p>
@@ -11832,20 +11269,14 @@
         <w:spacing w:after="120" w:line="276" w:lineRule="auto"/>
       </w:pPr>
       <w:r>
-        <w:t>The dashboard data produced four alerts: delayed shipments (27 reviews in the week of 24 August, baseline 3.5, z 12.56), damaged packaging (19 in the week of 7 September, z 9.80), price complaints (12 in the week of 14 September, z 4.54</w:t>
-      </w:r>
-      <w:r>
-        <w:t>) and missing parts (12 in the week of 7 September, z 4.26). The first three are planted spikes. The fourth was not planted, so it is a false alarm produced by ordinary variation in a small category, which is consistent with the roughly 0.5 false alarms pe</w:t>
-      </w:r>
-      <w:r>
-        <w:t>r 12 weeks measured above.</w:t>
+        <w:t>The dashboard data produced four alerts: delayed shipments (27 reviews in the week of 24 August, baseline 3.5, z 12.56), damaged packaging (19 in the week of 7 September, z 9.80), price complaints (12 in the week of 14 September, z 4.54) and missing parts (12 in the week of 7 September, z 4.26). The first three are planted spikes. The fourth was not planted, so it is a false alarm produced by ordinary variation in a small category, which is consistent with the roughly 0.5 false alarms per 12 weeks measured above.</w:t>
       </w:r>
     </w:p>
     <w:p>
       <w:pPr>
         <w:pStyle w:val="Heading2"/>
       </w:pPr>
-      <w:bookmarkStart w:id="22" w:name="_Toc241336258"/>
+      <w:bookmarkStart w:id="22" w:name="_Toc241868386"/>
       <w:r>
         <w:t>6.6 Response generation and quality checks</w:t>
       </w:r>
@@ -11856,10 +11287,7 @@
         <w:spacing w:after="120" w:line="276" w:lineRule="auto"/>
       </w:pPr>
       <w:r>
-        <w:t>A library of 21 playbooks, one for every combination of sentiment (three) and issue type (seven), gives the drafting model the right tone and structure. A system prompt adds the brand vo</w:t>
-      </w:r>
-      <w:r>
-        <w:t>ice and the hard guardrails listed in Section 4. One Claude Haiku call drafts each reply. The brand (“Acme Store”) and its support address are placeholders, and MARC has no reviewer names, so four synthetic first names per language test personalisation.</w:t>
+        <w:t>A library of 21 playbooks, one for every combination of sentiment (three) and issue type (seven), gives the drafting model the right tone and structure. A system prompt adds the brand voice and the hard guardrails listed in Section 4. One Claude Haiku call drafts each reply. The brand (“Acme Store”) and its support address are placeholders, and MARC has no reviewer names, so four synthetic first names per language test personalisation.</w:t>
       </w:r>
     </w:p>
     <w:p>
@@ -11867,13 +11295,7 @@
         <w:spacing w:after="120" w:line="276" w:lineRule="auto"/>
       </w:pPr>
       <w:r>
-        <w:t>Qu</w:t>
-      </w:r>
-      <w:r>
-        <w:t>ality is checked by Claude Sonnet 5 as an independent judge. It scores empathy, specificity, correctness and tone from 1 to 5 and flags promised outcomes, invented facts, wrong language and reviews a human must handle. A draft counts as judge-acceptable wh</w:t>
-      </w:r>
-      <w:r>
-        <w:t>en all four scores are at least 4 and no flag is raised. We tested on 48 held-out reviews (8 per language: 4 negative, 2 neutral, 2 positive).</w:t>
+        <w:t>Quality is checked by Claude Sonnet 5 as an independent judge. It scores empathy, specificity, correctness and tone from 1 to 5 and flags promised outcomes, invented facts, wrong language and reviews a human must handle. A draft counts as judge-acceptable when all four scores are at least 4 and no flag is raised. We tested on 48 held-out reviews (8 per language: 4 negative, 2 neutral, 2 positive).</w:t>
       </w:r>
     </w:p>
     <w:p>
@@ -11887,7 +11309,7 @@
           <w:noProof/>
         </w:rPr>
         <w:drawing>
-          <wp:inline distT="0" distB="0" distL="0" distR="0" wp14:anchorId="468FEA55" wp14:editId="1A1DA502">
+          <wp:inline distT="0" distB="0" distL="0" distR="0" wp14:anchorId="07042D6A" wp14:editId="464EECA9">
             <wp:extent cx="4476750" cy="2152650"/>
             <wp:effectExtent l="0" t="0" r="0" b="0"/>
             <wp:docPr id="4" name="fig_responses.png" descr="Figure 4. Reply quality, prompt v1 versus v2, scored by the Sonnet 5 judge on 48 replies." title="Figure 4. Reply quality, prompt v1 versus v2, scored by the Sonnet 5 judge on 48 replies."/>
@@ -11967,12 +11389,6 @@
         <w:gridCol w:w="2038"/>
       </w:tblGrid>
       <w:tr>
-        <w:tblPrEx>
-          <w:tblCellMar>
-            <w:top w:w="0" w:type="dxa"/>
-            <w:bottom w:w="0" w:type="dxa"/>
-          </w:tblCellMar>
-        </w:tblPrEx>
         <w:trPr>
           <w:cantSplit/>
           <w:tblHeader/>
@@ -12150,12 +11566,6 @@
         </w:tc>
       </w:tr>
       <w:tr>
-        <w:tblPrEx>
-          <w:tblCellMar>
-            <w:top w:w="0" w:type="dxa"/>
-            <w:bottom w:w="0" w:type="dxa"/>
-          </w:tblCellMar>
-        </w:tblPrEx>
         <w:trPr>
           <w:cantSplit/>
         </w:trPr>
@@ -12311,12 +11721,6 @@
         </w:tc>
       </w:tr>
       <w:tr>
-        <w:tblPrEx>
-          <w:tblCellMar>
-            <w:top w:w="0" w:type="dxa"/>
-            <w:bottom w:w="0" w:type="dxa"/>
-          </w:tblCellMar>
-        </w:tblPrEx>
         <w:trPr>
           <w:cantSplit/>
         </w:trPr>
@@ -12482,10 +11886,7 @@
         <w:spacing w:after="120" w:line="276" w:lineRule="auto"/>
       </w:pPr>
       <w:r>
-        <w:t>Prompt v2 adds “be specific, not stock” rules: mention at least two concrete details from the review, avoid stock phrases, match the emotional weight and make no assumptions. It improved acceptance from 68.8% to 79.2%. By sentiment (v2): negative 88%, posi</w:t>
-      </w:r>
-      <w:r>
-        <w:t>tive 83%, neutral 58%. By language: German, English and Spanish 88%; French and Chinese 75%; Japanese 62%.</w:t>
+        <w:t>Prompt v2 adds “be specific, not stock” rules: mention at least two concrete details from the review, avoid stock phrases, match the emotional weight and make no assumptions. It improved acceptance from 68.8% to 79.2%. By sentiment (v2): negative 88%, positive 83%, neutral 58%. By language: German, English and Spanish 88%; French and Chinese 75%; Japanese 62%.</w:t>
       </w:r>
     </w:p>
     <w:p>
@@ -12511,21 +11912,7 @@
           <w:sz w:val="20"/>
           <w:szCs w:val="20"/>
         </w:rPr>
-        <w:t xml:space="preserve"> the proposal asked for an 80% human-acceptance test. The team decided to skip it, so the 79.2% figure is a model’s opinion, not human appr</w:t>
-      </w:r>
-      <w:r>
-        <w:rPr>
-          <w:sz w:val="20"/>
-          <w:szCs w:val="20"/>
-        </w:rPr>
-        <w:t>oval. It is a useful signal (the judge caught, for example, replies that assumed the product worked), but human review remains the real test. The judge also made mistakes: it once flagged the customer’s supplied first name as an “invented fact” until we to</w:t>
-      </w:r>
-      <w:r>
-        <w:rPr>
-          <w:sz w:val="20"/>
-          <w:szCs w:val="20"/>
-        </w:rPr>
-        <w:t>ld it that the name is system-provided.</w:t>
+        <w:t xml:space="preserve"> the proposal asked for an 80% human-acceptance test. The team decided to skip it, so the 79.2% figure is a model’s opinion, not human approval. It is a useful signal (the judge caught, for example, replies that assumed the product worked), but human review remains the real test. The judge also made mistakes: it once flagged the customer’s supplied first name as an “invented fact” until we told it that the name is system-provided.</w:t>
       </w:r>
     </w:p>
     <w:p>
@@ -12533,17 +11920,14 @@
         <w:spacing w:after="120" w:line="276" w:lineRule="auto"/>
       </w:pPr>
       <w:r>
-        <w:t>Guardrails held: no reply was in the wrong language, and prompt v2 produced no promised outcomes. Typical remaining failures are replies that assume something the review never said and empathy lines that could be pas</w:t>
-      </w:r>
-      <w:r>
-        <w:t>ted anywhere. The approval queue works as designed: of 48 v2 replies, 24 negative plus 7 others waited for a human and 17 were auto-approved.</w:t>
+        <w:t>Guardrails held: no reply was in the wrong language, and prompt v2 produced no promised outcomes. Typical remaining failures are replies that assume something the review never said and empathy lines that could be pasted anywhere. The approval queue works as designed: of 48 v2 replies, 24 negative plus 7 others waited for a human and 17 were auto-approved.</w:t>
       </w:r>
     </w:p>
     <w:p>
       <w:pPr>
         <w:pStyle w:val="Heading2"/>
       </w:pPr>
-      <w:bookmarkStart w:id="23" w:name="_Toc241336259"/>
+      <w:bookmarkStart w:id="23" w:name="_Toc241868387"/>
       <w:r>
         <w:t>6.7 Dashboard and Slack alerts</w:t>
       </w:r>
@@ -12564,10 +11948,7 @@
         <w:t>Reviews</w:t>
       </w:r>
       <w:r>
-        <w:t xml:space="preserve"> holds the 1,560 analysed reviews</w:t>
-      </w:r>
-      <w:r>
-        <w:t xml:space="preserve">; </w:t>
+        <w:t xml:space="preserve"> holds the 1,560 analysed reviews; </w:t>
       </w:r>
       <w:r>
         <w:rPr>
@@ -12597,10 +11978,7 @@
         <w:t>Dashboard</w:t>
       </w:r>
       <w:r>
-        <w:t xml:space="preserve"> shows the summary figures and charts (issue-category bar chart, sentiment by week, topic share and a weekly spike</w:t>
-      </w:r>
-      <w:r>
-        <w:t xml:space="preserve"> line chart; see Appendix B). Review dates are simulated, so the trend charts demonstrate the detector, not real market behaviour.</w:t>
+        <w:t xml:space="preserve"> shows the summary figures and charts (issue-category bar chart, sentiment by week, topic share and a weekly spike line chart; see Appendix B). Review dates are simulated, so the trend charts demonstrate the detector, not real market behaviour.</w:t>
       </w:r>
     </w:p>
     <w:p>
@@ -12608,13 +11986,7 @@
         <w:spacing w:after="120" w:line="276" w:lineRule="auto"/>
       </w:pPr>
       <w:r>
-        <w:t>Workflow 04 (nine nodes) reads the Reviews tab through the sheet’s CSV export, counts negative reviews per issue category per</w:t>
-      </w:r>
-      <w:r>
-        <w:t xml:space="preserve"> week, applies the same z-score rule in JavaScript and posts one summary message to a Slack incoming webhook. It found the same four spikes with identical z-scores as the Python detector (12.56, 9.80, 4.54, 4.26) and needs no Claude calls, so it costs noth</w:t>
-      </w:r>
-      <w:r>
-        <w:t>ing to run.</w:t>
+        <w:t>Workflow 04 (nine nodes) reads the Reviews tab through the sheet’s CSV export, counts negative reviews per issue category per week, applies the same z-score rule in JavaScript and posts one summary message to a Slack incoming webhook. It found the same four spikes with identical z-scores as the Python detector (12.56, 9.80, 4.54, 4.26) and needs no Claude calls, so it costs nothing to run.</w:t>
       </w:r>
     </w:p>
     <w:p>
@@ -12655,14 +12027,7 @@
           <w:sz w:val="20"/>
           <w:szCs w:val="20"/>
         </w:rPr>
-        <w:t xml:space="preserve"> even though nothing had reached Slack. With the placeholder webhook URL still in place, Slack’s documentation website answered the POST with an HTML page and HTTP 200. The check now requires the e</w:t>
-      </w:r>
-      <w:r>
-        <w:rPr>
-          <w:sz w:val="20"/>
-          <w:szCs w:val="20"/>
-        </w:rPr>
-        <w:t xml:space="preserve">xact reply </w:t>
+        <w:t xml:space="preserve"> even though nothing had reached Slack. With the placeholder webhook URL still in place, Slack’s documentation website answered the POST with an HTML page and HTTP 200. The check now requires the exact reply </w:t>
       </w:r>
       <w:r>
         <w:rPr>
@@ -12699,7 +12064,7 @@
       <w:pPr>
         <w:pStyle w:val="Heading2"/>
       </w:pPr>
-      <w:bookmarkStart w:id="24" w:name="_Toc241336260"/>
+      <w:bookmarkStart w:id="24" w:name="_Toc241868388"/>
       <w:r>
         <w:t>6.8 API service and LLMOps</w:t>
       </w:r>
@@ -12735,12 +12100,6 @@
         <w:gridCol w:w="7038"/>
       </w:tblGrid>
       <w:tr>
-        <w:tblPrEx>
-          <w:tblCellMar>
-            <w:top w:w="0" w:type="dxa"/>
-            <w:bottom w:w="0" w:type="dxa"/>
-          </w:tblCellMar>
-        </w:tblPrEx>
         <w:trPr>
           <w:cantSplit/>
           <w:tblHeader/>
@@ -12815,12 +12174,6 @@
         </w:tc>
       </w:tr>
       <w:tr>
-        <w:tblPrEx>
-          <w:tblCellMar>
-            <w:top w:w="0" w:type="dxa"/>
-            <w:bottom w:w="0" w:type="dxa"/>
-          </w:tblCellMar>
-        </w:tblPrEx>
         <w:trPr>
           <w:cantSplit/>
         </w:trPr>
@@ -12886,12 +12239,6 @@
         </w:tc>
       </w:tr>
       <w:tr>
-        <w:tblPrEx>
-          <w:tblCellMar>
-            <w:top w:w="0" w:type="dxa"/>
-            <w:bottom w:w="0" w:type="dxa"/>
-          </w:tblCellMar>
-        </w:tblPrEx>
         <w:trPr>
           <w:cantSplit/>
         </w:trPr>
@@ -12959,12 +12306,6 @@
         </w:tc>
       </w:tr>
       <w:tr>
-        <w:tblPrEx>
-          <w:tblCellMar>
-            <w:top w:w="0" w:type="dxa"/>
-            <w:bottom w:w="0" w:type="dxa"/>
-          </w:tblCellMar>
-        </w:tblPrEx>
         <w:trPr>
           <w:cantSplit/>
         </w:trPr>
@@ -13060,12 +12401,6 @@
         </w:tc>
       </w:tr>
       <w:tr>
-        <w:tblPrEx>
-          <w:tblCellMar>
-            <w:top w:w="0" w:type="dxa"/>
-            <w:bottom w:w="0" w:type="dxa"/>
-          </w:tblCellMar>
-        </w:tblPrEx>
         <w:trPr>
           <w:cantSplit/>
         </w:trPr>
@@ -13125,14 +12460,7 @@
                 <w:sz w:val="18"/>
                 <w:szCs w:val="18"/>
               </w:rPr>
-              <w:t>Takes (cluster, date) event</w:t>
-            </w:r>
-            <w:r>
-              <w:rPr>
-                <w:sz w:val="18"/>
-                <w:szCs w:val="18"/>
-              </w:rPr>
-              <w:t>s; returns spikes and the latest week-over-week table (needs at least 5 weeks)</w:t>
+              <w:t>Takes (cluster, date) events; returns spikes and the latest week-over-week table (needs at least 5 weeks)</w:t>
             </w:r>
           </w:p>
         </w:tc>
@@ -13196,17 +12524,14 @@
         <w:t>X-API-Key</w:t>
       </w:r>
       <w:r>
-        <w:t xml:space="preserve"> header. A live check with real Claude calls classified four multilingual reviews correctly, drafted and judged a negative English </w:t>
-      </w:r>
-      <w:r>
-        <w:t>reply (issue phrase “arrived late and box was crushed”, scores 4/5/5/5, queued for a human) and auto-approved a positive Spanish reply (5/5/5/5), for a total cost of $0.0115.</w:t>
+        <w:t xml:space="preserve"> header. A live check with real Claude calls classified four multilingual reviews correctly, drafted and judged a negative English reply (issue phrase “arrived late and box was crushed”, scores 4/5/5/5, queued for a human) and auto-approved a positive Spanish reply (5/5/5/5), for a total cost of $0.0115.</w:t>
       </w:r>
     </w:p>
     <w:p>
       <w:pPr>
         <w:pStyle w:val="Heading2"/>
       </w:pPr>
-      <w:bookmarkStart w:id="25" w:name="_Toc241336261"/>
+      <w:bookmarkStart w:id="25" w:name="_Toc241868389"/>
       <w:r>
         <w:t>6.9 The full pipeline in n8n (workflow 03)</w:t>
       </w:r>
@@ -13217,13 +12542,7 @@
         <w:spacing w:after="120" w:line="276" w:lineRule="auto"/>
       </w:pPr>
       <w:r>
-        <w:t>Workflow 03 has 25 nodes and covers th</w:t>
-      </w:r>
-      <w:r>
-        <w:t>e brief’s first deliverable: ingest, simulated dates, translation, sentiment and topic, issue category for negatives, reply drafting, per-review status and a summary of counts, accuracy, tokens, cost and timing. Each Claude stage retries three times and co</w:t>
-      </w:r>
-      <w:r>
-        <w:t>ntinues on error. It was run locally and on the team’s n8n Cloud with the same result.</w:t>
+        <w:t>Workflow 03 has 25 nodes and covers the brief’s first deliverable: ingest, simulated dates, translation, sentiment and topic, issue category for negatives, reply drafting, per-review status and a summary of counts, accuracy, tokens, cost and timing. Each Claude stage retries three times and continues on error. It was run locally and on the team’s n8n Cloud with the same result.</w:t>
       </w:r>
     </w:p>
     <w:tbl>
@@ -13249,12 +12568,6 @@
         <w:gridCol w:w="3138"/>
       </w:tblGrid>
       <w:tr>
-        <w:tblPrEx>
-          <w:tblCellMar>
-            <w:top w:w="0" w:type="dxa"/>
-            <w:bottom w:w="0" w:type="dxa"/>
-          </w:tblCellMar>
-        </w:tblPrEx>
         <w:trPr>
           <w:cantSplit/>
           <w:tblHeader/>
@@ -13363,12 +12676,6 @@
         </w:tc>
       </w:tr>
       <w:tr>
-        <w:tblPrEx>
-          <w:tblCellMar>
-            <w:top w:w="0" w:type="dxa"/>
-            <w:bottom w:w="0" w:type="dxa"/>
-          </w:tblCellMar>
-        </w:tblPrEx>
         <w:trPr>
           <w:cantSplit/>
         </w:trPr>
@@ -13464,12 +12771,6 @@
         </w:tc>
       </w:tr>
       <w:tr>
-        <w:tblPrEx>
-          <w:tblCellMar>
-            <w:top w:w="0" w:type="dxa"/>
-            <w:bottom w:w="0" w:type="dxa"/>
-          </w:tblCellMar>
-        </w:tblPrEx>
         <w:trPr>
           <w:cantSplit/>
         </w:trPr>
@@ -13568,12 +12869,6 @@
         </w:tc>
       </w:tr>
       <w:tr>
-        <w:tblPrEx>
-          <w:tblCellMar>
-            <w:top w:w="0" w:type="dxa"/>
-            <w:bottom w:w="0" w:type="dxa"/>
-          </w:tblCellMar>
-        </w:tblPrEx>
         <w:trPr>
           <w:cantSplit/>
         </w:trPr>
@@ -13669,12 +12964,6 @@
         </w:tc>
       </w:tr>
       <w:tr>
-        <w:tblPrEx>
-          <w:tblCellMar>
-            <w:top w:w="0" w:type="dxa"/>
-            <w:bottom w:w="0" w:type="dxa"/>
-          </w:tblCellMar>
-        </w:tblPrEx>
         <w:trPr>
           <w:cantSplit/>
         </w:trPr>
@@ -13773,12 +13062,6 @@
         </w:tc>
       </w:tr>
       <w:tr>
-        <w:tblPrEx>
-          <w:tblCellMar>
-            <w:top w:w="0" w:type="dxa"/>
-            <w:bottom w:w="0" w:type="dxa"/>
-          </w:tblCellMar>
-        </w:tblPrEx>
         <w:trPr>
           <w:cantSplit/>
         </w:trPr>
@@ -13874,12 +13157,6 @@
         </w:tc>
       </w:tr>
       <w:tr>
-        <w:tblPrEx>
-          <w:tblCellMar>
-            <w:top w:w="0" w:type="dxa"/>
-            <w:bottom w:w="0" w:type="dxa"/>
-          </w:tblCellMar>
-        </w:tblPrEx>
         <w:trPr>
           <w:cantSplit/>
         </w:trPr>
@@ -13978,12 +13255,6 @@
         </w:tc>
       </w:tr>
       <w:tr>
-        <w:tblPrEx>
-          <w:tblCellMar>
-            <w:top w:w="0" w:type="dxa"/>
-            <w:bottom w:w="0" w:type="dxa"/>
-          </w:tblCellMar>
-        </w:tblPrEx>
         <w:trPr>
           <w:cantSplit/>
         </w:trPr>
@@ -14092,7 +13363,7 @@
           <w:noProof/>
         </w:rPr>
         <w:drawing>
-          <wp:inline distT="0" distB="0" distL="0" distR="0" wp14:anchorId="7E50074D" wp14:editId="5F352369">
+          <wp:inline distT="0" distB="0" distL="0" distR="0" wp14:anchorId="5CD9EF3A" wp14:editId="2FBB6A20">
             <wp:extent cx="4095750" cy="2019300"/>
             <wp:effectExtent l="0" t="0" r="0" b="0"/>
             <wp:docPr id="5" name="fig_cost.png" descr="Figure 5. Where the money goes: about $2.50 per 1,000 reviews, by stage." title="Figure 5. Where the money goes: about $2.50 per 1,000 reviews, by stage."/>
@@ -14151,7 +13422,7 @@
       <w:pPr>
         <w:pStyle w:val="Heading1"/>
       </w:pPr>
-      <w:bookmarkStart w:id="26" w:name="_Toc241336262"/>
+      <w:bookmarkStart w:id="26" w:name="_Toc241868390"/>
       <w:r>
         <w:t>7. Methods tried, challenges and how we overcame them</w:t>
       </w:r>
@@ -14180,12 +13451,6 @@
         <w:gridCol w:w="3838"/>
       </w:tblGrid>
       <w:tr>
-        <w:tblPrEx>
-          <w:tblCellMar>
-            <w:top w:w="0" w:type="dxa"/>
-            <w:bottom w:w="0" w:type="dxa"/>
-          </w:tblCellMar>
-        </w:tblPrEx>
         <w:trPr>
           <w:cantSplit/>
           <w:tblHeader/>
@@ -14291,12 +13556,6 @@
         </w:tc>
       </w:tr>
       <w:tr>
-        <w:tblPrEx>
-          <w:tblCellMar>
-            <w:top w:w="0" w:type="dxa"/>
-            <w:bottom w:w="0" w:type="dxa"/>
-          </w:tblCellMar>
-        </w:tblPrEx>
         <w:trPr>
           <w:cantSplit/>
         </w:trPr>
@@ -14419,12 +13678,6 @@
         </w:tc>
       </w:tr>
       <w:tr>
-        <w:tblPrEx>
-          <w:tblCellMar>
-            <w:top w:w="0" w:type="dxa"/>
-            <w:bottom w:w="0" w:type="dxa"/>
-          </w:tblCellMar>
-        </w:tblPrEx>
         <w:trPr>
           <w:cantSplit/>
         </w:trPr>
@@ -14520,12 +13773,6 @@
         </w:tc>
       </w:tr>
       <w:tr>
-        <w:tblPrEx>
-          <w:tblCellMar>
-            <w:top w:w="0" w:type="dxa"/>
-            <w:bottom w:w="0" w:type="dxa"/>
-          </w:tblCellMar>
-        </w:tblPrEx>
         <w:trPr>
           <w:cantSplit/>
         </w:trPr>
@@ -14618,12 +13865,6 @@
         </w:tc>
       </w:tr>
       <w:tr>
-        <w:tblPrEx>
-          <w:tblCellMar>
-            <w:top w:w="0" w:type="dxa"/>
-            <w:bottom w:w="0" w:type="dxa"/>
-          </w:tblCellMar>
-        </w:tblPrEx>
         <w:trPr>
           <w:cantSplit/>
         </w:trPr>
@@ -14719,12 +13960,6 @@
         </w:tc>
       </w:tr>
       <w:tr>
-        <w:tblPrEx>
-          <w:tblCellMar>
-            <w:top w:w="0" w:type="dxa"/>
-            <w:bottom w:w="0" w:type="dxa"/>
-          </w:tblCellMar>
-        </w:tblPrEx>
         <w:trPr>
           <w:cantSplit/>
         </w:trPr>
@@ -14817,12 +14052,6 @@
         </w:tc>
       </w:tr>
       <w:tr>
-        <w:tblPrEx>
-          <w:tblCellMar>
-            <w:top w:w="0" w:type="dxa"/>
-            <w:bottom w:w="0" w:type="dxa"/>
-          </w:tblCellMar>
-        </w:tblPrEx>
         <w:trPr>
           <w:cantSplit/>
         </w:trPr>
@@ -14919,12 +14148,6 @@
         </w:tc>
       </w:tr>
       <w:tr>
-        <w:tblPrEx>
-          <w:tblCellMar>
-            <w:top w:w="0" w:type="dxa"/>
-            <w:bottom w:w="0" w:type="dxa"/>
-          </w:tblCellMar>
-        </w:tblPrEx>
         <w:trPr>
           <w:cantSplit/>
         </w:trPr>
@@ -15017,12 +14240,6 @@
         </w:tc>
       </w:tr>
       <w:tr>
-        <w:tblPrEx>
-          <w:tblCellMar>
-            <w:top w:w="0" w:type="dxa"/>
-            <w:bottom w:w="0" w:type="dxa"/>
-          </w:tblCellMar>
-        </w:tblPrEx>
         <w:trPr>
           <w:cantSplit/>
         </w:trPr>
@@ -15118,12 +14335,6 @@
         </w:tc>
       </w:tr>
       <w:tr>
-        <w:tblPrEx>
-          <w:tblCellMar>
-            <w:top w:w="0" w:type="dxa"/>
-            <w:bottom w:w="0" w:type="dxa"/>
-          </w:tblCellMar>
-        </w:tblPrEx>
         <w:trPr>
           <w:cantSplit/>
         </w:trPr>
@@ -15231,12 +14442,6 @@
         </w:tc>
       </w:tr>
       <w:tr>
-        <w:tblPrEx>
-          <w:tblCellMar>
-            <w:top w:w="0" w:type="dxa"/>
-            <w:bottom w:w="0" w:type="dxa"/>
-          </w:tblCellMar>
-        </w:tblPrEx>
         <w:trPr>
           <w:cantSplit/>
         </w:trPr>
@@ -15296,7 +14501,7 @@
                 <w:sz w:val="17"/>
                 <w:szCs w:val="17"/>
               </w:rPr>
-              <w:t>n8n Cloud cannot run the embedding model or read local files; the trial ends about 9 October, before the final presentation.</w:t>
+              <w:t>n8n Cloud cannot run the embedding model or read local files; the free trial is time-limited (our current account runs to about 16 October, after the final presentation).</w:t>
             </w:r>
           </w:p>
         </w:tc>
@@ -15326,25 +14531,12 @@
                 <w:sz w:val="17"/>
                 <w:szCs w:val="17"/>
               </w:rPr>
-              <w:t>Claude classifies into the 13 named categories inside n8n; workflows are kept as JSON in the repository so they import into any n8n</w:t>
-            </w:r>
-            <w:r>
-              <w:rPr>
-                <w:sz w:val="17"/>
-                <w:szCs w:val="17"/>
-              </w:rPr>
-              <w:t>.</w:t>
+              <w:t>Claude classifies into the 13 named categories inside n8n; workflows are kept as JSON in the repository so they import into any n8n.</w:t>
             </w:r>
           </w:p>
         </w:tc>
       </w:tr>
       <w:tr>
-        <w:tblPrEx>
-          <w:tblCellMar>
-            <w:top w:w="0" w:type="dxa"/>
-            <w:bottom w:w="0" w:type="dxa"/>
-          </w:tblCellMar>
-        </w:tblPrEx>
         <w:trPr>
           <w:cantSplit/>
         </w:trPr>
@@ -15441,7 +14633,7 @@
       <w:pPr>
         <w:pStyle w:val="Heading1"/>
       </w:pPr>
-      <w:bookmarkStart w:id="27" w:name="_Toc241336263"/>
+      <w:bookmarkStart w:id="27" w:name="_Toc241868391"/>
       <w:r>
         <w:t>8. Test cases, results and experiment log</w:t>
       </w:r>
@@ -15451,7 +14643,7 @@
       <w:pPr>
         <w:pStyle w:val="Heading2"/>
       </w:pPr>
-      <w:bookmarkStart w:id="28" w:name="_Toc241336264"/>
+      <w:bookmarkStart w:id="28" w:name="_Toc241868392"/>
       <w:r>
         <w:t>8.1 Automated tests</w:t>
       </w:r>
@@ -15488,7 +14680,7 @@
       <w:pPr>
         <w:pStyle w:val="Heading2"/>
       </w:pPr>
-      <w:bookmarkStart w:id="29" w:name="_Toc241336265"/>
+      <w:bookmarkStart w:id="29" w:name="_Toc241868393"/>
       <w:r>
         <w:t>8.2 Functional test cases</w:t>
       </w:r>
@@ -15518,12 +14710,6 @@
         <w:gridCol w:w="2400"/>
       </w:tblGrid>
       <w:tr>
-        <w:tblPrEx>
-          <w:tblCellMar>
-            <w:top w:w="0" w:type="dxa"/>
-            <w:bottom w:w="0" w:type="dxa"/>
-          </w:tblCellMar>
-        </w:tblPrEx>
         <w:trPr>
           <w:cantSplit/>
           <w:tblHeader/>
@@ -15662,12 +14848,6 @@
         </w:tc>
       </w:tr>
       <w:tr>
-        <w:tblPrEx>
-          <w:tblCellMar>
-            <w:top w:w="0" w:type="dxa"/>
-            <w:bottom w:w="0" w:type="dxa"/>
-          </w:tblCellMar>
-        </w:tblPrEx>
         <w:trPr>
           <w:cantSplit/>
         </w:trPr>
@@ -15789,12 +14969,6 @@
         </w:tc>
       </w:tr>
       <w:tr>
-        <w:tblPrEx>
-          <w:tblCellMar>
-            <w:top w:w="0" w:type="dxa"/>
-            <w:bottom w:w="0" w:type="dxa"/>
-          </w:tblCellMar>
-        </w:tblPrEx>
         <w:trPr>
           <w:cantSplit/>
         </w:trPr>
@@ -15920,12 +15094,6 @@
         </w:tc>
       </w:tr>
       <w:tr>
-        <w:tblPrEx>
-          <w:tblCellMar>
-            <w:top w:w="0" w:type="dxa"/>
-            <w:bottom w:w="0" w:type="dxa"/>
-          </w:tblCellMar>
-        </w:tblPrEx>
         <w:trPr>
           <w:cantSplit/>
         </w:trPr>
@@ -16047,12 +15215,6 @@
         </w:tc>
       </w:tr>
       <w:tr>
-        <w:tblPrEx>
-          <w:tblCellMar>
-            <w:top w:w="0" w:type="dxa"/>
-            <w:bottom w:w="0" w:type="dxa"/>
-          </w:tblCellMar>
-        </w:tblPrEx>
         <w:trPr>
           <w:cantSplit/>
         </w:trPr>
@@ -16178,12 +15340,6 @@
         </w:tc>
       </w:tr>
       <w:tr>
-        <w:tblPrEx>
-          <w:tblCellMar>
-            <w:top w:w="0" w:type="dxa"/>
-            <w:bottom w:w="0" w:type="dxa"/>
-          </w:tblCellMar>
-        </w:tblPrEx>
         <w:trPr>
           <w:cantSplit/>
         </w:trPr>
@@ -16305,12 +15461,6 @@
         </w:tc>
       </w:tr>
       <w:tr>
-        <w:tblPrEx>
-          <w:tblCellMar>
-            <w:top w:w="0" w:type="dxa"/>
-            <w:bottom w:w="0" w:type="dxa"/>
-          </w:tblCellMar>
-        </w:tblPrEx>
         <w:trPr>
           <w:cantSplit/>
         </w:trPr>
@@ -16444,12 +15594,6 @@
         </w:tc>
       </w:tr>
       <w:tr>
-        <w:tblPrEx>
-          <w:tblCellMar>
-            <w:top w:w="0" w:type="dxa"/>
-            <w:bottom w:w="0" w:type="dxa"/>
-          </w:tblCellMar>
-        </w:tblPrEx>
         <w:trPr>
           <w:cantSplit/>
         </w:trPr>
@@ -16594,12 +15738,6 @@
         </w:tc>
       </w:tr>
       <w:tr>
-        <w:tblPrEx>
-          <w:tblCellMar>
-            <w:top w:w="0" w:type="dxa"/>
-            <w:bottom w:w="0" w:type="dxa"/>
-          </w:tblCellMar>
-        </w:tblPrEx>
         <w:trPr>
           <w:cantSplit/>
         </w:trPr>
@@ -16733,12 +15871,6 @@
         </w:tc>
       </w:tr>
       <w:tr>
-        <w:tblPrEx>
-          <w:tblCellMar>
-            <w:top w:w="0" w:type="dxa"/>
-            <w:bottom w:w="0" w:type="dxa"/>
-          </w:tblCellMar>
-        </w:tblPrEx>
         <w:trPr>
           <w:cantSplit/>
         </w:trPr>
@@ -16860,12 +15992,6 @@
         </w:tc>
       </w:tr>
       <w:tr>
-        <w:tblPrEx>
-          <w:tblCellMar>
-            <w:top w:w="0" w:type="dxa"/>
-            <w:bottom w:w="0" w:type="dxa"/>
-          </w:tblCellMar>
-        </w:tblPrEx>
         <w:trPr>
           <w:cantSplit/>
         </w:trPr>
@@ -17000,7 +16126,7 @@
       <w:pPr>
         <w:pStyle w:val="Heading2"/>
       </w:pPr>
-      <w:bookmarkStart w:id="30" w:name="_Toc241336266"/>
+      <w:bookmarkStart w:id="30" w:name="_Toc241868394"/>
       <w:r>
         <w:lastRenderedPageBreak/>
         <w:t>8.3 Experiment log summary</w:t>
@@ -17050,12 +16176,6 @@
         <w:gridCol w:w="5638"/>
       </w:tblGrid>
       <w:tr>
-        <w:tblPrEx>
-          <w:tblCellMar>
-            <w:top w:w="0" w:type="dxa"/>
-            <w:bottom w:w="0" w:type="dxa"/>
-          </w:tblCellMar>
-        </w:tblPrEx>
         <w:trPr>
           <w:cantSplit/>
           <w:tblHeader/>
@@ -17161,12 +16281,6 @@
         </w:tc>
       </w:tr>
       <w:tr>
-        <w:tblPrEx>
-          <w:tblCellMar>
-            <w:top w:w="0" w:type="dxa"/>
-            <w:bottom w:w="0" w:type="dxa"/>
-          </w:tblCellMar>
-        </w:tblPrEx>
         <w:trPr>
           <w:cantSplit/>
         </w:trPr>
@@ -17259,12 +16373,6 @@
         </w:tc>
       </w:tr>
       <w:tr>
-        <w:tblPrEx>
-          <w:tblCellMar>
-            <w:top w:w="0" w:type="dxa"/>
-            <w:bottom w:w="0" w:type="dxa"/>
-          </w:tblCellMar>
-        </w:tblPrEx>
         <w:trPr>
           <w:cantSplit/>
         </w:trPr>
@@ -17360,12 +16468,6 @@
         </w:tc>
       </w:tr>
       <w:tr>
-        <w:tblPrEx>
-          <w:tblCellMar>
-            <w:top w:w="0" w:type="dxa"/>
-            <w:bottom w:w="0" w:type="dxa"/>
-          </w:tblCellMar>
-        </w:tblPrEx>
         <w:trPr>
           <w:cantSplit/>
         </w:trPr>
@@ -17458,12 +16560,6 @@
         </w:tc>
       </w:tr>
       <w:tr>
-        <w:tblPrEx>
-          <w:tblCellMar>
-            <w:top w:w="0" w:type="dxa"/>
-            <w:bottom w:w="0" w:type="dxa"/>
-          </w:tblCellMar>
-        </w:tblPrEx>
         <w:trPr>
           <w:cantSplit/>
         </w:trPr>
@@ -17559,12 +16655,6 @@
         </w:tc>
       </w:tr>
       <w:tr>
-        <w:tblPrEx>
-          <w:tblCellMar>
-            <w:top w:w="0" w:type="dxa"/>
-            <w:bottom w:w="0" w:type="dxa"/>
-          </w:tblCellMar>
-        </w:tblPrEx>
         <w:trPr>
           <w:cantSplit/>
         </w:trPr>
@@ -17657,12 +16747,6 @@
         </w:tc>
       </w:tr>
       <w:tr>
-        <w:tblPrEx>
-          <w:tblCellMar>
-            <w:top w:w="0" w:type="dxa"/>
-            <w:bottom w:w="0" w:type="dxa"/>
-          </w:tblCellMar>
-        </w:tblPrEx>
         <w:trPr>
           <w:cantSplit/>
         </w:trPr>
@@ -17758,12 +16842,6 @@
         </w:tc>
       </w:tr>
       <w:tr>
-        <w:tblPrEx>
-          <w:tblCellMar>
-            <w:top w:w="0" w:type="dxa"/>
-            <w:bottom w:w="0" w:type="dxa"/>
-          </w:tblCellMar>
-        </w:tblPrEx>
         <w:trPr>
           <w:cantSplit/>
         </w:trPr>
@@ -17856,12 +16934,6 @@
         </w:tc>
       </w:tr>
       <w:tr>
-        <w:tblPrEx>
-          <w:tblCellMar>
-            <w:top w:w="0" w:type="dxa"/>
-            <w:bottom w:w="0" w:type="dxa"/>
-          </w:tblCellMar>
-        </w:tblPrEx>
         <w:trPr>
           <w:cantSplit/>
         </w:trPr>
@@ -17957,12 +17029,6 @@
         </w:tc>
       </w:tr>
       <w:tr>
-        <w:tblPrEx>
-          <w:tblCellMar>
-            <w:top w:w="0" w:type="dxa"/>
-            <w:bottom w:w="0" w:type="dxa"/>
-          </w:tblCellMar>
-        </w:tblPrEx>
         <w:trPr>
           <w:cantSplit/>
         </w:trPr>
@@ -18055,12 +17121,6 @@
         </w:tc>
       </w:tr>
       <w:tr>
-        <w:tblPrEx>
-          <w:tblCellMar>
-            <w:top w:w="0" w:type="dxa"/>
-            <w:bottom w:w="0" w:type="dxa"/>
-          </w:tblCellMar>
-        </w:tblPrEx>
         <w:trPr>
           <w:cantSplit/>
         </w:trPr>
@@ -18156,12 +17216,6 @@
         </w:tc>
       </w:tr>
       <w:tr>
-        <w:tblPrEx>
-          <w:tblCellMar>
-            <w:top w:w="0" w:type="dxa"/>
-            <w:bottom w:w="0" w:type="dxa"/>
-          </w:tblCellMar>
-        </w:tblPrEx>
         <w:trPr>
           <w:cantSplit/>
         </w:trPr>
@@ -18254,12 +17308,6 @@
         </w:tc>
       </w:tr>
       <w:tr>
-        <w:tblPrEx>
-          <w:tblCellMar>
-            <w:top w:w="0" w:type="dxa"/>
-            <w:bottom w:w="0" w:type="dxa"/>
-          </w:tblCellMar>
-        </w:tblPrEx>
         <w:trPr>
           <w:cantSplit/>
         </w:trPr>
@@ -18364,7 +17412,7 @@
       <w:pPr>
         <w:pStyle w:val="Heading2"/>
       </w:pPr>
-      <w:bookmarkStart w:id="31" w:name="_Toc241336267"/>
+      <w:bookmarkStart w:id="31" w:name="_Toc241868395"/>
       <w:r>
         <w:t>8.4 Claude spend</w:t>
       </w:r>
@@ -18392,12 +17440,6 @@
         <w:gridCol w:w="3438"/>
       </w:tblGrid>
       <w:tr>
-        <w:tblPrEx>
-          <w:tblCellMar>
-            <w:top w:w="0" w:type="dxa"/>
-            <w:bottom w:w="0" w:type="dxa"/>
-          </w:tblCellMar>
-        </w:tblPrEx>
         <w:trPr>
           <w:cantSplit/>
           <w:tblHeader/>
@@ -18472,12 +17514,6 @@
         </w:tc>
       </w:tr>
       <w:tr>
-        <w:tblPrEx>
-          <w:tblCellMar>
-            <w:top w:w="0" w:type="dxa"/>
-            <w:bottom w:w="0" w:type="dxa"/>
-          </w:tblCellMar>
-        </w:tblPrEx>
         <w:trPr>
           <w:cantSplit/>
         </w:trPr>
@@ -18543,12 +17579,6 @@
         </w:tc>
       </w:tr>
       <w:tr>
-        <w:tblPrEx>
-          <w:tblCellMar>
-            <w:top w:w="0" w:type="dxa"/>
-            <w:bottom w:w="0" w:type="dxa"/>
-          </w:tblCellMar>
-        </w:tblPrEx>
         <w:trPr>
           <w:cantSplit/>
         </w:trPr>
@@ -18616,12 +17646,6 @@
         </w:tc>
       </w:tr>
       <w:tr>
-        <w:tblPrEx>
-          <w:tblCellMar>
-            <w:top w:w="0" w:type="dxa"/>
-            <w:bottom w:w="0" w:type="dxa"/>
-          </w:tblCellMar>
-        </w:tblPrEx>
         <w:trPr>
           <w:cantSplit/>
         </w:trPr>
@@ -18687,12 +17711,6 @@
         </w:tc>
       </w:tr>
       <w:tr>
-        <w:tblPrEx>
-          <w:tblCellMar>
-            <w:top w:w="0" w:type="dxa"/>
-            <w:bottom w:w="0" w:type="dxa"/>
-          </w:tblCellMar>
-        </w:tblPrEx>
         <w:trPr>
           <w:cantSplit/>
         </w:trPr>
@@ -18760,12 +17778,6 @@
         </w:tc>
       </w:tr>
       <w:tr>
-        <w:tblPrEx>
-          <w:tblCellMar>
-            <w:top w:w="0" w:type="dxa"/>
-            <w:bottom w:w="0" w:type="dxa"/>
-          </w:tblCellMar>
-        </w:tblPrEx>
         <w:trPr>
           <w:cantSplit/>
         </w:trPr>
@@ -18831,12 +17843,6 @@
         </w:tc>
       </w:tr>
       <w:tr>
-        <w:tblPrEx>
-          <w:tblCellMar>
-            <w:top w:w="0" w:type="dxa"/>
-            <w:bottom w:w="0" w:type="dxa"/>
-          </w:tblCellMar>
-        </w:tblPrEx>
         <w:trPr>
           <w:cantSplit/>
         </w:trPr>
@@ -18923,7 +17929,7 @@
       <w:pPr>
         <w:pStyle w:val="Heading1"/>
       </w:pPr>
-      <w:bookmarkStart w:id="32" w:name="_Toc241336268"/>
+      <w:bookmarkStart w:id="32" w:name="_Toc241868396"/>
       <w:r>
         <w:lastRenderedPageBreak/>
         <w:t>9. Demo plan</w:t>
@@ -18936,10 +17942,7 @@
         <w:spacing w:after="120" w:line="276" w:lineRule="auto"/>
       </w:pPr>
       <w:r>
-        <w:t xml:space="preserve">The demo goes back to the </w:t>
-      </w:r>
-      <w:r>
-        <w:t>four situations in Section 2. Tasks get harder, so the audience sees the easy case work and then the cases that used to be a problem.</w:t>
+        <w:t>The demo goes back to the four situations in Section 2. Tasks get harder, so the audience sees the easy case work and then the cases that used to be a problem.</w:t>
       </w:r>
     </w:p>
     <w:tbl>
@@ -18966,12 +17969,6 @@
         <w:gridCol w:w="2038"/>
       </w:tblGrid>
       <w:tr>
-        <w:tblPrEx>
-          <w:tblCellMar>
-            <w:top w:w="0" w:type="dxa"/>
-            <w:bottom w:w="0" w:type="dxa"/>
-          </w:tblCellMar>
-        </w:tblPrEx>
         <w:trPr>
           <w:cantSplit/>
           <w:tblHeader/>
@@ -19114,12 +18111,6 @@
         </w:tc>
       </w:tr>
       <w:tr>
-        <w:tblPrEx>
-          <w:tblCellMar>
-            <w:top w:w="0" w:type="dxa"/>
-            <w:bottom w:w="0" w:type="dxa"/>
-          </w:tblCellMar>
-        </w:tblPrEx>
         <w:trPr>
           <w:cantSplit/>
         </w:trPr>
@@ -19245,12 +18236,6 @@
         </w:tc>
       </w:tr>
       <w:tr>
-        <w:tblPrEx>
-          <w:tblCellMar>
-            <w:top w:w="0" w:type="dxa"/>
-            <w:bottom w:w="0" w:type="dxa"/>
-          </w:tblCellMar>
-        </w:tblPrEx>
         <w:trPr>
           <w:cantSplit/>
         </w:trPr>
@@ -19380,12 +18365,6 @@
         </w:tc>
       </w:tr>
       <w:tr>
-        <w:tblPrEx>
-          <w:tblCellMar>
-            <w:top w:w="0" w:type="dxa"/>
-            <w:bottom w:w="0" w:type="dxa"/>
-          </w:tblCellMar>
-        </w:tblPrEx>
         <w:trPr>
           <w:cantSplit/>
         </w:trPr>
@@ -19511,12 +18490,6 @@
         </w:tc>
       </w:tr>
       <w:tr>
-        <w:tblPrEx>
-          <w:tblCellMar>
-            <w:top w:w="0" w:type="dxa"/>
-            <w:bottom w:w="0" w:type="dxa"/>
-          </w:tblCellMar>
-        </w:tblPrEx>
         <w:trPr>
           <w:cantSplit/>
         </w:trPr>
@@ -19640,25 +18613,12 @@
                 <w:sz w:val="17"/>
                 <w:szCs w:val="17"/>
               </w:rPr>
-              <w:t>Stars hide th</w:t>
-            </w:r>
-            <w:r>
-              <w:rPr>
-                <w:sz w:val="17"/>
-                <w:szCs w:val="17"/>
-              </w:rPr>
-              <w:t>e reason</w:t>
+              <w:t>Stars hide the reason</w:t>
             </w:r>
           </w:p>
         </w:tc>
       </w:tr>
       <w:tr>
-        <w:tblPrEx>
-          <w:tblCellMar>
-            <w:top w:w="0" w:type="dxa"/>
-            <w:bottom w:w="0" w:type="dxa"/>
-          </w:tblCellMar>
-        </w:tblPrEx>
         <w:trPr>
           <w:cantSplit/>
         </w:trPr>
@@ -19790,10 +18750,7 @@
         <w:spacing w:after="120" w:line="276" w:lineRule="auto"/>
       </w:pPr>
       <w:r>
-        <w:t>Backup plan: keep recorded outputs and the exported n8n workflow JSON files in case the network or the n8n trial fails on the day. The n8n Cloud trial ends about 9 October, before the presentation, so the workflows must be imported into another n8n (or run</w:t>
-      </w:r>
-      <w:r>
-        <w:t xml:space="preserve"> locally with </w:t>
+        <w:t xml:space="preserve">Backup plan: keep recorded outputs and the exported n8n workflow JSON files in case the network or the n8n trial fails on the day. Our current n8n Cloud trial runs to about 16 October, after the presentation, and the workflows are also kept as JSON so they can be imported into another n8n (or run locally with </w:t>
       </w:r>
       <w:r>
         <w:rPr>
@@ -19812,7 +18769,7 @@
         <w:pStyle w:val="Heading1"/>
         <w:pageBreakBefore/>
       </w:pPr>
-      <w:bookmarkStart w:id="33" w:name="_Toc241336269"/>
+      <w:bookmarkStart w:id="33" w:name="_Toc241868397"/>
       <w:r>
         <w:lastRenderedPageBreak/>
         <w:t>10. How to run the application</w:t>
@@ -19823,7 +18780,7 @@
       <w:pPr>
         <w:pStyle w:val="Heading2"/>
       </w:pPr>
-      <w:bookmarkStart w:id="34" w:name="_Toc241336270"/>
+      <w:bookmarkStart w:id="34" w:name="_Toc241868398"/>
       <w:r>
         <w:t>10.1 Setup (Windows)</w:t>
       </w:r>
@@ -19995,17 +18952,14 @@
         <w:t>data/samples/</w:t>
       </w:r>
       <w:r>
-        <w:t xml:space="preserve"> are already in the rep</w:t>
-      </w:r>
-      <w:r>
-        <w:t>ository.</w:t>
+        <w:t xml:space="preserve"> are already in the repository.</w:t>
       </w:r>
     </w:p>
     <w:p>
       <w:pPr>
         <w:pStyle w:val="Heading2"/>
       </w:pPr>
-      <w:bookmarkStart w:id="35" w:name="_Toc241336271"/>
+      <w:bookmarkStart w:id="35" w:name="_Toc241868399"/>
       <w:r>
         <w:t>10.2 n8n workflows</w:t>
       </w:r>
@@ -20076,10 +19030,7 @@
         <w:t>x-api-key</w:t>
       </w:r>
       <w:r>
-        <w:t>, Value = your Anthropic API</w:t>
-      </w:r>
-      <w:r>
-        <w:t xml:space="preserve"> key. Open each Claude HTTP node and select that credential.</w:t>
+        <w:t>, Value = your Anthropic API key. Open each Claude HTTP node and select that credential.</w:t>
       </w:r>
     </w:p>
     <w:p>
@@ -20125,10 +19076,7 @@
         <w:t>Execute workflow</w:t>
       </w:r>
       <w:r>
-        <w:t>. Read the su</w:t>
-      </w:r>
-      <w:r>
-        <w:t>mmary node (Pipeline summary or Alert result) rather than trusting the green ticks.</w:t>
+        <w:t>. Read the summary node (Pipeline summary or Alert result) rather than trusting the green ticks.</w:t>
       </w:r>
     </w:p>
     <w:tbl>
@@ -20154,12 +19102,6 @@
         <w:gridCol w:w="2438"/>
       </w:tblGrid>
       <w:tr>
-        <w:tblPrEx>
-          <w:tblCellMar>
-            <w:top w:w="0" w:type="dxa"/>
-            <w:bottom w:w="0" w:type="dxa"/>
-          </w:tblCellMar>
-        </w:tblPrEx>
         <w:trPr>
           <w:cantSplit/>
           <w:tblHeader/>
@@ -20268,12 +19210,6 @@
         </w:tc>
       </w:tr>
       <w:tr>
-        <w:tblPrEx>
-          <w:tblCellMar>
-            <w:top w:w="0" w:type="dxa"/>
-            <w:bottom w:w="0" w:type="dxa"/>
-          </w:tblCellMar>
-        </w:tblPrEx>
         <w:trPr>
           <w:cantSplit/>
         </w:trPr>
@@ -20369,12 +19305,6 @@
         </w:tc>
       </w:tr>
       <w:tr>
-        <w:tblPrEx>
-          <w:tblCellMar>
-            <w:top w:w="0" w:type="dxa"/>
-            <w:bottom w:w="0" w:type="dxa"/>
-          </w:tblCellMar>
-        </w:tblPrEx>
         <w:trPr>
           <w:cantSplit/>
         </w:trPr>
@@ -20473,12 +19403,6 @@
         </w:tc>
       </w:tr>
       <w:tr>
-        <w:tblPrEx>
-          <w:tblCellMar>
-            <w:top w:w="0" w:type="dxa"/>
-            <w:bottom w:w="0" w:type="dxa"/>
-          </w:tblCellMar>
-        </w:tblPrEx>
         <w:trPr>
           <w:cantSplit/>
         </w:trPr>
@@ -20604,12 +19528,6 @@
         </w:tc>
       </w:tr>
       <w:tr>
-        <w:tblPrEx>
-          <w:tblCellMar>
-            <w:top w:w="0" w:type="dxa"/>
-            <w:bottom w:w="0" w:type="dxa"/>
-          </w:tblCellMar>
-        </w:tblPrEx>
         <w:trPr>
           <w:cantSplit/>
         </w:trPr>
@@ -20714,7 +19632,7 @@
       <w:pPr>
         <w:pStyle w:val="Heading2"/>
       </w:pPr>
-      <w:bookmarkStart w:id="36" w:name="_Toc241336272"/>
+      <w:bookmarkStart w:id="36" w:name="_Toc241868400"/>
       <w:r>
         <w:t>10.3 Analysis scripts</w:t>
       </w:r>
@@ -20781,15 +19699,7 @@
           <w:sz w:val="18"/>
           <w:szCs w:val="18"/>
         </w:rPr>
-        <w:t>python scripts/run_stage4.py labe</w:t>
-      </w:r>
-      <w:r>
-        <w:rPr>
-          <w:rFonts w:ascii="Consolas" w:eastAsia="Consolas" w:hAnsi="Consolas" w:cs="Consolas"/>
-          <w:sz w:val="18"/>
-          <w:szCs w:val="18"/>
-        </w:rPr>
-        <w:t>l issue        # cluster labels</w:t>
+        <w:t>python scripts/run_stage4.py label issue        # cluster labels</w:t>
       </w:r>
     </w:p>
     <w:p>
@@ -20832,7 +19742,7 @@
       <w:pPr>
         <w:pStyle w:val="Heading2"/>
       </w:pPr>
-      <w:bookmarkStart w:id="37" w:name="_Toc241336273"/>
+      <w:bookmarkStart w:id="37" w:name="_Toc241868401"/>
       <w:r>
         <w:t>10.4 API service and tests</w:t>
       </w:r>
@@ -20914,15 +19824,7 @@
           <w:sz w:val="18"/>
           <w:szCs w:val="18"/>
         </w:rPr>
-        <w:t xml:space="preserve">pytest tests -q                  </w:t>
-      </w:r>
-      <w:r>
-        <w:rPr>
-          <w:rFonts w:ascii="Consolas" w:eastAsia="Consolas" w:hAnsi="Consolas" w:cs="Consolas"/>
-          <w:sz w:val="18"/>
-          <w:szCs w:val="18"/>
-        </w:rPr>
-        <w:t xml:space="preserve">   # 11 tests, no Claude calls</w:t>
+        <w:t>pytest tests -q                     # 11 tests, no Claude calls</w:t>
       </w:r>
     </w:p>
     <w:p>
@@ -20934,7 +19836,7 @@
       <w:pPr>
         <w:pStyle w:val="Heading2"/>
       </w:pPr>
-      <w:bookmarkStart w:id="38" w:name="_Toc241336274"/>
+      <w:bookmarkStart w:id="38" w:name="_Toc241868402"/>
       <w:r>
         <w:lastRenderedPageBreak/>
         <w:t>10.5 Repository map</w:t>
@@ -20963,12 +19865,6 @@
         <w:gridCol w:w="5938"/>
       </w:tblGrid>
       <w:tr>
-        <w:tblPrEx>
-          <w:tblCellMar>
-            <w:top w:w="0" w:type="dxa"/>
-            <w:bottom w:w="0" w:type="dxa"/>
-          </w:tblCellMar>
-        </w:tblPrEx>
         <w:trPr>
           <w:cantSplit/>
           <w:tblHeader/>
@@ -21043,12 +19939,6 @@
         </w:tc>
       </w:tr>
       <w:tr>
-        <w:tblPrEx>
-          <w:tblCellMar>
-            <w:top w:w="0" w:type="dxa"/>
-            <w:bottom w:w="0" w:type="dxa"/>
-          </w:tblCellMar>
-        </w:tblPrEx>
         <w:trPr>
           <w:cantSplit/>
         </w:trPr>
@@ -21160,12 +20050,6 @@
         </w:tc>
       </w:tr>
       <w:tr>
-        <w:tblPrEx>
-          <w:tblCellMar>
-            <w:top w:w="0" w:type="dxa"/>
-            <w:bottom w:w="0" w:type="dxa"/>
-          </w:tblCellMar>
-        </w:tblPrEx>
         <w:trPr>
           <w:cantSplit/>
         </w:trPr>
@@ -21234,12 +20118,6 @@
         </w:tc>
       </w:tr>
       <w:tr>
-        <w:tblPrEx>
-          <w:tblCellMar>
-            <w:top w:w="0" w:type="dxa"/>
-            <w:bottom w:w="0" w:type="dxa"/>
-          </w:tblCellMar>
-        </w:tblPrEx>
         <w:trPr>
           <w:cantSplit/>
         </w:trPr>
@@ -21306,12 +20184,6 @@
         </w:tc>
       </w:tr>
       <w:tr>
-        <w:tblPrEx>
-          <w:tblCellMar>
-            <w:top w:w="0" w:type="dxa"/>
-            <w:bottom w:w="0" w:type="dxa"/>
-          </w:tblCellMar>
-        </w:tblPrEx>
         <w:trPr>
           <w:cantSplit/>
         </w:trPr>
@@ -21380,12 +20252,6 @@
         </w:tc>
       </w:tr>
       <w:tr>
-        <w:tblPrEx>
-          <w:tblCellMar>
-            <w:top w:w="0" w:type="dxa"/>
-            <w:bottom w:w="0" w:type="dxa"/>
-          </w:tblCellMar>
-        </w:tblPrEx>
         <w:trPr>
           <w:cantSplit/>
         </w:trPr>
@@ -21452,12 +20318,6 @@
         </w:tc>
       </w:tr>
       <w:tr>
-        <w:tblPrEx>
-          <w:tblCellMar>
-            <w:top w:w="0" w:type="dxa"/>
-            <w:bottom w:w="0" w:type="dxa"/>
-          </w:tblCellMar>
-        </w:tblPrEx>
         <w:trPr>
           <w:cantSplit/>
         </w:trPr>
@@ -21526,12 +20386,6 @@
         </w:tc>
       </w:tr>
       <w:tr>
-        <w:tblPrEx>
-          <w:tblCellMar>
-            <w:top w:w="0" w:type="dxa"/>
-            <w:bottom w:w="0" w:type="dxa"/>
-          </w:tblCellMar>
-        </w:tblPrEx>
         <w:trPr>
           <w:cantSplit/>
         </w:trPr>
@@ -21600,7 +20454,7 @@
       <w:pPr>
         <w:pStyle w:val="Heading1"/>
       </w:pPr>
-      <w:bookmarkStart w:id="39" w:name="_Toc241336275"/>
+      <w:bookmarkStart w:id="39" w:name="_Toc241868403"/>
       <w:r>
         <w:t>11. Limitations</w:t>
       </w:r>
@@ -21643,10 +20497,7 @@
         <w:t>Star-derived labels.</w:t>
       </w:r>
       <w:r>
-        <w:t xml:space="preserve"> Sentiment accuracy is measured against a nois</w:t>
-      </w:r>
-      <w:r>
-        <w:t>y proxy. Three-way accuracy is 78.1%, below the 85% target, and the neutral class is recognised only about a third of the time.</w:t>
+        <w:t xml:space="preserve"> Sentiment accuracy is measured against a noisy proxy. Three-way accuracy is 78.1%, below the 85% target, and the neutral class is recognised only about a third of the time.</w:t>
       </w:r>
     </w:p>
     <w:p>
@@ -21706,10 +20557,7 @@
         <w:t>Issue categories in n8n.</w:t>
       </w:r>
       <w:r>
-        <w:t xml:space="preserve"> A Claude classifier over 13 fixed categories replaces </w:t>
-      </w:r>
-      <w:r>
-        <w:t>the embedding step, and it agrees with k-means only 43% of the time. The categories come from one sample and would need refreshing on a real feed.</w:t>
+        <w:t xml:space="preserve"> A Claude classifier over 13 fixed categories replaces the embedding step, and it agrees with k-means only 43% of the time. The categories come from one sample and would need refreshing on a real feed.</w:t>
       </w:r>
     </w:p>
     <w:p>
@@ -21729,10 +20577,7 @@
         <w:t>Small evaluation sets.</w:t>
       </w:r>
       <w:r>
-        <w:t xml:space="preserve"> 48 replies and 960 test reviews are enough to show trends, but small differences (for </w:t>
-      </w:r>
-      <w:r>
-        <w:t>example between prompt v1 and v2 on the development split) are within noise.</w:t>
+        <w:t xml:space="preserve"> 48 replies and 960 test reviews are enough to show trends, but small differences (for example between prompt v1 and v2 on the development split) are within noise.</w:t>
       </w:r>
     </w:p>
     <w:p>
@@ -21772,10 +20617,7 @@
         <w:t>Trial and budget.</w:t>
       </w:r>
       <w:r>
-        <w:t xml:space="preserve"> The n8n Cloud trial ends before the final presentatio</w:t>
-      </w:r>
-      <w:r>
-        <w:t>n, and Claude credit limits how many full runs we can afford. We measured throughput on 120 reviews and extrapolated to 1,000.</w:t>
+        <w:t xml:space="preserve"> The n8n Cloud trial is time-limited (we moved to a new account on 2 October, valid to about 16 October), and Claude credit limits how many full runs we can afford. We measured throughput on 120 reviews and extrapolated to 1,000.</w:t>
       </w:r>
     </w:p>
     <w:p>
@@ -21802,7 +20644,7 @@
       <w:pPr>
         <w:pStyle w:val="Heading1"/>
       </w:pPr>
-      <w:bookmarkStart w:id="40" w:name="_Toc241336276"/>
+      <w:bookmarkStart w:id="40" w:name="_Toc241868404"/>
       <w:r>
         <w:t>12. Future scope and scaling</w:t>
       </w:r>
@@ -21822,14 +20664,7 @@
           <w:b/>
           <w:bCs/>
         </w:rPr>
-        <w:t>R</w:t>
-      </w:r>
-      <w:r>
-        <w:rPr>
-          <w:b/>
-          <w:bCs/>
-        </w:rPr>
-        <w:t>eal data feed.</w:t>
+        <w:t>Real data feed.</w:t>
       </w:r>
       <w:r>
         <w:t xml:space="preserve"> Connect live review sources (marketplace exports, app-store and social feeds) with real timestamps, then retune the spike threshold on genuine weeks.</w:t>
@@ -21852,10 +20687,7 @@
         <w:t>Human evaluation.</w:t>
       </w:r>
       <w:r>
-        <w:t xml:space="preserve"> Run the reply acceptance test with support staff (the review sheet and sc</w:t>
-      </w:r>
-      <w:r>
-        <w:t>oring script already exist) and use the results to improve the playbooks.</w:t>
+        <w:t xml:space="preserve"> Run the reply acceptance test with support staff (the review sheet and scoring script already exist) and use the results to improve the playbooks.</w:t>
       </w:r>
     </w:p>
     <w:p>
@@ -21895,10 +20727,7 @@
         <w:t>Self-updating dashboard.</w:t>
       </w:r>
       <w:r>
-        <w:t xml:space="preserve"> Append pipeline</w:t>
-      </w:r>
-      <w:r>
-        <w:t xml:space="preserve"> results to Google Sheets or a database from workflow 03 and build Looker Studio pages on top.</w:t>
+        <w:t xml:space="preserve"> Append pipeline results to Google Sheets or a database from workflow 03 and build Looker Studio pages on top.</w:t>
       </w:r>
     </w:p>
     <w:p>
@@ -21919,10 +20748,7 @@
         <w:t>Scaling.</w:t>
       </w:r>
       <w:r>
-        <w:t xml:space="preserve"> Use batch and prompt-caching features of the model API to cut the $2.50 per 1,000 reviews, run the embedding step in a small service, and move the API t</w:t>
-      </w:r>
-      <w:r>
-        <w:t>o a hosted environment with proper tracing (for example Langfuse).</w:t>
+        <w:t xml:space="preserve"> Use batch and prompt-caching features of the model API to cut the $2.50 per 1,000 reviews, run the embedding step in a small service, and move the API to a hosted environment with proper tracing (for example Langfuse).</w:t>
       </w:r>
     </w:p>
     <w:p>
@@ -21969,7 +20795,7 @@
       <w:pPr>
         <w:pStyle w:val="Heading1"/>
       </w:pPr>
-      <w:bookmarkStart w:id="41" w:name="_Toc241336277"/>
+      <w:bookmarkStart w:id="41" w:name="_Toc241868405"/>
       <w:r>
         <w:t>13. Business perspective</w:t>
       </w:r>
@@ -21987,10 +20813,7 @@
         <w:t>Cost.</w:t>
       </w:r>
       <w:r>
-        <w:t xml:space="preserve"> The measured cost is about $2.50 per 1,000 reviews with Claude Haiku 4.5 (replies $1.40, translation $0.50, classific</w:t>
-      </w:r>
-      <w:r>
-        <w:t>ation $0.42, issue category $0.18). At 1,000 reviews per day this is about $75 per month of model usage. Trend detection and the Slack alert cost nothing to run.</w:t>
+        <w:t xml:space="preserve"> The measured cost is about $2.50 per 1,000 reviews with Claude Haiku 4.5 (replies $1.40, translation $0.50, classification $0.42, issue category $0.18). At 1,000 reviews per day this is about $75 per month of model usage. Trend detection and the Slack alert cost nothing to run.</w:t>
       </w:r>
     </w:p>
     <w:p>
@@ -22005,17 +20828,14 @@
         <w:t>Speed.</w:t>
       </w:r>
       <w:r>
-        <w:t xml:space="preserve"> The automated part takes about 11 minutes per 1,000 reviews, so a day’s feed is analyse</w:t>
-      </w:r>
-      <w:r>
-        <w:t>d in one short run instead of a working day of reading. A draft reply exists about a minute after a batch starts; the remaining time to reply is the human approval of negative drafts, which we did not measure.</w:t>
+        <w:t xml:space="preserve"> The automated part takes about 11 minutes per 1,000 reviews, so a day’s feed is analysed in one short run instead of a working day of reading. A draft reply exists about a minute after a batch starts; the remaining time to reply is the human approval of negative drafts, which we did not measure.</w:t>
       </w:r>
     </w:p>
     <w:p>
       <w:pPr>
         <w:pStyle w:val="Heading2"/>
       </w:pPr>
-      <w:bookmarkStart w:id="42" w:name="_Toc241336278"/>
+      <w:bookmarkStart w:id="42" w:name="_Toc241868406"/>
       <w:r>
         <w:t>Illustration of the saving</w:t>
       </w:r>
@@ -22027,10 +20847,7 @@
         <w:spacing w:after="120" w:line="276" w:lineRule="auto"/>
       </w:pPr>
       <w:r>
-        <w:t xml:space="preserve">The table below is </w:t>
-      </w:r>
-      <w:r>
-        <w:t>an illustration, not a measurement. The manual time per review is an assumption that the team should replace with its own figure.</w:t>
+        <w:t>The table below is an illustration, not a measurement. The manual time per review is an assumption that the team should replace with its own figure.</w:t>
       </w:r>
     </w:p>
     <w:tbl>
@@ -22056,12 +20873,6 @@
         <w:gridCol w:w="3438"/>
       </w:tblGrid>
       <w:tr>
-        <w:tblPrEx>
-          <w:tblCellMar>
-            <w:top w:w="0" w:type="dxa"/>
-            <w:bottom w:w="0" w:type="dxa"/>
-          </w:tblCellMar>
-        </w:tblPrEx>
         <w:trPr>
           <w:cantSplit/>
           <w:tblHeader/>
@@ -22160,12 +20971,6 @@
         </w:tc>
       </w:tr>
       <w:tr>
-        <w:tblPrEx>
-          <w:tblCellMar>
-            <w:top w:w="0" w:type="dxa"/>
-            <w:bottom w:w="0" w:type="dxa"/>
-          </w:tblCellMar>
-        </w:tblPrEx>
         <w:trPr>
           <w:cantSplit/>
         </w:trPr>
@@ -22261,12 +21066,6 @@
         </w:tc>
       </w:tr>
       <w:tr>
-        <w:tblPrEx>
-          <w:tblCellMar>
-            <w:top w:w="0" w:type="dxa"/>
-            <w:bottom w:w="0" w:type="dxa"/>
-          </w:tblCellMar>
-        </w:tblPrEx>
         <w:trPr>
           <w:cantSplit/>
         </w:trPr>
@@ -22365,12 +21164,6 @@
         </w:tc>
       </w:tr>
       <w:tr>
-        <w:tblPrEx>
-          <w:tblCellMar>
-            <w:top w:w="0" w:type="dxa"/>
-            <w:bottom w:w="0" w:type="dxa"/>
-          </w:tblCellMar>
-        </w:tblPrEx>
         <w:trPr>
           <w:cantSplit/>
         </w:trPr>
@@ -22466,12 +21259,6 @@
         </w:tc>
       </w:tr>
       <w:tr>
-        <w:tblPrEx>
-          <w:tblCellMar>
-            <w:top w:w="0" w:type="dxa"/>
-            <w:bottom w:w="0" w:type="dxa"/>
-          </w:tblCellMar>
-        </w:tblPrEx>
         <w:trPr>
           <w:cantSplit/>
         </w:trPr>
@@ -22584,10 +21371,7 @@
         <w:t>Business value.</w:t>
       </w:r>
       <w:r>
-        <w:t xml:space="preserve"> Faster and more consistent replies in the customer’s language, earlier warning about delivery, packaging or price problems, and a shared view of the reasons behind ratings. The human approval queue keeps a person in charge of anything sensitive, and the s</w:t>
-      </w:r>
-      <w:r>
-        <w:t>pend cap and call log make the cost predictable.</w:t>
+        <w:t xml:space="preserve"> Faster and more consistent replies in the customer’s language, earlier warning about delivery, packaging or price problems, and a shared view of the reasons behind ratings. The human approval queue keeps a person in charge of anything sensitive, and the spend cap and call log make the cost predictable.</w:t>
       </w:r>
     </w:p>
     <w:p>
@@ -22602,17 +21386,14 @@
         <w:t>Risks and how we handle them.</w:t>
       </w:r>
       <w:r>
-        <w:t xml:space="preserve"> Wrong or over-promising replies (guardrails, judge, mandatory human approval for negatives); privacy (the pipeline asks for no personal data and drafts use first names only); mo</w:t>
-      </w:r>
-      <w:r>
-        <w:t>del changes or price changes (versioned prompts, model name in configuration); overreliance on the automated sentiment (report the neutral-class weakness, offer a borderline-review flag).</w:t>
+        <w:t xml:space="preserve"> Wrong or over-promising replies (guardrails, judge, mandatory human approval for negatives); privacy (the pipeline asks for no personal data and drafts use first names only); model changes or price changes (versioned prompts, model name in configuration); overreliance on the automated sentiment (report the neutral-class weakness, offer a borderline-review flag).</w:t>
       </w:r>
     </w:p>
     <w:p>
       <w:pPr>
         <w:pStyle w:val="Heading1"/>
       </w:pPr>
-      <w:bookmarkStart w:id="43" w:name="_Toc241336279"/>
+      <w:bookmarkStart w:id="43" w:name="_Toc241868407"/>
       <w:r>
         <w:t>14. Conclusion</w:t>
       </w:r>
@@ -22623,27 +21404,18 @@
         <w:spacing w:after="120" w:line="276" w:lineRule="auto"/>
       </w:pPr>
       <w:r>
-        <w:t>We built a complete, working pipeline for multilingua</w:t>
-      </w:r>
-      <w:r>
-        <w:t>l review analysis and reply drafting, verified it on real reviews in six languages, and connected it to a dashboard and Slack. Positive-versus-negative accuracy of 88.4% and a cost of about $2.50 per 1,000 reviews show that the approach is practical. The r</w:t>
-      </w:r>
-      <w:r>
-        <w:t xml:space="preserve">esults that fall </w:t>
+        <w:t xml:space="preserve">We built a complete, working pipeline for multilingual review analysis and reply drafting, verified it on real reviews in six languages, and connected it to a dashboard and Slack. Positive-versus-negative accuracy of 88.4% and a cost of about $2.50 per 1,000 reviews show that the approach is practical. The results that fall </w:t>
       </w:r>
       <w:r>
         <w:lastRenderedPageBreak/>
-        <w:t>short of the proposal (three-way accuracy of 78.1%, star error of 0.47 and reply acceptance measured by a model) are explained rather than hidden. The most valuable next steps are testing on a real dated feed and asking people to review th</w:t>
-      </w:r>
-      <w:r>
-        <w:t>e drafts.</w:t>
+        <w:t>short of the proposal (three-way accuracy of 78.1%, star error of 0.47 and reply acceptance measured by a model) are explained rather than hidden. The most valuable next steps are testing on a real dated feed and asking people to review the drafts.</w:t>
       </w:r>
     </w:p>
     <w:p>
       <w:pPr>
         <w:pStyle w:val="Heading1"/>
       </w:pPr>
-      <w:bookmarkStart w:id="44" w:name="_Toc241336280"/>
+      <w:bookmarkStart w:id="44" w:name="_Toc241868408"/>
       <w:r>
         <w:t>References</w:t>
       </w:r>
@@ -22685,10 +21457,7 @@
         <w:spacing w:after="60" w:line="264" w:lineRule="auto"/>
       </w:pPr>
       <w:r>
-        <w:t>Rahman et al. (2025), Scientific Reports, multilingual sentiment with XLM-RoBERTa-style mod</w:t>
-      </w:r>
-      <w:r>
-        <w:t>els, as cited in the team’s project proposal.</w:t>
+        <w:t>Rahman et al. (2025), Scientific Reports, multilingual sentiment with XLM-RoBERTa-style models, as cited in the team’s project proposal.</w:t>
       </w:r>
     </w:p>
     <w:p>
@@ -22722,7 +21491,7 @@
         <w:pStyle w:val="Heading1"/>
         <w:pageBreakBefore/>
       </w:pPr>
-      <w:bookmarkStart w:id="45" w:name="_Toc241336281"/>
+      <w:bookmarkStart w:id="45" w:name="_Toc241868409"/>
       <w:r>
         <w:lastRenderedPageBreak/>
         <w:t>Appendix A. Prompts and versions</w:t>
@@ -22752,12 +21521,6 @@
         <w:gridCol w:w="2638"/>
       </w:tblGrid>
       <w:tr>
-        <w:tblPrEx>
-          <w:tblCellMar>
-            <w:top w:w="0" w:type="dxa"/>
-            <w:bottom w:w="0" w:type="dxa"/>
-          </w:tblCellMar>
-        </w:tblPrEx>
         <w:trPr>
           <w:cantSplit/>
           <w:tblHeader/>
@@ -22866,12 +21629,6 @@
         </w:tc>
       </w:tr>
       <w:tr>
-        <w:tblPrEx>
-          <w:tblCellMar>
-            <w:top w:w="0" w:type="dxa"/>
-            <w:bottom w:w="0" w:type="dxa"/>
-          </w:tblCellMar>
-        </w:tblPrEx>
         <w:trPr>
           <w:cantSplit/>
         </w:trPr>
@@ -22968,12 +21725,6 @@
         </w:tc>
       </w:tr>
       <w:tr>
-        <w:tblPrEx>
-          <w:tblCellMar>
-            <w:top w:w="0" w:type="dxa"/>
-            <w:bottom w:w="0" w:type="dxa"/>
-          </w:tblCellMar>
-        </w:tblPrEx>
         <w:trPr>
           <w:cantSplit/>
         </w:trPr>
@@ -23088,12 +21839,6 @@
         </w:tc>
       </w:tr>
       <w:tr>
-        <w:tblPrEx>
-          <w:tblCellMar>
-            <w:top w:w="0" w:type="dxa"/>
-            <w:bottom w:w="0" w:type="dxa"/>
-          </w:tblCellMar>
-        </w:tblPrEx>
         <w:trPr>
           <w:cantSplit/>
         </w:trPr>
@@ -23190,12 +21935,6 @@
         </w:tc>
       </w:tr>
       <w:tr>
-        <w:tblPrEx>
-          <w:tblCellMar>
-            <w:top w:w="0" w:type="dxa"/>
-            <w:bottom w:w="0" w:type="dxa"/>
-          </w:tblCellMar>
-        </w:tblPrEx>
         <w:trPr>
           <w:cantSplit/>
         </w:trPr>
@@ -23295,12 +22034,6 @@
         </w:tc>
       </w:tr>
       <w:tr>
-        <w:tblPrEx>
-          <w:tblCellMar>
-            <w:top w:w="0" w:type="dxa"/>
-            <w:bottom w:w="0" w:type="dxa"/>
-          </w:tblCellMar>
-        </w:tblPrEx>
         <w:trPr>
           <w:cantSplit/>
         </w:trPr>
@@ -23412,12 +22145,6 @@
         </w:tc>
       </w:tr>
       <w:tr>
-        <w:tblPrEx>
-          <w:tblCellMar>
-            <w:top w:w="0" w:type="dxa"/>
-            <w:bottom w:w="0" w:type="dxa"/>
-          </w:tblCellMar>
-        </w:tblPrEx>
         <w:trPr>
           <w:cantSplit/>
         </w:trPr>
@@ -23532,12 +22259,6 @@
         </w:tc>
       </w:tr>
       <w:tr>
-        <w:tblPrEx>
-          <w:tblCellMar>
-            <w:top w:w="0" w:type="dxa"/>
-            <w:bottom w:w="0" w:type="dxa"/>
-          </w:tblCellMar>
-        </w:tblPrEx>
         <w:trPr>
           <w:cantSplit/>
         </w:trPr>
@@ -23634,12 +22355,6 @@
         </w:tc>
       </w:tr>
       <w:tr>
-        <w:tblPrEx>
-          <w:tblCellMar>
-            <w:top w:w="0" w:type="dxa"/>
-            <w:bottom w:w="0" w:type="dxa"/>
-          </w:tblCellMar>
-        </w:tblPrEx>
         <w:trPr>
           <w:cantSplit/>
         </w:trPr>
@@ -23740,7 +22455,7 @@
       <w:pPr>
         <w:pStyle w:val="Heading1"/>
       </w:pPr>
-      <w:bookmarkStart w:id="46" w:name="_Toc241336282"/>
+      <w:bookmarkStart w:id="46" w:name="_Toc241868410"/>
       <w:r>
         <w:t>Appendix B. Dashboard screenshots</w:t>
       </w:r>
@@ -23751,10 +22466,7 @@
         <w:spacing w:after="120" w:line="276" w:lineRule="auto"/>
       </w:pPr>
       <w:r>
-        <w:t xml:space="preserve">The Dashboard tab of the Google Sheet holds the summary figures and four charts: the issue-category bar chart, sentiment by week, topic share, and the weekly spike line chart. The Alerts tab lists the four spikes reported </w:t>
-      </w:r>
-      <w:r>
-        <w:t>in Section 6.5. Review dates are simulated.</w:t>
+        <w:t>The Dashboard tab of the Google Sheet holds the summary figures and four charts: the issue-category bar chart, sentiment by week, topic share, and the weekly spike line chart. The Alerts tab lists the four spikes reported in Section 6.5. Review dates are simulated.</w:t>
       </w:r>
     </w:p>
     <w:p>
@@ -23961,10 +22673,7 @@
         <w:spacing w:after="120" w:line="276" w:lineRule="auto"/>
       </w:pPr>
       <w:r>
-        <w:t>The delayed-shipments spike (27 reviews) is in</w:t>
-      </w:r>
-      <w:r>
-        <w:t xml:space="preserve"> the week of 24 August, damaged packaging (19) and missing parts (12) in the week of 7 September, and price complaints (12) in the week of 14 September.</w:t>
+        <w:t>The delayed-shipments spike (27 reviews) is in the week of 24 August, damaged packaging (19) and missing parts (12) in the week of 7 September, and price complaints (12) in the week of 14 September.</w:t>
       </w:r>
     </w:p>
     <w:p>
@@ -24030,17 +22739,7 @@
           <w:sz w:val="19"/>
           <w:szCs w:val="19"/>
         </w:rPr>
-        <w:t xml:space="preserve">Figure B4. The Slack alert posted to #all-capstone-project by workflow 04, listing the four detected </w:t>
-      </w:r>
-      <w:r>
-        <w:rPr>
-          <w:i/>
-          <w:iCs/>
-          <w:color w:val="5A6470"/>
-          <w:sz w:val="19"/>
-          <w:szCs w:val="19"/>
-        </w:rPr>
-        <w:t>spikes with counts, baseline and z-score.</w:t>
+        <w:t>Figure B4. The Slack alert posted to #all-capstone-project by workflow 04, listing the four detected spikes with counts, baseline and z-score.</w:t>
       </w:r>
     </w:p>
     <w:p>

</xml_diff>

<commit_message>
Use the Anthropic Console total ($4.29) for project spend in report, deck and experiment log
Co-Authored-By: Claude Sonnet 5.5 <noreply@anthropic.com>
</commit_message>
<xml_diff>
--- a/docs/final/Final_Project_Report.docx
+++ b/docs/final/Final_Project_Report.docx
@@ -99,7 +99,7 @@
         <w:pStyle w:val="Heading1"/>
         <w:pageBreakBefore/>
       </w:pPr>
-      <w:bookmarkStart w:id="1" w:name="_Toc241868365"/>
+      <w:bookmarkStart w:id="1" w:name="_Toc241868753"/>
       <w:r>
         <w:lastRenderedPageBreak/>
         <w:t>Team</w:t>
@@ -614,7 +614,7 @@
       <w:pPr>
         <w:pStyle w:val="Heading2"/>
       </w:pPr>
-      <w:bookmarkStart w:id="2" w:name="_Toc241868366"/>
+      <w:bookmarkStart w:id="2" w:name="_Toc241868754"/>
       <w:r>
         <w:t>How this report is organised</w:t>
       </w:r>
@@ -687,7 +687,7 @@
           <w:r>
             <w:fldChar w:fldCharType="separate"/>
           </w:r>
-          <w:hyperlink w:anchor="_Toc241868365" w:history="1">
+          <w:hyperlink w:anchor="_Toc241868753" w:history="1">
             <w:r>
               <w:rPr>
                 <w:rStyle w:val="Hyperlink"/>
@@ -711,7 +711,7 @@
               <w:rPr>
                 <w:noProof/>
               </w:rPr>
-              <w:instrText xml:space="preserve"> PAGEREF _Toc241868365 \h </w:instrText>
+              <w:instrText xml:space="preserve"> PAGEREF _Toc241868753 \h </w:instrText>
             </w:r>
             <w:r>
               <w:rPr>
@@ -749,7 +749,7 @@
               <w:noProof/>
             </w:rPr>
           </w:pPr>
-          <w:hyperlink w:anchor="_Toc241868366" w:history="1">
+          <w:hyperlink w:anchor="_Toc241868754" w:history="1">
             <w:r>
               <w:rPr>
                 <w:rStyle w:val="Hyperlink"/>
@@ -773,7 +773,7 @@
               <w:rPr>
                 <w:noProof/>
               </w:rPr>
-              <w:instrText xml:space="preserve"> PAGEREF _Toc241868366 \h </w:instrText>
+              <w:instrText xml:space="preserve"> PAGEREF _Toc241868754 \h </w:instrText>
             </w:r>
             <w:r>
               <w:rPr>
@@ -811,7 +811,7 @@
               <w:noProof/>
             </w:rPr>
           </w:pPr>
-          <w:hyperlink w:anchor="_Toc241868367" w:history="1">
+          <w:hyperlink w:anchor="_Toc241868755" w:history="1">
             <w:r>
               <w:rPr>
                 <w:rStyle w:val="Hyperlink"/>
@@ -835,7 +835,7 @@
               <w:rPr>
                 <w:noProof/>
               </w:rPr>
-              <w:instrText xml:space="preserve"> PAGEREF _Toc241868367 \h </w:instrText>
+              <w:instrText xml:space="preserve"> PAGEREF _Toc241868755 \h </w:instrText>
             </w:r>
             <w:r>
               <w:rPr>
@@ -873,7 +873,7 @@
               <w:noProof/>
             </w:rPr>
           </w:pPr>
-          <w:hyperlink w:anchor="_Toc241868368" w:history="1">
+          <w:hyperlink w:anchor="_Toc241868756" w:history="1">
             <w:r>
               <w:rPr>
                 <w:rStyle w:val="Hyperlink"/>
@@ -897,7 +897,7 @@
               <w:rPr>
                 <w:noProof/>
               </w:rPr>
-              <w:instrText xml:space="preserve"> PAGEREF _Toc241868368 \h </w:instrText>
+              <w:instrText xml:space="preserve"> PAGEREF _Toc241868756 \h </w:instrText>
             </w:r>
             <w:r>
               <w:rPr>
@@ -935,7 +935,7 @@
               <w:noProof/>
             </w:rPr>
           </w:pPr>
-          <w:hyperlink w:anchor="_Toc241868369" w:history="1">
+          <w:hyperlink w:anchor="_Toc241868757" w:history="1">
             <w:r>
               <w:rPr>
                 <w:rStyle w:val="Hyperlink"/>
@@ -959,7 +959,7 @@
               <w:rPr>
                 <w:noProof/>
               </w:rPr>
-              <w:instrText xml:space="preserve"> PAGEREF _Toc241868369 \h </w:instrText>
+              <w:instrText xml:space="preserve"> PAGEREF _Toc241868757 \h </w:instrText>
             </w:r>
             <w:r>
               <w:rPr>
@@ -997,7 +997,7 @@
               <w:noProof/>
             </w:rPr>
           </w:pPr>
-          <w:hyperlink w:anchor="_Toc241868370" w:history="1">
+          <w:hyperlink w:anchor="_Toc241868758" w:history="1">
             <w:r>
               <w:rPr>
                 <w:rStyle w:val="Hyperlink"/>
@@ -1021,7 +1021,7 @@
               <w:rPr>
                 <w:noProof/>
               </w:rPr>
-              <w:instrText xml:space="preserve"> PAGEREF _Toc241868370 \h </w:instrText>
+              <w:instrText xml:space="preserve"> PAGEREF _Toc241868758 \h </w:instrText>
             </w:r>
             <w:r>
               <w:rPr>
@@ -1059,7 +1059,7 @@
               <w:noProof/>
             </w:rPr>
           </w:pPr>
-          <w:hyperlink w:anchor="_Toc241868371" w:history="1">
+          <w:hyperlink w:anchor="_Toc241868759" w:history="1">
             <w:r>
               <w:rPr>
                 <w:rStyle w:val="Hyperlink"/>
@@ -1083,7 +1083,7 @@
               <w:rPr>
                 <w:noProof/>
               </w:rPr>
-              <w:instrText xml:space="preserve"> PAGEREF _Toc241868371 \h </w:instrText>
+              <w:instrText xml:space="preserve"> PAGEREF _Toc241868759 \h </w:instrText>
             </w:r>
             <w:r>
               <w:rPr>
@@ -1121,7 +1121,7 @@
               <w:noProof/>
             </w:rPr>
           </w:pPr>
-          <w:hyperlink w:anchor="_Toc241868372" w:history="1">
+          <w:hyperlink w:anchor="_Toc241868760" w:history="1">
             <w:r>
               <w:rPr>
                 <w:rStyle w:val="Hyperlink"/>
@@ -1145,7 +1145,7 @@
               <w:rPr>
                 <w:noProof/>
               </w:rPr>
-              <w:instrText xml:space="preserve"> PAGEREF _Toc241868372 \h </w:instrText>
+              <w:instrText xml:space="preserve"> PAGEREF _Toc241868760 \h </w:instrText>
             </w:r>
             <w:r>
               <w:rPr>
@@ -1183,7 +1183,7 @@
               <w:noProof/>
             </w:rPr>
           </w:pPr>
-          <w:hyperlink w:anchor="_Toc241868373" w:history="1">
+          <w:hyperlink w:anchor="_Toc241868761" w:history="1">
             <w:r>
               <w:rPr>
                 <w:rStyle w:val="Hyperlink"/>
@@ -1207,7 +1207,7 @@
               <w:rPr>
                 <w:noProof/>
               </w:rPr>
-              <w:instrText xml:space="preserve"> PAGEREF _Toc241868373 \h </w:instrText>
+              <w:instrText xml:space="preserve"> PAGEREF _Toc241868761 \h </w:instrText>
             </w:r>
             <w:r>
               <w:rPr>
@@ -1245,7 +1245,7 @@
               <w:noProof/>
             </w:rPr>
           </w:pPr>
-          <w:hyperlink w:anchor="_Toc241868374" w:history="1">
+          <w:hyperlink w:anchor="_Toc241868762" w:history="1">
             <w:r>
               <w:rPr>
                 <w:rStyle w:val="Hyperlink"/>
@@ -1269,7 +1269,7 @@
               <w:rPr>
                 <w:noProof/>
               </w:rPr>
-              <w:instrText xml:space="preserve"> PAGEREF _Toc241868374 \h </w:instrText>
+              <w:instrText xml:space="preserve"> PAGEREF _Toc241868762 \h </w:instrText>
             </w:r>
             <w:r>
               <w:rPr>
@@ -1307,7 +1307,7 @@
               <w:noProof/>
             </w:rPr>
           </w:pPr>
-          <w:hyperlink w:anchor="_Toc241868375" w:history="1">
+          <w:hyperlink w:anchor="_Toc241868763" w:history="1">
             <w:r>
               <w:rPr>
                 <w:rStyle w:val="Hyperlink"/>
@@ -1331,7 +1331,7 @@
               <w:rPr>
                 <w:noProof/>
               </w:rPr>
-              <w:instrText xml:space="preserve"> PAGEREF _Toc241868375 \h </w:instrText>
+              <w:instrText xml:space="preserve"> PAGEREF _Toc241868763 \h </w:instrText>
             </w:r>
             <w:r>
               <w:rPr>
@@ -1369,7 +1369,7 @@
               <w:noProof/>
             </w:rPr>
           </w:pPr>
-          <w:hyperlink w:anchor="_Toc241868376" w:history="1">
+          <w:hyperlink w:anchor="_Toc241868764" w:history="1">
             <w:r>
               <w:rPr>
                 <w:rStyle w:val="Hyperlink"/>
@@ -1393,7 +1393,7 @@
               <w:rPr>
                 <w:noProof/>
               </w:rPr>
-              <w:instrText xml:space="preserve"> PAGEREF _Toc241868376 \h </w:instrText>
+              <w:instrText xml:space="preserve"> PAGEREF _Toc241868764 \h </w:instrText>
             </w:r>
             <w:r>
               <w:rPr>
@@ -1431,7 +1431,7 @@
               <w:noProof/>
             </w:rPr>
           </w:pPr>
-          <w:hyperlink w:anchor="_Toc241868377" w:history="1">
+          <w:hyperlink w:anchor="_Toc241868765" w:history="1">
             <w:r>
               <w:rPr>
                 <w:rStyle w:val="Hyperlink"/>
@@ -1455,7 +1455,7 @@
               <w:rPr>
                 <w:noProof/>
               </w:rPr>
-              <w:instrText xml:space="preserve"> PAGEREF _Toc241868377 \h </w:instrText>
+              <w:instrText xml:space="preserve"> PAGEREF _Toc241868765 \h </w:instrText>
             </w:r>
             <w:r>
               <w:rPr>
@@ -1493,7 +1493,7 @@
               <w:noProof/>
             </w:rPr>
           </w:pPr>
-          <w:hyperlink w:anchor="_Toc241868378" w:history="1">
+          <w:hyperlink w:anchor="_Toc241868766" w:history="1">
             <w:r>
               <w:rPr>
                 <w:rStyle w:val="Hyperlink"/>
@@ -1517,7 +1517,7 @@
               <w:rPr>
                 <w:noProof/>
               </w:rPr>
-              <w:instrText xml:space="preserve"> PAGEREF _Toc241868378 \h </w:instrText>
+              <w:instrText xml:space="preserve"> PAGEREF _Toc241868766 \h </w:instrText>
             </w:r>
             <w:r>
               <w:rPr>
@@ -1555,7 +1555,7 @@
               <w:noProof/>
             </w:rPr>
           </w:pPr>
-          <w:hyperlink w:anchor="_Toc241868379" w:history="1">
+          <w:hyperlink w:anchor="_Toc241868767" w:history="1">
             <w:r>
               <w:rPr>
                 <w:rStyle w:val="Hyperlink"/>
@@ -1579,7 +1579,7 @@
               <w:rPr>
                 <w:noProof/>
               </w:rPr>
-              <w:instrText xml:space="preserve"> PAGEREF _Toc241868379 \h </w:instrText>
+              <w:instrText xml:space="preserve"> PAGEREF _Toc241868767 \h </w:instrText>
             </w:r>
             <w:r>
               <w:rPr>
@@ -1617,7 +1617,7 @@
               <w:noProof/>
             </w:rPr>
           </w:pPr>
-          <w:hyperlink w:anchor="_Toc241868380" w:history="1">
+          <w:hyperlink w:anchor="_Toc241868768" w:history="1">
             <w:r>
               <w:rPr>
                 <w:rStyle w:val="Hyperlink"/>
@@ -1641,7 +1641,7 @@
               <w:rPr>
                 <w:noProof/>
               </w:rPr>
-              <w:instrText xml:space="preserve"> PAGEREF _Toc241868380 \h </w:instrText>
+              <w:instrText xml:space="preserve"> PAGEREF _Toc241868768 \h </w:instrText>
             </w:r>
             <w:r>
               <w:rPr>
@@ -1679,7 +1679,7 @@
               <w:noProof/>
             </w:rPr>
           </w:pPr>
-          <w:hyperlink w:anchor="_Toc241868381" w:history="1">
+          <w:hyperlink w:anchor="_Toc241868769" w:history="1">
             <w:r>
               <w:rPr>
                 <w:rStyle w:val="Hyperlink"/>
@@ -1703,7 +1703,7 @@
               <w:rPr>
                 <w:noProof/>
               </w:rPr>
-              <w:instrText xml:space="preserve"> PAGEREF _Toc241868381 \h </w:instrText>
+              <w:instrText xml:space="preserve"> PAGEREF _Toc241868769 \h </w:instrText>
             </w:r>
             <w:r>
               <w:rPr>
@@ -1741,7 +1741,7 @@
               <w:noProof/>
             </w:rPr>
           </w:pPr>
-          <w:hyperlink w:anchor="_Toc241868382" w:history="1">
+          <w:hyperlink w:anchor="_Toc241868770" w:history="1">
             <w:r>
               <w:rPr>
                 <w:rStyle w:val="Hyperlink"/>
@@ -1765,7 +1765,7 @@
               <w:rPr>
                 <w:noProof/>
               </w:rPr>
-              <w:instrText xml:space="preserve"> PAGEREF _Toc241868382 \h </w:instrText>
+              <w:instrText xml:space="preserve"> PAGEREF _Toc241868770 \h </w:instrText>
             </w:r>
             <w:r>
               <w:rPr>
@@ -1803,7 +1803,7 @@
               <w:noProof/>
             </w:rPr>
           </w:pPr>
-          <w:hyperlink w:anchor="_Toc241868383" w:history="1">
+          <w:hyperlink w:anchor="_Toc241868771" w:history="1">
             <w:r>
               <w:rPr>
                 <w:rStyle w:val="Hyperlink"/>
@@ -1827,7 +1827,7 @@
               <w:rPr>
                 <w:noProof/>
               </w:rPr>
-              <w:instrText xml:space="preserve"> PAGEREF _Toc241868383 \h </w:instrText>
+              <w:instrText xml:space="preserve"> PAGEREF _Toc241868771 \h </w:instrText>
             </w:r>
             <w:r>
               <w:rPr>
@@ -1865,7 +1865,7 @@
               <w:noProof/>
             </w:rPr>
           </w:pPr>
-          <w:hyperlink w:anchor="_Toc241868384" w:history="1">
+          <w:hyperlink w:anchor="_Toc241868772" w:history="1">
             <w:r>
               <w:rPr>
                 <w:rStyle w:val="Hyperlink"/>
@@ -1889,7 +1889,7 @@
               <w:rPr>
                 <w:noProof/>
               </w:rPr>
-              <w:instrText xml:space="preserve"> PAGEREF _Toc241868384 \h </w:instrText>
+              <w:instrText xml:space="preserve"> PAGEREF _Toc241868772 \h </w:instrText>
             </w:r>
             <w:r>
               <w:rPr>
@@ -1927,7 +1927,7 @@
               <w:noProof/>
             </w:rPr>
           </w:pPr>
-          <w:hyperlink w:anchor="_Toc241868385" w:history="1">
+          <w:hyperlink w:anchor="_Toc241868773" w:history="1">
             <w:r>
               <w:rPr>
                 <w:rStyle w:val="Hyperlink"/>
@@ -1951,7 +1951,7 @@
               <w:rPr>
                 <w:noProof/>
               </w:rPr>
-              <w:instrText xml:space="preserve"> PAGEREF _Toc241868385 \h </w:instrText>
+              <w:instrText xml:space="preserve"> PAGEREF _Toc241868773 \h </w:instrText>
             </w:r>
             <w:r>
               <w:rPr>
@@ -1989,7 +1989,7 @@
               <w:noProof/>
             </w:rPr>
           </w:pPr>
-          <w:hyperlink w:anchor="_Toc241868386" w:history="1">
+          <w:hyperlink w:anchor="_Toc241868774" w:history="1">
             <w:r>
               <w:rPr>
                 <w:rStyle w:val="Hyperlink"/>
@@ -2013,7 +2013,7 @@
               <w:rPr>
                 <w:noProof/>
               </w:rPr>
-              <w:instrText xml:space="preserve"> PAGEREF _Toc241868386 \h </w:instrText>
+              <w:instrText xml:space="preserve"> PAGEREF _Toc241868774 \h </w:instrText>
             </w:r>
             <w:r>
               <w:rPr>
@@ -2051,7 +2051,7 @@
               <w:noProof/>
             </w:rPr>
           </w:pPr>
-          <w:hyperlink w:anchor="_Toc241868387" w:history="1">
+          <w:hyperlink w:anchor="_Toc241868775" w:history="1">
             <w:r>
               <w:rPr>
                 <w:rStyle w:val="Hyperlink"/>
@@ -2075,7 +2075,7 @@
               <w:rPr>
                 <w:noProof/>
               </w:rPr>
-              <w:instrText xml:space="preserve"> PAGEREF _Toc241868387 \h </w:instrText>
+              <w:instrText xml:space="preserve"> PAGEREF _Toc241868775 \h </w:instrText>
             </w:r>
             <w:r>
               <w:rPr>
@@ -2113,7 +2113,7 @@
               <w:noProof/>
             </w:rPr>
           </w:pPr>
-          <w:hyperlink w:anchor="_Toc241868388" w:history="1">
+          <w:hyperlink w:anchor="_Toc241868776" w:history="1">
             <w:r>
               <w:rPr>
                 <w:rStyle w:val="Hyperlink"/>
@@ -2137,7 +2137,7 @@
               <w:rPr>
                 <w:noProof/>
               </w:rPr>
-              <w:instrText xml:space="preserve"> PAGEREF _Toc241868388 \h </w:instrText>
+              <w:instrText xml:space="preserve"> PAGEREF _Toc241868776 \h </w:instrText>
             </w:r>
             <w:r>
               <w:rPr>
@@ -2175,7 +2175,7 @@
               <w:noProof/>
             </w:rPr>
           </w:pPr>
-          <w:hyperlink w:anchor="_Toc241868389" w:history="1">
+          <w:hyperlink w:anchor="_Toc241868777" w:history="1">
             <w:r>
               <w:rPr>
                 <w:rStyle w:val="Hyperlink"/>
@@ -2199,7 +2199,7 @@
               <w:rPr>
                 <w:noProof/>
               </w:rPr>
-              <w:instrText xml:space="preserve"> PAGEREF _Toc241868389 \h </w:instrText>
+              <w:instrText xml:space="preserve"> PAGEREF _Toc241868777 \h </w:instrText>
             </w:r>
             <w:r>
               <w:rPr>
@@ -2237,7 +2237,7 @@
               <w:noProof/>
             </w:rPr>
           </w:pPr>
-          <w:hyperlink w:anchor="_Toc241868390" w:history="1">
+          <w:hyperlink w:anchor="_Toc241868778" w:history="1">
             <w:r>
               <w:rPr>
                 <w:rStyle w:val="Hyperlink"/>
@@ -2261,7 +2261,7 @@
               <w:rPr>
                 <w:noProof/>
               </w:rPr>
-              <w:instrText xml:space="preserve"> PAGEREF _Toc241868390 \h </w:instrText>
+              <w:instrText xml:space="preserve"> PAGEREF _Toc241868778 \h </w:instrText>
             </w:r>
             <w:r>
               <w:rPr>
@@ -2299,7 +2299,7 @@
               <w:noProof/>
             </w:rPr>
           </w:pPr>
-          <w:hyperlink w:anchor="_Toc241868391" w:history="1">
+          <w:hyperlink w:anchor="_Toc241868779" w:history="1">
             <w:r>
               <w:rPr>
                 <w:rStyle w:val="Hyperlink"/>
@@ -2323,7 +2323,7 @@
               <w:rPr>
                 <w:noProof/>
               </w:rPr>
-              <w:instrText xml:space="preserve"> PAGEREF _Toc241868391 \h </w:instrText>
+              <w:instrText xml:space="preserve"> PAGEREF _Toc241868779 \h </w:instrText>
             </w:r>
             <w:r>
               <w:rPr>
@@ -2361,7 +2361,7 @@
               <w:noProof/>
             </w:rPr>
           </w:pPr>
-          <w:hyperlink w:anchor="_Toc241868392" w:history="1">
+          <w:hyperlink w:anchor="_Toc241868780" w:history="1">
             <w:r>
               <w:rPr>
                 <w:rStyle w:val="Hyperlink"/>
@@ -2385,7 +2385,7 @@
               <w:rPr>
                 <w:noProof/>
               </w:rPr>
-              <w:instrText xml:space="preserve"> PAGEREF _Toc241868392 \h </w:instrText>
+              <w:instrText xml:space="preserve"> PAGEREF _Toc241868780 \h </w:instrText>
             </w:r>
             <w:r>
               <w:rPr>
@@ -2423,7 +2423,7 @@
               <w:noProof/>
             </w:rPr>
           </w:pPr>
-          <w:hyperlink w:anchor="_Toc241868393" w:history="1">
+          <w:hyperlink w:anchor="_Toc241868781" w:history="1">
             <w:r>
               <w:rPr>
                 <w:rStyle w:val="Hyperlink"/>
@@ -2447,7 +2447,7 @@
               <w:rPr>
                 <w:noProof/>
               </w:rPr>
-              <w:instrText xml:space="preserve"> PAGEREF _Toc241868393 \h </w:instrText>
+              <w:instrText xml:space="preserve"> PAGEREF _Toc241868781 \h </w:instrText>
             </w:r>
             <w:r>
               <w:rPr>
@@ -2485,7 +2485,7 @@
               <w:noProof/>
             </w:rPr>
           </w:pPr>
-          <w:hyperlink w:anchor="_Toc241868394" w:history="1">
+          <w:hyperlink w:anchor="_Toc241868782" w:history="1">
             <w:r>
               <w:rPr>
                 <w:rStyle w:val="Hyperlink"/>
@@ -2509,7 +2509,7 @@
               <w:rPr>
                 <w:noProof/>
               </w:rPr>
-              <w:instrText xml:space="preserve"> PAGEREF _Toc241868394 \h </w:instrText>
+              <w:instrText xml:space="preserve"> PAGEREF _Toc241868782 \h </w:instrText>
             </w:r>
             <w:r>
               <w:rPr>
@@ -2547,7 +2547,7 @@
               <w:noProof/>
             </w:rPr>
           </w:pPr>
-          <w:hyperlink w:anchor="_Toc241868395" w:history="1">
+          <w:hyperlink w:anchor="_Toc241868783" w:history="1">
             <w:r>
               <w:rPr>
                 <w:rStyle w:val="Hyperlink"/>
@@ -2571,7 +2571,7 @@
               <w:rPr>
                 <w:noProof/>
               </w:rPr>
-              <w:instrText xml:space="preserve"> PAGEREF _Toc241868395 \h </w:instrText>
+              <w:instrText xml:space="preserve"> PAGEREF _Toc241868783 \h </w:instrText>
             </w:r>
             <w:r>
               <w:rPr>
@@ -2609,7 +2609,7 @@
               <w:noProof/>
             </w:rPr>
           </w:pPr>
-          <w:hyperlink w:anchor="_Toc241868396" w:history="1">
+          <w:hyperlink w:anchor="_Toc241868784" w:history="1">
             <w:r>
               <w:rPr>
                 <w:rStyle w:val="Hyperlink"/>
@@ -2633,7 +2633,7 @@
               <w:rPr>
                 <w:noProof/>
               </w:rPr>
-              <w:instrText xml:space="preserve"> PAGEREF _Toc241868396 \h </w:instrText>
+              <w:instrText xml:space="preserve"> PAGEREF _Toc241868784 \h </w:instrText>
             </w:r>
             <w:r>
               <w:rPr>
@@ -2671,7 +2671,7 @@
               <w:noProof/>
             </w:rPr>
           </w:pPr>
-          <w:hyperlink w:anchor="_Toc241868397" w:history="1">
+          <w:hyperlink w:anchor="_Toc241868785" w:history="1">
             <w:r>
               <w:rPr>
                 <w:rStyle w:val="Hyperlink"/>
@@ -2695,7 +2695,7 @@
               <w:rPr>
                 <w:noProof/>
               </w:rPr>
-              <w:instrText xml:space="preserve"> PAGEREF _Toc241868397 \h </w:instrText>
+              <w:instrText xml:space="preserve"> PAGEREF _Toc241868785 \h </w:instrText>
             </w:r>
             <w:r>
               <w:rPr>
@@ -2733,7 +2733,7 @@
               <w:noProof/>
             </w:rPr>
           </w:pPr>
-          <w:hyperlink w:anchor="_Toc241868398" w:history="1">
+          <w:hyperlink w:anchor="_Toc241868786" w:history="1">
             <w:r>
               <w:rPr>
                 <w:rStyle w:val="Hyperlink"/>
@@ -2757,7 +2757,7 @@
               <w:rPr>
                 <w:noProof/>
               </w:rPr>
-              <w:instrText xml:space="preserve"> PAGEREF _Toc241868398 \h </w:instrText>
+              <w:instrText xml:space="preserve"> PAGEREF _Toc241868786 \h </w:instrText>
             </w:r>
             <w:r>
               <w:rPr>
@@ -2795,7 +2795,7 @@
               <w:noProof/>
             </w:rPr>
           </w:pPr>
-          <w:hyperlink w:anchor="_Toc241868399" w:history="1">
+          <w:hyperlink w:anchor="_Toc241868787" w:history="1">
             <w:r>
               <w:rPr>
                 <w:rStyle w:val="Hyperlink"/>
@@ -2819,7 +2819,7 @@
               <w:rPr>
                 <w:noProof/>
               </w:rPr>
-              <w:instrText xml:space="preserve"> PAGEREF _Toc241868399 \h </w:instrText>
+              <w:instrText xml:space="preserve"> PAGEREF _Toc241868787 \h </w:instrText>
             </w:r>
             <w:r>
               <w:rPr>
@@ -2857,7 +2857,7 @@
               <w:noProof/>
             </w:rPr>
           </w:pPr>
-          <w:hyperlink w:anchor="_Toc241868400" w:history="1">
+          <w:hyperlink w:anchor="_Toc241868788" w:history="1">
             <w:r>
               <w:rPr>
                 <w:rStyle w:val="Hyperlink"/>
@@ -2881,7 +2881,7 @@
               <w:rPr>
                 <w:noProof/>
               </w:rPr>
-              <w:instrText xml:space="preserve"> PAGEREF _Toc241868400 \h </w:instrText>
+              <w:instrText xml:space="preserve"> PAGEREF _Toc241868788 \h </w:instrText>
             </w:r>
             <w:r>
               <w:rPr>
@@ -2919,7 +2919,7 @@
               <w:noProof/>
             </w:rPr>
           </w:pPr>
-          <w:hyperlink w:anchor="_Toc241868401" w:history="1">
+          <w:hyperlink w:anchor="_Toc241868789" w:history="1">
             <w:r>
               <w:rPr>
                 <w:rStyle w:val="Hyperlink"/>
@@ -2943,7 +2943,7 @@
               <w:rPr>
                 <w:noProof/>
               </w:rPr>
-              <w:instrText xml:space="preserve"> PAGEREF _Toc241868401 \h </w:instrText>
+              <w:instrText xml:space="preserve"> PAGEREF _Toc241868789 \h </w:instrText>
             </w:r>
             <w:r>
               <w:rPr>
@@ -2981,7 +2981,7 @@
               <w:noProof/>
             </w:rPr>
           </w:pPr>
-          <w:hyperlink w:anchor="_Toc241868402" w:history="1">
+          <w:hyperlink w:anchor="_Toc241868790" w:history="1">
             <w:r>
               <w:rPr>
                 <w:rStyle w:val="Hyperlink"/>
@@ -3005,7 +3005,7 @@
               <w:rPr>
                 <w:noProof/>
               </w:rPr>
-              <w:instrText xml:space="preserve"> PAGEREF _Toc241868402 \h </w:instrText>
+              <w:instrText xml:space="preserve"> PAGEREF _Toc241868790 \h </w:instrText>
             </w:r>
             <w:r>
               <w:rPr>
@@ -3043,7 +3043,7 @@
               <w:noProof/>
             </w:rPr>
           </w:pPr>
-          <w:hyperlink w:anchor="_Toc241868403" w:history="1">
+          <w:hyperlink w:anchor="_Toc241868791" w:history="1">
             <w:r>
               <w:rPr>
                 <w:rStyle w:val="Hyperlink"/>
@@ -3067,7 +3067,7 @@
               <w:rPr>
                 <w:noProof/>
               </w:rPr>
-              <w:instrText xml:space="preserve"> PAGEREF _Toc241868403 \h </w:instrText>
+              <w:instrText xml:space="preserve"> PAGEREF _Toc241868791 \h </w:instrText>
             </w:r>
             <w:r>
               <w:rPr>
@@ -3105,7 +3105,7 @@
               <w:noProof/>
             </w:rPr>
           </w:pPr>
-          <w:hyperlink w:anchor="_Toc241868404" w:history="1">
+          <w:hyperlink w:anchor="_Toc241868792" w:history="1">
             <w:r>
               <w:rPr>
                 <w:rStyle w:val="Hyperlink"/>
@@ -3129,7 +3129,7 @@
               <w:rPr>
                 <w:noProof/>
               </w:rPr>
-              <w:instrText xml:space="preserve"> PAGEREF _Toc241868404 \h </w:instrText>
+              <w:instrText xml:space="preserve"> PAGEREF _Toc241868792 \h </w:instrText>
             </w:r>
             <w:r>
               <w:rPr>
@@ -3167,7 +3167,7 @@
               <w:noProof/>
             </w:rPr>
           </w:pPr>
-          <w:hyperlink w:anchor="_Toc241868405" w:history="1">
+          <w:hyperlink w:anchor="_Toc241868793" w:history="1">
             <w:r>
               <w:rPr>
                 <w:rStyle w:val="Hyperlink"/>
@@ -3191,7 +3191,7 @@
               <w:rPr>
                 <w:noProof/>
               </w:rPr>
-              <w:instrText xml:space="preserve"> PAGEREF _Toc241868405 \h </w:instrText>
+              <w:instrText xml:space="preserve"> PAGEREF _Toc241868793 \h </w:instrText>
             </w:r>
             <w:r>
               <w:rPr>
@@ -3229,7 +3229,7 @@
               <w:noProof/>
             </w:rPr>
           </w:pPr>
-          <w:hyperlink w:anchor="_Toc241868406" w:history="1">
+          <w:hyperlink w:anchor="_Toc241868794" w:history="1">
             <w:r>
               <w:rPr>
                 <w:rStyle w:val="Hyperlink"/>
@@ -3253,7 +3253,7 @@
               <w:rPr>
                 <w:noProof/>
               </w:rPr>
-              <w:instrText xml:space="preserve"> PAGEREF _Toc241868406 \h </w:instrText>
+              <w:instrText xml:space="preserve"> PAGEREF _Toc241868794 \h </w:instrText>
             </w:r>
             <w:r>
               <w:rPr>
@@ -3291,7 +3291,7 @@
               <w:noProof/>
             </w:rPr>
           </w:pPr>
-          <w:hyperlink w:anchor="_Toc241868407" w:history="1">
+          <w:hyperlink w:anchor="_Toc241868795" w:history="1">
             <w:r>
               <w:rPr>
                 <w:rStyle w:val="Hyperlink"/>
@@ -3315,7 +3315,7 @@
               <w:rPr>
                 <w:noProof/>
               </w:rPr>
-              <w:instrText xml:space="preserve"> PAGEREF _Toc241868407 \h </w:instrText>
+              <w:instrText xml:space="preserve"> PAGEREF _Toc241868795 \h </w:instrText>
             </w:r>
             <w:r>
               <w:rPr>
@@ -3353,7 +3353,7 @@
               <w:noProof/>
             </w:rPr>
           </w:pPr>
-          <w:hyperlink w:anchor="_Toc241868408" w:history="1">
+          <w:hyperlink w:anchor="_Toc241868796" w:history="1">
             <w:r>
               <w:rPr>
                 <w:rStyle w:val="Hyperlink"/>
@@ -3377,7 +3377,7 @@
               <w:rPr>
                 <w:noProof/>
               </w:rPr>
-              <w:instrText xml:space="preserve"> PAGEREF _Toc241868408 \h </w:instrText>
+              <w:instrText xml:space="preserve"> PAGEREF _Toc241868796 \h </w:instrText>
             </w:r>
             <w:r>
               <w:rPr>
@@ -3415,7 +3415,7 @@
               <w:noProof/>
             </w:rPr>
           </w:pPr>
-          <w:hyperlink w:anchor="_Toc241868409" w:history="1">
+          <w:hyperlink w:anchor="_Toc241868797" w:history="1">
             <w:r>
               <w:rPr>
                 <w:rStyle w:val="Hyperlink"/>
@@ -3439,7 +3439,7 @@
               <w:rPr>
                 <w:noProof/>
               </w:rPr>
-              <w:instrText xml:space="preserve"> PAGEREF _Toc241868409 \h </w:instrText>
+              <w:instrText xml:space="preserve"> PAGEREF _Toc241868797 \h </w:instrText>
             </w:r>
             <w:r>
               <w:rPr>
@@ -3477,7 +3477,7 @@
               <w:noProof/>
             </w:rPr>
           </w:pPr>
-          <w:hyperlink w:anchor="_Toc241868410" w:history="1">
+          <w:hyperlink w:anchor="_Toc241868798" w:history="1">
             <w:r>
               <w:rPr>
                 <w:rStyle w:val="Hyperlink"/>
@@ -3501,7 +3501,7 @@
               <w:rPr>
                 <w:noProof/>
               </w:rPr>
-              <w:instrText xml:space="preserve"> PAGEREF _Toc241868410 \h </w:instrText>
+              <w:instrText xml:space="preserve"> PAGEREF _Toc241868798 \h </w:instrText>
             </w:r>
             <w:r>
               <w:rPr>
@@ -3540,7 +3540,7 @@
         <w:pStyle w:val="Heading1"/>
         <w:pageBreakBefore/>
       </w:pPr>
-      <w:bookmarkStart w:id="3" w:name="_Toc241868367"/>
+      <w:bookmarkStart w:id="3" w:name="_Toc241868755"/>
       <w:r>
         <w:lastRenderedPageBreak/>
         <w:t>1. Executive summary</w:t>
@@ -3560,14 +3560,14 @@
         <w:spacing w:after="120" w:line="276" w:lineRule="auto"/>
       </w:pPr>
       <w:r>
-        <w:t>We built and tested every stage with Claude Haiku 4.5 as the only language model for the pipeline and Claude Sonnet 5 as an independent judge of reply quality. The workflow runs in n8n, the analysis code and the API service run in Python, results are shown in a Google Sheets dashboard, and spike alerts go to Slack. The whole project used about $2.5 to $3.7 of the $5 Claude budget.</w:t>
+        <w:t>We built and tested every stage with Claude Haiku 4.5 as the only language model for the pipeline and Claude Sonnet 5 as an independent judge of reply quality. The workflow runs in n8n, the analysis code and the API service run in Python, results are shown in a Google Sheets dashboard, and spike alerts go to Slack. The whole project used $4.29 of Claude credit (Anthropic Console total), within the $5 budget.</w:t>
       </w:r>
     </w:p>
     <w:p>
       <w:pPr>
         <w:pStyle w:val="Heading2"/>
       </w:pPr>
-      <w:bookmarkStart w:id="4" w:name="_Toc241868368"/>
+      <w:bookmarkStart w:id="4" w:name="_Toc241868756"/>
       <w:r>
         <w:t>Results against the targets</w:t>
       </w:r>
@@ -4431,7 +4431,7 @@
       <w:pPr>
         <w:pStyle w:val="Heading1"/>
       </w:pPr>
-      <w:bookmarkStart w:id="5" w:name="_Toc241868369"/>
+      <w:bookmarkStart w:id="5" w:name="_Toc241868757"/>
       <w:r>
         <w:t>2. Problem statement</w:t>
       </w:r>
@@ -4530,7 +4530,7 @@
       <w:pPr>
         <w:pStyle w:val="Heading2"/>
       </w:pPr>
-      <w:bookmarkStart w:id="6" w:name="_Toc241868370"/>
+      <w:bookmarkStart w:id="6" w:name="_Toc241868758"/>
       <w:r>
         <w:t>Current methods and where they fail</w:t>
       </w:r>
@@ -5067,7 +5067,7 @@
       <w:pPr>
         <w:pStyle w:val="Heading1"/>
       </w:pPr>
-      <w:bookmarkStart w:id="7" w:name="_Toc241868371"/>
+      <w:bookmarkStart w:id="7" w:name="_Toc241868759"/>
       <w:r>
         <w:t>3. Objectives and success metrics</w:t>
       </w:r>
@@ -5985,7 +5985,7 @@
       <w:pPr>
         <w:pStyle w:val="Heading1"/>
       </w:pPr>
-      <w:bookmarkStart w:id="8" w:name="_Toc241868372"/>
+      <w:bookmarkStart w:id="8" w:name="_Toc241868760"/>
       <w:r>
         <w:lastRenderedPageBreak/>
         <w:t>4. Proposed solution and architecture</w:t>
@@ -6011,7 +6011,7 @@
           <w:noProof/>
         </w:rPr>
         <w:drawing>
-          <wp:inline distT="0" distB="0" distL="0" distR="0" wp14:anchorId="630DC6AD" wp14:editId="228BB450">
+          <wp:inline distT="0" distB="0" distL="0" distR="0" wp14:anchorId="24D7F188" wp14:editId="0B59BBD0">
             <wp:extent cx="6096000" cy="3152775"/>
             <wp:effectExtent l="0" t="0" r="0" b="0"/>
             <wp:docPr id="1" name="fig_architecture.png" descr="Figure 1. Architecture: the n8n pipeline (top), outputs (middle) and supporting services (bottom)." title="Figure 1. Architecture: the n8n pipeline (top), outputs (middle) and supporting services (bottom)."/>
@@ -6070,7 +6070,7 @@
       <w:pPr>
         <w:pStyle w:val="Heading2"/>
       </w:pPr>
-      <w:bookmarkStart w:id="9" w:name="_Toc241868373"/>
+      <w:bookmarkStart w:id="9" w:name="_Toc241868761"/>
       <w:r>
         <w:t>Design principles</w:t>
       </w:r>
@@ -6191,7 +6191,7 @@
       <w:pPr>
         <w:pStyle w:val="Heading2"/>
       </w:pPr>
-      <w:bookmarkStart w:id="10" w:name="_Toc241868374"/>
+      <w:bookmarkStart w:id="10" w:name="_Toc241868762"/>
       <w:r>
         <w:lastRenderedPageBreak/>
         <w:t>Tools and technology</w:t>
@@ -7004,7 +7004,7 @@
       <w:pPr>
         <w:pStyle w:val="Heading1"/>
       </w:pPr>
-      <w:bookmarkStart w:id="11" w:name="_Toc241868375"/>
+      <w:bookmarkStart w:id="11" w:name="_Toc241868763"/>
       <w:r>
         <w:t>5. Data and pipeline design</w:t>
       </w:r>
@@ -7014,7 +7014,7 @@
       <w:pPr>
         <w:pStyle w:val="Heading2"/>
       </w:pPr>
-      <w:bookmarkStart w:id="12" w:name="_Toc241868376"/>
+      <w:bookmarkStart w:id="12" w:name="_Toc241868764"/>
       <w:r>
         <w:t>5.1 Dataset</w:t>
       </w:r>
@@ -7043,7 +7043,7 @@
       <w:pPr>
         <w:pStyle w:val="Heading2"/>
       </w:pPr>
-      <w:bookmarkStart w:id="13" w:name="_Toc241868377"/>
+      <w:bookmarkStart w:id="13" w:name="_Toc241868765"/>
       <w:r>
         <w:t>5.2 Unified schema</w:t>
       </w:r>
@@ -7089,7 +7089,7 @@
       <w:pPr>
         <w:pStyle w:val="Heading2"/>
       </w:pPr>
-      <w:bookmarkStart w:id="14" w:name="_Toc241868378"/>
+      <w:bookmarkStart w:id="14" w:name="_Toc241868766"/>
       <w:r>
         <w:t>5.3 Samples and splits</w:t>
       </w:r>
@@ -7811,7 +7811,7 @@
       <w:pPr>
         <w:pStyle w:val="Heading2"/>
       </w:pPr>
-      <w:bookmarkStart w:id="15" w:name="_Toc241868379"/>
+      <w:bookmarkStart w:id="15" w:name="_Toc241868767"/>
       <w:r>
         <w:t>5.4 Ground truth and its limits</w:t>
       </w:r>
@@ -7834,7 +7834,7 @@
         <w:pStyle w:val="Heading1"/>
         <w:pageBreakBefore/>
       </w:pPr>
-      <w:bookmarkStart w:id="16" w:name="_Toc241868380"/>
+      <w:bookmarkStart w:id="16" w:name="_Toc241868768"/>
       <w:r>
         <w:lastRenderedPageBreak/>
         <w:t>6. Components in detail</w:t>
@@ -7845,7 +7845,7 @@
       <w:pPr>
         <w:pStyle w:val="Heading2"/>
       </w:pPr>
-      <w:bookmarkStart w:id="17" w:name="_Toc241868381"/>
+      <w:bookmarkStart w:id="17" w:name="_Toc241868769"/>
       <w:r>
         <w:t>6.1 Ingestion (n8n workflow 01)</w:t>
       </w:r>
@@ -7863,7 +7863,7 @@
       <w:pPr>
         <w:pStyle w:val="Heading2"/>
       </w:pPr>
-      <w:bookmarkStart w:id="18" w:name="_Toc241868382"/>
+      <w:bookmarkStart w:id="18" w:name="_Toc241868770"/>
       <w:r>
         <w:t>6.2 Translation (n8n workflow 02)</w:t>
       </w:r>
@@ -8311,7 +8311,7 @@
       <w:pPr>
         <w:pStyle w:val="Heading2"/>
       </w:pPr>
-      <w:bookmarkStart w:id="19" w:name="_Toc241868383"/>
+      <w:bookmarkStart w:id="19" w:name="_Toc241868771"/>
       <w:r>
         <w:t>6.3 Sentiment, topic and estimated stars</w:t>
       </w:r>
@@ -8336,7 +8336,7 @@
           <w:noProof/>
         </w:rPr>
         <w:drawing>
-          <wp:inline distT="0" distB="0" distL="0" distR="0" wp14:anchorId="64913641" wp14:editId="31DB499C">
+          <wp:inline distT="0" distB="0" distL="0" distR="0" wp14:anchorId="0C86C008" wp14:editId="28819F7E">
             <wp:extent cx="4476750" cy="2266950"/>
             <wp:effectExtent l="0" t="0" r="0" b="0"/>
             <wp:docPr id="2" name="fig_sentiment.png" descr="Figure 2. Sentiment accuracy on the 960 held-out test reviews." title="Figure 2. Sentiment accuracy on the 960 held-out test reviews."/>
@@ -10187,7 +10187,7 @@
       <w:pPr>
         <w:pStyle w:val="Heading2"/>
       </w:pPr>
-      <w:bookmarkStart w:id="20" w:name="_Toc241868384"/>
+      <w:bookmarkStart w:id="20" w:name="_Toc241868772"/>
       <w:r>
         <w:t>6.4 Issue clustering</w:t>
       </w:r>
@@ -10651,7 +10651,7 @@
       <w:pPr>
         <w:pStyle w:val="Heading2"/>
       </w:pPr>
-      <w:bookmarkStart w:id="21" w:name="_Toc241868385"/>
+      <w:bookmarkStart w:id="21" w:name="_Toc241868773"/>
       <w:r>
         <w:t>6.5 Trend detection and alerts</w:t>
       </w:r>
@@ -11209,7 +11209,7 @@
         </w:rPr>
         <w:lastRenderedPageBreak/>
         <w:drawing>
-          <wp:inline distT="0" distB="0" distL="0" distR="0" wp14:anchorId="44A3B206" wp14:editId="56F16D8A">
+          <wp:inline distT="0" distB="0" distL="0" distR="0" wp14:anchorId="0FD05B2D" wp14:editId="47467BE1">
             <wp:extent cx="5334000" cy="2533650"/>
             <wp:effectExtent l="0" t="0" r="0" b="0"/>
             <wp:docPr id="3" name="fig_spikes.png" descr="Figure 3. Weekly negative reviews for four issue categories in the dashboard data. Circles mark the four alerts sent to Slack." title="Figure 3. Weekly negative reviews for four issue categories in the dashboard data. Circles mark the four alerts sent to Slack."/>
@@ -11276,7 +11276,7 @@
       <w:pPr>
         <w:pStyle w:val="Heading2"/>
       </w:pPr>
-      <w:bookmarkStart w:id="22" w:name="_Toc241868386"/>
+      <w:bookmarkStart w:id="22" w:name="_Toc241868774"/>
       <w:r>
         <w:t>6.6 Response generation and quality checks</w:t>
       </w:r>
@@ -11309,7 +11309,7 @@
           <w:noProof/>
         </w:rPr>
         <w:drawing>
-          <wp:inline distT="0" distB="0" distL="0" distR="0" wp14:anchorId="07042D6A" wp14:editId="464EECA9">
+          <wp:inline distT="0" distB="0" distL="0" distR="0" wp14:anchorId="760B38DB" wp14:editId="27912CC3">
             <wp:extent cx="4476750" cy="2152650"/>
             <wp:effectExtent l="0" t="0" r="0" b="0"/>
             <wp:docPr id="4" name="fig_responses.png" descr="Figure 4. Reply quality, prompt v1 versus v2, scored by the Sonnet 5 judge on 48 replies." title="Figure 4. Reply quality, prompt v1 versus v2, scored by the Sonnet 5 judge on 48 replies."/>
@@ -11927,7 +11927,7 @@
       <w:pPr>
         <w:pStyle w:val="Heading2"/>
       </w:pPr>
-      <w:bookmarkStart w:id="23" w:name="_Toc241868387"/>
+      <w:bookmarkStart w:id="23" w:name="_Toc241868775"/>
       <w:r>
         <w:t>6.7 Dashboard and Slack alerts</w:t>
       </w:r>
@@ -12064,7 +12064,7 @@
       <w:pPr>
         <w:pStyle w:val="Heading2"/>
       </w:pPr>
-      <w:bookmarkStart w:id="24" w:name="_Toc241868388"/>
+      <w:bookmarkStart w:id="24" w:name="_Toc241868776"/>
       <w:r>
         <w:t>6.8 API service and LLMOps</w:t>
       </w:r>
@@ -12531,7 +12531,7 @@
       <w:pPr>
         <w:pStyle w:val="Heading2"/>
       </w:pPr>
-      <w:bookmarkStart w:id="25" w:name="_Toc241868389"/>
+      <w:bookmarkStart w:id="25" w:name="_Toc241868777"/>
       <w:r>
         <w:t>6.9 The full pipeline in n8n (workflow 03)</w:t>
       </w:r>
@@ -13363,7 +13363,7 @@
           <w:noProof/>
         </w:rPr>
         <w:drawing>
-          <wp:inline distT="0" distB="0" distL="0" distR="0" wp14:anchorId="5CD9EF3A" wp14:editId="2FBB6A20">
+          <wp:inline distT="0" distB="0" distL="0" distR="0" wp14:anchorId="076EEA6B" wp14:editId="4523B97A">
             <wp:extent cx="4095750" cy="2019300"/>
             <wp:effectExtent l="0" t="0" r="0" b="0"/>
             <wp:docPr id="5" name="fig_cost.png" descr="Figure 5. Where the money goes: about $2.50 per 1,000 reviews, by stage." title="Figure 5. Where the money goes: about $2.50 per 1,000 reviews, by stage."/>
@@ -13422,7 +13422,7 @@
       <w:pPr>
         <w:pStyle w:val="Heading1"/>
       </w:pPr>
-      <w:bookmarkStart w:id="26" w:name="_Toc241868390"/>
+      <w:bookmarkStart w:id="26" w:name="_Toc241868778"/>
       <w:r>
         <w:t>7. Methods tried, challenges and how we overcame them</w:t>
       </w:r>
@@ -14633,7 +14633,7 @@
       <w:pPr>
         <w:pStyle w:val="Heading1"/>
       </w:pPr>
-      <w:bookmarkStart w:id="27" w:name="_Toc241868391"/>
+      <w:bookmarkStart w:id="27" w:name="_Toc241868779"/>
       <w:r>
         <w:t>8. Test cases, results and experiment log</w:t>
       </w:r>
@@ -14643,7 +14643,7 @@
       <w:pPr>
         <w:pStyle w:val="Heading2"/>
       </w:pPr>
-      <w:bookmarkStart w:id="28" w:name="_Toc241868392"/>
+      <w:bookmarkStart w:id="28" w:name="_Toc241868780"/>
       <w:r>
         <w:t>8.1 Automated tests</w:t>
       </w:r>
@@ -14680,7 +14680,7 @@
       <w:pPr>
         <w:pStyle w:val="Heading2"/>
       </w:pPr>
-      <w:bookmarkStart w:id="29" w:name="_Toc241868393"/>
+      <w:bookmarkStart w:id="29" w:name="_Toc241868781"/>
       <w:r>
         <w:t>8.2 Functional test cases</w:t>
       </w:r>
@@ -16126,7 +16126,7 @@
       <w:pPr>
         <w:pStyle w:val="Heading2"/>
       </w:pPr>
-      <w:bookmarkStart w:id="30" w:name="_Toc241868394"/>
+      <w:bookmarkStart w:id="30" w:name="_Toc241868782"/>
       <w:r>
         <w:lastRenderedPageBreak/>
         <w:t>8.3 Experiment log summary</w:t>
@@ -17412,7 +17412,7 @@
       <w:pPr>
         <w:pStyle w:val="Heading2"/>
       </w:pPr>
-      <w:bookmarkStart w:id="31" w:name="_Toc241868395"/>
+      <w:bookmarkStart w:id="31" w:name="_Toc241868783"/>
       <w:r>
         <w:t>8.4 Claude spend</w:t>
       </w:r>
@@ -17922,14 +17922,14 @@
         <w:spacing w:after="120" w:line="276" w:lineRule="auto"/>
       </w:pPr>
       <w:r>
-        <w:t>Runs of workflow 03 on n8n Cloud, and three earlier cloud executions whose cost was not recorded, add roughly $0.3 to $1.2, so total spend is about $2.8 to $3.7. The Anthropic Console usage page has the exact figure.</w:t>
+        <w:t>The calls logged above add up to about $2.51. Runs on n8n Cloud (including three whose cost was not recorded), the demo app and the final test runs make up the rest. The Anthropic Console shows a total of $4.29 for the whole project, within the $5 budget.</w:t>
       </w:r>
     </w:p>
     <w:p>
       <w:pPr>
         <w:pStyle w:val="Heading1"/>
       </w:pPr>
-      <w:bookmarkStart w:id="32" w:name="_Toc241868396"/>
+      <w:bookmarkStart w:id="32" w:name="_Toc241868784"/>
       <w:r>
         <w:lastRenderedPageBreak/>
         <w:t>9. Demo plan</w:t>
@@ -18769,7 +18769,7 @@
         <w:pStyle w:val="Heading1"/>
         <w:pageBreakBefore/>
       </w:pPr>
-      <w:bookmarkStart w:id="33" w:name="_Toc241868397"/>
+      <w:bookmarkStart w:id="33" w:name="_Toc241868785"/>
       <w:r>
         <w:lastRenderedPageBreak/>
         <w:t>10. How to run the application</w:t>
@@ -18780,7 +18780,7 @@
       <w:pPr>
         <w:pStyle w:val="Heading2"/>
       </w:pPr>
-      <w:bookmarkStart w:id="34" w:name="_Toc241868398"/>
+      <w:bookmarkStart w:id="34" w:name="_Toc241868786"/>
       <w:r>
         <w:t>10.1 Setup (Windows)</w:t>
       </w:r>
@@ -18959,7 +18959,7 @@
       <w:pPr>
         <w:pStyle w:val="Heading2"/>
       </w:pPr>
-      <w:bookmarkStart w:id="35" w:name="_Toc241868399"/>
+      <w:bookmarkStart w:id="35" w:name="_Toc241868787"/>
       <w:r>
         <w:t>10.2 n8n workflows</w:t>
       </w:r>
@@ -19632,7 +19632,7 @@
       <w:pPr>
         <w:pStyle w:val="Heading2"/>
       </w:pPr>
-      <w:bookmarkStart w:id="36" w:name="_Toc241868400"/>
+      <w:bookmarkStart w:id="36" w:name="_Toc241868788"/>
       <w:r>
         <w:t>10.3 Analysis scripts</w:t>
       </w:r>
@@ -19742,7 +19742,7 @@
       <w:pPr>
         <w:pStyle w:val="Heading2"/>
       </w:pPr>
-      <w:bookmarkStart w:id="37" w:name="_Toc241868401"/>
+      <w:bookmarkStart w:id="37" w:name="_Toc241868789"/>
       <w:r>
         <w:t>10.4 API service and tests</w:t>
       </w:r>
@@ -19836,7 +19836,7 @@
       <w:pPr>
         <w:pStyle w:val="Heading2"/>
       </w:pPr>
-      <w:bookmarkStart w:id="38" w:name="_Toc241868402"/>
+      <w:bookmarkStart w:id="38" w:name="_Toc241868790"/>
       <w:r>
         <w:lastRenderedPageBreak/>
         <w:t>10.5 Repository map</w:t>
@@ -20454,7 +20454,7 @@
       <w:pPr>
         <w:pStyle w:val="Heading1"/>
       </w:pPr>
-      <w:bookmarkStart w:id="39" w:name="_Toc241868403"/>
+      <w:bookmarkStart w:id="39" w:name="_Toc241868791"/>
       <w:r>
         <w:t>11. Limitations</w:t>
       </w:r>
@@ -20644,7 +20644,7 @@
       <w:pPr>
         <w:pStyle w:val="Heading1"/>
       </w:pPr>
-      <w:bookmarkStart w:id="40" w:name="_Toc241868404"/>
+      <w:bookmarkStart w:id="40" w:name="_Toc241868792"/>
       <w:r>
         <w:t>12. Future scope and scaling</w:t>
       </w:r>
@@ -20795,7 +20795,7 @@
       <w:pPr>
         <w:pStyle w:val="Heading1"/>
       </w:pPr>
-      <w:bookmarkStart w:id="41" w:name="_Toc241868405"/>
+      <w:bookmarkStart w:id="41" w:name="_Toc241868793"/>
       <w:r>
         <w:t>13. Business perspective</w:t>
       </w:r>
@@ -20835,7 +20835,7 @@
       <w:pPr>
         <w:pStyle w:val="Heading2"/>
       </w:pPr>
-      <w:bookmarkStart w:id="42" w:name="_Toc241868406"/>
+      <w:bookmarkStart w:id="42" w:name="_Toc241868794"/>
       <w:r>
         <w:t>Illustration of the saving</w:t>
       </w:r>
@@ -21393,7 +21393,7 @@
       <w:pPr>
         <w:pStyle w:val="Heading1"/>
       </w:pPr>
-      <w:bookmarkStart w:id="43" w:name="_Toc241868407"/>
+      <w:bookmarkStart w:id="43" w:name="_Toc241868795"/>
       <w:r>
         <w:t>14. Conclusion</w:t>
       </w:r>
@@ -21415,7 +21415,7 @@
       <w:pPr>
         <w:pStyle w:val="Heading1"/>
       </w:pPr>
-      <w:bookmarkStart w:id="44" w:name="_Toc241868408"/>
+      <w:bookmarkStart w:id="44" w:name="_Toc241868796"/>
       <w:r>
         <w:t>References</w:t>
       </w:r>
@@ -21491,7 +21491,7 @@
         <w:pStyle w:val="Heading1"/>
         <w:pageBreakBefore/>
       </w:pPr>
-      <w:bookmarkStart w:id="45" w:name="_Toc241868409"/>
+      <w:bookmarkStart w:id="45" w:name="_Toc241868797"/>
       <w:r>
         <w:lastRenderedPageBreak/>
         <w:t>Appendix A. Prompts and versions</w:t>
@@ -22455,7 +22455,7 @@
       <w:pPr>
         <w:pStyle w:val="Heading1"/>
       </w:pPr>
-      <w:bookmarkStart w:id="46" w:name="_Toc241868410"/>
+      <w:bookmarkStart w:id="46" w:name="_Toc241868798"/>
       <w:r>
         <w:t>Appendix B. Dashboard screenshots</w:t>
       </w:r>

</xml_diff>

<commit_message>
Add demo app screenshots to the final report (Figures B5, B6) and deck (slide 15)
Co-Authored-By: Claude Sonnet 5.5 <noreply@anthropic.com>
</commit_message>
<xml_diff>
--- a/docs/final/Final_Project_Report.docx
+++ b/docs/final/Final_Project_Report.docx
@@ -105,7 +105,7 @@
         <w:pStyle w:val="Heading1"/>
         <w:pageBreakBefore/>
       </w:pPr>
-      <w:bookmarkStart w:id="1" w:name="_Toc241869784"/>
+      <w:bookmarkStart w:id="1" w:name="_Toc241869937"/>
       <w:r>
         <w:lastRenderedPageBreak/>
         <w:t>Team</w:t>
@@ -135,7 +135,7 @@
           <w:left w:w="10" w:type="dxa"/>
           <w:right w:w="10" w:type="dxa"/>
         </w:tblCellMar>
-        <w:tblLook w:val="0000" w:firstRow="0" w:lastRow="0" w:firstColumn="0" w:lastColumn="0" w:noHBand="0" w:noVBand="0"/>
+        <w:tblLook w:val="04A0" w:firstRow="1" w:lastRow="0" w:firstColumn="1" w:lastColumn="0" w:noHBand="0" w:noVBand="1"/>
       </w:tblPr>
       <w:tblGrid>
         <w:gridCol w:w="4200"/>
@@ -668,7 +668,7 @@
       <w:pPr>
         <w:pStyle w:val="Heading2"/>
       </w:pPr>
-      <w:bookmarkStart w:id="2" w:name="_Toc241869785"/>
+      <w:bookmarkStart w:id="2" w:name="_Toc241869938"/>
       <w:r>
         <w:t>How this report is organised</w:t>
       </w:r>
@@ -720,7 +720,7 @@
     <w:sdt>
       <w:sdtPr>
         <w:alias w:val="Contents"/>
-        <w:id w:val="1470084968"/>
+        <w:id w:val="-1689050162"/>
       </w:sdtPr>
       <w:sdtEndPr/>
       <w:sdtContent>
@@ -744,7 +744,7 @@
           <w:r>
             <w:fldChar w:fldCharType="separate"/>
           </w:r>
-          <w:hyperlink w:anchor="_Toc241869784" w:history="1">
+          <w:hyperlink w:anchor="_Toc241869937" w:history="1">
             <w:r>
               <w:rPr>
                 <w:rStyle w:val="Hyperlink"/>
@@ -768,7 +768,7 @@
               <w:rPr>
                 <w:noProof/>
               </w:rPr>
-              <w:instrText xml:space="preserve"> PAGEREF _Toc241869784 \h </w:instrText>
+              <w:instrText xml:space="preserve"> PAGEREF _Toc241869937 \h </w:instrText>
             </w:r>
             <w:r>
               <w:rPr>
@@ -806,7 +806,7 @@
               <w:noProof/>
             </w:rPr>
           </w:pPr>
-          <w:hyperlink w:anchor="_Toc241869785" w:history="1">
+          <w:hyperlink w:anchor="_Toc241869938" w:history="1">
             <w:r>
               <w:rPr>
                 <w:rStyle w:val="Hyperlink"/>
@@ -830,7 +830,7 @@
               <w:rPr>
                 <w:noProof/>
               </w:rPr>
-              <w:instrText xml:space="preserve"> PAGEREF _Toc241869785 \h </w:instrText>
+              <w:instrText xml:space="preserve"> PAGEREF _Toc241869938 \h </w:instrText>
             </w:r>
             <w:r>
               <w:rPr>
@@ -868,7 +868,7 @@
               <w:noProof/>
             </w:rPr>
           </w:pPr>
-          <w:hyperlink w:anchor="_Toc241869786" w:history="1">
+          <w:hyperlink w:anchor="_Toc241869939" w:history="1">
             <w:r>
               <w:rPr>
                 <w:rStyle w:val="Hyperlink"/>
@@ -892,7 +892,7 @@
               <w:rPr>
                 <w:noProof/>
               </w:rPr>
-              <w:instrText xml:space="preserve"> PAGEREF _Toc241869786 \h </w:instrText>
+              <w:instrText xml:space="preserve"> PAGEREF _Toc241869939 \h </w:instrText>
             </w:r>
             <w:r>
               <w:rPr>
@@ -930,7 +930,7 @@
               <w:noProof/>
             </w:rPr>
           </w:pPr>
-          <w:hyperlink w:anchor="_Toc241869787" w:history="1">
+          <w:hyperlink w:anchor="_Toc241869940" w:history="1">
             <w:r>
               <w:rPr>
                 <w:rStyle w:val="Hyperlink"/>
@@ -954,7 +954,7 @@
               <w:rPr>
                 <w:noProof/>
               </w:rPr>
-              <w:instrText xml:space="preserve"> PAGEREF _Toc241869787 \h </w:instrText>
+              <w:instrText xml:space="preserve"> PAGEREF _Toc241869940 \h </w:instrText>
             </w:r>
             <w:r>
               <w:rPr>
@@ -992,7 +992,7 @@
               <w:noProof/>
             </w:rPr>
           </w:pPr>
-          <w:hyperlink w:anchor="_Toc241869788" w:history="1">
+          <w:hyperlink w:anchor="_Toc241869941" w:history="1">
             <w:r>
               <w:rPr>
                 <w:rStyle w:val="Hyperlink"/>
@@ -1016,7 +1016,7 @@
               <w:rPr>
                 <w:noProof/>
               </w:rPr>
-              <w:instrText xml:space="preserve"> PAGEREF _Toc241869788 \h </w:instrText>
+              <w:instrText xml:space="preserve"> PAGEREF _Toc241869941 \h </w:instrText>
             </w:r>
             <w:r>
               <w:rPr>
@@ -1054,7 +1054,7 @@
               <w:noProof/>
             </w:rPr>
           </w:pPr>
-          <w:hyperlink w:anchor="_Toc241869789" w:history="1">
+          <w:hyperlink w:anchor="_Toc241869942" w:history="1">
             <w:r>
               <w:rPr>
                 <w:rStyle w:val="Hyperlink"/>
@@ -1078,7 +1078,7 @@
               <w:rPr>
                 <w:noProof/>
               </w:rPr>
-              <w:instrText xml:space="preserve"> PAGEREF _Toc241869789 \h </w:instrText>
+              <w:instrText xml:space="preserve"> PAGEREF _Toc241869942 \h </w:instrText>
             </w:r>
             <w:r>
               <w:rPr>
@@ -1116,7 +1116,7 @@
               <w:noProof/>
             </w:rPr>
           </w:pPr>
-          <w:hyperlink w:anchor="_Toc241869790" w:history="1">
+          <w:hyperlink w:anchor="_Toc241869943" w:history="1">
             <w:r>
               <w:rPr>
                 <w:rStyle w:val="Hyperlink"/>
@@ -1140,7 +1140,7 @@
               <w:rPr>
                 <w:noProof/>
               </w:rPr>
-              <w:instrText xml:space="preserve"> PAGEREF _Toc241869790 \h </w:instrText>
+              <w:instrText xml:space="preserve"> PAGEREF _Toc241869943 \h </w:instrText>
             </w:r>
             <w:r>
               <w:rPr>
@@ -1178,7 +1178,7 @@
               <w:noProof/>
             </w:rPr>
           </w:pPr>
-          <w:hyperlink w:anchor="_Toc241869791" w:history="1">
+          <w:hyperlink w:anchor="_Toc241869944" w:history="1">
             <w:r>
               <w:rPr>
                 <w:rStyle w:val="Hyperlink"/>
@@ -1202,7 +1202,7 @@
               <w:rPr>
                 <w:noProof/>
               </w:rPr>
-              <w:instrText xml:space="preserve"> PAGEREF _Toc241869791 \h </w:instrText>
+              <w:instrText xml:space="preserve"> PAGEREF _Toc241869944 \h </w:instrText>
             </w:r>
             <w:r>
               <w:rPr>
@@ -1240,7 +1240,7 @@
               <w:noProof/>
             </w:rPr>
           </w:pPr>
-          <w:hyperlink w:anchor="_Toc241869792" w:history="1">
+          <w:hyperlink w:anchor="_Toc241869945" w:history="1">
             <w:r>
               <w:rPr>
                 <w:rStyle w:val="Hyperlink"/>
@@ -1264,7 +1264,7 @@
               <w:rPr>
                 <w:noProof/>
               </w:rPr>
-              <w:instrText xml:space="preserve"> PAGEREF _Toc241869792 \h </w:instrText>
+              <w:instrText xml:space="preserve"> PAGEREF _Toc241869945 \h </w:instrText>
             </w:r>
             <w:r>
               <w:rPr>
@@ -1302,7 +1302,7 @@
               <w:noProof/>
             </w:rPr>
           </w:pPr>
-          <w:hyperlink w:anchor="_Toc241869793" w:history="1">
+          <w:hyperlink w:anchor="_Toc241869946" w:history="1">
             <w:r>
               <w:rPr>
                 <w:rStyle w:val="Hyperlink"/>
@@ -1326,7 +1326,7 @@
               <w:rPr>
                 <w:noProof/>
               </w:rPr>
-              <w:instrText xml:space="preserve"> PAGEREF _Toc241869793 \h </w:instrText>
+              <w:instrText xml:space="preserve"> PAGEREF _Toc241869946 \h </w:instrText>
             </w:r>
             <w:r>
               <w:rPr>
@@ -1364,7 +1364,7 @@
               <w:noProof/>
             </w:rPr>
           </w:pPr>
-          <w:hyperlink w:anchor="_Toc241869794" w:history="1">
+          <w:hyperlink w:anchor="_Toc241869947" w:history="1">
             <w:r>
               <w:rPr>
                 <w:rStyle w:val="Hyperlink"/>
@@ -1388,7 +1388,7 @@
               <w:rPr>
                 <w:noProof/>
               </w:rPr>
-              <w:instrText xml:space="preserve"> PAGEREF _Toc241869794 \h </w:instrText>
+              <w:instrText xml:space="preserve"> PAGEREF _Toc241869947 \h </w:instrText>
             </w:r>
             <w:r>
               <w:rPr>
@@ -1426,7 +1426,7 @@
               <w:noProof/>
             </w:rPr>
           </w:pPr>
-          <w:hyperlink w:anchor="_Toc241869795" w:history="1">
+          <w:hyperlink w:anchor="_Toc241869948" w:history="1">
             <w:r>
               <w:rPr>
                 <w:rStyle w:val="Hyperlink"/>
@@ -1450,7 +1450,7 @@
               <w:rPr>
                 <w:noProof/>
               </w:rPr>
-              <w:instrText xml:space="preserve"> PAGEREF _Toc241869795 \h </w:instrText>
+              <w:instrText xml:space="preserve"> PAGEREF _Toc241869948 \h </w:instrText>
             </w:r>
             <w:r>
               <w:rPr>
@@ -1488,7 +1488,7 @@
               <w:noProof/>
             </w:rPr>
           </w:pPr>
-          <w:hyperlink w:anchor="_Toc241869796" w:history="1">
+          <w:hyperlink w:anchor="_Toc241869949" w:history="1">
             <w:r>
               <w:rPr>
                 <w:rStyle w:val="Hyperlink"/>
@@ -1512,7 +1512,7 @@
               <w:rPr>
                 <w:noProof/>
               </w:rPr>
-              <w:instrText xml:space="preserve"> PAGEREF _Toc241869796 \h </w:instrText>
+              <w:instrText xml:space="preserve"> PAGEREF _Toc241869949 \h </w:instrText>
             </w:r>
             <w:r>
               <w:rPr>
@@ -1550,7 +1550,7 @@
               <w:noProof/>
             </w:rPr>
           </w:pPr>
-          <w:hyperlink w:anchor="_Toc241869797" w:history="1">
+          <w:hyperlink w:anchor="_Toc241869950" w:history="1">
             <w:r>
               <w:rPr>
                 <w:rStyle w:val="Hyperlink"/>
@@ -1574,7 +1574,7 @@
               <w:rPr>
                 <w:noProof/>
               </w:rPr>
-              <w:instrText xml:space="preserve"> PAGEREF _Toc241869797 \h </w:instrText>
+              <w:instrText xml:space="preserve"> PAGEREF _Toc241869950 \h </w:instrText>
             </w:r>
             <w:r>
               <w:rPr>
@@ -1612,7 +1612,7 @@
               <w:noProof/>
             </w:rPr>
           </w:pPr>
-          <w:hyperlink w:anchor="_Toc241869798" w:history="1">
+          <w:hyperlink w:anchor="_Toc241869951" w:history="1">
             <w:r>
               <w:rPr>
                 <w:rStyle w:val="Hyperlink"/>
@@ -1636,7 +1636,7 @@
               <w:rPr>
                 <w:noProof/>
               </w:rPr>
-              <w:instrText xml:space="preserve"> PAGEREF _Toc241869798 \h </w:instrText>
+              <w:instrText xml:space="preserve"> PAGEREF _Toc241869951 \h </w:instrText>
             </w:r>
             <w:r>
               <w:rPr>
@@ -1674,7 +1674,7 @@
               <w:noProof/>
             </w:rPr>
           </w:pPr>
-          <w:hyperlink w:anchor="_Toc241869799" w:history="1">
+          <w:hyperlink w:anchor="_Toc241869952" w:history="1">
             <w:r>
               <w:rPr>
                 <w:rStyle w:val="Hyperlink"/>
@@ -1698,7 +1698,7 @@
               <w:rPr>
                 <w:noProof/>
               </w:rPr>
-              <w:instrText xml:space="preserve"> PAGEREF _Toc241869799 \h </w:instrText>
+              <w:instrText xml:space="preserve"> PAGEREF _Toc241869952 \h </w:instrText>
             </w:r>
             <w:r>
               <w:rPr>
@@ -1736,7 +1736,7 @@
               <w:noProof/>
             </w:rPr>
           </w:pPr>
-          <w:hyperlink w:anchor="_Toc241869800" w:history="1">
+          <w:hyperlink w:anchor="_Toc241869953" w:history="1">
             <w:r>
               <w:rPr>
                 <w:rStyle w:val="Hyperlink"/>
@@ -1760,7 +1760,7 @@
               <w:rPr>
                 <w:noProof/>
               </w:rPr>
-              <w:instrText xml:space="preserve"> PAGEREF _Toc241869800 \h </w:instrText>
+              <w:instrText xml:space="preserve"> PAGEREF _Toc241869953 \h </w:instrText>
             </w:r>
             <w:r>
               <w:rPr>
@@ -1798,7 +1798,7 @@
               <w:noProof/>
             </w:rPr>
           </w:pPr>
-          <w:hyperlink w:anchor="_Toc241869801" w:history="1">
+          <w:hyperlink w:anchor="_Toc241869954" w:history="1">
             <w:r>
               <w:rPr>
                 <w:rStyle w:val="Hyperlink"/>
@@ -1822,7 +1822,7 @@
               <w:rPr>
                 <w:noProof/>
               </w:rPr>
-              <w:instrText xml:space="preserve"> PAGEREF _Toc241869801 \h </w:instrText>
+              <w:instrText xml:space="preserve"> PAGEREF _Toc241869954 \h </w:instrText>
             </w:r>
             <w:r>
               <w:rPr>
@@ -1860,7 +1860,7 @@
               <w:noProof/>
             </w:rPr>
           </w:pPr>
-          <w:hyperlink w:anchor="_Toc241869802" w:history="1">
+          <w:hyperlink w:anchor="_Toc241869955" w:history="1">
             <w:r>
               <w:rPr>
                 <w:rStyle w:val="Hyperlink"/>
@@ -1884,7 +1884,7 @@
               <w:rPr>
                 <w:noProof/>
               </w:rPr>
-              <w:instrText xml:space="preserve"> PAGEREF _Toc241869802 \h </w:instrText>
+              <w:instrText xml:space="preserve"> PAGEREF _Toc241869955 \h </w:instrText>
             </w:r>
             <w:r>
               <w:rPr>
@@ -1922,7 +1922,7 @@
               <w:noProof/>
             </w:rPr>
           </w:pPr>
-          <w:hyperlink w:anchor="_Toc241869803" w:history="1">
+          <w:hyperlink w:anchor="_Toc241869956" w:history="1">
             <w:r>
               <w:rPr>
                 <w:rStyle w:val="Hyperlink"/>
@@ -1946,7 +1946,7 @@
               <w:rPr>
                 <w:noProof/>
               </w:rPr>
-              <w:instrText xml:space="preserve"> PAGEREF _Toc241869803 \h </w:instrText>
+              <w:instrText xml:space="preserve"> PAGEREF _Toc241869956 \h </w:instrText>
             </w:r>
             <w:r>
               <w:rPr>
@@ -1984,7 +1984,7 @@
               <w:noProof/>
             </w:rPr>
           </w:pPr>
-          <w:hyperlink w:anchor="_Toc241869804" w:history="1">
+          <w:hyperlink w:anchor="_Toc241869957" w:history="1">
             <w:r>
               <w:rPr>
                 <w:rStyle w:val="Hyperlink"/>
@@ -2008,7 +2008,7 @@
               <w:rPr>
                 <w:noProof/>
               </w:rPr>
-              <w:instrText xml:space="preserve"> PAGEREF _Toc241869804 \h </w:instrText>
+              <w:instrText xml:space="preserve"> PAGEREF _Toc241869957 \h </w:instrText>
             </w:r>
             <w:r>
               <w:rPr>
@@ -2046,7 +2046,7 @@
               <w:noProof/>
             </w:rPr>
           </w:pPr>
-          <w:hyperlink w:anchor="_Toc241869805" w:history="1">
+          <w:hyperlink w:anchor="_Toc241869958" w:history="1">
             <w:r>
               <w:rPr>
                 <w:rStyle w:val="Hyperlink"/>
@@ -2070,7 +2070,7 @@
               <w:rPr>
                 <w:noProof/>
               </w:rPr>
-              <w:instrText xml:space="preserve"> PAGEREF _Toc241869805 \h </w:instrText>
+              <w:instrText xml:space="preserve"> PAGEREF _Toc241869958 \h </w:instrText>
             </w:r>
             <w:r>
               <w:rPr>
@@ -2108,7 +2108,7 @@
               <w:noProof/>
             </w:rPr>
           </w:pPr>
-          <w:hyperlink w:anchor="_Toc241869806" w:history="1">
+          <w:hyperlink w:anchor="_Toc241869959" w:history="1">
             <w:r>
               <w:rPr>
                 <w:rStyle w:val="Hyperlink"/>
@@ -2132,7 +2132,7 @@
               <w:rPr>
                 <w:noProof/>
               </w:rPr>
-              <w:instrText xml:space="preserve"> PAGEREF _Toc241869806 \h </w:instrText>
+              <w:instrText xml:space="preserve"> PAGEREF _Toc241869959 \h </w:instrText>
             </w:r>
             <w:r>
               <w:rPr>
@@ -2170,7 +2170,7 @@
               <w:noProof/>
             </w:rPr>
           </w:pPr>
-          <w:hyperlink w:anchor="_Toc241869807" w:history="1">
+          <w:hyperlink w:anchor="_Toc241869960" w:history="1">
             <w:r>
               <w:rPr>
                 <w:rStyle w:val="Hyperlink"/>
@@ -2194,7 +2194,7 @@
               <w:rPr>
                 <w:noProof/>
               </w:rPr>
-              <w:instrText xml:space="preserve"> PAGEREF _Toc241869807 \h </w:instrText>
+              <w:instrText xml:space="preserve"> PAGEREF _Toc241869960 \h </w:instrText>
             </w:r>
             <w:r>
               <w:rPr>
@@ -2232,7 +2232,7 @@
               <w:noProof/>
             </w:rPr>
           </w:pPr>
-          <w:hyperlink w:anchor="_Toc241869808" w:history="1">
+          <w:hyperlink w:anchor="_Toc241869961" w:history="1">
             <w:r>
               <w:rPr>
                 <w:rStyle w:val="Hyperlink"/>
@@ -2256,7 +2256,7 @@
               <w:rPr>
                 <w:noProof/>
               </w:rPr>
-              <w:instrText xml:space="preserve"> PAGEREF _Toc241869808 \h </w:instrText>
+              <w:instrText xml:space="preserve"> PAGEREF _Toc241869961 \h </w:instrText>
             </w:r>
             <w:r>
               <w:rPr>
@@ -2294,7 +2294,7 @@
               <w:noProof/>
             </w:rPr>
           </w:pPr>
-          <w:hyperlink w:anchor="_Toc241869809" w:history="1">
+          <w:hyperlink w:anchor="_Toc241869962" w:history="1">
             <w:r>
               <w:rPr>
                 <w:rStyle w:val="Hyperlink"/>
@@ -2318,7 +2318,7 @@
               <w:rPr>
                 <w:noProof/>
               </w:rPr>
-              <w:instrText xml:space="preserve"> PAGEREF _Toc241869809 \h </w:instrText>
+              <w:instrText xml:space="preserve"> PAGEREF _Toc241869962 \h </w:instrText>
             </w:r>
             <w:r>
               <w:rPr>
@@ -2356,7 +2356,7 @@
               <w:noProof/>
             </w:rPr>
           </w:pPr>
-          <w:hyperlink w:anchor="_Toc241869810" w:history="1">
+          <w:hyperlink w:anchor="_Toc241869963" w:history="1">
             <w:r>
               <w:rPr>
                 <w:rStyle w:val="Hyperlink"/>
@@ -2380,7 +2380,7 @@
               <w:rPr>
                 <w:noProof/>
               </w:rPr>
-              <w:instrText xml:space="preserve"> PAGEREF _Toc241869810 \h </w:instrText>
+              <w:instrText xml:space="preserve"> PAGEREF _Toc241869963 \h </w:instrText>
             </w:r>
             <w:r>
               <w:rPr>
@@ -2418,7 +2418,7 @@
               <w:noProof/>
             </w:rPr>
           </w:pPr>
-          <w:hyperlink w:anchor="_Toc241869811" w:history="1">
+          <w:hyperlink w:anchor="_Toc241869964" w:history="1">
             <w:r>
               <w:rPr>
                 <w:rStyle w:val="Hyperlink"/>
@@ -2442,7 +2442,7 @@
               <w:rPr>
                 <w:noProof/>
               </w:rPr>
-              <w:instrText xml:space="preserve"> PAGEREF _Toc241869811 \h </w:instrText>
+              <w:instrText xml:space="preserve"> PAGEREF _Toc241869964 \h </w:instrText>
             </w:r>
             <w:r>
               <w:rPr>
@@ -2480,7 +2480,7 @@
               <w:noProof/>
             </w:rPr>
           </w:pPr>
-          <w:hyperlink w:anchor="_Toc241869812" w:history="1">
+          <w:hyperlink w:anchor="_Toc241869965" w:history="1">
             <w:r>
               <w:rPr>
                 <w:rStyle w:val="Hyperlink"/>
@@ -2504,7 +2504,7 @@
               <w:rPr>
                 <w:noProof/>
               </w:rPr>
-              <w:instrText xml:space="preserve"> PAGEREF _Toc241869812 \h </w:instrText>
+              <w:instrText xml:space="preserve"> PAGEREF _Toc241869965 \h </w:instrText>
             </w:r>
             <w:r>
               <w:rPr>
@@ -2542,7 +2542,7 @@
               <w:noProof/>
             </w:rPr>
           </w:pPr>
-          <w:hyperlink w:anchor="_Toc241869813" w:history="1">
+          <w:hyperlink w:anchor="_Toc241869966" w:history="1">
             <w:r>
               <w:rPr>
                 <w:rStyle w:val="Hyperlink"/>
@@ -2566,7 +2566,7 @@
               <w:rPr>
                 <w:noProof/>
               </w:rPr>
-              <w:instrText xml:space="preserve"> PAGEREF _Toc241869813 \h </w:instrText>
+              <w:instrText xml:space="preserve"> PAGEREF _Toc241869966 \h </w:instrText>
             </w:r>
             <w:r>
               <w:rPr>
@@ -2604,7 +2604,7 @@
               <w:noProof/>
             </w:rPr>
           </w:pPr>
-          <w:hyperlink w:anchor="_Toc241869814" w:history="1">
+          <w:hyperlink w:anchor="_Toc241869967" w:history="1">
             <w:r>
               <w:rPr>
                 <w:rStyle w:val="Hyperlink"/>
@@ -2628,7 +2628,7 @@
               <w:rPr>
                 <w:noProof/>
               </w:rPr>
-              <w:instrText xml:space="preserve"> PAGEREF _Toc241869814 \h </w:instrText>
+              <w:instrText xml:space="preserve"> PAGEREF _Toc241869967 \h </w:instrText>
             </w:r>
             <w:r>
               <w:rPr>
@@ -2666,7 +2666,7 @@
               <w:noProof/>
             </w:rPr>
           </w:pPr>
-          <w:hyperlink w:anchor="_Toc241869815" w:history="1">
+          <w:hyperlink w:anchor="_Toc241869968" w:history="1">
             <w:r>
               <w:rPr>
                 <w:rStyle w:val="Hyperlink"/>
@@ -2690,7 +2690,7 @@
               <w:rPr>
                 <w:noProof/>
               </w:rPr>
-              <w:instrText xml:space="preserve"> PAGEREF _Toc241869815 \h </w:instrText>
+              <w:instrText xml:space="preserve"> PAGEREF _Toc241869968 \h </w:instrText>
             </w:r>
             <w:r>
               <w:rPr>
@@ -2728,7 +2728,7 @@
               <w:noProof/>
             </w:rPr>
           </w:pPr>
-          <w:hyperlink w:anchor="_Toc241869816" w:history="1">
+          <w:hyperlink w:anchor="_Toc241869969" w:history="1">
             <w:r>
               <w:rPr>
                 <w:rStyle w:val="Hyperlink"/>
@@ -2752,7 +2752,7 @@
               <w:rPr>
                 <w:noProof/>
               </w:rPr>
-              <w:instrText xml:space="preserve"> PAGEREF _Toc241869816 \h </w:instrText>
+              <w:instrText xml:space="preserve"> PAGEREF _Toc241869969 \h </w:instrText>
             </w:r>
             <w:r>
               <w:rPr>
@@ -2790,7 +2790,7 @@
               <w:noProof/>
             </w:rPr>
           </w:pPr>
-          <w:hyperlink w:anchor="_Toc241869817" w:history="1">
+          <w:hyperlink w:anchor="_Toc241869970" w:history="1">
             <w:r>
               <w:rPr>
                 <w:rStyle w:val="Hyperlink"/>
@@ -2814,7 +2814,7 @@
               <w:rPr>
                 <w:noProof/>
               </w:rPr>
-              <w:instrText xml:space="preserve"> PAGEREF _Toc241869817 \h </w:instrText>
+              <w:instrText xml:space="preserve"> PAGEREF _Toc241869970 \h </w:instrText>
             </w:r>
             <w:r>
               <w:rPr>
@@ -2852,7 +2852,7 @@
               <w:noProof/>
             </w:rPr>
           </w:pPr>
-          <w:hyperlink w:anchor="_Toc241869818" w:history="1">
+          <w:hyperlink w:anchor="_Toc241869971" w:history="1">
             <w:r>
               <w:rPr>
                 <w:rStyle w:val="Hyperlink"/>
@@ -2876,7 +2876,7 @@
               <w:rPr>
                 <w:noProof/>
               </w:rPr>
-              <w:instrText xml:space="preserve"> PAGEREF _Toc241869818 \h </w:instrText>
+              <w:instrText xml:space="preserve"> PAGEREF _Toc241869971 \h </w:instrText>
             </w:r>
             <w:r>
               <w:rPr>
@@ -2914,7 +2914,7 @@
               <w:noProof/>
             </w:rPr>
           </w:pPr>
-          <w:hyperlink w:anchor="_Toc241869819" w:history="1">
+          <w:hyperlink w:anchor="_Toc241869972" w:history="1">
             <w:r>
               <w:rPr>
                 <w:rStyle w:val="Hyperlink"/>
@@ -2938,7 +2938,7 @@
               <w:rPr>
                 <w:noProof/>
               </w:rPr>
-              <w:instrText xml:space="preserve"> PAGEREF _Toc241869819 \h </w:instrText>
+              <w:instrText xml:space="preserve"> PAGEREF _Toc241869972 \h </w:instrText>
             </w:r>
             <w:r>
               <w:rPr>
@@ -2976,7 +2976,7 @@
               <w:noProof/>
             </w:rPr>
           </w:pPr>
-          <w:hyperlink w:anchor="_Toc241869820" w:history="1">
+          <w:hyperlink w:anchor="_Toc241869973" w:history="1">
             <w:r>
               <w:rPr>
                 <w:rStyle w:val="Hyperlink"/>
@@ -3000,7 +3000,7 @@
               <w:rPr>
                 <w:noProof/>
               </w:rPr>
-              <w:instrText xml:space="preserve"> PAGEREF _Toc241869820 \h </w:instrText>
+              <w:instrText xml:space="preserve"> PAGEREF _Toc241869973 \h </w:instrText>
             </w:r>
             <w:r>
               <w:rPr>
@@ -3038,7 +3038,7 @@
               <w:noProof/>
             </w:rPr>
           </w:pPr>
-          <w:hyperlink w:anchor="_Toc241869821" w:history="1">
+          <w:hyperlink w:anchor="_Toc241869974" w:history="1">
             <w:r>
               <w:rPr>
                 <w:rStyle w:val="Hyperlink"/>
@@ -3062,7 +3062,7 @@
               <w:rPr>
                 <w:noProof/>
               </w:rPr>
-              <w:instrText xml:space="preserve"> PAGEREF _Toc241869821 \h </w:instrText>
+              <w:instrText xml:space="preserve"> PAGEREF _Toc241869974 \h </w:instrText>
             </w:r>
             <w:r>
               <w:rPr>
@@ -3100,7 +3100,7 @@
               <w:noProof/>
             </w:rPr>
           </w:pPr>
-          <w:hyperlink w:anchor="_Toc241869822" w:history="1">
+          <w:hyperlink w:anchor="_Toc241869975" w:history="1">
             <w:r>
               <w:rPr>
                 <w:rStyle w:val="Hyperlink"/>
@@ -3124,7 +3124,7 @@
               <w:rPr>
                 <w:noProof/>
               </w:rPr>
-              <w:instrText xml:space="preserve"> PAGEREF _Toc241869822 \h </w:instrText>
+              <w:instrText xml:space="preserve"> PAGEREF _Toc241869975 \h </w:instrText>
             </w:r>
             <w:r>
               <w:rPr>
@@ -3162,7 +3162,7 @@
               <w:noProof/>
             </w:rPr>
           </w:pPr>
-          <w:hyperlink w:anchor="_Toc241869823" w:history="1">
+          <w:hyperlink w:anchor="_Toc241869976" w:history="1">
             <w:r>
               <w:rPr>
                 <w:rStyle w:val="Hyperlink"/>
@@ -3186,7 +3186,7 @@
               <w:rPr>
                 <w:noProof/>
               </w:rPr>
-              <w:instrText xml:space="preserve"> PAGEREF _Toc241869823 \h </w:instrText>
+              <w:instrText xml:space="preserve"> PAGEREF _Toc241869976 \h </w:instrText>
             </w:r>
             <w:r>
               <w:rPr>
@@ -3224,7 +3224,7 @@
               <w:noProof/>
             </w:rPr>
           </w:pPr>
-          <w:hyperlink w:anchor="_Toc241869824" w:history="1">
+          <w:hyperlink w:anchor="_Toc241869977" w:history="1">
             <w:r>
               <w:rPr>
                 <w:rStyle w:val="Hyperlink"/>
@@ -3248,7 +3248,7 @@
               <w:rPr>
                 <w:noProof/>
               </w:rPr>
-              <w:instrText xml:space="preserve"> PAGEREF _Toc241869824 \h </w:instrText>
+              <w:instrText xml:space="preserve"> PAGEREF _Toc241869977 \h </w:instrText>
             </w:r>
             <w:r>
               <w:rPr>
@@ -3286,7 +3286,7 @@
               <w:noProof/>
             </w:rPr>
           </w:pPr>
-          <w:hyperlink w:anchor="_Toc241869825" w:history="1">
+          <w:hyperlink w:anchor="_Toc241869978" w:history="1">
             <w:r>
               <w:rPr>
                 <w:rStyle w:val="Hyperlink"/>
@@ -3310,7 +3310,7 @@
               <w:rPr>
                 <w:noProof/>
               </w:rPr>
-              <w:instrText xml:space="preserve"> PAGEREF _Toc241869825 \h </w:instrText>
+              <w:instrText xml:space="preserve"> PAGEREF _Toc241869978 \h </w:instrText>
             </w:r>
             <w:r>
               <w:rPr>
@@ -3348,7 +3348,7 @@
               <w:noProof/>
             </w:rPr>
           </w:pPr>
-          <w:hyperlink w:anchor="_Toc241869826" w:history="1">
+          <w:hyperlink w:anchor="_Toc241869979" w:history="1">
             <w:r>
               <w:rPr>
                 <w:rStyle w:val="Hyperlink"/>
@@ -3372,7 +3372,7 @@
               <w:rPr>
                 <w:noProof/>
               </w:rPr>
-              <w:instrText xml:space="preserve"> PAGEREF _Toc241869826 \h </w:instrText>
+              <w:instrText xml:space="preserve"> PAGEREF _Toc241869979 \h </w:instrText>
             </w:r>
             <w:r>
               <w:rPr>
@@ -3410,7 +3410,7 @@
               <w:noProof/>
             </w:rPr>
           </w:pPr>
-          <w:hyperlink w:anchor="_Toc241869827" w:history="1">
+          <w:hyperlink w:anchor="_Toc241869980" w:history="1">
             <w:r>
               <w:rPr>
                 <w:rStyle w:val="Hyperlink"/>
@@ -3434,7 +3434,7 @@
               <w:rPr>
                 <w:noProof/>
               </w:rPr>
-              <w:instrText xml:space="preserve"> PAGEREF _Toc241869827 \h </w:instrText>
+              <w:instrText xml:space="preserve"> PAGEREF _Toc241869980 \h </w:instrText>
             </w:r>
             <w:r>
               <w:rPr>
@@ -3472,7 +3472,7 @@
               <w:noProof/>
             </w:rPr>
           </w:pPr>
-          <w:hyperlink w:anchor="_Toc241869828" w:history="1">
+          <w:hyperlink w:anchor="_Toc241869981" w:history="1">
             <w:r>
               <w:rPr>
                 <w:rStyle w:val="Hyperlink"/>
@@ -3496,7 +3496,7 @@
               <w:rPr>
                 <w:noProof/>
               </w:rPr>
-              <w:instrText xml:space="preserve"> PAGEREF _Toc241869828 \h </w:instrText>
+              <w:instrText xml:space="preserve"> PAGEREF _Toc241869981 \h </w:instrText>
             </w:r>
             <w:r>
               <w:rPr>
@@ -3534,7 +3534,7 @@
               <w:noProof/>
             </w:rPr>
           </w:pPr>
-          <w:hyperlink w:anchor="_Toc241869829" w:history="1">
+          <w:hyperlink w:anchor="_Toc241869982" w:history="1">
             <w:r>
               <w:rPr>
                 <w:rStyle w:val="Hyperlink"/>
@@ -3558,7 +3558,7 @@
               <w:rPr>
                 <w:noProof/>
               </w:rPr>
-              <w:instrText xml:space="preserve"> PAGEREF _Toc241869829 \h </w:instrText>
+              <w:instrText xml:space="preserve"> PAGEREF _Toc241869982 \h </w:instrText>
             </w:r>
             <w:r>
               <w:rPr>
@@ -3596,7 +3596,7 @@
               <w:noProof/>
             </w:rPr>
           </w:pPr>
-          <w:hyperlink w:anchor="_Toc241869830" w:history="1">
+          <w:hyperlink w:anchor="_Toc241869983" w:history="1">
             <w:r>
               <w:rPr>
                 <w:rStyle w:val="Hyperlink"/>
@@ -3620,7 +3620,7 @@
               <w:rPr>
                 <w:noProof/>
               </w:rPr>
-              <w:instrText xml:space="preserve"> PAGEREF _Toc241869830 \h </w:instrText>
+              <w:instrText xml:space="preserve"> PAGEREF _Toc241869983 \h </w:instrText>
             </w:r>
             <w:r>
               <w:rPr>
@@ -3658,13 +3658,13 @@
               <w:noProof/>
             </w:rPr>
           </w:pPr>
-          <w:hyperlink w:anchor="_Toc241869831" w:history="1">
+          <w:hyperlink w:anchor="_Toc241869984" w:history="1">
             <w:r>
               <w:rPr>
                 <w:rStyle w:val="Hyperlink"/>
                 <w:noProof/>
               </w:rPr>
-              <w:t>Appendix B. Dashboard screenshots</w:t>
+              <w:t>Appendix B. Dashboard, alert and demo app screenshots</w:t>
             </w:r>
             <w:r>
               <w:rPr>
@@ -3682,7 +3682,7 @@
               <w:rPr>
                 <w:noProof/>
               </w:rPr>
-              <w:instrText xml:space="preserve"> PAGEREF _Toc241869831 \h </w:instrText>
+              <w:instrText xml:space="preserve"> PAGEREF _Toc241869984 \h </w:instrText>
             </w:r>
             <w:r>
               <w:rPr>
@@ -3721,7 +3721,7 @@
         <w:pStyle w:val="Heading1"/>
         <w:pageBreakBefore/>
       </w:pPr>
-      <w:bookmarkStart w:id="3" w:name="_Toc241869786"/>
+      <w:bookmarkStart w:id="3" w:name="_Toc241869939"/>
       <w:r>
         <w:lastRenderedPageBreak/>
         <w:t>1. Executive summary</w:t>
@@ -3760,7 +3760,7 @@
       <w:pPr>
         <w:pStyle w:val="Heading2"/>
       </w:pPr>
-      <w:bookmarkStart w:id="4" w:name="_Toc241869787"/>
+      <w:bookmarkStart w:id="4" w:name="_Toc241869940"/>
       <w:r>
         <w:t>Results against the targets</w:t>
       </w:r>
@@ -3781,7 +3781,7 @@
           <w:left w:w="10" w:type="dxa"/>
           <w:right w:w="10" w:type="dxa"/>
         </w:tblCellMar>
-        <w:tblLook w:val="0000" w:firstRow="0" w:lastRow="0" w:firstColumn="0" w:lastColumn="0" w:noHBand="0" w:noVBand="0"/>
+        <w:tblLook w:val="04A0" w:firstRow="1" w:lastRow="0" w:firstColumn="1" w:lastColumn="0" w:noHBand="0" w:noVBand="1"/>
       </w:tblPr>
       <w:tblGrid>
         <w:gridCol w:w="2700"/>
@@ -4675,7 +4675,7 @@
       <w:pPr>
         <w:pStyle w:val="Heading1"/>
       </w:pPr>
-      <w:bookmarkStart w:id="5" w:name="_Toc241869788"/>
+      <w:bookmarkStart w:id="5" w:name="_Toc241869941"/>
       <w:r>
         <w:t>2. Problem statement</w:t>
       </w:r>
@@ -4783,7 +4783,7 @@
       <w:pPr>
         <w:pStyle w:val="Heading2"/>
       </w:pPr>
-      <w:bookmarkStart w:id="6" w:name="_Toc241869789"/>
+      <w:bookmarkStart w:id="6" w:name="_Toc241869942"/>
       <w:r>
         <w:t>Current methods and where they fail</w:t>
       </w:r>
@@ -4804,7 +4804,7 @@
           <w:left w:w="10" w:type="dxa"/>
           <w:right w:w="10" w:type="dxa"/>
         </w:tblCellMar>
-        <w:tblLook w:val="0000" w:firstRow="0" w:lastRow="0" w:firstColumn="0" w:lastColumn="0" w:noHBand="0" w:noVBand="0"/>
+        <w:tblLook w:val="04A0" w:firstRow="1" w:lastRow="0" w:firstColumn="1" w:lastColumn="0" w:noHBand="0" w:noVBand="1"/>
       </w:tblPr>
       <w:tblGrid>
         <w:gridCol w:w="3100"/>
@@ -5350,7 +5350,7 @@
       <w:pPr>
         <w:pStyle w:val="Heading1"/>
       </w:pPr>
-      <w:bookmarkStart w:id="7" w:name="_Toc241869790"/>
+      <w:bookmarkStart w:id="7" w:name="_Toc241869943"/>
       <w:r>
         <w:t>3. Objectives and success metrics</w:t>
       </w:r>
@@ -5382,7 +5382,7 @@
           <w:left w:w="10" w:type="dxa"/>
           <w:right w:w="10" w:type="dxa"/>
         </w:tblCellMar>
-        <w:tblLook w:val="0000" w:firstRow="0" w:lastRow="0" w:firstColumn="0" w:lastColumn="0" w:noHBand="0" w:noVBand="0"/>
+        <w:tblLook w:val="04A0" w:firstRow="1" w:lastRow="0" w:firstColumn="1" w:lastColumn="0" w:noHBand="0" w:noVBand="1"/>
       </w:tblPr>
       <w:tblGrid>
         <w:gridCol w:w="3300"/>
@@ -6325,7 +6325,7 @@
       <w:pPr>
         <w:pStyle w:val="Heading1"/>
       </w:pPr>
-      <w:bookmarkStart w:id="8" w:name="_Toc241869791"/>
+      <w:bookmarkStart w:id="8" w:name="_Toc241869944"/>
       <w:r>
         <w:lastRenderedPageBreak/>
         <w:t>4. Proposed solution and architecture</w:t>
@@ -6351,7 +6351,7 @@
           <w:noProof/>
         </w:rPr>
         <w:drawing>
-          <wp:inline distT="0" distB="0" distL="0" distR="0" wp14:anchorId="3011FECE" wp14:editId="3D68E9EC">
+          <wp:inline distT="0" distB="0" distL="0" distR="0" wp14:anchorId="72A48EC4" wp14:editId="2E05E153">
             <wp:extent cx="6096000" cy="3152775"/>
             <wp:effectExtent l="0" t="0" r="0" b="0"/>
             <wp:docPr id="1" name="fig_architecture.png" descr="Figure 1. Architecture: the n8n pipeline (top), outputs (middle) and supporting services (bottom)." title="Figure 1. Architecture: the n8n pipeline (top), outputs (middle) and supporting services (bottom)."/>
@@ -6420,7 +6420,7 @@
       <w:pPr>
         <w:pStyle w:val="Heading2"/>
       </w:pPr>
-      <w:bookmarkStart w:id="9" w:name="_Toc241869792"/>
+      <w:bookmarkStart w:id="9" w:name="_Toc241869945"/>
       <w:r>
         <w:t>Design principles</w:t>
       </w:r>
@@ -6555,7 +6555,7 @@
       <w:pPr>
         <w:pStyle w:val="Heading2"/>
       </w:pPr>
-      <w:bookmarkStart w:id="10" w:name="_Toc241869793"/>
+      <w:bookmarkStart w:id="10" w:name="_Toc241869946"/>
       <w:r>
         <w:lastRenderedPageBreak/>
         <w:t>Tools and technology</w:t>
@@ -6577,7 +6577,7 @@
           <w:left w:w="10" w:type="dxa"/>
           <w:right w:w="10" w:type="dxa"/>
         </w:tblCellMar>
-        <w:tblLook w:val="0000" w:firstRow="0" w:lastRow="0" w:firstColumn="0" w:lastColumn="0" w:noHBand="0" w:noVBand="0"/>
+        <w:tblLook w:val="04A0" w:firstRow="1" w:lastRow="0" w:firstColumn="1" w:lastColumn="0" w:noHBand="0" w:noVBand="1"/>
       </w:tblPr>
       <w:tblGrid>
         <w:gridCol w:w="2400"/>
@@ -7520,7 +7520,7 @@
       <w:pPr>
         <w:pStyle w:val="Heading1"/>
       </w:pPr>
-      <w:bookmarkStart w:id="11" w:name="_Toc241869794"/>
+      <w:bookmarkStart w:id="11" w:name="_Toc241869947"/>
       <w:r>
         <w:t>5. Data and pipeline design</w:t>
       </w:r>
@@ -7530,7 +7530,7 @@
       <w:pPr>
         <w:pStyle w:val="Heading2"/>
       </w:pPr>
-      <w:bookmarkStart w:id="12" w:name="_Toc241869795"/>
+      <w:bookmarkStart w:id="12" w:name="_Toc241869948"/>
       <w:r>
         <w:t>5.1 Dataset</w:t>
       </w:r>
@@ -7562,7 +7562,7 @@
       <w:pPr>
         <w:pStyle w:val="Heading2"/>
       </w:pPr>
-      <w:bookmarkStart w:id="13" w:name="_Toc241869796"/>
+      <w:bookmarkStart w:id="13" w:name="_Toc241869949"/>
       <w:r>
         <w:t>5</w:t>
       </w:r>
@@ -7611,7 +7611,7 @@
       <w:pPr>
         <w:pStyle w:val="Heading2"/>
       </w:pPr>
-      <w:bookmarkStart w:id="14" w:name="_Toc241869797"/>
+      <w:bookmarkStart w:id="14" w:name="_Toc241869950"/>
       <w:r>
         <w:t>5.3 Samples and splits</w:t>
       </w:r>
@@ -7632,7 +7632,7 @@
           <w:left w:w="10" w:type="dxa"/>
           <w:right w:w="10" w:type="dxa"/>
         </w:tblCellMar>
-        <w:tblLook w:val="0000" w:firstRow="0" w:lastRow="0" w:firstColumn="0" w:lastColumn="0" w:noHBand="0" w:noVBand="0"/>
+        <w:tblLook w:val="04A0" w:firstRow="1" w:lastRow="0" w:firstColumn="1" w:lastColumn="0" w:noHBand="0" w:noVBand="1"/>
       </w:tblPr>
       <w:tblGrid>
         <w:gridCol w:w="2400"/>
@@ -8375,7 +8375,7 @@
       <w:pPr>
         <w:pStyle w:val="Heading2"/>
       </w:pPr>
-      <w:bookmarkStart w:id="15" w:name="_Toc241869798"/>
+      <w:bookmarkStart w:id="15" w:name="_Toc241869951"/>
       <w:r>
         <w:lastRenderedPageBreak/>
         <w:t>5.4 Ground truth and its limits</w:t>
@@ -8398,7 +8398,7 @@
         <w:pStyle w:val="Heading1"/>
         <w:pageBreakBefore/>
       </w:pPr>
-      <w:bookmarkStart w:id="16" w:name="_Toc241869799"/>
+      <w:bookmarkStart w:id="16" w:name="_Toc241869952"/>
       <w:r>
         <w:lastRenderedPageBreak/>
         <w:t>6. Components in detail</w:t>
@@ -8409,7 +8409,7 @@
       <w:pPr>
         <w:pStyle w:val="Heading2"/>
       </w:pPr>
-      <w:bookmarkStart w:id="17" w:name="_Toc241869800"/>
+      <w:bookmarkStart w:id="17" w:name="_Toc241869953"/>
       <w:r>
         <w:t>6.1 Ingestion (n8n workflow 01)</w:t>
       </w:r>
@@ -8433,7 +8433,7 @@
       <w:pPr>
         <w:pStyle w:val="Heading2"/>
       </w:pPr>
-      <w:bookmarkStart w:id="18" w:name="_Toc241869801"/>
+      <w:bookmarkStart w:id="18" w:name="_Toc241869954"/>
       <w:r>
         <w:t>6.2 Translation (n8n workflow 02)</w:t>
       </w:r>
@@ -8476,7 +8476,7 @@
           <w:left w:w="10" w:type="dxa"/>
           <w:right w:w="10" w:type="dxa"/>
         </w:tblCellMar>
-        <w:tblLook w:val="0000" w:firstRow="0" w:lastRow="0" w:firstColumn="0" w:lastColumn="0" w:noHBand="0" w:noVBand="0"/>
+        <w:tblLook w:val="04A0" w:firstRow="1" w:lastRow="0" w:firstColumn="1" w:lastColumn="0" w:noHBand="0" w:noVBand="1"/>
       </w:tblPr>
       <w:tblGrid>
         <w:gridCol w:w="3800"/>
@@ -8911,7 +8911,7 @@
       <w:pPr>
         <w:pStyle w:val="Heading2"/>
       </w:pPr>
-      <w:bookmarkStart w:id="19" w:name="_Toc241869802"/>
+      <w:bookmarkStart w:id="19" w:name="_Toc241869955"/>
       <w:r>
         <w:t>6.3 Sentiment, topic and estimated stars</w:t>
       </w:r>
@@ -8942,7 +8942,7 @@
           <w:noProof/>
         </w:rPr>
         <w:drawing>
-          <wp:inline distT="0" distB="0" distL="0" distR="0" wp14:anchorId="7CE2C857" wp14:editId="232CA7FF">
+          <wp:inline distT="0" distB="0" distL="0" distR="0" wp14:anchorId="32A20B30" wp14:editId="0D9408B5">
             <wp:extent cx="4476750" cy="2266950"/>
             <wp:effectExtent l="0" t="0" r="0" b="0"/>
             <wp:docPr id="2" name="fig_sentiment.png" descr="Figure 2. Sentiment accuracy on the 960 held-out test reviews." title="Figure 2. Sentiment accuracy on the 960 held-out test reviews."/>
@@ -9012,7 +9012,7 @@
           <w:left w:w="10" w:type="dxa"/>
           <w:right w:w="10" w:type="dxa"/>
         </w:tblCellMar>
-        <w:tblLook w:val="0000" w:firstRow="0" w:lastRow="0" w:firstColumn="0" w:lastColumn="0" w:noHBand="0" w:noVBand="0"/>
+        <w:tblLook w:val="04A0" w:firstRow="1" w:lastRow="0" w:firstColumn="1" w:lastColumn="0" w:noHBand="0" w:noVBand="1"/>
       </w:tblPr>
       <w:tblGrid>
         <w:gridCol w:w="3900"/>
@@ -10224,7 +10224,7 @@
           <w:left w:w="10" w:type="dxa"/>
           <w:right w:w="10" w:type="dxa"/>
         </w:tblCellMar>
-        <w:tblLook w:val="0000" w:firstRow="0" w:lastRow="0" w:firstColumn="0" w:lastColumn="0" w:noHBand="0" w:noVBand="0"/>
+        <w:tblLook w:val="04A0" w:firstRow="1" w:lastRow="0" w:firstColumn="1" w:lastColumn="0" w:noHBand="0" w:noVBand="1"/>
       </w:tblPr>
       <w:tblGrid>
         <w:gridCol w:w="3000"/>
@@ -10877,7 +10877,7 @@
       <w:pPr>
         <w:pStyle w:val="Heading2"/>
       </w:pPr>
-      <w:bookmarkStart w:id="20" w:name="_Toc241869803"/>
+      <w:bookmarkStart w:id="20" w:name="_Toc241869956"/>
       <w:r>
         <w:t>6.4 Issue clustering</w:t>
       </w:r>
@@ -10909,7 +10909,7 @@
           <w:left w:w="10" w:type="dxa"/>
           <w:right w:w="10" w:type="dxa"/>
         </w:tblCellMar>
-        <w:tblLook w:val="0000" w:firstRow="0" w:lastRow="0" w:firstColumn="0" w:lastColumn="0" w:noHBand="0" w:noVBand="0"/>
+        <w:tblLook w:val="04A0" w:firstRow="1" w:lastRow="0" w:firstColumn="1" w:lastColumn="0" w:noHBand="0" w:noVBand="1"/>
       </w:tblPr>
       <w:tblGrid>
         <w:gridCol w:w="2700"/>
@@ -10993,17 +10993,7 @@
                 <w:sz w:val="18"/>
                 <w:szCs w:val="18"/>
               </w:rPr>
-              <w:t>k-</w:t>
-            </w:r>
-            <w:r>
-              <w:rPr>
-                <w:b/>
-                <w:bCs/>
-                <w:color w:val="FFFFFF"/>
-                <w:sz w:val="18"/>
-                <w:szCs w:val="18"/>
-              </w:rPr>
-              <w:t>means silhouette (k = 6 to 14)</w:t>
+              <w:t>k-means silhouette (k = 6 to 14)</w:t>
             </w:r>
           </w:p>
         </w:tc>
@@ -11387,7 +11377,7 @@
       <w:pPr>
         <w:pStyle w:val="Heading2"/>
       </w:pPr>
-      <w:bookmarkStart w:id="21" w:name="_Toc241869804"/>
+      <w:bookmarkStart w:id="21" w:name="_Toc241869957"/>
       <w:r>
         <w:t>6.5 Trend detection and alerts</w:t>
       </w:r>
@@ -11433,7 +11423,7 @@
           <w:left w:w="10" w:type="dxa"/>
           <w:right w:w="10" w:type="dxa"/>
         </w:tblCellMar>
-        <w:tblLook w:val="0000" w:firstRow="0" w:lastRow="0" w:firstColumn="0" w:lastColumn="0" w:noHBand="0" w:noVBand="0"/>
+        <w:tblLook w:val="04A0" w:firstRow="1" w:lastRow="0" w:firstColumn="1" w:lastColumn="0" w:noHBand="0" w:noVBand="1"/>
       </w:tblPr>
       <w:tblGrid>
         <w:gridCol w:w="2500"/>
@@ -11975,7 +11965,7 @@
         </w:rPr>
         <w:lastRenderedPageBreak/>
         <w:drawing>
-          <wp:inline distT="0" distB="0" distL="0" distR="0" wp14:anchorId="033594D1" wp14:editId="399ACBBA">
+          <wp:inline distT="0" distB="0" distL="0" distR="0" wp14:anchorId="031EBA2F" wp14:editId="4CD959EA">
             <wp:extent cx="5334000" cy="2533650"/>
             <wp:effectExtent l="0" t="0" r="0" b="0"/>
             <wp:docPr id="3" name="fig_spikes.png" descr="Figure 3. Weekly negative reviews for four issue categories in the dashboard data. Circles mark the four alerts sent to Slack." title="Figure 3. Weekly negative reviews for four issue categories in the dashboard data. Circles mark the four alerts sent to Slack."/>
@@ -12058,7 +12048,7 @@
       <w:pPr>
         <w:pStyle w:val="Heading2"/>
       </w:pPr>
-      <w:bookmarkStart w:id="22" w:name="_Toc241869805"/>
+      <w:bookmarkStart w:id="22" w:name="_Toc241869958"/>
       <w:r>
         <w:t>6.6 Response generation and quality checks</w:t>
       </w:r>
@@ -12100,7 +12090,7 @@
           <w:noProof/>
         </w:rPr>
         <w:drawing>
-          <wp:inline distT="0" distB="0" distL="0" distR="0" wp14:anchorId="02866216" wp14:editId="786DA35B">
+          <wp:inline distT="0" distB="0" distL="0" distR="0" wp14:anchorId="495B52BB" wp14:editId="4F81AFEB">
             <wp:extent cx="4476750" cy="2152650"/>
             <wp:effectExtent l="0" t="0" r="0" b="0"/>
             <wp:docPr id="4" name="fig_responses.png" descr="Figure 4. Reply quality, prompt v1 versus v2, scored by the Sonnet 5 judge on 48 replies." title="Figure 4. Reply quality, prompt v1 versus v2, scored by the Sonnet 5 judge on 48 replies."/>
@@ -12170,7 +12160,7 @@
           <w:left w:w="10" w:type="dxa"/>
           <w:right w:w="10" w:type="dxa"/>
         </w:tblCellMar>
-        <w:tblLook w:val="0000" w:firstRow="0" w:lastRow="0" w:firstColumn="0" w:lastColumn="0" w:noHBand="0" w:noVBand="0"/>
+        <w:tblLook w:val="04A0" w:firstRow="1" w:lastRow="0" w:firstColumn="1" w:lastColumn="0" w:noHBand="0" w:noVBand="1"/>
       </w:tblPr>
       <w:tblGrid>
         <w:gridCol w:w="2200"/>
@@ -12752,7 +12742,7 @@
       <w:pPr>
         <w:pStyle w:val="Heading2"/>
       </w:pPr>
-      <w:bookmarkStart w:id="23" w:name="_Toc241869806"/>
+      <w:bookmarkStart w:id="23" w:name="_Toc241869959"/>
       <w:r>
         <w:t>6.7 Dashboard and Slack alerts</w:t>
       </w:r>
@@ -12912,7 +12902,7 @@
       <w:pPr>
         <w:pStyle w:val="Heading2"/>
       </w:pPr>
-      <w:bookmarkStart w:id="24" w:name="_Toc241869807"/>
+      <w:bookmarkStart w:id="24" w:name="_Toc241869960"/>
       <w:r>
         <w:t>6.8 API service and LLMOps</w:t>
       </w:r>
@@ -12941,7 +12931,7 @@
           <w:left w:w="10" w:type="dxa"/>
           <w:right w:w="10" w:type="dxa"/>
         </w:tblCellMar>
-        <w:tblLook w:val="0000" w:firstRow="0" w:lastRow="0" w:firstColumn="0" w:lastColumn="0" w:noHBand="0" w:noVBand="0"/>
+        <w:tblLook w:val="04A0" w:firstRow="1" w:lastRow="0" w:firstColumn="1" w:lastColumn="0" w:noHBand="0" w:noVBand="1"/>
       </w:tblPr>
       <w:tblGrid>
         <w:gridCol w:w="2600"/>
@@ -13420,7 +13410,7 @@
       <w:pPr>
         <w:pStyle w:val="Heading2"/>
       </w:pPr>
-      <w:bookmarkStart w:id="25" w:name="_Toc241869808"/>
+      <w:bookmarkStart w:id="25" w:name="_Toc241869961"/>
       <w:r>
         <w:t>6.9 The full pipeline in n8n (workflow 03)</w:t>
       </w:r>
@@ -13452,7 +13442,7 @@
           <w:left w:w="10" w:type="dxa"/>
           <w:right w:w="10" w:type="dxa"/>
         </w:tblCellMar>
-        <w:tblLook w:val="0000" w:firstRow="0" w:lastRow="0" w:firstColumn="0" w:lastColumn="0" w:noHBand="0" w:noVBand="0"/>
+        <w:tblLook w:val="04A0" w:firstRow="1" w:lastRow="0" w:firstColumn="1" w:lastColumn="0" w:noHBand="0" w:noVBand="1"/>
       </w:tblPr>
       <w:tblGrid>
         <w:gridCol w:w="3400"/>
@@ -14313,7 +14303,7 @@
           <w:noProof/>
         </w:rPr>
         <w:drawing>
-          <wp:inline distT="0" distB="0" distL="0" distR="0" wp14:anchorId="2120D133" wp14:editId="030654BE">
+          <wp:inline distT="0" distB="0" distL="0" distR="0" wp14:anchorId="3D4697FF" wp14:editId="5841F25E">
             <wp:extent cx="4095750" cy="2019300"/>
             <wp:effectExtent l="0" t="0" r="0" b="0"/>
             <wp:docPr id="5" name="fig_cost.png" descr="Figure 5. Where the money goes: about $2.50 per 1,000 reviews, by stage." title="Figure 5. Where the money goes: about $2.50 per 1,000 reviews, by stage."/>
@@ -14372,7 +14362,7 @@
       <w:pPr>
         <w:pStyle w:val="Heading2"/>
       </w:pPr>
-      <w:bookmarkStart w:id="26" w:name="_Toc241869809"/>
+      <w:bookmarkStart w:id="26" w:name="_Toc241869962"/>
       <w:r>
         <w:t>6.10 Demo app and deployment</w:t>
       </w:r>
@@ -14474,7 +14464,7 @@
           <w:left w:w="10" w:type="dxa"/>
           <w:right w:w="10" w:type="dxa"/>
         </w:tblCellMar>
-        <w:tblLook w:val="0000" w:firstRow="0" w:lastRow="0" w:firstColumn="0" w:lastColumn="0" w:noHBand="0" w:noVBand="0"/>
+        <w:tblLook w:val="04A0" w:firstRow="1" w:lastRow="0" w:firstColumn="1" w:lastColumn="0" w:noHBand="0" w:noVBand="1"/>
       </w:tblPr>
       <w:tblGrid>
         <w:gridCol w:w="2000"/>
@@ -15304,6 +15294,14 @@
         <w:spacing w:after="120" w:line="276" w:lineRule="auto"/>
       </w:pPr>
       <w:r>
+        <w:t>Figures B5 and B6 in Appendix B show the live and spike tabs.</w:t>
+      </w:r>
+    </w:p>
+    <w:p>
+      <w:pPr>
+        <w:spacing w:after="120" w:line="276" w:lineRule="auto"/>
+      </w:pPr>
+      <w:r>
         <w:rPr>
           <w:b/>
           <w:bCs/>
@@ -15321,7 +15319,7 @@
       <w:pPr>
         <w:pStyle w:val="Heading1"/>
       </w:pPr>
-      <w:bookmarkStart w:id="27" w:name="_Toc241869810"/>
+      <w:bookmarkStart w:id="27" w:name="_Toc241869963"/>
       <w:r>
         <w:t>7. Methods tried, challenges and how we overcame them</w:t>
       </w:r>
@@ -15342,7 +15340,7 @@
           <w:left w:w="10" w:type="dxa"/>
           <w:right w:w="10" w:type="dxa"/>
         </w:tblCellMar>
-        <w:tblLook w:val="0000" w:firstRow="0" w:lastRow="0" w:firstColumn="0" w:lastColumn="0" w:noHBand="0" w:noVBand="0"/>
+        <w:tblLook w:val="04A0" w:firstRow="1" w:lastRow="0" w:firstColumn="1" w:lastColumn="0" w:noHBand="0" w:noVBand="1"/>
       </w:tblPr>
       <w:tblGrid>
         <w:gridCol w:w="2100"/>
@@ -16611,7 +16609,7 @@
       <w:pPr>
         <w:pStyle w:val="Heading1"/>
       </w:pPr>
-      <w:bookmarkStart w:id="28" w:name="_Toc241869811"/>
+      <w:bookmarkStart w:id="28" w:name="_Toc241869964"/>
       <w:r>
         <w:t>8. Test cases, results and experiment log</w:t>
       </w:r>
@@ -16621,7 +16619,7 @@
       <w:pPr>
         <w:pStyle w:val="Heading2"/>
       </w:pPr>
-      <w:bookmarkStart w:id="29" w:name="_Toc241869812"/>
+      <w:bookmarkStart w:id="29" w:name="_Toc241869965"/>
       <w:r>
         <w:t>8.1 Automated tests</w:t>
       </w:r>
@@ -16658,7 +16656,7 @@
       <w:pPr>
         <w:pStyle w:val="Heading2"/>
       </w:pPr>
-      <w:bookmarkStart w:id="30" w:name="_Toc241869813"/>
+      <w:bookmarkStart w:id="30" w:name="_Toc241869966"/>
       <w:r>
         <w:t>8.2 Functional test cases</w:t>
       </w:r>
@@ -16679,7 +16677,7 @@
           <w:left w:w="10" w:type="dxa"/>
           <w:right w:w="10" w:type="dxa"/>
         </w:tblCellMar>
-        <w:tblLook w:val="0000" w:firstRow="0" w:lastRow="0" w:firstColumn="0" w:lastColumn="0" w:noHBand="0" w:noVBand="0"/>
+        <w:tblLook w:val="04A0" w:firstRow="1" w:lastRow="0" w:firstColumn="1" w:lastColumn="0" w:noHBand="0" w:noVBand="1"/>
       </w:tblPr>
       <w:tblGrid>
         <w:gridCol w:w="700"/>
@@ -18170,7 +18168,7 @@
       <w:pPr>
         <w:pStyle w:val="Heading2"/>
       </w:pPr>
-      <w:bookmarkStart w:id="31" w:name="_Toc241869814"/>
+      <w:bookmarkStart w:id="31" w:name="_Toc241869967"/>
       <w:r>
         <w:t>8.3 Experiment log summary</w:t>
       </w:r>
@@ -18211,7 +18209,7 @@
           <w:left w:w="10" w:type="dxa"/>
           <w:right w:w="10" w:type="dxa"/>
         </w:tblCellMar>
-        <w:tblLook w:val="0000" w:firstRow="0" w:lastRow="0" w:firstColumn="0" w:lastColumn="0" w:noHBand="0" w:noVBand="0"/>
+        <w:tblLook w:val="04A0" w:firstRow="1" w:lastRow="0" w:firstColumn="1" w:lastColumn="0" w:noHBand="0" w:noVBand="1"/>
       </w:tblPr>
       <w:tblGrid>
         <w:gridCol w:w="800"/>
@@ -19831,7 +19829,7 @@
       <w:pPr>
         <w:pStyle w:val="Heading2"/>
       </w:pPr>
-      <w:bookmarkStart w:id="32" w:name="_Toc241869815"/>
+      <w:bookmarkStart w:id="32" w:name="_Toc241869968"/>
       <w:r>
         <w:t>8.4 Claude spend</w:t>
       </w:r>
@@ -19852,7 +19850,7 @@
           <w:left w:w="10" w:type="dxa"/>
           <w:right w:w="10" w:type="dxa"/>
         </w:tblCellMar>
-        <w:tblLook w:val="0000" w:firstRow="0" w:lastRow="0" w:firstColumn="0" w:lastColumn="0" w:noHBand="0" w:noVBand="0"/>
+        <w:tblLook w:val="04A0" w:firstRow="1" w:lastRow="0" w:firstColumn="1" w:lastColumn="0" w:noHBand="0" w:noVBand="1"/>
       </w:tblPr>
       <w:tblGrid>
         <w:gridCol w:w="6200"/>
@@ -20390,7 +20388,7 @@
       <w:pPr>
         <w:pStyle w:val="Heading1"/>
       </w:pPr>
-      <w:bookmarkStart w:id="33" w:name="_Toc241869816"/>
+      <w:bookmarkStart w:id="33" w:name="_Toc241869969"/>
       <w:r>
         <w:t>9. Demo plan</w:t>
       </w:r>
@@ -20420,7 +20418,7 @@
           <w:left w:w="10" w:type="dxa"/>
           <w:right w:w="10" w:type="dxa"/>
         </w:tblCellMar>
-        <w:tblLook w:val="0000" w:firstRow="0" w:lastRow="0" w:firstColumn="0" w:lastColumn="0" w:noHBand="0" w:noVBand="0"/>
+        <w:tblLook w:val="04A0" w:firstRow="1" w:lastRow="0" w:firstColumn="1" w:lastColumn="0" w:noHBand="0" w:noVBand="1"/>
       </w:tblPr>
       <w:tblGrid>
         <w:gridCol w:w="1100"/>
@@ -21276,7 +21274,7 @@
         <w:pStyle w:val="Heading1"/>
         <w:pageBreakBefore/>
       </w:pPr>
-      <w:bookmarkStart w:id="34" w:name="_Toc241869817"/>
+      <w:bookmarkStart w:id="34" w:name="_Toc241869970"/>
       <w:r>
         <w:lastRenderedPageBreak/>
         <w:t>10. How to run the application</w:t>
@@ -21287,7 +21285,7 @@
       <w:pPr>
         <w:pStyle w:val="Heading2"/>
       </w:pPr>
-      <w:bookmarkStart w:id="35" w:name="_Toc241869818"/>
+      <w:bookmarkStart w:id="35" w:name="_Toc241869971"/>
       <w:r>
         <w:t>10.1 Setup (Windows)</w:t>
       </w:r>
@@ -21466,7 +21464,7 @@
       <w:pPr>
         <w:pStyle w:val="Heading2"/>
       </w:pPr>
-      <w:bookmarkStart w:id="36" w:name="_Toc241869819"/>
+      <w:bookmarkStart w:id="36" w:name="_Toc241869972"/>
       <w:r>
         <w:t>10.2 n8n workflows</w:t>
       </w:r>
@@ -21607,7 +21605,7 @@
           <w:left w:w="10" w:type="dxa"/>
           <w:right w:w="10" w:type="dxa"/>
         </w:tblCellMar>
-        <w:tblLook w:val="0000" w:firstRow="0" w:lastRow="0" w:firstColumn="0" w:lastColumn="0" w:noHBand="0" w:noVBand="0"/>
+        <w:tblLook w:val="04A0" w:firstRow="1" w:lastRow="0" w:firstColumn="1" w:lastColumn="0" w:noHBand="0" w:noVBand="1"/>
       </w:tblPr>
       <w:tblGrid>
         <w:gridCol w:w="3900"/>
@@ -22175,7 +22173,7 @@
       <w:pPr>
         <w:pStyle w:val="Heading2"/>
       </w:pPr>
-      <w:bookmarkStart w:id="37" w:name="_Toc241869820"/>
+      <w:bookmarkStart w:id="37" w:name="_Toc241869973"/>
       <w:r>
         <w:t>10.3 Analysis scripts</w:t>
       </w:r>
@@ -22293,7 +22291,7 @@
       <w:pPr>
         <w:pStyle w:val="Heading2"/>
       </w:pPr>
-      <w:bookmarkStart w:id="38" w:name="_Toc241869821"/>
+      <w:bookmarkStart w:id="38" w:name="_Toc241869974"/>
       <w:r>
         <w:t>10.4 API service and tests</w:t>
       </w:r>
@@ -22387,7 +22385,7 @@
       <w:pPr>
         <w:pStyle w:val="Heading2"/>
       </w:pPr>
-      <w:bookmarkStart w:id="39" w:name="_Toc241869822"/>
+      <w:bookmarkStart w:id="39" w:name="_Toc241869975"/>
       <w:r>
         <w:lastRenderedPageBreak/>
         <w:t>10.5 Demo app and Hugging Face Space</w:t>
@@ -22496,7 +22494,7 @@
       <w:pPr>
         <w:pStyle w:val="Heading2"/>
       </w:pPr>
-      <w:bookmarkStart w:id="40" w:name="_Toc241869823"/>
+      <w:bookmarkStart w:id="40" w:name="_Toc241869976"/>
       <w:r>
         <w:t>10.6 Repository map</w:t>
       </w:r>
@@ -22517,7 +22515,7 @@
           <w:left w:w="10" w:type="dxa"/>
           <w:right w:w="10" w:type="dxa"/>
         </w:tblCellMar>
-        <w:tblLook w:val="0000" w:firstRow="0" w:lastRow="0" w:firstColumn="0" w:lastColumn="0" w:noHBand="0" w:noVBand="0"/>
+        <w:tblLook w:val="04A0" w:firstRow="1" w:lastRow="0" w:firstColumn="1" w:lastColumn="0" w:noHBand="0" w:noVBand="1"/>
       </w:tblPr>
       <w:tblGrid>
         <w:gridCol w:w="3700"/>
@@ -23280,7 +23278,7 @@
       <w:pPr>
         <w:pStyle w:val="Heading1"/>
       </w:pPr>
-      <w:bookmarkStart w:id="41" w:name="_Toc241869824"/>
+      <w:bookmarkStart w:id="41" w:name="_Toc241869977"/>
       <w:r>
         <w:t>11. Limitations</w:t>
       </w:r>
@@ -23323,10 +23321,7 @@
         <w:t>Star-derived labels.</w:t>
       </w:r>
       <w:r>
-        <w:t xml:space="preserve"> Sentiment ac</w:t>
-      </w:r>
-      <w:r>
-        <w:t>curacy is measured against a noisy proxy. Three-way accuracy is 78.1%, below the 85% target, and the neutral class is recognised only about a third of the time.</w:t>
+        <w:t xml:space="preserve"> Sentiment accuracy is measured against a noisy proxy. Three-way accuracy is 78.1%, below the 85% target, and the neutral class is recognised only about a third of the time.</w:t>
       </w:r>
     </w:p>
     <w:p>
@@ -23346,10 +23341,10 @@
         <w:t>No human acceptance test.</w:t>
       </w:r>
       <w:r>
-        <w:t xml:space="preserve"> Reply quality is judged by a model. The 79.2% figure is not human app</w:t>
-      </w:r>
-      <w:r>
-        <w:t>roval.</w:t>
+        <w:t xml:space="preserve"> Reply quality is judged by a model. The 79.2% figure is </w:t>
+      </w:r>
+      <w:r>
+        <w:t>not human approval.</w:t>
       </w:r>
     </w:p>
     <w:p>
@@ -23389,10 +23384,10 @@
         <w:t>Issue categories in n8n.</w:t>
       </w:r>
       <w:r>
-        <w:t xml:space="preserve"> A Claude classifier over </w:t>
-      </w:r>
-      <w:r>
-        <w:t>13 fixed categories replaces the embedding step, and it agrees with k-means only 43% of the time. The categories come from one sample and would need refreshing on a real feed.</w:t>
+        <w:t xml:space="preserve"> A Claude cla</w:t>
+      </w:r>
+      <w:r>
+        <w:t>ssifier over 13 fixed categories replaces the embedding step, and it agrees with k-means only 43% of the time. The categories come from one sample and would need refreshing on a real feed.</w:t>
       </w:r>
     </w:p>
     <w:p>
@@ -23412,10 +23407,10 @@
         <w:t>Small evaluation sets.</w:t>
       </w:r>
       <w:r>
-        <w:t xml:space="preserve"> 48 replies and 960 test reviews are enough to show trends</w:t>
-      </w:r>
-      <w:r>
-        <w:t>, but small differences (for example between prompt v1 and v2 on the development split) are within noise.</w:t>
+        <w:t xml:space="preserve"> 48 replies and 960 test reviews are enough t</w:t>
+      </w:r>
+      <w:r>
+        <w:t>o show trends, but small differences (for example between prompt v1 and v2 on the development split) are within noise.</w:t>
       </w:r>
     </w:p>
     <w:p>
@@ -23435,10 +23430,10 @@
         <w:t>Not yet automatic.</w:t>
       </w:r>
       <w:r>
-        <w:t xml:space="preserve"> Results reach the Google Sheet by paste or import, and the n8n workflows are started by hand. Only the demo app is public (Hugging </w:t>
-      </w:r>
-      <w:r>
-        <w:t>Face Space); the API service runs locally.</w:t>
+        <w:t xml:space="preserve"> Results reach the Google Sheet by paste or import, and the n8n workflows are started by hand. Only the demo app is pub</w:t>
+      </w:r>
+      <w:r>
+        <w:t>lic (Hugging Face Space); the API service runs locally.</w:t>
       </w:r>
     </w:p>
     <w:p>
@@ -23458,10 +23453,10 @@
         <w:t>Trial and budget.</w:t>
       </w:r>
       <w:r>
-        <w:t xml:space="preserve"> The n8n Cloud trial is time-limited (we moved to a new account on 2 October, valid to about 16 October), and Claude credit limits how many full runs we can afford. We measured throughput on 120 r</w:t>
-      </w:r>
-      <w:r>
-        <w:t>eviews and extrapolated to 1,000.</w:t>
+        <w:t xml:space="preserve"> The n8n Cloud trial is time-limited (we moved to a new account on 2 October, valid to about 16 October), and Claude credit limits how many full runs we can afford. We measured throug</w:t>
+      </w:r>
+      <w:r>
+        <w:t>hput on 120 reviews and extrapolated to 1,000.</w:t>
       </w:r>
     </w:p>
     <w:p>
@@ -23489,7 +23484,7 @@
       <w:pPr>
         <w:pStyle w:val="Heading1"/>
       </w:pPr>
-      <w:bookmarkStart w:id="42" w:name="_Toc241869825"/>
+      <w:bookmarkStart w:id="42" w:name="_Toc241869978"/>
       <w:r>
         <w:t>12. Future scope and scaling</w:t>
       </w:r>
@@ -23512,7 +23507,10 @@
         <w:t>Real data feed.</w:t>
       </w:r>
       <w:r>
-        <w:t xml:space="preserve"> Connect live review sources (marketplace exports, app-store and social feeds) with real timestamps, then retune the spike threshold on genuine weeks.</w:t>
+        <w:t xml:space="preserve"> Connect live review sources (marketplace exports, app-store and s</w:t>
+      </w:r>
+      <w:r>
+        <w:t>ocial feeds) with real timestamps, then retune the spike threshold on genuine weeks.</w:t>
       </w:r>
     </w:p>
     <w:p>
@@ -23532,10 +23530,7 @@
         <w:t>Human evaluation.</w:t>
       </w:r>
       <w:r>
-        <w:t xml:space="preserve"> Run the reply acceptance test with support staff (the review sheet and scoring script a</w:t>
-      </w:r>
-      <w:r>
-        <w:t>lready exist) and use the results to improve the playbooks.</w:t>
+        <w:t xml:space="preserve"> Run the reply acceptance test with support staff (the review sheet and scoring script already exist) and use the results to improve the playbooks.</w:t>
       </w:r>
     </w:p>
     <w:p>
@@ -23552,7 +23547,14 @@
           <w:b/>
           <w:bCs/>
         </w:rPr>
-        <w:t>Better neutral handling.</w:t>
+        <w:t>Better</w:t>
+      </w:r>
+      <w:r>
+        <w:rPr>
+          <w:b/>
+          <w:bCs/>
+        </w:rPr>
+        <w:t xml:space="preserve"> neutral handling.</w:t>
       </w:r>
       <w:r>
         <w:t xml:space="preserve"> Ask for a 1 to 5 rating plus a separate “mixed” flag, or fine-tune a multilingual model on labelled neutral reviews.</w:t>
@@ -23575,10 +23577,10 @@
         <w:t>Self-updating dashboard.</w:t>
       </w:r>
       <w:r>
-        <w:t xml:space="preserve"> Append pipeline results to Go</w:t>
-      </w:r>
-      <w:r>
-        <w:t>ogle Sheets or a database from workflow 03 and build Looker Studio pages on top.</w:t>
+        <w:t xml:space="preserve"> Append pipeline results to Google Sheets or a database from workflow 03 and build Looker Studio</w:t>
+      </w:r>
+      <w:r>
+        <w:t xml:space="preserve"> pages on top.</w:t>
       </w:r>
     </w:p>
     <w:p>
@@ -23598,10 +23600,7 @@
         <w:t>Scaling.</w:t>
       </w:r>
       <w:r>
-        <w:t xml:space="preserve"> Use batch and prompt-caching features of the model API to cut the $2.50 per 1,000 reviews, run the embedding step in a small service, and move the API to a hosted env</w:t>
-      </w:r>
-      <w:r>
-        <w:t>ironment with proper tracing (for example Langfuse).</w:t>
+        <w:t xml:space="preserve"> Use batch and prompt-caching features of the model API to cut the $2.50 per 1,000 reviews, run the embedding step in a small service, and move the API to a hosted environment with proper tracing (for example Langfuse).</w:t>
       </w:r>
     </w:p>
     <w:p>
@@ -23618,7 +23617,14 @@
           <w:b/>
           <w:bCs/>
         </w:rPr>
-        <w:t>More languages and channels.</w:t>
+        <w:t>More language</w:t>
+      </w:r>
+      <w:r>
+        <w:rPr>
+          <w:b/>
+          <w:bCs/>
+        </w:rPr>
+        <w:t>s and channels.</w:t>
       </w:r>
       <w:r>
         <w:t xml:space="preserve"> Extend beyond six languages, add Slack or email delivery of approved replies, and track how long human approval takes to measure the 3-hour goal properly.</w:t>
@@ -23641,17 +23647,17 @@
         <w:t>Closed loop.</w:t>
       </w:r>
       <w:r>
-        <w:t xml:space="preserve"> Feed a</w:t>
-      </w:r>
-      <w:r>
-        <w:t>pproved and edited replies back as examples, and report which issues shrink after a fix.</w:t>
+        <w:t xml:space="preserve"> Feed approved and edited replies back as examples, and report which issu</w:t>
+      </w:r>
+      <w:r>
+        <w:t>es shrink after a fix.</w:t>
       </w:r>
     </w:p>
     <w:p>
       <w:pPr>
         <w:pStyle w:val="Heading1"/>
       </w:pPr>
-      <w:bookmarkStart w:id="43" w:name="_Toc241869826"/>
+      <w:bookmarkStart w:id="43" w:name="_Toc241869979"/>
       <w:r>
         <w:t>13. Business perspective</w:t>
       </w:r>
@@ -23669,10 +23675,10 @@
         <w:t>Cost.</w:t>
       </w:r>
       <w:r>
-        <w:t xml:space="preserve"> The measured cost is about $2.50 per 1,000 reviews with Claude Haiku 4.5 (replies $1.40, translation $0.50, classification $0.42, issue </w:t>
-      </w:r>
-      <w:r>
-        <w:t>category $0.18). At 1,000 reviews per day this is about $75 per month of model usage. Trend detection and the Slack alert cost nothing to run.</w:t>
+        <w:t xml:space="preserve"> The measured cost is about $2.50 per 1,000 reviews with Claude Haiku 4.5 (replies $1.40, translation $0.50, classification $0.42, issue category $0.18). At 1,000 reviews per day this is about $75 per mo</w:t>
+      </w:r>
+      <w:r>
+        <w:t>nth of model usage. Trend detection and the Slack alert cost nothing to run.</w:t>
       </w:r>
     </w:p>
     <w:p>
@@ -23687,17 +23693,17 @@
         <w:t>Speed.</w:t>
       </w:r>
       <w:r>
-        <w:t xml:space="preserve"> The automated part takes about 11 minutes per 1,000 reviews, so a day’s feed is analysed in one short run </w:t>
-      </w:r>
-      <w:r>
-        <w:t>instead of a working day of reading. A draft reply exists about a minute after a batch starts; the remaining time to reply is the human approval of negative drafts, which we did not measure.</w:t>
+        <w:t xml:space="preserve"> The automated part takes about 11 minutes per 1,000 reviews, so a day’s feed is analysed in one short run instead of a working day of reading. A draft reply exists about a </w:t>
+      </w:r>
+      <w:r>
+        <w:t>minute after a batch starts; the remaining time to reply is the human approval of negative drafts, which we did not measure.</w:t>
       </w:r>
     </w:p>
     <w:p>
       <w:pPr>
         <w:pStyle w:val="Heading2"/>
       </w:pPr>
-      <w:bookmarkStart w:id="44" w:name="_Toc241869827"/>
+      <w:bookmarkStart w:id="44" w:name="_Toc241869980"/>
       <w:r>
         <w:t>Illustration of the saving</w:t>
       </w:r>
@@ -23709,10 +23715,10 @@
         <w:spacing w:after="120" w:line="276" w:lineRule="auto"/>
       </w:pPr>
       <w:r>
-        <w:t>The table below is an illustration, no</w:t>
-      </w:r>
-      <w:r>
-        <w:t>t a measurement. The manual time per review is an assumption that the team should replace with its own figure.</w:t>
+        <w:t xml:space="preserve">The table below is an illustration, not a measurement. The manual time per review is an assumption that </w:t>
+      </w:r>
+      <w:r>
+        <w:t>the team should replace with its own figure.</w:t>
       </w:r>
     </w:p>
     <w:tbl>
@@ -23730,7 +23736,7 @@
           <w:left w:w="10" w:type="dxa"/>
           <w:right w:w="10" w:type="dxa"/>
         </w:tblCellMar>
-        <w:tblLook w:val="0000" w:firstRow="0" w:lastRow="0" w:firstColumn="0" w:lastColumn="0" w:noHBand="0" w:noVBand="0"/>
+        <w:tblLook w:val="04A0" w:firstRow="1" w:lastRow="0" w:firstColumn="1" w:lastColumn="0" w:noHBand="0" w:noVBand="1"/>
       </w:tblPr>
       <w:tblGrid>
         <w:gridCol w:w="3000"/>
@@ -24298,7 +24304,7 @@
       <w:pPr>
         <w:pStyle w:val="Heading1"/>
       </w:pPr>
-      <w:bookmarkStart w:id="45" w:name="_Toc241869828"/>
+      <w:bookmarkStart w:id="45" w:name="_Toc241869981"/>
       <w:r>
         <w:t>14. Conclusion</w:t>
       </w:r>
@@ -24325,7 +24331,7 @@
       <w:pPr>
         <w:pStyle w:val="Heading1"/>
       </w:pPr>
-      <w:bookmarkStart w:id="46" w:name="_Toc241869829"/>
+      <w:bookmarkStart w:id="46" w:name="_Toc241869982"/>
       <w:r>
         <w:t>References</w:t>
       </w:r>
@@ -24407,7 +24413,7 @@
         <w:pStyle w:val="Heading1"/>
         <w:pageBreakBefore/>
       </w:pPr>
-      <w:bookmarkStart w:id="47" w:name="_Toc241869830"/>
+      <w:bookmarkStart w:id="47" w:name="_Toc241869983"/>
       <w:r>
         <w:lastRenderedPageBreak/>
         <w:t>Appendix A. Prompts and versions</w:t>
@@ -24429,7 +24435,7 @@
           <w:left w:w="10" w:type="dxa"/>
           <w:right w:w="10" w:type="dxa"/>
         </w:tblCellMar>
-        <w:tblLook w:val="0000" w:firstRow="0" w:lastRow="0" w:firstColumn="0" w:lastColumn="0" w:noHBand="0" w:noVBand="0"/>
+        <w:tblLook w:val="04A0" w:firstRow="1" w:lastRow="0" w:firstColumn="1" w:lastColumn="0" w:noHBand="0" w:noVBand="1"/>
       </w:tblPr>
       <w:tblGrid>
         <w:gridCol w:w="3400"/>
@@ -25425,9 +25431,9 @@
       <w:pPr>
         <w:pStyle w:val="Heading1"/>
       </w:pPr>
-      <w:bookmarkStart w:id="48" w:name="_Toc241869831"/>
-      <w:r>
-        <w:t>Appendix B. Dashboard screenshots</w:t>
+      <w:bookmarkStart w:id="48" w:name="_Toc241869984"/>
+      <w:r>
+        <w:t>Appendix B. Dashboard, alert and demo app screenshots</w:t>
       </w:r>
       <w:bookmarkEnd w:id="48"/>
     </w:p>
@@ -25730,6 +25736,170 @@
     </w:p>
     <w:p>
       <w:pPr>
+        <w:spacing w:after="120" w:line="276" w:lineRule="auto"/>
+      </w:pPr>
+      <w:r>
+        <w:t xml:space="preserve">The two figures below are from the public demo app on the Hugging Face Space (Section 6.10). The first review was pasted in German; the app classified it as negative, topic shipping, one star, wrote the issue phrase and a German reply, marked it for human </w:t>
+      </w:r>
+      <w:r>
+        <w:t>review and scored it with the Sonnet 5 judge. The spike tab reproduces the four alerts of workflow 04 with the same z-scores and lets the viewer change the two thresholds.</w:t>
+      </w:r>
+    </w:p>
+    <w:p>
+      <w:pPr>
+        <w:keepNext/>
+        <w:spacing w:before="120" w:after="60"/>
+        <w:jc w:val="center"/>
+      </w:pPr>
+      <w:r>
+        <w:rPr>
+          <w:noProof/>
+        </w:rPr>
+        <w:lastRenderedPageBreak/>
+        <w:drawing>
+          <wp:inline distT="0" distB="0" distL="0" distR="0">
+            <wp:extent cx="4762500" cy="3695700"/>
+            <wp:effectExtent l="0" t="0" r="0" b="0"/>
+            <wp:docPr id="10" name="space_live.png" descr="Figure B5. Demo app, “Try your own review” tab: sentiment, topic, estimated stars, issue phrase, drafted German reply, status and judge scores for a pasted review. The server-wide spend counter is shown at the bottom." title="Figure B5. Demo app, “Try your own review” tab: sentiment, topic, estimated stars, issue phrase, drafted German reply, status and judge scores for a pasted review. The server-wide spend counter is shown at the bottom."/>
+            <wp:cNvGraphicFramePr>
+              <a:graphicFrameLocks xmlns:a="http://schemas.openxmlformats.org/drawingml/2006/main" noChangeAspect="1"/>
+            </wp:cNvGraphicFramePr>
+            <a:graphic xmlns:a="http://schemas.openxmlformats.org/drawingml/2006/main">
+              <a:graphicData uri="http://schemas.openxmlformats.org/drawingml/2006/picture">
+                <pic:pic xmlns:pic="http://schemas.openxmlformats.org/drawingml/2006/picture">
+                  <pic:nvPicPr>
+                    <pic:cNvPr id="0" name=""/>
+                    <pic:cNvPicPr>
+                      <a:picLocks noChangeAspect="1" noChangeArrowheads="1"/>
+                    </pic:cNvPicPr>
+                  </pic:nvPicPr>
+                  <pic:blipFill>
+                    <a:blip r:embed="rId16"/>
+                    <a:srcRect/>
+                    <a:stretch>
+                      <a:fillRect/>
+                    </a:stretch>
+                  </pic:blipFill>
+                  <pic:spPr bwMode="auto">
+                    <a:xfrm>
+                      <a:off x="0" y="0"/>
+                      <a:ext cx="4762500" cy="3695700"/>
+                    </a:xfrm>
+                    <a:prstGeom prst="rect">
+                      <a:avLst/>
+                    </a:prstGeom>
+                  </pic:spPr>
+                </pic:pic>
+              </a:graphicData>
+            </a:graphic>
+          </wp:inline>
+        </w:drawing>
+      </w:r>
+    </w:p>
+    <w:p>
+      <w:pPr>
+        <w:spacing w:after="200"/>
+        <w:jc w:val="center"/>
+      </w:pPr>
+      <w:r>
+        <w:rPr>
+          <w:i/>
+          <w:iCs/>
+          <w:color w:val="5A6470"/>
+          <w:sz w:val="19"/>
+          <w:szCs w:val="19"/>
+        </w:rPr>
+        <w:t>Figure B5. Demo app, “Try your own review” tab: sentiment, topic, estimated stars,</w:t>
+      </w:r>
+      <w:r>
+        <w:rPr>
+          <w:i/>
+          <w:iCs/>
+          <w:color w:val="5A6470"/>
+          <w:sz w:val="19"/>
+          <w:szCs w:val="19"/>
+        </w:rPr>
+        <w:t xml:space="preserve"> issue phrase, drafted German reply, status and judge scores for a pasted review. The server-wide spend counter is shown at the bottom.</w:t>
+      </w:r>
+    </w:p>
+    <w:p>
+      <w:pPr>
+        <w:keepNext/>
+        <w:spacing w:before="120" w:after="60"/>
+        <w:jc w:val="center"/>
+      </w:pPr>
+      <w:r>
+        <w:rPr>
+          <w:noProof/>
+        </w:rPr>
+        <w:drawing>
+          <wp:inline distT="0" distB="0" distL="0" distR="0">
+            <wp:extent cx="4762500" cy="3467100"/>
+            <wp:effectExtent l="0" t="0" r="0" b="0"/>
+            <wp:docPr id="11" name="space_spikes.png" descr="Figure B6. Demo app, “Spike detection” tab: the four spikes (z-score 12.56, 9.80, 4.54 and 4.26) and the weekly line chart; the same detector as workflow 04." title="Figure B6. Demo app, “Spike detection” tab: the four spikes (z-score 12.56, 9.80, 4.54 and 4.26) and the weekly line chart; the same detector as workflow 04."/>
+            <wp:cNvGraphicFramePr>
+              <a:graphicFrameLocks xmlns:a="http://schemas.openxmlformats.org/drawingml/2006/main" noChangeAspect="1"/>
+            </wp:cNvGraphicFramePr>
+            <a:graphic xmlns:a="http://schemas.openxmlformats.org/drawingml/2006/main">
+              <a:graphicData uri="http://schemas.openxmlformats.org/drawingml/2006/picture">
+                <pic:pic xmlns:pic="http://schemas.openxmlformats.org/drawingml/2006/picture">
+                  <pic:nvPicPr>
+                    <pic:cNvPr id="0" name=""/>
+                    <pic:cNvPicPr>
+                      <a:picLocks noChangeAspect="1" noChangeArrowheads="1"/>
+                    </pic:cNvPicPr>
+                  </pic:nvPicPr>
+                  <pic:blipFill>
+                    <a:blip r:embed="rId17"/>
+                    <a:srcRect/>
+                    <a:stretch>
+                      <a:fillRect/>
+                    </a:stretch>
+                  </pic:blipFill>
+                  <pic:spPr bwMode="auto">
+                    <a:xfrm>
+                      <a:off x="0" y="0"/>
+                      <a:ext cx="4762500" cy="3467100"/>
+                    </a:xfrm>
+                    <a:prstGeom prst="rect">
+                      <a:avLst/>
+                    </a:prstGeom>
+                  </pic:spPr>
+                </pic:pic>
+              </a:graphicData>
+            </a:graphic>
+          </wp:inline>
+        </w:drawing>
+      </w:r>
+    </w:p>
+    <w:p>
+      <w:pPr>
+        <w:spacing w:after="200"/>
+        <w:jc w:val="center"/>
+      </w:pPr>
+      <w:r>
+        <w:rPr>
+          <w:i/>
+          <w:iCs/>
+          <w:color w:val="5A6470"/>
+          <w:sz w:val="19"/>
+          <w:szCs w:val="19"/>
+        </w:rPr>
+        <w:t>Figure B6. Demo app, “Spike detection” tab: the four spikes (z-score 12.56, 9.80, 4.54 and 4.26) and the weekly line c</w:t>
+      </w:r>
+      <w:r>
+        <w:rPr>
+          <w:i/>
+          <w:iCs/>
+          <w:color w:val="5A6470"/>
+          <w:sz w:val="19"/>
+          <w:szCs w:val="19"/>
+        </w:rPr>
+        <w:t>hart; the same detector as workflow 04.</w:t>
+      </w:r>
+    </w:p>
+    <w:p>
+      <w:pPr>
         <w:pBdr>
           <w:left w:val="single" w:sz="18" w:space="8" w:color="E9A23B"/>
         </w:pBdr>
@@ -25755,8 +25925,8 @@
       </w:r>
     </w:p>
     <w:sectPr>
-      <w:headerReference w:type="default" r:id="rId16"/>
-      <w:footerReference w:type="default" r:id="rId17"/>
+      <w:headerReference w:type="default" r:id="rId18"/>
+      <w:footerReference w:type="default" r:id="rId19"/>
       <w:pgSz w:w="11906" w:h="16838"/>
       <w:pgMar w:top="1134" w:right="1134" w:bottom="1134" w:left="1134" w:header="708" w:footer="708" w:gutter="0"/>
       <w:cols w:space="720"/>
@@ -25830,7 +26000,7 @@
         <w:sz w:val="17"/>
         <w:szCs w:val="17"/>
       </w:rPr>
-      <w:t>25</w:t>
+      <w:t>26</w:t>
     </w:r>
     <w:r>
       <w:rPr>
@@ -25884,10 +26054,64 @@
 <file path=word/numbering.xml><?xml version="1.0" encoding="utf-8"?>
 <w:numbering xmlns:wpc="http://schemas.microsoft.com/office/word/2010/wordprocessingCanvas" xmlns:cx="http://schemas.microsoft.com/office/drawing/2014/chartex" xmlns:mc="http://schemas.openxmlformats.org/markup-compatibility/2006" xmlns:o="urn:schemas-microsoft-com:office:office" xmlns:r="http://schemas.openxmlformats.org/officeDocument/2006/relationships" xmlns:m="http://schemas.openxmlformats.org/officeDocument/2006/math" xmlns:v="urn:schemas-microsoft-com:vml" xmlns:wp14="http://schemas.microsoft.com/office/word/2010/wordprocessingDrawing" xmlns:wp="http://schemas.openxmlformats.org/drawingml/2006/wordprocessingDrawing" xmlns:w10="urn:schemas-microsoft-com:office:word" xmlns:w="http://schemas.openxmlformats.org/wordprocessingml/2006/main" xmlns:w14="http://schemas.microsoft.com/office/word/2010/wordml" xmlns:w15="http://schemas.microsoft.com/office/word/2012/wordml" xmlns:w16se="http://schemas.microsoft.com/office/word/2015/wordml/symex" xmlns:wpg="http://schemas.microsoft.com/office/word/2010/wordprocessingGroup" xmlns:wpi="http://schemas.microsoft.com/office/word/2010/wordprocessingInk" xmlns:wne="http://schemas.microsoft.com/office/word/2006/wordml" xmlns:wps="http://schemas.microsoft.com/office/word/2010/wordprocessingShape" mc:Ignorable="w14 w15 w16se wp14">
   <w:abstractNum w:abstractNumId="0" w15:restartNumberingAfterBreak="0">
-    <w:nsid w:val="4E136B1E"/>
+    <w:nsid w:val="0CAD0C02"/>
     <w:multiLevelType w:val="hybridMultilevel"/>
-    <w:tmpl w:val="686A19E2"/>
-    <w:lvl w:ilvl="0" w:tplc="30F49040">
+    <w:tmpl w:val="AF24A730"/>
+    <w:lvl w:ilvl="0" w:tplc="4DCCE4C0">
+      <w:start w:val="1"/>
+      <w:numFmt w:val="decimal"/>
+      <w:lvlText w:val="%1."/>
+      <w:lvlJc w:val="left"/>
+      <w:pPr>
+        <w:ind w:left="540" w:hanging="360"/>
+      </w:pPr>
+    </w:lvl>
+    <w:lvl w:ilvl="1" w:tplc="3A66BA72">
+      <w:numFmt w:val="decimal"/>
+      <w:lvlText w:val=""/>
+      <w:lvlJc w:val="left"/>
+    </w:lvl>
+    <w:lvl w:ilvl="2" w:tplc="55340B0C">
+      <w:numFmt w:val="decimal"/>
+      <w:lvlText w:val=""/>
+      <w:lvlJc w:val="left"/>
+    </w:lvl>
+    <w:lvl w:ilvl="3" w:tplc="2CE24C16">
+      <w:numFmt w:val="decimal"/>
+      <w:lvlText w:val=""/>
+      <w:lvlJc w:val="left"/>
+    </w:lvl>
+    <w:lvl w:ilvl="4" w:tplc="6F50D54E">
+      <w:numFmt w:val="decimal"/>
+      <w:lvlText w:val=""/>
+      <w:lvlJc w:val="left"/>
+    </w:lvl>
+    <w:lvl w:ilvl="5" w:tplc="94EE074C">
+      <w:numFmt w:val="decimal"/>
+      <w:lvlText w:val=""/>
+      <w:lvlJc w:val="left"/>
+    </w:lvl>
+    <w:lvl w:ilvl="6" w:tplc="543617F4">
+      <w:numFmt w:val="decimal"/>
+      <w:lvlText w:val=""/>
+      <w:lvlJc w:val="left"/>
+    </w:lvl>
+    <w:lvl w:ilvl="7" w:tplc="29E6DDF0">
+      <w:numFmt w:val="decimal"/>
+      <w:lvlText w:val=""/>
+      <w:lvlJc w:val="left"/>
+    </w:lvl>
+    <w:lvl w:ilvl="8" w:tplc="049C420A">
+      <w:numFmt w:val="decimal"/>
+      <w:lvlText w:val=""/>
+      <w:lvlJc w:val="left"/>
+    </w:lvl>
+  </w:abstractNum>
+  <w:abstractNum w:abstractNumId="1" w15:restartNumberingAfterBreak="0">
+    <w:nsid w:val="37A621A5"/>
+    <w:multiLevelType w:val="hybridMultilevel"/>
+    <w:tmpl w:val="E14CAD46"/>
+    <w:lvl w:ilvl="0" w:tplc="03C6FB2A">
       <w:start w:val="1"/>
       <w:numFmt w:val="bullet"/>
       <w:lvlText w:val="•"/>
@@ -25896,106 +26120,52 @@
         <w:ind w:left="540" w:hanging="270"/>
       </w:pPr>
     </w:lvl>
-    <w:lvl w:ilvl="1" w:tplc="6CE62A7C">
+    <w:lvl w:ilvl="1" w:tplc="32A448DC">
       <w:numFmt w:val="decimal"/>
       <w:lvlText w:val=""/>
       <w:lvlJc w:val="left"/>
     </w:lvl>
-    <w:lvl w:ilvl="2" w:tplc="2F4CFC24">
+    <w:lvl w:ilvl="2" w:tplc="965CAE82">
       <w:numFmt w:val="decimal"/>
       <w:lvlText w:val=""/>
       <w:lvlJc w:val="left"/>
     </w:lvl>
-    <w:lvl w:ilvl="3" w:tplc="A3E040B6">
+    <w:lvl w:ilvl="3" w:tplc="5F581CA6">
       <w:numFmt w:val="decimal"/>
       <w:lvlText w:val=""/>
       <w:lvlJc w:val="left"/>
     </w:lvl>
-    <w:lvl w:ilvl="4" w:tplc="D9E0E5EA">
+    <w:lvl w:ilvl="4" w:tplc="95D47954">
       <w:numFmt w:val="decimal"/>
       <w:lvlText w:val=""/>
       <w:lvlJc w:val="left"/>
     </w:lvl>
-    <w:lvl w:ilvl="5" w:tplc="FB1A9BE4">
+    <w:lvl w:ilvl="5" w:tplc="31DAD3BA">
       <w:numFmt w:val="decimal"/>
       <w:lvlText w:val=""/>
       <w:lvlJc w:val="left"/>
     </w:lvl>
-    <w:lvl w:ilvl="6" w:tplc="11589B64">
+    <w:lvl w:ilvl="6" w:tplc="092AF81A">
       <w:numFmt w:val="decimal"/>
       <w:lvlText w:val=""/>
       <w:lvlJc w:val="left"/>
     </w:lvl>
-    <w:lvl w:ilvl="7" w:tplc="E08E36E6">
+    <w:lvl w:ilvl="7" w:tplc="C532C5B2">
       <w:numFmt w:val="decimal"/>
       <w:lvlText w:val=""/>
       <w:lvlJc w:val="left"/>
     </w:lvl>
-    <w:lvl w:ilvl="8" w:tplc="8FB44E00">
-      <w:numFmt w:val="decimal"/>
-      <w:lvlText w:val=""/>
-      <w:lvlJc w:val="left"/>
-    </w:lvl>
-  </w:abstractNum>
-  <w:abstractNum w:abstractNumId="1" w15:restartNumberingAfterBreak="0">
-    <w:nsid w:val="61780ABD"/>
-    <w:multiLevelType w:val="hybridMultilevel"/>
-    <w:tmpl w:val="4F364B80"/>
-    <w:lvl w:ilvl="0" w:tplc="F1A26A40">
-      <w:start w:val="1"/>
-      <w:numFmt w:val="decimal"/>
-      <w:lvlText w:val="%1."/>
-      <w:lvlJc w:val="left"/>
-      <w:pPr>
-        <w:ind w:left="540" w:hanging="360"/>
-      </w:pPr>
-    </w:lvl>
-    <w:lvl w:ilvl="1" w:tplc="98A438FC">
-      <w:numFmt w:val="decimal"/>
-      <w:lvlText w:val=""/>
-      <w:lvlJc w:val="left"/>
-    </w:lvl>
-    <w:lvl w:ilvl="2" w:tplc="692C3732">
-      <w:numFmt w:val="decimal"/>
-      <w:lvlText w:val=""/>
-      <w:lvlJc w:val="left"/>
-    </w:lvl>
-    <w:lvl w:ilvl="3" w:tplc="CAC80EB2">
-      <w:numFmt w:val="decimal"/>
-      <w:lvlText w:val=""/>
-      <w:lvlJc w:val="left"/>
-    </w:lvl>
-    <w:lvl w:ilvl="4" w:tplc="3800C93C">
-      <w:numFmt w:val="decimal"/>
-      <w:lvlText w:val=""/>
-      <w:lvlJc w:val="left"/>
-    </w:lvl>
-    <w:lvl w:ilvl="5" w:tplc="784EA504">
-      <w:numFmt w:val="decimal"/>
-      <w:lvlText w:val=""/>
-      <w:lvlJc w:val="left"/>
-    </w:lvl>
-    <w:lvl w:ilvl="6" w:tplc="12689D5A">
-      <w:numFmt w:val="decimal"/>
-      <w:lvlText w:val=""/>
-      <w:lvlJc w:val="left"/>
-    </w:lvl>
-    <w:lvl w:ilvl="7" w:tplc="08AE4C68">
-      <w:numFmt w:val="decimal"/>
-      <w:lvlText w:val=""/>
-      <w:lvlJc w:val="left"/>
-    </w:lvl>
-    <w:lvl w:ilvl="8" w:tplc="8CF86E32">
+    <w:lvl w:ilvl="8" w:tplc="DCB6BDC0">
       <w:numFmt w:val="decimal"/>
       <w:lvlText w:val=""/>
       <w:lvlJc w:val="left"/>
     </w:lvl>
   </w:abstractNum>
   <w:abstractNum w:abstractNumId="2" w15:restartNumberingAfterBreak="0">
-    <w:nsid w:val="6AC66923"/>
+    <w:nsid w:val="5E635692"/>
     <w:multiLevelType w:val="hybridMultilevel"/>
-    <w:tmpl w:val="76D41B88"/>
-    <w:lvl w:ilvl="0" w:tplc="A5100B10">
+    <w:tmpl w:val="DA322954"/>
+    <w:lvl w:ilvl="0" w:tplc="BF9A2826">
       <w:start w:val="1"/>
       <w:numFmt w:val="bullet"/>
       <w:lvlText w:val="●"/>
@@ -26004,7 +26174,7 @@
         <w:ind w:left="720" w:hanging="360"/>
       </w:pPr>
     </w:lvl>
-    <w:lvl w:ilvl="1" w:tplc="E62234A0">
+    <w:lvl w:ilvl="1" w:tplc="C15EE79A">
       <w:start w:val="1"/>
       <w:numFmt w:val="bullet"/>
       <w:lvlText w:val="○"/>
@@ -26013,7 +26183,7 @@
         <w:ind w:left="1440" w:hanging="360"/>
       </w:pPr>
     </w:lvl>
-    <w:lvl w:ilvl="2" w:tplc="4D7E2D08">
+    <w:lvl w:ilvl="2" w:tplc="9A1A55D6">
       <w:start w:val="1"/>
       <w:numFmt w:val="bullet"/>
       <w:lvlText w:val="■"/>
@@ -26022,7 +26192,7 @@
         <w:ind w:left="2160" w:hanging="360"/>
       </w:pPr>
     </w:lvl>
-    <w:lvl w:ilvl="3" w:tplc="09A43FB8">
+    <w:lvl w:ilvl="3" w:tplc="4E3E1AAA">
       <w:start w:val="1"/>
       <w:numFmt w:val="bullet"/>
       <w:lvlText w:val="●"/>
@@ -26031,7 +26201,7 @@
         <w:ind w:left="2880" w:hanging="360"/>
       </w:pPr>
     </w:lvl>
-    <w:lvl w:ilvl="4" w:tplc="00FE6CE4">
+    <w:lvl w:ilvl="4" w:tplc="2AE4B388">
       <w:start w:val="1"/>
       <w:numFmt w:val="bullet"/>
       <w:lvlText w:val="○"/>
@@ -26040,7 +26210,7 @@
         <w:ind w:left="3600" w:hanging="360"/>
       </w:pPr>
     </w:lvl>
-    <w:lvl w:ilvl="5" w:tplc="C7FEE6B0">
+    <w:lvl w:ilvl="5" w:tplc="F3F21D22">
       <w:start w:val="1"/>
       <w:numFmt w:val="bullet"/>
       <w:lvlText w:val="■"/>
@@ -26049,7 +26219,7 @@
         <w:ind w:left="4320" w:hanging="360"/>
       </w:pPr>
     </w:lvl>
-    <w:lvl w:ilvl="6" w:tplc="AE4C1382">
+    <w:lvl w:ilvl="6" w:tplc="1EDC5116">
       <w:start w:val="1"/>
       <w:numFmt w:val="bullet"/>
       <w:lvlText w:val="●"/>
@@ -26058,7 +26228,7 @@
         <w:ind w:left="5040" w:hanging="360"/>
       </w:pPr>
     </w:lvl>
-    <w:lvl w:ilvl="7" w:tplc="E6D8A1DA">
+    <w:lvl w:ilvl="7" w:tplc="46B4BB3A">
       <w:start w:val="1"/>
       <w:numFmt w:val="bullet"/>
       <w:lvlText w:val="●"/>
@@ -26067,7 +26237,7 @@
         <w:ind w:left="5760" w:hanging="360"/>
       </w:pPr>
     </w:lvl>
-    <w:lvl w:ilvl="8" w:tplc="B456F152">
+    <w:lvl w:ilvl="8" w:tplc="19DECF2C">
       <w:start w:val="1"/>
       <w:numFmt w:val="bullet"/>
       <w:lvlText w:val="●"/>
@@ -26078,10 +26248,10 @@
     </w:lvl>
   </w:abstractNum>
   <w:abstractNum w:abstractNumId="3" w15:restartNumberingAfterBreak="0">
-    <w:nsid w:val="791F5B9E"/>
+    <w:nsid w:val="6C857E9F"/>
     <w:multiLevelType w:val="hybridMultilevel"/>
-    <w:tmpl w:val="EBDAA0BC"/>
-    <w:lvl w:ilvl="0" w:tplc="E098CB44">
+    <w:tmpl w:val="FC7E055A"/>
+    <w:lvl w:ilvl="0" w:tplc="A51EFBEA">
       <w:start w:val="1"/>
       <w:numFmt w:val="decimal"/>
       <w:lvlText w:val="%1."/>
@@ -26090,42 +26260,42 @@
         <w:ind w:left="540" w:hanging="360"/>
       </w:pPr>
     </w:lvl>
-    <w:lvl w:ilvl="1" w:tplc="8A9AE218">
+    <w:lvl w:ilvl="1" w:tplc="DA9C2C3A">
       <w:numFmt w:val="decimal"/>
       <w:lvlText w:val=""/>
       <w:lvlJc w:val="left"/>
     </w:lvl>
-    <w:lvl w:ilvl="2" w:tplc="4240E8DC">
+    <w:lvl w:ilvl="2" w:tplc="0D20CDD2">
       <w:numFmt w:val="decimal"/>
       <w:lvlText w:val=""/>
       <w:lvlJc w:val="left"/>
     </w:lvl>
-    <w:lvl w:ilvl="3" w:tplc="CD8CFE58">
+    <w:lvl w:ilvl="3" w:tplc="A13E56EE">
       <w:numFmt w:val="decimal"/>
       <w:lvlText w:val=""/>
       <w:lvlJc w:val="left"/>
     </w:lvl>
-    <w:lvl w:ilvl="4" w:tplc="0D0AB812">
+    <w:lvl w:ilvl="4" w:tplc="6BA660E6">
       <w:numFmt w:val="decimal"/>
       <w:lvlText w:val=""/>
       <w:lvlJc w:val="left"/>
     </w:lvl>
-    <w:lvl w:ilvl="5" w:tplc="3662AD98">
+    <w:lvl w:ilvl="5" w:tplc="F14C9BD6">
       <w:numFmt w:val="decimal"/>
       <w:lvlText w:val=""/>
       <w:lvlJc w:val="left"/>
     </w:lvl>
-    <w:lvl w:ilvl="6" w:tplc="3B965CCE">
+    <w:lvl w:ilvl="6" w:tplc="DAA23C30">
       <w:numFmt w:val="decimal"/>
       <w:lvlText w:val=""/>
       <w:lvlJc w:val="left"/>
     </w:lvl>
-    <w:lvl w:ilvl="7" w:tplc="BB344696">
+    <w:lvl w:ilvl="7" w:tplc="7E481406">
       <w:numFmt w:val="decimal"/>
       <w:lvlText w:val=""/>
       <w:lvlJc w:val="left"/>
     </w:lvl>
-    <w:lvl w:ilvl="8" w:tplc="5D40E4B0">
+    <w:lvl w:ilvl="8" w:tplc="9B102CBE">
       <w:numFmt w:val="decimal"/>
       <w:lvlText w:val=""/>
       <w:lvlJc w:val="left"/>
@@ -26138,13 +26308,13 @@
     </w:lvlOverride>
   </w:num>
   <w:num w:numId="2">
-    <w:abstractNumId w:val="0"/>
+    <w:abstractNumId w:val="1"/>
     <w:lvlOverride w:ilvl="0">
       <w:startOverride w:val="1"/>
     </w:lvlOverride>
   </w:num>
   <w:num w:numId="3">
-    <w:abstractNumId w:val="1"/>
+    <w:abstractNumId w:val="0"/>
     <w:lvlOverride w:ilvl="0">
       <w:startOverride w:val="1"/>
     </w:lvlOverride>
@@ -26753,7 +26923,7 @@
     <w:autoRedefine/>
     <w:uiPriority w:val="39"/>
     <w:unhideWhenUsed/>
-    <w:rsid w:val="000B59D5"/>
+    <w:rsid w:val="0030090B"/>
     <w:pPr>
       <w:spacing w:after="100"/>
     </w:pPr>
@@ -26765,7 +26935,7 @@
     <w:autoRedefine/>
     <w:uiPriority w:val="39"/>
     <w:unhideWhenUsed/>
-    <w:rsid w:val="000B59D5"/>
+    <w:rsid w:val="0030090B"/>
     <w:pPr>
       <w:spacing w:after="100"/>
       <w:ind w:left="220"/>

</xml_diff>

<commit_message>
Report: describe the Anthropic node for translation and the updated credential setup
Co-Authored-By: Claude Sonnet 5.5 <noreply@anthropic.com>
</commit_message>
<xml_diff>
--- a/docs/final/Final_Project_Report.docx
+++ b/docs/final/Final_Project_Report.docx
@@ -105,7 +105,7 @@
         <w:pStyle w:val="Heading1"/>
         <w:pageBreakBefore/>
       </w:pPr>
-      <w:bookmarkStart w:id="1" w:name="_Toc241869937"/>
+      <w:bookmarkStart w:id="1" w:name="_Toc242005689"/>
       <w:r>
         <w:lastRenderedPageBreak/>
         <w:t>Team</w:t>
@@ -135,7 +135,7 @@
           <w:left w:w="10" w:type="dxa"/>
           <w:right w:w="10" w:type="dxa"/>
         </w:tblCellMar>
-        <w:tblLook w:val="04A0" w:firstRow="1" w:lastRow="0" w:firstColumn="1" w:lastColumn="0" w:noHBand="0" w:noVBand="1"/>
+        <w:tblLook w:val="0000" w:firstRow="0" w:lastRow="0" w:firstColumn="0" w:lastColumn="0" w:noHBand="0" w:noVBand="0"/>
       </w:tblPr>
       <w:tblGrid>
         <w:gridCol w:w="4200"/>
@@ -668,7 +668,7 @@
       <w:pPr>
         <w:pStyle w:val="Heading2"/>
       </w:pPr>
-      <w:bookmarkStart w:id="2" w:name="_Toc241869938"/>
+      <w:bookmarkStart w:id="2" w:name="_Toc242005690"/>
       <w:r>
         <w:t>How this report is organised</w:t>
       </w:r>
@@ -720,7 +720,7 @@
     <w:sdt>
       <w:sdtPr>
         <w:alias w:val="Contents"/>
-        <w:id w:val="-1689050162"/>
+        <w:id w:val="1785074853"/>
       </w:sdtPr>
       <w:sdtEndPr/>
       <w:sdtContent>
@@ -744,7 +744,7 @@
           <w:r>
             <w:fldChar w:fldCharType="separate"/>
           </w:r>
-          <w:hyperlink w:anchor="_Toc241869937" w:history="1">
+          <w:hyperlink w:anchor="_Toc242005689" w:history="1">
             <w:r>
               <w:rPr>
                 <w:rStyle w:val="Hyperlink"/>
@@ -768,7 +768,7 @@
               <w:rPr>
                 <w:noProof/>
               </w:rPr>
-              <w:instrText xml:space="preserve"> PAGEREF _Toc241869937 \h </w:instrText>
+              <w:instrText xml:space="preserve"> PAGEREF _Toc242005689 \h </w:instrText>
             </w:r>
             <w:r>
               <w:rPr>
@@ -806,7 +806,7 @@
               <w:noProof/>
             </w:rPr>
           </w:pPr>
-          <w:hyperlink w:anchor="_Toc241869938" w:history="1">
+          <w:hyperlink w:anchor="_Toc242005690" w:history="1">
             <w:r>
               <w:rPr>
                 <w:rStyle w:val="Hyperlink"/>
@@ -830,7 +830,7 @@
               <w:rPr>
                 <w:noProof/>
               </w:rPr>
-              <w:instrText xml:space="preserve"> PAGEREF _Toc241869938 \h </w:instrText>
+              <w:instrText xml:space="preserve"> PAGEREF _Toc242005690 \h </w:instrText>
             </w:r>
             <w:r>
               <w:rPr>
@@ -868,7 +868,7 @@
               <w:noProof/>
             </w:rPr>
           </w:pPr>
-          <w:hyperlink w:anchor="_Toc241869939" w:history="1">
+          <w:hyperlink w:anchor="_Toc242005691" w:history="1">
             <w:r>
               <w:rPr>
                 <w:rStyle w:val="Hyperlink"/>
@@ -892,7 +892,7 @@
               <w:rPr>
                 <w:noProof/>
               </w:rPr>
-              <w:instrText xml:space="preserve"> PAGEREF _Toc241869939 \h </w:instrText>
+              <w:instrText xml:space="preserve"> PAGEREF _Toc242005691 \h </w:instrText>
             </w:r>
             <w:r>
               <w:rPr>
@@ -930,7 +930,7 @@
               <w:noProof/>
             </w:rPr>
           </w:pPr>
-          <w:hyperlink w:anchor="_Toc241869940" w:history="1">
+          <w:hyperlink w:anchor="_Toc242005692" w:history="1">
             <w:r>
               <w:rPr>
                 <w:rStyle w:val="Hyperlink"/>
@@ -954,7 +954,7 @@
               <w:rPr>
                 <w:noProof/>
               </w:rPr>
-              <w:instrText xml:space="preserve"> PAGEREF _Toc241869940 \h </w:instrText>
+              <w:instrText xml:space="preserve"> PAGEREF _Toc242005692 \h </w:instrText>
             </w:r>
             <w:r>
               <w:rPr>
@@ -992,7 +992,7 @@
               <w:noProof/>
             </w:rPr>
           </w:pPr>
-          <w:hyperlink w:anchor="_Toc241869941" w:history="1">
+          <w:hyperlink w:anchor="_Toc242005693" w:history="1">
             <w:r>
               <w:rPr>
                 <w:rStyle w:val="Hyperlink"/>
@@ -1016,7 +1016,7 @@
               <w:rPr>
                 <w:noProof/>
               </w:rPr>
-              <w:instrText xml:space="preserve"> PAGEREF _Toc241869941 \h </w:instrText>
+              <w:instrText xml:space="preserve"> PAGEREF _Toc242005693 \h </w:instrText>
             </w:r>
             <w:r>
               <w:rPr>
@@ -1054,7 +1054,7 @@
               <w:noProof/>
             </w:rPr>
           </w:pPr>
-          <w:hyperlink w:anchor="_Toc241869942" w:history="1">
+          <w:hyperlink w:anchor="_Toc242005694" w:history="1">
             <w:r>
               <w:rPr>
                 <w:rStyle w:val="Hyperlink"/>
@@ -1078,7 +1078,7 @@
               <w:rPr>
                 <w:noProof/>
               </w:rPr>
-              <w:instrText xml:space="preserve"> PAGEREF _Toc241869942 \h </w:instrText>
+              <w:instrText xml:space="preserve"> PAGEREF _Toc242005694 \h </w:instrText>
             </w:r>
             <w:r>
               <w:rPr>
@@ -1116,7 +1116,7 @@
               <w:noProof/>
             </w:rPr>
           </w:pPr>
-          <w:hyperlink w:anchor="_Toc241869943" w:history="1">
+          <w:hyperlink w:anchor="_Toc242005695" w:history="1">
             <w:r>
               <w:rPr>
                 <w:rStyle w:val="Hyperlink"/>
@@ -1140,7 +1140,7 @@
               <w:rPr>
                 <w:noProof/>
               </w:rPr>
-              <w:instrText xml:space="preserve"> PAGEREF _Toc241869943 \h </w:instrText>
+              <w:instrText xml:space="preserve"> PAGEREF _Toc242005695 \h </w:instrText>
             </w:r>
             <w:r>
               <w:rPr>
@@ -1178,7 +1178,7 @@
               <w:noProof/>
             </w:rPr>
           </w:pPr>
-          <w:hyperlink w:anchor="_Toc241869944" w:history="1">
+          <w:hyperlink w:anchor="_Toc242005696" w:history="1">
             <w:r>
               <w:rPr>
                 <w:rStyle w:val="Hyperlink"/>
@@ -1202,7 +1202,7 @@
               <w:rPr>
                 <w:noProof/>
               </w:rPr>
-              <w:instrText xml:space="preserve"> PAGEREF _Toc241869944 \h </w:instrText>
+              <w:instrText xml:space="preserve"> PAGEREF _Toc242005696 \h </w:instrText>
             </w:r>
             <w:r>
               <w:rPr>
@@ -1240,7 +1240,7 @@
               <w:noProof/>
             </w:rPr>
           </w:pPr>
-          <w:hyperlink w:anchor="_Toc241869945" w:history="1">
+          <w:hyperlink w:anchor="_Toc242005697" w:history="1">
             <w:r>
               <w:rPr>
                 <w:rStyle w:val="Hyperlink"/>
@@ -1264,7 +1264,7 @@
               <w:rPr>
                 <w:noProof/>
               </w:rPr>
-              <w:instrText xml:space="preserve"> PAGEREF _Toc241869945 \h </w:instrText>
+              <w:instrText xml:space="preserve"> PAGEREF _Toc242005697 \h </w:instrText>
             </w:r>
             <w:r>
               <w:rPr>
@@ -1302,7 +1302,7 @@
               <w:noProof/>
             </w:rPr>
           </w:pPr>
-          <w:hyperlink w:anchor="_Toc241869946" w:history="1">
+          <w:hyperlink w:anchor="_Toc242005698" w:history="1">
             <w:r>
               <w:rPr>
                 <w:rStyle w:val="Hyperlink"/>
@@ -1326,7 +1326,7 @@
               <w:rPr>
                 <w:noProof/>
               </w:rPr>
-              <w:instrText xml:space="preserve"> PAGEREF _Toc241869946 \h </w:instrText>
+              <w:instrText xml:space="preserve"> PAGEREF _Toc242005698 \h </w:instrText>
             </w:r>
             <w:r>
               <w:rPr>
@@ -1364,7 +1364,7 @@
               <w:noProof/>
             </w:rPr>
           </w:pPr>
-          <w:hyperlink w:anchor="_Toc241869947" w:history="1">
+          <w:hyperlink w:anchor="_Toc242005699" w:history="1">
             <w:r>
               <w:rPr>
                 <w:rStyle w:val="Hyperlink"/>
@@ -1388,7 +1388,7 @@
               <w:rPr>
                 <w:noProof/>
               </w:rPr>
-              <w:instrText xml:space="preserve"> PAGEREF _Toc241869947 \h </w:instrText>
+              <w:instrText xml:space="preserve"> PAGEREF _Toc242005699 \h </w:instrText>
             </w:r>
             <w:r>
               <w:rPr>
@@ -1426,7 +1426,7 @@
               <w:noProof/>
             </w:rPr>
           </w:pPr>
-          <w:hyperlink w:anchor="_Toc241869948" w:history="1">
+          <w:hyperlink w:anchor="_Toc242005700" w:history="1">
             <w:r>
               <w:rPr>
                 <w:rStyle w:val="Hyperlink"/>
@@ -1450,7 +1450,7 @@
               <w:rPr>
                 <w:noProof/>
               </w:rPr>
-              <w:instrText xml:space="preserve"> PAGEREF _Toc241869948 \h </w:instrText>
+              <w:instrText xml:space="preserve"> PAGEREF _Toc242005700 \h </w:instrText>
             </w:r>
             <w:r>
               <w:rPr>
@@ -1488,7 +1488,7 @@
               <w:noProof/>
             </w:rPr>
           </w:pPr>
-          <w:hyperlink w:anchor="_Toc241869949" w:history="1">
+          <w:hyperlink w:anchor="_Toc242005701" w:history="1">
             <w:r>
               <w:rPr>
                 <w:rStyle w:val="Hyperlink"/>
@@ -1512,7 +1512,7 @@
               <w:rPr>
                 <w:noProof/>
               </w:rPr>
-              <w:instrText xml:space="preserve"> PAGEREF _Toc241869949 \h </w:instrText>
+              <w:instrText xml:space="preserve"> PAGEREF _Toc242005701 \h </w:instrText>
             </w:r>
             <w:r>
               <w:rPr>
@@ -1550,7 +1550,7 @@
               <w:noProof/>
             </w:rPr>
           </w:pPr>
-          <w:hyperlink w:anchor="_Toc241869950" w:history="1">
+          <w:hyperlink w:anchor="_Toc242005702" w:history="1">
             <w:r>
               <w:rPr>
                 <w:rStyle w:val="Hyperlink"/>
@@ -1574,7 +1574,7 @@
               <w:rPr>
                 <w:noProof/>
               </w:rPr>
-              <w:instrText xml:space="preserve"> PAGEREF _Toc241869950 \h </w:instrText>
+              <w:instrText xml:space="preserve"> PAGEREF _Toc242005702 \h </w:instrText>
             </w:r>
             <w:r>
               <w:rPr>
@@ -1612,7 +1612,7 @@
               <w:noProof/>
             </w:rPr>
           </w:pPr>
-          <w:hyperlink w:anchor="_Toc241869951" w:history="1">
+          <w:hyperlink w:anchor="_Toc242005703" w:history="1">
             <w:r>
               <w:rPr>
                 <w:rStyle w:val="Hyperlink"/>
@@ -1636,7 +1636,7 @@
               <w:rPr>
                 <w:noProof/>
               </w:rPr>
-              <w:instrText xml:space="preserve"> PAGEREF _Toc241869951 \h </w:instrText>
+              <w:instrText xml:space="preserve"> PAGEREF _Toc242005703 \h </w:instrText>
             </w:r>
             <w:r>
               <w:rPr>
@@ -1674,7 +1674,7 @@
               <w:noProof/>
             </w:rPr>
           </w:pPr>
-          <w:hyperlink w:anchor="_Toc241869952" w:history="1">
+          <w:hyperlink w:anchor="_Toc242005704" w:history="1">
             <w:r>
               <w:rPr>
                 <w:rStyle w:val="Hyperlink"/>
@@ -1698,7 +1698,7 @@
               <w:rPr>
                 <w:noProof/>
               </w:rPr>
-              <w:instrText xml:space="preserve"> PAGEREF _Toc241869952 \h </w:instrText>
+              <w:instrText xml:space="preserve"> PAGEREF _Toc242005704 \h </w:instrText>
             </w:r>
             <w:r>
               <w:rPr>
@@ -1736,7 +1736,7 @@
               <w:noProof/>
             </w:rPr>
           </w:pPr>
-          <w:hyperlink w:anchor="_Toc241869953" w:history="1">
+          <w:hyperlink w:anchor="_Toc242005705" w:history="1">
             <w:r>
               <w:rPr>
                 <w:rStyle w:val="Hyperlink"/>
@@ -1760,7 +1760,7 @@
               <w:rPr>
                 <w:noProof/>
               </w:rPr>
-              <w:instrText xml:space="preserve"> PAGEREF _Toc241869953 \h </w:instrText>
+              <w:instrText xml:space="preserve"> PAGEREF _Toc242005705 \h </w:instrText>
             </w:r>
             <w:r>
               <w:rPr>
@@ -1798,7 +1798,7 @@
               <w:noProof/>
             </w:rPr>
           </w:pPr>
-          <w:hyperlink w:anchor="_Toc241869954" w:history="1">
+          <w:hyperlink w:anchor="_Toc242005706" w:history="1">
             <w:r>
               <w:rPr>
                 <w:rStyle w:val="Hyperlink"/>
@@ -1822,7 +1822,7 @@
               <w:rPr>
                 <w:noProof/>
               </w:rPr>
-              <w:instrText xml:space="preserve"> PAGEREF _Toc241869954 \h </w:instrText>
+              <w:instrText xml:space="preserve"> PAGEREF _Toc242005706 \h </w:instrText>
             </w:r>
             <w:r>
               <w:rPr>
@@ -1860,7 +1860,7 @@
               <w:noProof/>
             </w:rPr>
           </w:pPr>
-          <w:hyperlink w:anchor="_Toc241869955" w:history="1">
+          <w:hyperlink w:anchor="_Toc242005707" w:history="1">
             <w:r>
               <w:rPr>
                 <w:rStyle w:val="Hyperlink"/>
@@ -1884,7 +1884,7 @@
               <w:rPr>
                 <w:noProof/>
               </w:rPr>
-              <w:instrText xml:space="preserve"> PAGEREF _Toc241869955 \h </w:instrText>
+              <w:instrText xml:space="preserve"> PAGEREF _Toc242005707 \h </w:instrText>
             </w:r>
             <w:r>
               <w:rPr>
@@ -1922,7 +1922,7 @@
               <w:noProof/>
             </w:rPr>
           </w:pPr>
-          <w:hyperlink w:anchor="_Toc241869956" w:history="1">
+          <w:hyperlink w:anchor="_Toc242005708" w:history="1">
             <w:r>
               <w:rPr>
                 <w:rStyle w:val="Hyperlink"/>
@@ -1946,7 +1946,7 @@
               <w:rPr>
                 <w:noProof/>
               </w:rPr>
-              <w:instrText xml:space="preserve"> PAGEREF _Toc241869956 \h </w:instrText>
+              <w:instrText xml:space="preserve"> PAGEREF _Toc242005708 \h </w:instrText>
             </w:r>
             <w:r>
               <w:rPr>
@@ -1963,7 +1963,7 @@
               <w:rPr>
                 <w:noProof/>
               </w:rPr>
-              <w:t>11</w:t>
+              <w:t>12</w:t>
             </w:r>
             <w:r>
               <w:rPr>
@@ -1984,7 +1984,7 @@
               <w:noProof/>
             </w:rPr>
           </w:pPr>
-          <w:hyperlink w:anchor="_Toc241869957" w:history="1">
+          <w:hyperlink w:anchor="_Toc242005709" w:history="1">
             <w:r>
               <w:rPr>
                 <w:rStyle w:val="Hyperlink"/>
@@ -2008,7 +2008,7 @@
               <w:rPr>
                 <w:noProof/>
               </w:rPr>
-              <w:instrText xml:space="preserve"> PAGEREF _Toc241869957 \h </w:instrText>
+              <w:instrText xml:space="preserve"> PAGEREF _Toc242005709 \h </w:instrText>
             </w:r>
             <w:r>
               <w:rPr>
@@ -2046,7 +2046,7 @@
               <w:noProof/>
             </w:rPr>
           </w:pPr>
-          <w:hyperlink w:anchor="_Toc241869958" w:history="1">
+          <w:hyperlink w:anchor="_Toc242005710" w:history="1">
             <w:r>
               <w:rPr>
                 <w:rStyle w:val="Hyperlink"/>
@@ -2070,7 +2070,7 @@
               <w:rPr>
                 <w:noProof/>
               </w:rPr>
-              <w:instrText xml:space="preserve"> PAGEREF _Toc241869958 \h </w:instrText>
+              <w:instrText xml:space="preserve"> PAGEREF _Toc242005710 \h </w:instrText>
             </w:r>
             <w:r>
               <w:rPr>
@@ -2108,7 +2108,7 @@
               <w:noProof/>
             </w:rPr>
           </w:pPr>
-          <w:hyperlink w:anchor="_Toc241869959" w:history="1">
+          <w:hyperlink w:anchor="_Toc242005711" w:history="1">
             <w:r>
               <w:rPr>
                 <w:rStyle w:val="Hyperlink"/>
@@ -2132,7 +2132,7 @@
               <w:rPr>
                 <w:noProof/>
               </w:rPr>
-              <w:instrText xml:space="preserve"> PAGEREF _Toc241869959 \h </w:instrText>
+              <w:instrText xml:space="preserve"> PAGEREF _Toc242005711 \h </w:instrText>
             </w:r>
             <w:r>
               <w:rPr>
@@ -2170,7 +2170,7 @@
               <w:noProof/>
             </w:rPr>
           </w:pPr>
-          <w:hyperlink w:anchor="_Toc241869960" w:history="1">
+          <w:hyperlink w:anchor="_Toc242005712" w:history="1">
             <w:r>
               <w:rPr>
                 <w:rStyle w:val="Hyperlink"/>
@@ -2194,7 +2194,7 @@
               <w:rPr>
                 <w:noProof/>
               </w:rPr>
-              <w:instrText xml:space="preserve"> PAGEREF _Toc241869960 \h </w:instrText>
+              <w:instrText xml:space="preserve"> PAGEREF _Toc242005712 \h </w:instrText>
             </w:r>
             <w:r>
               <w:rPr>
@@ -2211,7 +2211,7 @@
               <w:rPr>
                 <w:noProof/>
               </w:rPr>
-              <w:t>14</w:t>
+              <w:t>15</w:t>
             </w:r>
             <w:r>
               <w:rPr>
@@ -2232,7 +2232,7 @@
               <w:noProof/>
             </w:rPr>
           </w:pPr>
-          <w:hyperlink w:anchor="_Toc241869961" w:history="1">
+          <w:hyperlink w:anchor="_Toc242005713" w:history="1">
             <w:r>
               <w:rPr>
                 <w:rStyle w:val="Hyperlink"/>
@@ -2256,7 +2256,7 @@
               <w:rPr>
                 <w:noProof/>
               </w:rPr>
-              <w:instrText xml:space="preserve"> PAGEREF _Toc241869961 \h </w:instrText>
+              <w:instrText xml:space="preserve"> PAGEREF _Toc242005713 \h </w:instrText>
             </w:r>
             <w:r>
               <w:rPr>
@@ -2294,7 +2294,7 @@
               <w:noProof/>
             </w:rPr>
           </w:pPr>
-          <w:hyperlink w:anchor="_Toc241869962" w:history="1">
+          <w:hyperlink w:anchor="_Toc242005714" w:history="1">
             <w:r>
               <w:rPr>
                 <w:rStyle w:val="Hyperlink"/>
@@ -2318,7 +2318,7 @@
               <w:rPr>
                 <w:noProof/>
               </w:rPr>
-              <w:instrText xml:space="preserve"> PAGEREF _Toc241869962 \h </w:instrText>
+              <w:instrText xml:space="preserve"> PAGEREF _Toc242005714 \h </w:instrText>
             </w:r>
             <w:r>
               <w:rPr>
@@ -2335,7 +2335,7 @@
               <w:rPr>
                 <w:noProof/>
               </w:rPr>
-              <w:t>15</w:t>
+              <w:t>16</w:t>
             </w:r>
             <w:r>
               <w:rPr>
@@ -2356,7 +2356,7 @@
               <w:noProof/>
             </w:rPr>
           </w:pPr>
-          <w:hyperlink w:anchor="_Toc241869963" w:history="1">
+          <w:hyperlink w:anchor="_Toc242005715" w:history="1">
             <w:r>
               <w:rPr>
                 <w:rStyle w:val="Hyperlink"/>
@@ -2380,7 +2380,7 @@
               <w:rPr>
                 <w:noProof/>
               </w:rPr>
-              <w:instrText xml:space="preserve"> PAGEREF _Toc241869963 \h </w:instrText>
+              <w:instrText xml:space="preserve"> PAGEREF _Toc242005715 \h </w:instrText>
             </w:r>
             <w:r>
               <w:rPr>
@@ -2397,7 +2397,7 @@
               <w:rPr>
                 <w:noProof/>
               </w:rPr>
-              <w:t>16</w:t>
+              <w:t>17</w:t>
             </w:r>
             <w:r>
               <w:rPr>
@@ -2418,7 +2418,7 @@
               <w:noProof/>
             </w:rPr>
           </w:pPr>
-          <w:hyperlink w:anchor="_Toc241869964" w:history="1">
+          <w:hyperlink w:anchor="_Toc242005716" w:history="1">
             <w:r>
               <w:rPr>
                 <w:rStyle w:val="Hyperlink"/>
@@ -2442,7 +2442,7 @@
               <w:rPr>
                 <w:noProof/>
               </w:rPr>
-              <w:instrText xml:space="preserve"> PAGEREF _Toc241869964 \h </w:instrText>
+              <w:instrText xml:space="preserve"> PAGEREF _Toc242005716 \h </w:instrText>
             </w:r>
             <w:r>
               <w:rPr>
@@ -2480,7 +2480,7 @@
               <w:noProof/>
             </w:rPr>
           </w:pPr>
-          <w:hyperlink w:anchor="_Toc241869965" w:history="1">
+          <w:hyperlink w:anchor="_Toc242005717" w:history="1">
             <w:r>
               <w:rPr>
                 <w:rStyle w:val="Hyperlink"/>
@@ -2504,7 +2504,7 @@
               <w:rPr>
                 <w:noProof/>
               </w:rPr>
-              <w:instrText xml:space="preserve"> PAGEREF _Toc241869965 \h </w:instrText>
+              <w:instrText xml:space="preserve"> PAGEREF _Toc242005717 \h </w:instrText>
             </w:r>
             <w:r>
               <w:rPr>
@@ -2542,7 +2542,7 @@
               <w:noProof/>
             </w:rPr>
           </w:pPr>
-          <w:hyperlink w:anchor="_Toc241869966" w:history="1">
+          <w:hyperlink w:anchor="_Toc242005718" w:history="1">
             <w:r>
               <w:rPr>
                 <w:rStyle w:val="Hyperlink"/>
@@ -2566,7 +2566,7 @@
               <w:rPr>
                 <w:noProof/>
               </w:rPr>
-              <w:instrText xml:space="preserve"> PAGEREF _Toc241869966 \h </w:instrText>
+              <w:instrText xml:space="preserve"> PAGEREF _Toc242005718 \h </w:instrText>
             </w:r>
             <w:r>
               <w:rPr>
@@ -2604,7 +2604,7 @@
               <w:noProof/>
             </w:rPr>
           </w:pPr>
-          <w:hyperlink w:anchor="_Toc241869967" w:history="1">
+          <w:hyperlink w:anchor="_Toc242005719" w:history="1">
             <w:r>
               <w:rPr>
                 <w:rStyle w:val="Hyperlink"/>
@@ -2628,7 +2628,7 @@
               <w:rPr>
                 <w:noProof/>
               </w:rPr>
-              <w:instrText xml:space="preserve"> PAGEREF _Toc241869967 \h </w:instrText>
+              <w:instrText xml:space="preserve"> PAGEREF _Toc242005719 \h </w:instrText>
             </w:r>
             <w:r>
               <w:rPr>
@@ -2645,7 +2645,7 @@
               <w:rPr>
                 <w:noProof/>
               </w:rPr>
-              <w:t>17</w:t>
+              <w:t>18</w:t>
             </w:r>
             <w:r>
               <w:rPr>
@@ -2666,7 +2666,7 @@
               <w:noProof/>
             </w:rPr>
           </w:pPr>
-          <w:hyperlink w:anchor="_Toc241869968" w:history="1">
+          <w:hyperlink w:anchor="_Toc242005720" w:history="1">
             <w:r>
               <w:rPr>
                 <w:rStyle w:val="Hyperlink"/>
@@ -2690,7 +2690,7 @@
               <w:rPr>
                 <w:noProof/>
               </w:rPr>
-              <w:instrText xml:space="preserve"> PAGEREF _Toc241869968 \h </w:instrText>
+              <w:instrText xml:space="preserve"> PAGEREF _Toc242005720 \h </w:instrText>
             </w:r>
             <w:r>
               <w:rPr>
@@ -2707,7 +2707,7 @@
               <w:rPr>
                 <w:noProof/>
               </w:rPr>
-              <w:t>18</w:t>
+              <w:t>19</w:t>
             </w:r>
             <w:r>
               <w:rPr>
@@ -2728,7 +2728,7 @@
               <w:noProof/>
             </w:rPr>
           </w:pPr>
-          <w:hyperlink w:anchor="_Toc241869969" w:history="1">
+          <w:hyperlink w:anchor="_Toc242005721" w:history="1">
             <w:r>
               <w:rPr>
                 <w:rStyle w:val="Hyperlink"/>
@@ -2752,7 +2752,7 @@
               <w:rPr>
                 <w:noProof/>
               </w:rPr>
-              <w:instrText xml:space="preserve"> PAGEREF _Toc241869969 \h </w:instrText>
+              <w:instrText xml:space="preserve"> PAGEREF _Toc242005721 \h </w:instrText>
             </w:r>
             <w:r>
               <w:rPr>
@@ -2769,7 +2769,7 @@
               <w:rPr>
                 <w:noProof/>
               </w:rPr>
-              <w:t>18</w:t>
+              <w:t>19</w:t>
             </w:r>
             <w:r>
               <w:rPr>
@@ -2790,7 +2790,7 @@
               <w:noProof/>
             </w:rPr>
           </w:pPr>
-          <w:hyperlink w:anchor="_Toc241869970" w:history="1">
+          <w:hyperlink w:anchor="_Toc242005722" w:history="1">
             <w:r>
               <w:rPr>
                 <w:rStyle w:val="Hyperlink"/>
@@ -2814,7 +2814,7 @@
               <w:rPr>
                 <w:noProof/>
               </w:rPr>
-              <w:instrText xml:space="preserve"> PAGEREF _Toc241869970 \h </w:instrText>
+              <w:instrText xml:space="preserve"> PAGEREF _Toc242005722 \h </w:instrText>
             </w:r>
             <w:r>
               <w:rPr>
@@ -2852,7 +2852,7 @@
               <w:noProof/>
             </w:rPr>
           </w:pPr>
-          <w:hyperlink w:anchor="_Toc241869971" w:history="1">
+          <w:hyperlink w:anchor="_Toc242005723" w:history="1">
             <w:r>
               <w:rPr>
                 <w:rStyle w:val="Hyperlink"/>
@@ -2876,7 +2876,7 @@
               <w:rPr>
                 <w:noProof/>
               </w:rPr>
-              <w:instrText xml:space="preserve"> PAGEREF _Toc241869971 \h </w:instrText>
+              <w:instrText xml:space="preserve"> PAGEREF _Toc242005723 \h </w:instrText>
             </w:r>
             <w:r>
               <w:rPr>
@@ -2914,7 +2914,7 @@
               <w:noProof/>
             </w:rPr>
           </w:pPr>
-          <w:hyperlink w:anchor="_Toc241869972" w:history="1">
+          <w:hyperlink w:anchor="_Toc242005724" w:history="1">
             <w:r>
               <w:rPr>
                 <w:rStyle w:val="Hyperlink"/>
@@ -2938,7 +2938,7 @@
               <w:rPr>
                 <w:noProof/>
               </w:rPr>
-              <w:instrText xml:space="preserve"> PAGEREF _Toc241869972 \h </w:instrText>
+              <w:instrText xml:space="preserve"> PAGEREF _Toc242005724 \h </w:instrText>
             </w:r>
             <w:r>
               <w:rPr>
@@ -2976,7 +2976,7 @@
               <w:noProof/>
             </w:rPr>
           </w:pPr>
-          <w:hyperlink w:anchor="_Toc241869973" w:history="1">
+          <w:hyperlink w:anchor="_Toc242005725" w:history="1">
             <w:r>
               <w:rPr>
                 <w:rStyle w:val="Hyperlink"/>
@@ -3000,7 +3000,7 @@
               <w:rPr>
                 <w:noProof/>
               </w:rPr>
-              <w:instrText xml:space="preserve"> PAGEREF _Toc241869973 \h </w:instrText>
+              <w:instrText xml:space="preserve"> PAGEREF _Toc242005725 \h </w:instrText>
             </w:r>
             <w:r>
               <w:rPr>
@@ -3038,7 +3038,7 @@
               <w:noProof/>
             </w:rPr>
           </w:pPr>
-          <w:hyperlink w:anchor="_Toc241869974" w:history="1">
+          <w:hyperlink w:anchor="_Toc242005726" w:history="1">
             <w:r>
               <w:rPr>
                 <w:rStyle w:val="Hyperlink"/>
@@ -3062,7 +3062,7 @@
               <w:rPr>
                 <w:noProof/>
               </w:rPr>
-              <w:instrText xml:space="preserve"> PAGEREF _Toc241869974 \h </w:instrText>
+              <w:instrText xml:space="preserve"> PAGEREF _Toc242005726 \h </w:instrText>
             </w:r>
             <w:r>
               <w:rPr>
@@ -3100,7 +3100,7 @@
               <w:noProof/>
             </w:rPr>
           </w:pPr>
-          <w:hyperlink w:anchor="_Toc241869975" w:history="1">
+          <w:hyperlink w:anchor="_Toc242005727" w:history="1">
             <w:r>
               <w:rPr>
                 <w:rStyle w:val="Hyperlink"/>
@@ -3124,7 +3124,7 @@
               <w:rPr>
                 <w:noProof/>
               </w:rPr>
-              <w:instrText xml:space="preserve"> PAGEREF _Toc241869975 \h </w:instrText>
+              <w:instrText xml:space="preserve"> PAGEREF _Toc242005727 \h </w:instrText>
             </w:r>
             <w:r>
               <w:rPr>
@@ -3162,7 +3162,7 @@
               <w:noProof/>
             </w:rPr>
           </w:pPr>
-          <w:hyperlink w:anchor="_Toc241869976" w:history="1">
+          <w:hyperlink w:anchor="_Toc242005728" w:history="1">
             <w:r>
               <w:rPr>
                 <w:rStyle w:val="Hyperlink"/>
@@ -3186,7 +3186,7 @@
               <w:rPr>
                 <w:noProof/>
               </w:rPr>
-              <w:instrText xml:space="preserve"> PAGEREF _Toc241869976 \h </w:instrText>
+              <w:instrText xml:space="preserve"> PAGEREF _Toc242005728 \h </w:instrText>
             </w:r>
             <w:r>
               <w:rPr>
@@ -3224,7 +3224,7 @@
               <w:noProof/>
             </w:rPr>
           </w:pPr>
-          <w:hyperlink w:anchor="_Toc241869977" w:history="1">
+          <w:hyperlink w:anchor="_Toc242005729" w:history="1">
             <w:r>
               <w:rPr>
                 <w:rStyle w:val="Hyperlink"/>
@@ -3248,7 +3248,7 @@
               <w:rPr>
                 <w:noProof/>
               </w:rPr>
-              <w:instrText xml:space="preserve"> PAGEREF _Toc241869977 \h </w:instrText>
+              <w:instrText xml:space="preserve"> PAGEREF _Toc242005729 \h </w:instrText>
             </w:r>
             <w:r>
               <w:rPr>
@@ -3286,7 +3286,7 @@
               <w:noProof/>
             </w:rPr>
           </w:pPr>
-          <w:hyperlink w:anchor="_Toc241869978" w:history="1">
+          <w:hyperlink w:anchor="_Toc242005730" w:history="1">
             <w:r>
               <w:rPr>
                 <w:rStyle w:val="Hyperlink"/>
@@ -3310,7 +3310,7 @@
               <w:rPr>
                 <w:noProof/>
               </w:rPr>
-              <w:instrText xml:space="preserve"> PAGEREF _Toc241869978 \h </w:instrText>
+              <w:instrText xml:space="preserve"> PAGEREF _Toc242005730 \h </w:instrText>
             </w:r>
             <w:r>
               <w:rPr>
@@ -3348,7 +3348,7 @@
               <w:noProof/>
             </w:rPr>
           </w:pPr>
-          <w:hyperlink w:anchor="_Toc241869979" w:history="1">
+          <w:hyperlink w:anchor="_Toc242005731" w:history="1">
             <w:r>
               <w:rPr>
                 <w:rStyle w:val="Hyperlink"/>
@@ -3372,7 +3372,7 @@
               <w:rPr>
                 <w:noProof/>
               </w:rPr>
-              <w:instrText xml:space="preserve"> PAGEREF _Toc241869979 \h </w:instrText>
+              <w:instrText xml:space="preserve"> PAGEREF _Toc242005731 \h </w:instrText>
             </w:r>
             <w:r>
               <w:rPr>
@@ -3410,7 +3410,7 @@
               <w:noProof/>
             </w:rPr>
           </w:pPr>
-          <w:hyperlink w:anchor="_Toc241869980" w:history="1">
+          <w:hyperlink w:anchor="_Toc242005732" w:history="1">
             <w:r>
               <w:rPr>
                 <w:rStyle w:val="Hyperlink"/>
@@ -3434,7 +3434,7 @@
               <w:rPr>
                 <w:noProof/>
               </w:rPr>
-              <w:instrText xml:space="preserve"> PAGEREF _Toc241869980 \h </w:instrText>
+              <w:instrText xml:space="preserve"> PAGEREF _Toc242005732 \h </w:instrText>
             </w:r>
             <w:r>
               <w:rPr>
@@ -3472,7 +3472,7 @@
               <w:noProof/>
             </w:rPr>
           </w:pPr>
-          <w:hyperlink w:anchor="_Toc241869981" w:history="1">
+          <w:hyperlink w:anchor="_Toc242005733" w:history="1">
             <w:r>
               <w:rPr>
                 <w:rStyle w:val="Hyperlink"/>
@@ -3496,7 +3496,7 @@
               <w:rPr>
                 <w:noProof/>
               </w:rPr>
-              <w:instrText xml:space="preserve"> PAGEREF _Toc241869981 \h </w:instrText>
+              <w:instrText xml:space="preserve"> PAGEREF _Toc242005733 \h </w:instrText>
             </w:r>
             <w:r>
               <w:rPr>
@@ -3534,7 +3534,7 @@
               <w:noProof/>
             </w:rPr>
           </w:pPr>
-          <w:hyperlink w:anchor="_Toc241869982" w:history="1">
+          <w:hyperlink w:anchor="_Toc242005734" w:history="1">
             <w:r>
               <w:rPr>
                 <w:rStyle w:val="Hyperlink"/>
@@ -3558,7 +3558,7 @@
               <w:rPr>
                 <w:noProof/>
               </w:rPr>
-              <w:instrText xml:space="preserve"> PAGEREF _Toc241869982 \h </w:instrText>
+              <w:instrText xml:space="preserve"> PAGEREF _Toc242005734 \h </w:instrText>
             </w:r>
             <w:r>
               <w:rPr>
@@ -3596,7 +3596,7 @@
               <w:noProof/>
             </w:rPr>
           </w:pPr>
-          <w:hyperlink w:anchor="_Toc241869983" w:history="1">
+          <w:hyperlink w:anchor="_Toc242005735" w:history="1">
             <w:r>
               <w:rPr>
                 <w:rStyle w:val="Hyperlink"/>
@@ -3620,7 +3620,7 @@
               <w:rPr>
                 <w:noProof/>
               </w:rPr>
-              <w:instrText xml:space="preserve"> PAGEREF _Toc241869983 \h </w:instrText>
+              <w:instrText xml:space="preserve"> PAGEREF _Toc242005735 \h </w:instrText>
             </w:r>
             <w:r>
               <w:rPr>
@@ -3658,7 +3658,7 @@
               <w:noProof/>
             </w:rPr>
           </w:pPr>
-          <w:hyperlink w:anchor="_Toc241869984" w:history="1">
+          <w:hyperlink w:anchor="_Toc242005736" w:history="1">
             <w:r>
               <w:rPr>
                 <w:rStyle w:val="Hyperlink"/>
@@ -3682,7 +3682,7 @@
               <w:rPr>
                 <w:noProof/>
               </w:rPr>
-              <w:instrText xml:space="preserve"> PAGEREF _Toc241869984 \h </w:instrText>
+              <w:instrText xml:space="preserve"> PAGEREF _Toc242005736 \h </w:instrText>
             </w:r>
             <w:r>
               <w:rPr>
@@ -3721,7 +3721,7 @@
         <w:pStyle w:val="Heading1"/>
         <w:pageBreakBefore/>
       </w:pPr>
-      <w:bookmarkStart w:id="3" w:name="_Toc241869939"/>
+      <w:bookmarkStart w:id="3" w:name="_Toc242005691"/>
       <w:r>
         <w:lastRenderedPageBreak/>
         <w:t>1. Executive summary</w:t>
@@ -3760,7 +3760,7 @@
       <w:pPr>
         <w:pStyle w:val="Heading2"/>
       </w:pPr>
-      <w:bookmarkStart w:id="4" w:name="_Toc241869940"/>
+      <w:bookmarkStart w:id="4" w:name="_Toc242005692"/>
       <w:r>
         <w:t>Results against the targets</w:t>
       </w:r>
@@ -3781,7 +3781,7 @@
           <w:left w:w="10" w:type="dxa"/>
           <w:right w:w="10" w:type="dxa"/>
         </w:tblCellMar>
-        <w:tblLook w:val="04A0" w:firstRow="1" w:lastRow="0" w:firstColumn="1" w:lastColumn="0" w:noHBand="0" w:noVBand="1"/>
+        <w:tblLook w:val="0000" w:firstRow="0" w:lastRow="0" w:firstColumn="0" w:lastColumn="0" w:noHBand="0" w:noVBand="0"/>
       </w:tblPr>
       <w:tblGrid>
         <w:gridCol w:w="2700"/>
@@ -4675,7 +4675,7 @@
       <w:pPr>
         <w:pStyle w:val="Heading1"/>
       </w:pPr>
-      <w:bookmarkStart w:id="5" w:name="_Toc241869941"/>
+      <w:bookmarkStart w:id="5" w:name="_Toc242005693"/>
       <w:r>
         <w:t>2. Problem statement</w:t>
       </w:r>
@@ -4783,7 +4783,7 @@
       <w:pPr>
         <w:pStyle w:val="Heading2"/>
       </w:pPr>
-      <w:bookmarkStart w:id="6" w:name="_Toc241869942"/>
+      <w:bookmarkStart w:id="6" w:name="_Toc242005694"/>
       <w:r>
         <w:t>Current methods and where they fail</w:t>
       </w:r>
@@ -4804,7 +4804,7 @@
           <w:left w:w="10" w:type="dxa"/>
           <w:right w:w="10" w:type="dxa"/>
         </w:tblCellMar>
-        <w:tblLook w:val="04A0" w:firstRow="1" w:lastRow="0" w:firstColumn="1" w:lastColumn="0" w:noHBand="0" w:noVBand="1"/>
+        <w:tblLook w:val="0000" w:firstRow="0" w:lastRow="0" w:firstColumn="0" w:lastColumn="0" w:noHBand="0" w:noVBand="0"/>
       </w:tblPr>
       <w:tblGrid>
         <w:gridCol w:w="3100"/>
@@ -5350,7 +5350,7 @@
       <w:pPr>
         <w:pStyle w:val="Heading1"/>
       </w:pPr>
-      <w:bookmarkStart w:id="7" w:name="_Toc241869943"/>
+      <w:bookmarkStart w:id="7" w:name="_Toc242005695"/>
       <w:r>
         <w:t>3. Objectives and success metrics</w:t>
       </w:r>
@@ -5382,7 +5382,7 @@
           <w:left w:w="10" w:type="dxa"/>
           <w:right w:w="10" w:type="dxa"/>
         </w:tblCellMar>
-        <w:tblLook w:val="04A0" w:firstRow="1" w:lastRow="0" w:firstColumn="1" w:lastColumn="0" w:noHBand="0" w:noVBand="1"/>
+        <w:tblLook w:val="0000" w:firstRow="0" w:lastRow="0" w:firstColumn="0" w:lastColumn="0" w:noHBand="0" w:noVBand="0"/>
       </w:tblPr>
       <w:tblGrid>
         <w:gridCol w:w="3300"/>
@@ -6325,7 +6325,7 @@
       <w:pPr>
         <w:pStyle w:val="Heading1"/>
       </w:pPr>
-      <w:bookmarkStart w:id="8" w:name="_Toc241869944"/>
+      <w:bookmarkStart w:id="8" w:name="_Toc242005696"/>
       <w:r>
         <w:lastRenderedPageBreak/>
         <w:t>4. Proposed solution and architecture</w:t>
@@ -6351,7 +6351,7 @@
           <w:noProof/>
         </w:rPr>
         <w:drawing>
-          <wp:inline distT="0" distB="0" distL="0" distR="0" wp14:anchorId="72A48EC4" wp14:editId="2E05E153">
+          <wp:inline distT="0" distB="0" distL="0" distR="0" wp14:anchorId="5E1352E6" wp14:editId="266031A6">
             <wp:extent cx="6096000" cy="3152775"/>
             <wp:effectExtent l="0" t="0" r="0" b="0"/>
             <wp:docPr id="1" name="fig_architecture.png" descr="Figure 1. Architecture: the n8n pipeline (top), outputs (middle) and supporting services (bottom)." title="Figure 1. Architecture: the n8n pipeline (top), outputs (middle) and supporting services (bottom)."/>
@@ -6420,7 +6420,7 @@
       <w:pPr>
         <w:pStyle w:val="Heading2"/>
       </w:pPr>
-      <w:bookmarkStart w:id="9" w:name="_Toc241869945"/>
+      <w:bookmarkStart w:id="9" w:name="_Toc242005697"/>
       <w:r>
         <w:t>Design principles</w:t>
       </w:r>
@@ -6555,7 +6555,7 @@
       <w:pPr>
         <w:pStyle w:val="Heading2"/>
       </w:pPr>
-      <w:bookmarkStart w:id="10" w:name="_Toc241869946"/>
+      <w:bookmarkStart w:id="10" w:name="_Toc242005698"/>
       <w:r>
         <w:lastRenderedPageBreak/>
         <w:t>Tools and technology</w:t>
@@ -6577,7 +6577,7 @@
           <w:left w:w="10" w:type="dxa"/>
           <w:right w:w="10" w:type="dxa"/>
         </w:tblCellMar>
-        <w:tblLook w:val="04A0" w:firstRow="1" w:lastRow="0" w:firstColumn="1" w:lastColumn="0" w:noHBand="0" w:noVBand="1"/>
+        <w:tblLook w:val="0000" w:firstRow="0" w:lastRow="0" w:firstColumn="0" w:lastColumn="0" w:noHBand="0" w:noVBand="0"/>
       </w:tblPr>
       <w:tblGrid>
         <w:gridCol w:w="2400"/>
@@ -7520,7 +7520,7 @@
       <w:pPr>
         <w:pStyle w:val="Heading1"/>
       </w:pPr>
-      <w:bookmarkStart w:id="11" w:name="_Toc241869947"/>
+      <w:bookmarkStart w:id="11" w:name="_Toc242005699"/>
       <w:r>
         <w:t>5. Data and pipeline design</w:t>
       </w:r>
@@ -7530,7 +7530,7 @@
       <w:pPr>
         <w:pStyle w:val="Heading2"/>
       </w:pPr>
-      <w:bookmarkStart w:id="12" w:name="_Toc241869948"/>
+      <w:bookmarkStart w:id="12" w:name="_Toc242005700"/>
       <w:r>
         <w:t>5.1 Dataset</w:t>
       </w:r>
@@ -7562,7 +7562,7 @@
       <w:pPr>
         <w:pStyle w:val="Heading2"/>
       </w:pPr>
-      <w:bookmarkStart w:id="13" w:name="_Toc241869949"/>
+      <w:bookmarkStart w:id="13" w:name="_Toc242005701"/>
       <w:r>
         <w:t>5</w:t>
       </w:r>
@@ -7611,7 +7611,7 @@
       <w:pPr>
         <w:pStyle w:val="Heading2"/>
       </w:pPr>
-      <w:bookmarkStart w:id="14" w:name="_Toc241869950"/>
+      <w:bookmarkStart w:id="14" w:name="_Toc242005702"/>
       <w:r>
         <w:t>5.3 Samples and splits</w:t>
       </w:r>
@@ -7632,7 +7632,7 @@
           <w:left w:w="10" w:type="dxa"/>
           <w:right w:w="10" w:type="dxa"/>
         </w:tblCellMar>
-        <w:tblLook w:val="04A0" w:firstRow="1" w:lastRow="0" w:firstColumn="1" w:lastColumn="0" w:noHBand="0" w:noVBand="1"/>
+        <w:tblLook w:val="0000" w:firstRow="0" w:lastRow="0" w:firstColumn="0" w:lastColumn="0" w:noHBand="0" w:noVBand="0"/>
       </w:tblPr>
       <w:tblGrid>
         <w:gridCol w:w="2400"/>
@@ -8375,7 +8375,7 @@
       <w:pPr>
         <w:pStyle w:val="Heading2"/>
       </w:pPr>
-      <w:bookmarkStart w:id="15" w:name="_Toc241869951"/>
+      <w:bookmarkStart w:id="15" w:name="_Toc242005703"/>
       <w:r>
         <w:lastRenderedPageBreak/>
         <w:t>5.4 Ground truth and its limits</w:t>
@@ -8398,7 +8398,7 @@
         <w:pStyle w:val="Heading1"/>
         <w:pageBreakBefore/>
       </w:pPr>
-      <w:bookmarkStart w:id="16" w:name="_Toc241869952"/>
+      <w:bookmarkStart w:id="16" w:name="_Toc242005704"/>
       <w:r>
         <w:lastRenderedPageBreak/>
         <w:t>6. Components in detail</w:t>
@@ -8409,7 +8409,7 @@
       <w:pPr>
         <w:pStyle w:val="Heading2"/>
       </w:pPr>
-      <w:bookmarkStart w:id="17" w:name="_Toc241869953"/>
+      <w:bookmarkStart w:id="17" w:name="_Toc242005705"/>
       <w:r>
         <w:t>6.1 Ingestion (n8n workflow 01)</w:t>
       </w:r>
@@ -8433,7 +8433,7 @@
       <w:pPr>
         <w:pStyle w:val="Heading2"/>
       </w:pPr>
-      <w:bookmarkStart w:id="18" w:name="_Toc241869954"/>
+      <w:bookmarkStart w:id="18" w:name="_Toc242005706"/>
       <w:r>
         <w:t>6.2 Translation (n8n workflow 02)</w:t>
       </w:r>
@@ -8458,7 +8458,13 @@
         <w:t>failed</w:t>
       </w:r>
       <w:r>
-        <w:t xml:space="preserve"> with the error and the run continues.</w:t>
+        <w:t xml:space="preserve"> with the error and the run continues. The call is made by n8n’s built-in Anthropic node (Message a model) rather than a generic HTTP Request n</w:t>
+      </w:r>
+      <w:r>
+        <w:t>ode, as our mentor suggested: it handles the Anthropic request format itself and uses a dedicated Anthropic credential. We switched it off “Simplify output” so the full response, including the token counts that the summary adds up, is kept; a test showed t</w:t>
+      </w:r>
+      <w:r>
+        <w:t>he Basic LLM Chain would return only the text and lose those counts.</w:t>
       </w:r>
     </w:p>
     <w:tbl>
@@ -8476,7 +8482,7 @@
           <w:left w:w="10" w:type="dxa"/>
           <w:right w:w="10" w:type="dxa"/>
         </w:tblCellMar>
-        <w:tblLook w:val="04A0" w:firstRow="1" w:lastRow="0" w:firstColumn="1" w:lastColumn="0" w:noHBand="0" w:noVBand="1"/>
+        <w:tblLook w:val="0000" w:firstRow="0" w:lastRow="0" w:firstColumn="0" w:lastColumn="0" w:noHBand="0" w:noVBand="0"/>
       </w:tblPr>
       <w:tblGrid>
         <w:gridCol w:w="3800"/>
@@ -8911,7 +8917,7 @@
       <w:pPr>
         <w:pStyle w:val="Heading2"/>
       </w:pPr>
-      <w:bookmarkStart w:id="19" w:name="_Toc241869955"/>
+      <w:bookmarkStart w:id="19" w:name="_Toc242005707"/>
       <w:r>
         <w:t>6.3 Sentiment, topic and estimated stars</w:t>
       </w:r>
@@ -8941,8 +8947,9 @@
         <w:rPr>
           <w:noProof/>
         </w:rPr>
+        <w:lastRenderedPageBreak/>
         <w:drawing>
-          <wp:inline distT="0" distB="0" distL="0" distR="0" wp14:anchorId="32A20B30" wp14:editId="0D9408B5">
+          <wp:inline distT="0" distB="0" distL="0" distR="0" wp14:anchorId="535D7CF4" wp14:editId="448F79B4">
             <wp:extent cx="4476750" cy="2266950"/>
             <wp:effectExtent l="0" t="0" r="0" b="0"/>
             <wp:docPr id="2" name="fig_sentiment.png" descr="Figure 2. Sentiment accuracy on the 960 held-out test reviews." title="Figure 2. Sentiment accuracy on the 960 held-out test reviews."/>
@@ -9012,7 +9019,7 @@
           <w:left w:w="10" w:type="dxa"/>
           <w:right w:w="10" w:type="dxa"/>
         </w:tblCellMar>
-        <w:tblLook w:val="04A0" w:firstRow="1" w:lastRow="0" w:firstColumn="1" w:lastColumn="0" w:noHBand="0" w:noVBand="1"/>
+        <w:tblLook w:val="0000" w:firstRow="0" w:lastRow="0" w:firstColumn="0" w:lastColumn="0" w:noHBand="0" w:noVBand="0"/>
       </w:tblPr>
       <w:tblGrid>
         <w:gridCol w:w="3900"/>
@@ -9062,7 +9069,6 @@
                 <w:sz w:val="18"/>
                 <w:szCs w:val="18"/>
               </w:rPr>
-              <w:lastRenderedPageBreak/>
               <w:t>Model (test, 960 reviews)</w:t>
             </w:r>
           </w:p>
@@ -10224,7 +10230,7 @@
           <w:left w:w="10" w:type="dxa"/>
           <w:right w:w="10" w:type="dxa"/>
         </w:tblCellMar>
-        <w:tblLook w:val="04A0" w:firstRow="1" w:lastRow="0" w:firstColumn="1" w:lastColumn="0" w:noHBand="0" w:noVBand="1"/>
+        <w:tblLook w:val="0000" w:firstRow="0" w:lastRow="0" w:firstColumn="0" w:lastColumn="0" w:noHBand="0" w:noVBand="0"/>
       </w:tblPr>
       <w:tblGrid>
         <w:gridCol w:w="3000"/>
@@ -10856,6 +10862,7 @@
         <w:spacing w:after="60" w:line="264" w:lineRule="auto"/>
       </w:pPr>
       <w:r>
+        <w:lastRenderedPageBreak/>
         <w:t>Star estimate versus true stars: MAE 0.47, exact match 58.0%, within one star 95.6% (Chinese weakest, MAE 0</w:t>
       </w:r>
       <w:r>
@@ -10877,7 +10884,7 @@
       <w:pPr>
         <w:pStyle w:val="Heading2"/>
       </w:pPr>
-      <w:bookmarkStart w:id="20" w:name="_Toc241869956"/>
+      <w:bookmarkStart w:id="20" w:name="_Toc242005708"/>
       <w:r>
         <w:t>6.4 Issue clustering</w:t>
       </w:r>
@@ -10909,7 +10916,7 @@
           <w:left w:w="10" w:type="dxa"/>
           <w:right w:w="10" w:type="dxa"/>
         </w:tblCellMar>
-        <w:tblLook w:val="04A0" w:firstRow="1" w:lastRow="0" w:firstColumn="1" w:lastColumn="0" w:noHBand="0" w:noVBand="1"/>
+        <w:tblLook w:val="0000" w:firstRow="0" w:lastRow="0" w:firstColumn="0" w:lastColumn="0" w:noHBand="0" w:noVBand="0"/>
       </w:tblPr>
       <w:tblGrid>
         <w:gridCol w:w="2700"/>
@@ -10958,7 +10965,6 @@
                 <w:sz w:val="18"/>
                 <w:szCs w:val="18"/>
               </w:rPr>
-              <w:lastRenderedPageBreak/>
               <w:t>Text that is embedded</w:t>
             </w:r>
           </w:p>
@@ -10993,7 +10999,17 @@
                 <w:sz w:val="18"/>
                 <w:szCs w:val="18"/>
               </w:rPr>
-              <w:t>k-means silhouette (k = 6 to 14)</w:t>
+              <w:t>k-</w:t>
+            </w:r>
+            <w:r>
+              <w:rPr>
+                <w:b/>
+                <w:bCs/>
+                <w:color w:val="FFFFFF"/>
+                <w:sz w:val="18"/>
+                <w:szCs w:val="18"/>
+              </w:rPr>
+              <w:t>means silhouette (k = 6 to 14)</w:t>
             </w:r>
           </w:p>
         </w:tc>
@@ -11377,7 +11393,7 @@
       <w:pPr>
         <w:pStyle w:val="Heading2"/>
       </w:pPr>
-      <w:bookmarkStart w:id="21" w:name="_Toc241869957"/>
+      <w:bookmarkStart w:id="21" w:name="_Toc242005709"/>
       <w:r>
         <w:t>6.5 Trend detection and alerts</w:t>
       </w:r>
@@ -11423,7 +11439,7 @@
           <w:left w:w="10" w:type="dxa"/>
           <w:right w:w="10" w:type="dxa"/>
         </w:tblCellMar>
-        <w:tblLook w:val="04A0" w:firstRow="1" w:lastRow="0" w:firstColumn="1" w:lastColumn="0" w:noHBand="0" w:noVBand="1"/>
+        <w:tblLook w:val="0000" w:firstRow="0" w:lastRow="0" w:firstColumn="0" w:lastColumn="0" w:noHBand="0" w:noVBand="0"/>
       </w:tblPr>
       <w:tblGrid>
         <w:gridCol w:w="2500"/>
@@ -11473,6 +11489,7 @@
                 <w:sz w:val="18"/>
                 <w:szCs w:val="18"/>
               </w:rPr>
+              <w:lastRenderedPageBreak/>
               <w:t>Rule</w:t>
             </w:r>
           </w:p>
@@ -11963,9 +11980,8 @@
         <w:rPr>
           <w:noProof/>
         </w:rPr>
-        <w:lastRenderedPageBreak/>
         <w:drawing>
-          <wp:inline distT="0" distB="0" distL="0" distR="0" wp14:anchorId="031EBA2F" wp14:editId="4CD959EA">
+          <wp:inline distT="0" distB="0" distL="0" distR="0" wp14:anchorId="4F3CB8CB" wp14:editId="678A2BBF">
             <wp:extent cx="5334000" cy="2533650"/>
             <wp:effectExtent l="0" t="0" r="0" b="0"/>
             <wp:docPr id="3" name="fig_spikes.png" descr="Figure 3. Weekly negative reviews for four issue categories in the dashboard data. Circles mark the four alerts sent to Slack." title="Figure 3. Weekly negative reviews for four issue categories in the dashboard data. Circles mark the four alerts sent to Slack."/>
@@ -12048,7 +12064,7 @@
       <w:pPr>
         <w:pStyle w:val="Heading2"/>
       </w:pPr>
-      <w:bookmarkStart w:id="22" w:name="_Toc241869958"/>
+      <w:bookmarkStart w:id="22" w:name="_Toc242005710"/>
       <w:r>
         <w:t>6.6 Response generation and quality checks</w:t>
       </w:r>
@@ -12089,8 +12105,9 @@
         <w:rPr>
           <w:noProof/>
         </w:rPr>
+        <w:lastRenderedPageBreak/>
         <w:drawing>
-          <wp:inline distT="0" distB="0" distL="0" distR="0" wp14:anchorId="495B52BB" wp14:editId="4F81AFEB">
+          <wp:inline distT="0" distB="0" distL="0" distR="0" wp14:anchorId="3ABD1CB9" wp14:editId="0403B2FD">
             <wp:extent cx="4476750" cy="2152650"/>
             <wp:effectExtent l="0" t="0" r="0" b="0"/>
             <wp:docPr id="4" name="fig_responses.png" descr="Figure 4. Reply quality, prompt v1 versus v2, scored by the Sonnet 5 judge on 48 replies." title="Figure 4. Reply quality, prompt v1 versus v2, scored by the Sonnet 5 judge on 48 replies."/>
@@ -12160,7 +12177,7 @@
           <w:left w:w="10" w:type="dxa"/>
           <w:right w:w="10" w:type="dxa"/>
         </w:tblCellMar>
-        <w:tblLook w:val="04A0" w:firstRow="1" w:lastRow="0" w:firstColumn="1" w:lastColumn="0" w:noHBand="0" w:noVBand="1"/>
+        <w:tblLook w:val="0000" w:firstRow="0" w:lastRow="0" w:firstColumn="0" w:lastColumn="0" w:noHBand="0" w:noVBand="0"/>
       </w:tblPr>
       <w:tblGrid>
         <w:gridCol w:w="2200"/>
@@ -12210,7 +12227,6 @@
                 <w:sz w:val="18"/>
                 <w:szCs w:val="18"/>
               </w:rPr>
-              <w:lastRenderedPageBreak/>
               <w:t>Prompt</w:t>
             </w:r>
           </w:p>
@@ -12742,7 +12758,7 @@
       <w:pPr>
         <w:pStyle w:val="Heading2"/>
       </w:pPr>
-      <w:bookmarkStart w:id="23" w:name="_Toc241869959"/>
+      <w:bookmarkStart w:id="23" w:name="_Toc242005711"/>
       <w:r>
         <w:t>6.7 Dashboard and Slack alerts</w:t>
       </w:r>
@@ -12902,8 +12918,9 @@
       <w:pPr>
         <w:pStyle w:val="Heading2"/>
       </w:pPr>
-      <w:bookmarkStart w:id="24" w:name="_Toc241869960"/>
-      <w:r>
+      <w:bookmarkStart w:id="24" w:name="_Toc242005712"/>
+      <w:r>
+        <w:lastRenderedPageBreak/>
         <w:t>6.8 API service and LLMOps</w:t>
       </w:r>
       <w:bookmarkEnd w:id="24"/>
@@ -12931,7 +12948,7 @@
           <w:left w:w="10" w:type="dxa"/>
           <w:right w:w="10" w:type="dxa"/>
         </w:tblCellMar>
-        <w:tblLook w:val="04A0" w:firstRow="1" w:lastRow="0" w:firstColumn="1" w:lastColumn="0" w:noHBand="0" w:noVBand="1"/>
+        <w:tblLook w:val="0000" w:firstRow="0" w:lastRow="0" w:firstColumn="0" w:lastColumn="0" w:noHBand="0" w:noVBand="0"/>
       </w:tblPr>
       <w:tblGrid>
         <w:gridCol w:w="2600"/>
@@ -13366,11 +13383,7 @@
         <w:t>MAX_SPEND_USD</w:t>
       </w:r>
       <w:r>
-        <w:t xml:space="preserve">, default $1) makes the service </w:t>
-      </w:r>
-      <w:r>
-        <w:lastRenderedPageBreak/>
-        <w:t xml:space="preserve">answer HTTP 429 instead of spending more; and </w:t>
+        <w:t xml:space="preserve">, default $1) makes the service answer HTTP 429 instead of spending more; and </w:t>
       </w:r>
       <w:r>
         <w:rPr>
@@ -13410,7 +13423,7 @@
       <w:pPr>
         <w:pStyle w:val="Heading2"/>
       </w:pPr>
-      <w:bookmarkStart w:id="25" w:name="_Toc241869961"/>
+      <w:bookmarkStart w:id="25" w:name="_Toc242005713"/>
       <w:r>
         <w:t>6.9 The full pipeline in n8n (workflow 03)</w:t>
       </w:r>
@@ -13442,7 +13455,7 @@
           <w:left w:w="10" w:type="dxa"/>
           <w:right w:w="10" w:type="dxa"/>
         </w:tblCellMar>
-        <w:tblLook w:val="04A0" w:firstRow="1" w:lastRow="0" w:firstColumn="1" w:lastColumn="0" w:noHBand="0" w:noVBand="1"/>
+        <w:tblLook w:val="0000" w:firstRow="0" w:lastRow="0" w:firstColumn="0" w:lastColumn="0" w:noHBand="0" w:noVBand="0"/>
       </w:tblPr>
       <w:tblGrid>
         <w:gridCol w:w="3400"/>
@@ -14302,8 +14315,9 @@
         <w:rPr>
           <w:noProof/>
         </w:rPr>
+        <w:lastRenderedPageBreak/>
         <w:drawing>
-          <wp:inline distT="0" distB="0" distL="0" distR="0" wp14:anchorId="3D4697FF" wp14:editId="5841F25E">
+          <wp:inline distT="0" distB="0" distL="0" distR="0" wp14:anchorId="1CF635DB" wp14:editId="2C7CD0E7">
             <wp:extent cx="4095750" cy="2019300"/>
             <wp:effectExtent l="0" t="0" r="0" b="0"/>
             <wp:docPr id="5" name="fig_cost.png" descr="Figure 5. Where the money goes: about $2.50 per 1,000 reviews, by stage." title="Figure 5. Where the money goes: about $2.50 per 1,000 reviews, by stage."/>
@@ -14362,7 +14376,7 @@
       <w:pPr>
         <w:pStyle w:val="Heading2"/>
       </w:pPr>
-      <w:bookmarkStart w:id="26" w:name="_Toc241869962"/>
+      <w:bookmarkStart w:id="26" w:name="_Toc242005714"/>
       <w:r>
         <w:t>6.10 Demo app and deployment</w:t>
       </w:r>
@@ -14429,11 +14443,7 @@
         <w:t xml:space="preserve">er because the free CPU option was not available to the account; the app itself uses no GPU, and a placeholder function satisfies the tier’s start-up check. The Anthropic key is stored as a Space secret and is never in the code or the repository. The live </w:t>
       </w:r>
       <w:r>
-        <w:t xml:space="preserve">tab is limited by a spend cap (default $0.50, counted in a log </w:t>
-      </w:r>
-      <w:r>
-        <w:lastRenderedPageBreak/>
-        <w:t>file that restarts with the Space), 10 calls per browser session and an optional access code; an Anthropic Console spend limit is the backstop.</w:t>
+        <w:t>tab is limited by a spend cap (default $0.50, counted in a log file that restarts with the Space), 10 calls per browser session and an optional access code; an Anthropic Console spend limit is the backstop.</w:t>
       </w:r>
     </w:p>
     <w:p>
@@ -14464,7 +14474,7 @@
           <w:left w:w="10" w:type="dxa"/>
           <w:right w:w="10" w:type="dxa"/>
         </w:tblCellMar>
-        <w:tblLook w:val="04A0" w:firstRow="1" w:lastRow="0" w:firstColumn="1" w:lastColumn="0" w:noHBand="0" w:noVBand="1"/>
+        <w:tblLook w:val="0000" w:firstRow="0" w:lastRow="0" w:firstColumn="0" w:lastColumn="0" w:noHBand="0" w:noVBand="0"/>
       </w:tblPr>
       <w:tblGrid>
         <w:gridCol w:w="2000"/>
@@ -14721,7 +14731,7 @@
                 <w:sz w:val="17"/>
                 <w:szCs w:val="17"/>
               </w:rPr>
-              <w:t>; Header Auth credential and Slack webhook added by the team</w:t>
+              <w:t>; Anthropic, Header Auth and Google Sheets credentials and the Slack webhook added by the team</w:t>
             </w:r>
           </w:p>
         </w:tc>
@@ -15309,17 +15319,24 @@
         <w:t>Moving n8n accounts.</w:t>
       </w:r>
       <w:r>
-        <w:t xml:space="preserve"> Imported workflows never carry credentials, so on 2 October, when the team moved to a new n8n Cloud account, the four workflows were re-imported, the credential was created again and attached to the five Claude nodes, and the Slack webhook was pasted agai</w:t>
-      </w:r>
-      <w:r>
-        <w:t>n. Verification on the new account: workflow 03 processed 120 reviews in 83 s for $0.30 with all 120 carrying a product category, and workflow 04 posted the four spikes to Slack.</w:t>
+        <w:t xml:space="preserve"> Imported workflows never carry credentials, so on 2 October, when the team moved to a new n8n Cloud account, the four workflows were re-imported, the credentials were created again (Anthropic for the translation node, Header Auth for the three HTTP Claude</w:t>
+      </w:r>
+      <w:r>
+        <w:t xml:space="preserve"> nodes of workflow 03, Google Sheets for the output node), and the Slack webhook was pasted again. Verification on the new account: </w:t>
+      </w:r>
+      <w:r>
+        <w:lastRenderedPageBreak/>
+        <w:t>workflow 03 processed 120 reviews in 83 s for $0.30 with all 120 carrying a product category, and workflow 04 posted the fou</w:t>
+      </w:r>
+      <w:r>
+        <w:t>r spikes to Slack.</w:t>
       </w:r>
     </w:p>
     <w:p>
       <w:pPr>
         <w:pStyle w:val="Heading1"/>
       </w:pPr>
-      <w:bookmarkStart w:id="27" w:name="_Toc241869963"/>
+      <w:bookmarkStart w:id="27" w:name="_Toc242005715"/>
       <w:r>
         <w:t>7. Methods tried, challenges and how we overcame them</w:t>
       </w:r>
@@ -15340,7 +15357,7 @@
           <w:left w:w="10" w:type="dxa"/>
           <w:right w:w="10" w:type="dxa"/>
         </w:tblCellMar>
-        <w:tblLook w:val="04A0" w:firstRow="1" w:lastRow="0" w:firstColumn="1" w:lastColumn="0" w:noHBand="0" w:noVBand="1"/>
+        <w:tblLook w:val="0000" w:firstRow="0" w:lastRow="0" w:firstColumn="0" w:lastColumn="0" w:noHBand="0" w:noVBand="0"/>
       </w:tblPr>
       <w:tblGrid>
         <w:gridCol w:w="2100"/>
@@ -16433,7 +16450,6 @@
                 <w:sz w:val="17"/>
                 <w:szCs w:val="17"/>
               </w:rPr>
-              <w:lastRenderedPageBreak/>
               <w:t>Cloud limits</w:t>
             </w:r>
           </w:p>
@@ -16609,7 +16625,7 @@
       <w:pPr>
         <w:pStyle w:val="Heading1"/>
       </w:pPr>
-      <w:bookmarkStart w:id="28" w:name="_Toc241869964"/>
+      <w:bookmarkStart w:id="28" w:name="_Toc242005716"/>
       <w:r>
         <w:t>8. Test cases, results and experiment log</w:t>
       </w:r>
@@ -16619,7 +16635,7 @@
       <w:pPr>
         <w:pStyle w:val="Heading2"/>
       </w:pPr>
-      <w:bookmarkStart w:id="29" w:name="_Toc241869965"/>
+      <w:bookmarkStart w:id="29" w:name="_Toc242005717"/>
       <w:r>
         <w:t>8.1 Automated tests</w:t>
       </w:r>
@@ -16656,7 +16672,7 @@
       <w:pPr>
         <w:pStyle w:val="Heading2"/>
       </w:pPr>
-      <w:bookmarkStart w:id="30" w:name="_Toc241869966"/>
+      <w:bookmarkStart w:id="30" w:name="_Toc242005718"/>
       <w:r>
         <w:t>8.2 Functional test cases</w:t>
       </w:r>
@@ -16677,7 +16693,7 @@
           <w:left w:w="10" w:type="dxa"/>
           <w:right w:w="10" w:type="dxa"/>
         </w:tblCellMar>
-        <w:tblLook w:val="04A0" w:firstRow="1" w:lastRow="0" w:firstColumn="1" w:lastColumn="0" w:noHBand="0" w:noVBand="1"/>
+        <w:tblLook w:val="0000" w:firstRow="0" w:lastRow="0" w:firstColumn="0" w:lastColumn="0" w:noHBand="0" w:noVBand="0"/>
       </w:tblPr>
       <w:tblGrid>
         <w:gridCol w:w="700"/>
@@ -17380,6 +17396,7 @@
                 <w:sz w:val="17"/>
                 <w:szCs w:val="17"/>
               </w:rPr>
+              <w:lastRenderedPageBreak/>
               <w:t>T5</w:t>
             </w:r>
           </w:p>
@@ -18168,7 +18185,7 @@
       <w:pPr>
         <w:pStyle w:val="Heading2"/>
       </w:pPr>
-      <w:bookmarkStart w:id="31" w:name="_Toc241869967"/>
+      <w:bookmarkStart w:id="31" w:name="_Toc242005719"/>
       <w:r>
         <w:t>8.3 Experiment log summary</w:t>
       </w:r>
@@ -18209,7 +18226,7 @@
           <w:left w:w="10" w:type="dxa"/>
           <w:right w:w="10" w:type="dxa"/>
         </w:tblCellMar>
-        <w:tblLook w:val="04A0" w:firstRow="1" w:lastRow="0" w:firstColumn="1" w:lastColumn="0" w:noHBand="0" w:noVBand="1"/>
+        <w:tblLook w:val="0000" w:firstRow="0" w:lastRow="0" w:firstColumn="0" w:lastColumn="0" w:noHBand="0" w:noVBand="0"/>
       </w:tblPr>
       <w:tblGrid>
         <w:gridCol w:w="800"/>
@@ -18959,7 +18976,6 @@
                 <w:sz w:val="18"/>
                 <w:szCs w:val="18"/>
               </w:rPr>
-              <w:lastRenderedPageBreak/>
               <w:t>E7</w:t>
             </w:r>
           </w:p>
@@ -19829,8 +19845,9 @@
       <w:pPr>
         <w:pStyle w:val="Heading2"/>
       </w:pPr>
-      <w:bookmarkStart w:id="32" w:name="_Toc241869968"/>
-      <w:r>
+      <w:bookmarkStart w:id="32" w:name="_Toc242005720"/>
+      <w:r>
+        <w:lastRenderedPageBreak/>
         <w:t>8.4 Claude spend</w:t>
       </w:r>
       <w:bookmarkEnd w:id="32"/>
@@ -19850,7 +19867,7 @@
           <w:left w:w="10" w:type="dxa"/>
           <w:right w:w="10" w:type="dxa"/>
         </w:tblCellMar>
-        <w:tblLook w:val="04A0" w:firstRow="1" w:lastRow="0" w:firstColumn="1" w:lastColumn="0" w:noHBand="0" w:noVBand="1"/>
+        <w:tblLook w:val="0000" w:firstRow="0" w:lastRow="0" w:firstColumn="0" w:lastColumn="0" w:noHBand="0" w:noVBand="0"/>
       </w:tblPr>
       <w:tblGrid>
         <w:gridCol w:w="6200"/>
@@ -20388,7 +20405,7 @@
       <w:pPr>
         <w:pStyle w:val="Heading1"/>
       </w:pPr>
-      <w:bookmarkStart w:id="33" w:name="_Toc241869969"/>
+      <w:bookmarkStart w:id="33" w:name="_Toc242005721"/>
       <w:r>
         <w:t>9. Demo plan</w:t>
       </w:r>
@@ -20418,7 +20435,7 @@
           <w:left w:w="10" w:type="dxa"/>
           <w:right w:w="10" w:type="dxa"/>
         </w:tblCellMar>
-        <w:tblLook w:val="04A0" w:firstRow="1" w:lastRow="0" w:firstColumn="1" w:lastColumn="0" w:noHBand="0" w:noVBand="1"/>
+        <w:tblLook w:val="0000" w:firstRow="0" w:lastRow="0" w:firstColumn="0" w:lastColumn="0" w:noHBand="0" w:noVBand="0"/>
       </w:tblPr>
       <w:tblGrid>
         <w:gridCol w:w="1100"/>
@@ -21251,7 +21268,6 @@
         <w:spacing w:after="120" w:line="276" w:lineRule="auto"/>
       </w:pPr>
       <w:r>
-        <w:lastRenderedPageBreak/>
         <w:t>Backup plan: keep recorded outputs and the exported n8n workflow JSON files in case the network or the n8n trial fails on the day. Our current n8n Cloud trial runs to about 16 October, after the presentation, and the workflows are also kept as JSON so they</w:t>
       </w:r>
       <w:r>
@@ -21274,7 +21290,7 @@
         <w:pStyle w:val="Heading1"/>
         <w:pageBreakBefore/>
       </w:pPr>
-      <w:bookmarkStart w:id="34" w:name="_Toc241869970"/>
+      <w:bookmarkStart w:id="34" w:name="_Toc242005722"/>
       <w:r>
         <w:lastRenderedPageBreak/>
         <w:t>10. How to run the application</w:t>
@@ -21285,7 +21301,7 @@
       <w:pPr>
         <w:pStyle w:val="Heading2"/>
       </w:pPr>
-      <w:bookmarkStart w:id="35" w:name="_Toc241869971"/>
+      <w:bookmarkStart w:id="35" w:name="_Toc242005723"/>
       <w:r>
         <w:t>10.1 Setup (Windows)</w:t>
       </w:r>
@@ -21464,7 +21480,7 @@
       <w:pPr>
         <w:pStyle w:val="Heading2"/>
       </w:pPr>
-      <w:bookmarkStart w:id="36" w:name="_Toc241869972"/>
+      <w:bookmarkStart w:id="36" w:name="_Toc242005724"/>
       <w:r>
         <w:t>10.2 n8n workflows</w:t>
       </w:r>
@@ -21514,10 +21530,30 @@
         <w:spacing w:after="60" w:line="264" w:lineRule="auto"/>
       </w:pPr>
       <w:r>
-        <w:t>Create the Claude credenti</w:t>
-      </w:r>
-      <w:r>
-        <w:t xml:space="preserve">al once: Credentials, Create, </w:t>
+        <w:t>Create the credentials onc</w:t>
+      </w:r>
+      <w:r>
+        <w:t xml:space="preserve">e. For </w:t>
+      </w:r>
+      <w:r>
+        <w:rPr>
+          <w:b/>
+          <w:bCs/>
+        </w:rPr>
+        <w:t>Claude translate</w:t>
+      </w:r>
+      <w:r>
+        <w:t xml:space="preserve"> (workflows 02 and 03): Credentials, Create, </w:t>
+      </w:r>
+      <w:r>
+        <w:rPr>
+          <w:b/>
+          <w:bCs/>
+        </w:rPr>
+        <w:t>Anthropic</w:t>
+      </w:r>
+      <w:r>
+        <w:t xml:space="preserve">, paste your Anthropic API key, then pick it in that node. For the three HTTP Claude nodes of workflow 03: Credentials, Create, </w:t>
       </w:r>
       <w:r>
         <w:rPr>
@@ -21538,7 +21574,10 @@
         <w:t>x-api-key</w:t>
       </w:r>
       <w:r>
-        <w:t>, Value = your Anthropic API key. Open each Claude HTTP node and select that credential.</w:t>
+        <w:t>, Value = your Anthropic</w:t>
+      </w:r>
+      <w:r>
+        <w:t xml:space="preserve"> API key, and pick it in each of them.</w:t>
       </w:r>
     </w:p>
     <w:p>
@@ -21551,10 +21590,7 @@
         <w:spacing w:after="60" w:line="264" w:lineRule="auto"/>
       </w:pPr>
       <w:r>
-        <w:t>For workflow 04, share the dashboard sheet as “Anyone with the link can view” and paste your Slack incoming-we</w:t>
-      </w:r>
-      <w:r>
-        <w:t xml:space="preserve">bhook URL into the </w:t>
+        <w:t xml:space="preserve">For workflow 04, share the dashboard sheet as “Anyone with the link can view” and paste your Slack incoming-webhook URL into the </w:t>
       </w:r>
       <w:r>
         <w:rPr>
@@ -21587,7 +21623,10 @@
         <w:t>Execute workflow</w:t>
       </w:r>
       <w:r>
-        <w:t>. Read the summary node (Pipeline summary or Alert result) rather than trusting the green ticks.</w:t>
+        <w:t>. Read the summary node (Pipeline s</w:t>
+      </w:r>
+      <w:r>
+        <w:t>ummary or Alert result) rather than trusting the green ticks.</w:t>
       </w:r>
     </w:p>
     <w:tbl>
@@ -21605,7 +21644,7 @@
           <w:left w:w="10" w:type="dxa"/>
           <w:right w:w="10" w:type="dxa"/>
         </w:tblCellMar>
-        <w:tblLook w:val="04A0" w:firstRow="1" w:lastRow="0" w:firstColumn="1" w:lastColumn="0" w:noHBand="0" w:noVBand="1"/>
+        <w:tblLook w:val="0000" w:firstRow="0" w:lastRow="0" w:firstColumn="0" w:lastColumn="0" w:noHBand="0" w:noVBand="0"/>
       </w:tblPr>
       <w:tblGrid>
         <w:gridCol w:w="3900"/>
@@ -22173,7 +22212,7 @@
       <w:pPr>
         <w:pStyle w:val="Heading2"/>
       </w:pPr>
-      <w:bookmarkStart w:id="37" w:name="_Toc241869973"/>
+      <w:bookmarkStart w:id="37" w:name="_Toc242005725"/>
       <w:r>
         <w:t>10.3 Analysis scripts</w:t>
       </w:r>
@@ -22240,7 +22279,15 @@
           <w:sz w:val="18"/>
           <w:szCs w:val="18"/>
         </w:rPr>
-        <w:t>python scripts/run_stage4.py label issue        # cluster labels</w:t>
+        <w:t>python scripts/run_stage4.py labe</w:t>
+      </w:r>
+      <w:r>
+        <w:rPr>
+          <w:rFonts w:ascii="Consolas" w:eastAsia="Consolas" w:hAnsi="Consolas" w:cs="Consolas"/>
+          <w:sz w:val="18"/>
+          <w:szCs w:val="18"/>
+        </w:rPr>
+        <w:t>l issue        # cluster labels</w:t>
       </w:r>
     </w:p>
     <w:p>
@@ -22271,15 +22318,7 @@
           <w:sz w:val="18"/>
           <w:szCs w:val="18"/>
         </w:rPr>
-        <w:t>python scripts/eval_responses.py                 # rep</w:t>
-      </w:r>
-      <w:r>
-        <w:rPr>
-          <w:rFonts w:ascii="Consolas" w:eastAsia="Consolas" w:hAnsi="Consolas" w:cs="Consolas"/>
-          <w:sz w:val="18"/>
-          <w:szCs w:val="18"/>
-        </w:rPr>
-        <w:t>lies + judge (RESPONSE_VERSION=v1|v2)</w:t>
+        <w:t>python scripts/eval_responses.py                 # replies + judge (RESPONSE_VERSION=v1|v2)</w:t>
       </w:r>
     </w:p>
     <w:p>
@@ -22291,7 +22330,7 @@
       <w:pPr>
         <w:pStyle w:val="Heading2"/>
       </w:pPr>
-      <w:bookmarkStart w:id="38" w:name="_Toc241869974"/>
+      <w:bookmarkStart w:id="38" w:name="_Toc242005726"/>
       <w:r>
         <w:t>10.4 API service and tests</w:t>
       </w:r>
@@ -22373,7 +22412,15 @@
           <w:sz w:val="18"/>
           <w:szCs w:val="18"/>
         </w:rPr>
-        <w:t>pytest tests -q                     # 16 tests, no Claude calls</w:t>
+        <w:t xml:space="preserve">pytest tests -q                  </w:t>
+      </w:r>
+      <w:r>
+        <w:rPr>
+          <w:rFonts w:ascii="Consolas" w:eastAsia="Consolas" w:hAnsi="Consolas" w:cs="Consolas"/>
+          <w:sz w:val="18"/>
+          <w:szCs w:val="18"/>
+        </w:rPr>
+        <w:t xml:space="preserve">   # 16 tests, no Claude calls</w:t>
       </w:r>
     </w:p>
     <w:p>
@@ -22385,7 +22432,7 @@
       <w:pPr>
         <w:pStyle w:val="Heading2"/>
       </w:pPr>
-      <w:bookmarkStart w:id="39" w:name="_Toc241869975"/>
+      <w:bookmarkStart w:id="39" w:name="_Toc242005727"/>
       <w:r>
         <w:lastRenderedPageBreak/>
         <w:t>10.5 Demo app and Hugging Face Space</w:t>
@@ -22421,15 +22468,7 @@
           <w:sz w:val="18"/>
           <w:szCs w:val="18"/>
         </w:rPr>
-        <w:t xml:space="preserve">python app.py      </w:t>
-      </w:r>
-      <w:r>
-        <w:rPr>
-          <w:rFonts w:ascii="Consolas" w:eastAsia="Consolas" w:hAnsi="Consolas" w:cs="Consolas"/>
-          <w:sz w:val="18"/>
-          <w:szCs w:val="18"/>
-        </w:rPr>
-        <w:t xml:space="preserve">                # http://127.0.0.1:7860</w:t>
+        <w:t>python app.py                      # http://127.0.0.1:7860</w:t>
       </w:r>
     </w:p>
     <w:p>
@@ -22445,7 +22484,15 @@
           <w:sz w:val="18"/>
           <w:szCs w:val="18"/>
         </w:rPr>
-        <w:t>python scripts/build_space.py      # builds space_build/ (about 200 KB, no keys)</w:t>
+        <w:t>python scripts/build_space.py      # bui</w:t>
+      </w:r>
+      <w:r>
+        <w:rPr>
+          <w:rFonts w:ascii="Consolas" w:eastAsia="Consolas" w:hAnsi="Consolas" w:cs="Consolas"/>
+          <w:sz w:val="18"/>
+          <w:szCs w:val="18"/>
+        </w:rPr>
+        <w:t>lds space_build/ (about 200 KB, no keys)</w:t>
       </w:r>
     </w:p>
     <w:p>
@@ -22473,10 +22520,7 @@
         <w:spacing w:after="120" w:line="276" w:lineRule="auto"/>
       </w:pPr>
       <w:r>
-        <w:t>To publish your own copy: create a Space on huggi</w:t>
-      </w:r>
-      <w:r>
-        <w:t xml:space="preserve">ngface.co (SDK Gradio), add the secret </w:t>
+        <w:t xml:space="preserve">To publish your own copy: create a Space on huggingface.co (SDK Gradio), add the secret </w:t>
       </w:r>
       <w:r>
         <w:rPr>
@@ -22487,14 +22531,17 @@
         <w:t>ANTHROPIC_API_KEY</w:t>
       </w:r>
       <w:r>
-        <w:t xml:space="preserve"> yourself in Settings, Variables and secrets, and run the two scripts above. Delete the write token when you are done deploying.</w:t>
+        <w:t xml:space="preserve"> yourself in Settings, V</w:t>
+      </w:r>
+      <w:r>
+        <w:t>ariables and secrets, and run the two scripts above. Delete the write token when you are done deploying.</w:t>
       </w:r>
     </w:p>
     <w:p>
       <w:pPr>
         <w:pStyle w:val="Heading2"/>
       </w:pPr>
-      <w:bookmarkStart w:id="40" w:name="_Toc241869976"/>
+      <w:bookmarkStart w:id="40" w:name="_Toc242005728"/>
       <w:r>
         <w:t>10.6 Repository map</w:t>
       </w:r>
@@ -22515,7 +22562,7 @@
           <w:left w:w="10" w:type="dxa"/>
           <w:right w:w="10" w:type="dxa"/>
         </w:tblCellMar>
-        <w:tblLook w:val="04A0" w:firstRow="1" w:lastRow="0" w:firstColumn="1" w:lastColumn="0" w:noHBand="0" w:noVBand="1"/>
+        <w:tblLook w:val="0000" w:firstRow="0" w:lastRow="0" w:firstColumn="0" w:lastColumn="0" w:noHBand="0" w:noVBand="0"/>
       </w:tblPr>
       <w:tblGrid>
         <w:gridCol w:w="3700"/>
@@ -23278,7 +23325,7 @@
       <w:pPr>
         <w:pStyle w:val="Heading1"/>
       </w:pPr>
-      <w:bookmarkStart w:id="41" w:name="_Toc241869977"/>
+      <w:bookmarkStart w:id="41" w:name="_Toc242005729"/>
       <w:r>
         <w:t>11. Limitations</w:t>
       </w:r>
@@ -23301,7 +23348,10 @@
         <w:t>Simulated dates.</w:t>
       </w:r>
       <w:r>
-        <w:t xml:space="preserve"> The dataset has no review dates, so trend detection was tested on simulated weeks with planted spikes, and the threshold was tuned on the same simulation. Real data may behave differently.</w:t>
+        <w:t xml:space="preserve"> The dataset has no review dates, so trend detection was tested on simulated weeks with planted spikes, an</w:t>
+      </w:r>
+      <w:r>
+        <w:t>d the threshold was tuned on the same simulation. Real data may behave differently.</w:t>
       </w:r>
     </w:p>
     <w:p>
@@ -23321,7 +23371,10 @@
         <w:t>Star-derived labels.</w:t>
       </w:r>
       <w:r>
-        <w:t xml:space="preserve"> Sentiment accuracy is measured against a noisy proxy. Three-way accuracy is 78.1%, below the 85% target, and the neutral class is recognised only about a third of the time.</w:t>
+        <w:t xml:space="preserve"> Sentiment accuracy is measured against a noisy proxy. Three-way accuracy is 78.1%, below the 85% target, and the neutral class is recognised only about</w:t>
+      </w:r>
+      <w:r>
+        <w:t xml:space="preserve"> a third of the time.</w:t>
       </w:r>
     </w:p>
     <w:p>
@@ -23341,10 +23394,7 @@
         <w:t>No human acceptance test.</w:t>
       </w:r>
       <w:r>
-        <w:t xml:space="preserve"> Reply quality is judged by a model. The 79.2% figure is </w:t>
-      </w:r>
-      <w:r>
-        <w:t>not human approval.</w:t>
+        <w:t xml:space="preserve"> Reply quality is judged by a model. The 79.2% figure is not human approval.</w:t>
       </w:r>
     </w:p>
     <w:p>
@@ -23364,7 +23414,10 @@
         <w:t>Weak spots in replies.</w:t>
       </w:r>
       <w:r>
-        <w:t xml:space="preserve"> Neutral reviews (58% accepted) and Japanese (62%) are the weakest; the reply signature stays in English in other languages; some replies assume facts the review did not state.</w:t>
+        <w:t xml:space="preserve"> Neutral reviews (58% accepted) and Japanese (62%) are the weakest; the reply signature stays in English in ot</w:t>
+      </w:r>
+      <w:r>
+        <w:t>her languages; some replies assume facts the review did not state.</w:t>
       </w:r>
     </w:p>
     <w:p>
@@ -23384,10 +23437,10 @@
         <w:t>Issue categories in n8n.</w:t>
       </w:r>
       <w:r>
-        <w:t xml:space="preserve"> A Claude cla</w:t>
-      </w:r>
-      <w:r>
-        <w:t>ssifier over 13 fixed categories replaces the embedding step, and it agrees with k-means only 43% of the time. The categories come from one sample and would need refreshing on a real feed.</w:t>
+        <w:t xml:space="preserve"> A Claude classifier over 13 fixed categories replaces the embedding step, and it agrees with k-means only 43% of the time. The categories come from one sample and w</w:t>
+      </w:r>
+      <w:r>
+        <w:t>ould need refreshing on a real feed.</w:t>
       </w:r>
     </w:p>
     <w:p>
@@ -23407,10 +23460,7 @@
         <w:t>Small evaluation sets.</w:t>
       </w:r>
       <w:r>
-        <w:t xml:space="preserve"> 48 replies and 960 test reviews are enough t</w:t>
-      </w:r>
-      <w:r>
-        <w:t>o show trends, but small differences (for example between prompt v1 and v2 on the development split) are within noise.</w:t>
+        <w:t xml:space="preserve"> 48 replies and 960 test reviews are enough to show trends, but small differences (for example between prompt v1 and v2 on the development split) are within noise.</w:t>
       </w:r>
     </w:p>
     <w:p>
@@ -23430,10 +23480,10 @@
         <w:t>Not yet automatic.</w:t>
       </w:r>
       <w:r>
-        <w:t xml:space="preserve"> Results reach the Google Sheet by paste or import, and the n8n workflows are started by hand. Only the demo app is pub</w:t>
-      </w:r>
-      <w:r>
-        <w:t>lic (Hugging Face Space); the API service runs locally.</w:t>
+        <w:t xml:space="preserve"> Results reach </w:t>
+      </w:r>
+      <w:r>
+        <w:t>the Google Sheet by paste or import, and the n8n workflows are started by hand. Only the demo app is public (Hugging Face Space); the API service runs locally.</w:t>
       </w:r>
     </w:p>
     <w:p>
@@ -23453,10 +23503,10 @@
         <w:t>Trial and budget.</w:t>
       </w:r>
       <w:r>
-        <w:t xml:space="preserve"> The n8n Cloud trial is time-limited (we moved to a new account on 2 October, valid to about 16 October), and Claude credit limits how many full runs we can afford. We measured throug</w:t>
-      </w:r>
-      <w:r>
-        <w:t>hput on 120 reviews and extrapolated to 1,000.</w:t>
+        <w:t xml:space="preserve"> The n8n Cloud trial is time-limited (we moved to a new account on 2 October, v</w:t>
+      </w:r>
+      <w:r>
+        <w:t>alid to about 16 October), and Claude credit limits how many full runs we can afford. We measured throughput on 120 reviews and extrapolated to 1,000.</w:t>
       </w:r>
     </w:p>
     <w:p>
@@ -23484,9 +23534,12 @@
       <w:pPr>
         <w:pStyle w:val="Heading1"/>
       </w:pPr>
-      <w:bookmarkStart w:id="42" w:name="_Toc241869978"/>
-      <w:r>
-        <w:t>12. Future scope and scaling</w:t>
+      <w:bookmarkStart w:id="42" w:name="_Toc242005730"/>
+      <w:r>
+        <w:t>12. Fu</w:t>
+      </w:r>
+      <w:r>
+        <w:t>ture scope and scaling</w:t>
       </w:r>
       <w:bookmarkEnd w:id="42"/>
     </w:p>
@@ -23507,10 +23560,7 @@
         <w:t>Real data feed.</w:t>
       </w:r>
       <w:r>
-        <w:t xml:space="preserve"> Connect live review sources (marketplace exports, app-store and s</w:t>
-      </w:r>
-      <w:r>
-        <w:t>ocial feeds) with real timestamps, then retune the spike threshold on genuine weeks.</w:t>
+        <w:t xml:space="preserve"> Connect live review sources (marketplace exports, app-store and social feeds) with real timestamps, then retune the spike threshold on genuine weeks.</w:t>
       </w:r>
     </w:p>
     <w:p>
@@ -23547,17 +23597,13 @@
           <w:b/>
           <w:bCs/>
         </w:rPr>
-        <w:t>Better</w:t>
-      </w:r>
-      <w:r>
-        <w:rPr>
-          <w:b/>
-          <w:bCs/>
-        </w:rPr>
-        <w:t xml:space="preserve"> neutral handling.</w:t>
-      </w:r>
-      <w:r>
-        <w:t xml:space="preserve"> Ask for a 1 to 5 rating plus a separate “mixed” flag, or fine-tune a multilingual model on labelled neutral reviews.</w:t>
+        <w:t>Better neutral handling.</w:t>
+      </w:r>
+      <w:r>
+        <w:t xml:space="preserve"> Ask for a 1 to 5 rating plus a separate “mixed” flag, or fine-tune a multilingual m</w:t>
+      </w:r>
+      <w:r>
+        <w:t>odel on labelled neutral reviews.</w:t>
       </w:r>
     </w:p>
     <w:p>
@@ -23577,10 +23623,7 @@
         <w:t>Self-updating dashboard.</w:t>
       </w:r>
       <w:r>
-        <w:t xml:space="preserve"> Append pipeline results to Google Sheets or a database from workflow 03 and build Looker Studio</w:t>
-      </w:r>
-      <w:r>
-        <w:t xml:space="preserve"> pages on top.</w:t>
+        <w:t xml:space="preserve"> Append pipeline results to Google Sheets or a database from workflow 03 and build Looker Studio pages on top.</w:t>
       </w:r>
     </w:p>
     <w:p>
@@ -23600,7 +23643,10 @@
         <w:t>Scaling.</w:t>
       </w:r>
       <w:r>
-        <w:t xml:space="preserve"> Use batch and prompt-caching features of the model API to cut the $2.50 per 1,000 reviews, run the embedding step in a small service, and move the API to a hosted environment with proper tracing (for example Langfuse).</w:t>
+        <w:t xml:space="preserve"> Use batch and prompt-caching features of the model API to cut the $2.50 per 1,</w:t>
+      </w:r>
+      <w:r>
+        <w:t>000 reviews, run the embedding step in a small service, and move the API to a hosted environment with proper tracing (for example Langfuse).</w:t>
       </w:r>
     </w:p>
     <w:p>
@@ -23617,17 +23663,13 @@
           <w:b/>
           <w:bCs/>
         </w:rPr>
-        <w:t>More language</w:t>
-      </w:r>
-      <w:r>
-        <w:rPr>
-          <w:b/>
-          <w:bCs/>
-        </w:rPr>
-        <w:t>s and channels.</w:t>
-      </w:r>
-      <w:r>
-        <w:t xml:space="preserve"> Extend beyond six languages, add Slack or email delivery of approved replies, and track how long human approval takes to measure the 3-hour goal properly.</w:t>
+        <w:t>More languages and channels.</w:t>
+      </w:r>
+      <w:r>
+        <w:t xml:space="preserve"> Extend beyond six languages, add Slack or email delivery of approved replies, and trac</w:t>
+      </w:r>
+      <w:r>
+        <w:t>k how long human approval takes to measure the 3-hour goal properly.</w:t>
       </w:r>
     </w:p>
     <w:p>
@@ -23647,17 +23689,14 @@
         <w:t>Closed loop.</w:t>
       </w:r>
       <w:r>
-        <w:t xml:space="preserve"> Feed approved and edited replies back as examples, and report which issu</w:t>
-      </w:r>
-      <w:r>
-        <w:t>es shrink after a fix.</w:t>
+        <w:t xml:space="preserve"> Feed approved and edited replies back as examples, and report which issues shrink after a fix.</w:t>
       </w:r>
     </w:p>
     <w:p>
       <w:pPr>
         <w:pStyle w:val="Heading1"/>
       </w:pPr>
-      <w:bookmarkStart w:id="43" w:name="_Toc241869979"/>
+      <w:bookmarkStart w:id="43" w:name="_Toc242005731"/>
       <w:r>
         <w:t>13. Business perspective</w:t>
       </w:r>
@@ -23675,10 +23714,10 @@
         <w:t>Cost.</w:t>
       </w:r>
       <w:r>
-        <w:t xml:space="preserve"> The measured cost is about $2.50 per 1,000 reviews with Claude Haiku 4.5 (replies $1.40, translation $0.50, classification $0.42, issue category $0.18). At 1,000 reviews per day this is about $75 per mo</w:t>
-      </w:r>
-      <w:r>
-        <w:t>nth of model usage. Trend detection and the Slack alert cost nothing to run.</w:t>
+        <w:t xml:space="preserve"> The measured cost is about $2.50 per 1,000 revie</w:t>
+      </w:r>
+      <w:r>
+        <w:t>ws with Claude Haiku 4.5 (replies $1.40, translation $0.50, classification $0.42, issue category $0.18). At 1,000 reviews per day this is about $75 per month of model usage. Trend detection and the Slack alert cost nothing to run.</w:t>
       </w:r>
     </w:p>
     <w:p>
@@ -23693,17 +23732,20 @@
         <w:t>Speed.</w:t>
       </w:r>
       <w:r>
-        <w:t xml:space="preserve"> The automated part takes about 11 minutes per 1,000 reviews, so a day’s feed is analysed in one short run instead of a working day of reading. A draft reply exists about a </w:t>
-      </w:r>
-      <w:r>
-        <w:t>minute after a batch starts; the remaining time to reply is the human approval of negative drafts, which we did not measure.</w:t>
+        <w:t xml:space="preserve"> The automated part</w:t>
+      </w:r>
+      <w:r>
+        <w:t xml:space="preserve"> takes about 11 minutes per 1,000 reviews, so a day’s feed is analysed in one short run instead of a working day of reading. A draft reply exists about a minute after a batch starts; the remaining time to reply is the human approval of negative drafts, whi</w:t>
+      </w:r>
+      <w:r>
+        <w:t>ch we did not measure.</w:t>
       </w:r>
     </w:p>
     <w:p>
       <w:pPr>
         <w:pStyle w:val="Heading2"/>
       </w:pPr>
-      <w:bookmarkStart w:id="44" w:name="_Toc241869980"/>
+      <w:bookmarkStart w:id="44" w:name="_Toc242005732"/>
       <w:r>
         <w:t>Illustration of the saving</w:t>
       </w:r>
@@ -23715,10 +23757,7 @@
         <w:spacing w:after="120" w:line="276" w:lineRule="auto"/>
       </w:pPr>
       <w:r>
-        <w:t xml:space="preserve">The table below is an illustration, not a measurement. The manual time per review is an assumption that </w:t>
-      </w:r>
-      <w:r>
-        <w:t>the team should replace with its own figure.</w:t>
+        <w:t>The table below is an illustration, not a measurement. The manual time per review is an assumption that the team should replace with its own figure.</w:t>
       </w:r>
     </w:p>
     <w:tbl>
@@ -23736,7 +23775,7 @@
           <w:left w:w="10" w:type="dxa"/>
           <w:right w:w="10" w:type="dxa"/>
         </w:tblCellMar>
-        <w:tblLook w:val="04A0" w:firstRow="1" w:lastRow="0" w:firstColumn="1" w:lastColumn="0" w:noHBand="0" w:noVBand="1"/>
+        <w:tblLook w:val="0000" w:firstRow="0" w:lastRow="0" w:firstColumn="0" w:lastColumn="0" w:noHBand="0" w:noVBand="0"/>
       </w:tblPr>
       <w:tblGrid>
         <w:gridCol w:w="3000"/>
@@ -24304,7 +24343,7 @@
       <w:pPr>
         <w:pStyle w:val="Heading1"/>
       </w:pPr>
-      <w:bookmarkStart w:id="45" w:name="_Toc241869981"/>
+      <w:bookmarkStart w:id="45" w:name="_Toc242005733"/>
       <w:r>
         <w:t>14. Conclusion</w:t>
       </w:r>
@@ -24331,7 +24370,7 @@
       <w:pPr>
         <w:pStyle w:val="Heading1"/>
       </w:pPr>
-      <w:bookmarkStart w:id="46" w:name="_Toc241869982"/>
+      <w:bookmarkStart w:id="46" w:name="_Toc242005734"/>
       <w:r>
         <w:t>References</w:t>
       </w:r>
@@ -24413,7 +24452,7 @@
         <w:pStyle w:val="Heading1"/>
         <w:pageBreakBefore/>
       </w:pPr>
-      <w:bookmarkStart w:id="47" w:name="_Toc241869983"/>
+      <w:bookmarkStart w:id="47" w:name="_Toc242005735"/>
       <w:r>
         <w:lastRenderedPageBreak/>
         <w:t>Appendix A. Prompts and versions</w:t>
@@ -24435,7 +24474,7 @@
           <w:left w:w="10" w:type="dxa"/>
           <w:right w:w="10" w:type="dxa"/>
         </w:tblCellMar>
-        <w:tblLook w:val="04A0" w:firstRow="1" w:lastRow="0" w:firstColumn="1" w:lastColumn="0" w:noHBand="0" w:noVBand="1"/>
+        <w:tblLook w:val="0000" w:firstRow="0" w:lastRow="0" w:firstColumn="0" w:lastColumn="0" w:noHBand="0" w:noVBand="0"/>
       </w:tblPr>
       <w:tblGrid>
         <w:gridCol w:w="3400"/>
@@ -25431,7 +25470,7 @@
       <w:pPr>
         <w:pStyle w:val="Heading1"/>
       </w:pPr>
-      <w:bookmarkStart w:id="48" w:name="_Toc241869984"/>
+      <w:bookmarkStart w:id="48" w:name="_Toc242005736"/>
       <w:r>
         <w:t>Appendix B. Dashboard, alert and demo app screenshots</w:t>
       </w:r>
@@ -26054,10 +26093,64 @@
 <file path=word/numbering.xml><?xml version="1.0" encoding="utf-8"?>
 <w:numbering xmlns:wpc="http://schemas.microsoft.com/office/word/2010/wordprocessingCanvas" xmlns:cx="http://schemas.microsoft.com/office/drawing/2014/chartex" xmlns:mc="http://schemas.openxmlformats.org/markup-compatibility/2006" xmlns:o="urn:schemas-microsoft-com:office:office" xmlns:r="http://schemas.openxmlformats.org/officeDocument/2006/relationships" xmlns:m="http://schemas.openxmlformats.org/officeDocument/2006/math" xmlns:v="urn:schemas-microsoft-com:vml" xmlns:wp14="http://schemas.microsoft.com/office/word/2010/wordprocessingDrawing" xmlns:wp="http://schemas.openxmlformats.org/drawingml/2006/wordprocessingDrawing" xmlns:w10="urn:schemas-microsoft-com:office:word" xmlns:w="http://schemas.openxmlformats.org/wordprocessingml/2006/main" xmlns:w14="http://schemas.microsoft.com/office/word/2010/wordml" xmlns:w15="http://schemas.microsoft.com/office/word/2012/wordml" xmlns:w16se="http://schemas.microsoft.com/office/word/2015/wordml/symex" xmlns:wpg="http://schemas.microsoft.com/office/word/2010/wordprocessingGroup" xmlns:wpi="http://schemas.microsoft.com/office/word/2010/wordprocessingInk" xmlns:wne="http://schemas.microsoft.com/office/word/2006/wordml" xmlns:wps="http://schemas.microsoft.com/office/word/2010/wordprocessingShape" mc:Ignorable="w14 w15 w16se wp14">
   <w:abstractNum w:abstractNumId="0" w15:restartNumberingAfterBreak="0">
-    <w:nsid w:val="0CAD0C02"/>
+    <w:nsid w:val="0DAC3A0B"/>
     <w:multiLevelType w:val="hybridMultilevel"/>
-    <w:tmpl w:val="AF24A730"/>
-    <w:lvl w:ilvl="0" w:tplc="4DCCE4C0">
+    <w:tmpl w:val="E514E838"/>
+    <w:lvl w:ilvl="0" w:tplc="3FD8BA40">
+      <w:start w:val="1"/>
+      <w:numFmt w:val="bullet"/>
+      <w:lvlText w:val="•"/>
+      <w:lvlJc w:val="left"/>
+      <w:pPr>
+        <w:ind w:left="540" w:hanging="270"/>
+      </w:pPr>
+    </w:lvl>
+    <w:lvl w:ilvl="1" w:tplc="9FB8EF46">
+      <w:numFmt w:val="decimal"/>
+      <w:lvlText w:val=""/>
+      <w:lvlJc w:val="left"/>
+    </w:lvl>
+    <w:lvl w:ilvl="2" w:tplc="D562CF9A">
+      <w:numFmt w:val="decimal"/>
+      <w:lvlText w:val=""/>
+      <w:lvlJc w:val="left"/>
+    </w:lvl>
+    <w:lvl w:ilvl="3" w:tplc="C4F6B144">
+      <w:numFmt w:val="decimal"/>
+      <w:lvlText w:val=""/>
+      <w:lvlJc w:val="left"/>
+    </w:lvl>
+    <w:lvl w:ilvl="4" w:tplc="05F837CA">
+      <w:numFmt w:val="decimal"/>
+      <w:lvlText w:val=""/>
+      <w:lvlJc w:val="left"/>
+    </w:lvl>
+    <w:lvl w:ilvl="5" w:tplc="A06CF2FC">
+      <w:numFmt w:val="decimal"/>
+      <w:lvlText w:val=""/>
+      <w:lvlJc w:val="left"/>
+    </w:lvl>
+    <w:lvl w:ilvl="6" w:tplc="411A086E">
+      <w:numFmt w:val="decimal"/>
+      <w:lvlText w:val=""/>
+      <w:lvlJc w:val="left"/>
+    </w:lvl>
+    <w:lvl w:ilvl="7" w:tplc="BD5CF682">
+      <w:numFmt w:val="decimal"/>
+      <w:lvlText w:val=""/>
+      <w:lvlJc w:val="left"/>
+    </w:lvl>
+    <w:lvl w:ilvl="8" w:tplc="A3E41568">
+      <w:numFmt w:val="decimal"/>
+      <w:lvlText w:val=""/>
+      <w:lvlJc w:val="left"/>
+    </w:lvl>
+  </w:abstractNum>
+  <w:abstractNum w:abstractNumId="1" w15:restartNumberingAfterBreak="0">
+    <w:nsid w:val="3BBE2FB4"/>
+    <w:multiLevelType w:val="hybridMultilevel"/>
+    <w:tmpl w:val="9FC25BE6"/>
+    <w:lvl w:ilvl="0" w:tplc="F0A0ABDC">
       <w:start w:val="1"/>
       <w:numFmt w:val="decimal"/>
       <w:lvlText w:val="%1."/>
@@ -26066,106 +26159,106 @@
         <w:ind w:left="540" w:hanging="360"/>
       </w:pPr>
     </w:lvl>
-    <w:lvl w:ilvl="1" w:tplc="3A66BA72">
+    <w:lvl w:ilvl="1" w:tplc="83EA3F5C">
       <w:numFmt w:val="decimal"/>
       <w:lvlText w:val=""/>
       <w:lvlJc w:val="left"/>
     </w:lvl>
-    <w:lvl w:ilvl="2" w:tplc="55340B0C">
+    <w:lvl w:ilvl="2" w:tplc="FBFED35C">
       <w:numFmt w:val="decimal"/>
       <w:lvlText w:val=""/>
       <w:lvlJc w:val="left"/>
     </w:lvl>
-    <w:lvl w:ilvl="3" w:tplc="2CE24C16">
+    <w:lvl w:ilvl="3" w:tplc="06B6EB7E">
       <w:numFmt w:val="decimal"/>
       <w:lvlText w:val=""/>
       <w:lvlJc w:val="left"/>
     </w:lvl>
-    <w:lvl w:ilvl="4" w:tplc="6F50D54E">
+    <w:lvl w:ilvl="4" w:tplc="F886DFDA">
       <w:numFmt w:val="decimal"/>
       <w:lvlText w:val=""/>
       <w:lvlJc w:val="left"/>
     </w:lvl>
-    <w:lvl w:ilvl="5" w:tplc="94EE074C">
+    <w:lvl w:ilvl="5" w:tplc="63701F86">
       <w:numFmt w:val="decimal"/>
       <w:lvlText w:val=""/>
       <w:lvlJc w:val="left"/>
     </w:lvl>
-    <w:lvl w:ilvl="6" w:tplc="543617F4">
+    <w:lvl w:ilvl="6" w:tplc="BA0042EE">
       <w:numFmt w:val="decimal"/>
       <w:lvlText w:val=""/>
       <w:lvlJc w:val="left"/>
     </w:lvl>
-    <w:lvl w:ilvl="7" w:tplc="29E6DDF0">
+    <w:lvl w:ilvl="7" w:tplc="07EC44BC">
       <w:numFmt w:val="decimal"/>
       <w:lvlText w:val=""/>
       <w:lvlJc w:val="left"/>
     </w:lvl>
-    <w:lvl w:ilvl="8" w:tplc="049C420A">
-      <w:numFmt w:val="decimal"/>
-      <w:lvlText w:val=""/>
-      <w:lvlJc w:val="left"/>
-    </w:lvl>
-  </w:abstractNum>
-  <w:abstractNum w:abstractNumId="1" w15:restartNumberingAfterBreak="0">
-    <w:nsid w:val="37A621A5"/>
-    <w:multiLevelType w:val="hybridMultilevel"/>
-    <w:tmpl w:val="E14CAD46"/>
-    <w:lvl w:ilvl="0" w:tplc="03C6FB2A">
-      <w:start w:val="1"/>
-      <w:numFmt w:val="bullet"/>
-      <w:lvlText w:val="•"/>
-      <w:lvlJc w:val="left"/>
-      <w:pPr>
-        <w:ind w:left="540" w:hanging="270"/>
-      </w:pPr>
-    </w:lvl>
-    <w:lvl w:ilvl="1" w:tplc="32A448DC">
-      <w:numFmt w:val="decimal"/>
-      <w:lvlText w:val=""/>
-      <w:lvlJc w:val="left"/>
-    </w:lvl>
-    <w:lvl w:ilvl="2" w:tplc="965CAE82">
-      <w:numFmt w:val="decimal"/>
-      <w:lvlText w:val=""/>
-      <w:lvlJc w:val="left"/>
-    </w:lvl>
-    <w:lvl w:ilvl="3" w:tplc="5F581CA6">
-      <w:numFmt w:val="decimal"/>
-      <w:lvlText w:val=""/>
-      <w:lvlJc w:val="left"/>
-    </w:lvl>
-    <w:lvl w:ilvl="4" w:tplc="95D47954">
-      <w:numFmt w:val="decimal"/>
-      <w:lvlText w:val=""/>
-      <w:lvlJc w:val="left"/>
-    </w:lvl>
-    <w:lvl w:ilvl="5" w:tplc="31DAD3BA">
-      <w:numFmt w:val="decimal"/>
-      <w:lvlText w:val=""/>
-      <w:lvlJc w:val="left"/>
-    </w:lvl>
-    <w:lvl w:ilvl="6" w:tplc="092AF81A">
-      <w:numFmt w:val="decimal"/>
-      <w:lvlText w:val=""/>
-      <w:lvlJc w:val="left"/>
-    </w:lvl>
-    <w:lvl w:ilvl="7" w:tplc="C532C5B2">
-      <w:numFmt w:val="decimal"/>
-      <w:lvlText w:val=""/>
-      <w:lvlJc w:val="left"/>
-    </w:lvl>
-    <w:lvl w:ilvl="8" w:tplc="DCB6BDC0">
+    <w:lvl w:ilvl="8" w:tplc="76C8777E">
       <w:numFmt w:val="decimal"/>
       <w:lvlText w:val=""/>
       <w:lvlJc w:val="left"/>
     </w:lvl>
   </w:abstractNum>
   <w:abstractNum w:abstractNumId="2" w15:restartNumberingAfterBreak="0">
-    <w:nsid w:val="5E635692"/>
+    <w:nsid w:val="4F203B04"/>
     <w:multiLevelType w:val="hybridMultilevel"/>
-    <w:tmpl w:val="DA322954"/>
-    <w:lvl w:ilvl="0" w:tplc="BF9A2826">
+    <w:tmpl w:val="8710F79A"/>
+    <w:lvl w:ilvl="0" w:tplc="63F4DC4A">
+      <w:start w:val="1"/>
+      <w:numFmt w:val="decimal"/>
+      <w:lvlText w:val="%1."/>
+      <w:lvlJc w:val="left"/>
+      <w:pPr>
+        <w:ind w:left="540" w:hanging="360"/>
+      </w:pPr>
+    </w:lvl>
+    <w:lvl w:ilvl="1" w:tplc="91FACAA0">
+      <w:numFmt w:val="decimal"/>
+      <w:lvlText w:val=""/>
+      <w:lvlJc w:val="left"/>
+    </w:lvl>
+    <w:lvl w:ilvl="2" w:tplc="FCE43A06">
+      <w:numFmt w:val="decimal"/>
+      <w:lvlText w:val=""/>
+      <w:lvlJc w:val="left"/>
+    </w:lvl>
+    <w:lvl w:ilvl="3" w:tplc="53D68D42">
+      <w:numFmt w:val="decimal"/>
+      <w:lvlText w:val=""/>
+      <w:lvlJc w:val="left"/>
+    </w:lvl>
+    <w:lvl w:ilvl="4" w:tplc="B846D176">
+      <w:numFmt w:val="decimal"/>
+      <w:lvlText w:val=""/>
+      <w:lvlJc w:val="left"/>
+    </w:lvl>
+    <w:lvl w:ilvl="5" w:tplc="2FBEFB36">
+      <w:numFmt w:val="decimal"/>
+      <w:lvlText w:val=""/>
+      <w:lvlJc w:val="left"/>
+    </w:lvl>
+    <w:lvl w:ilvl="6" w:tplc="12D60C62">
+      <w:numFmt w:val="decimal"/>
+      <w:lvlText w:val=""/>
+      <w:lvlJc w:val="left"/>
+    </w:lvl>
+    <w:lvl w:ilvl="7" w:tplc="7EC85CC6">
+      <w:numFmt w:val="decimal"/>
+      <w:lvlText w:val=""/>
+      <w:lvlJc w:val="left"/>
+    </w:lvl>
+    <w:lvl w:ilvl="8" w:tplc="9FD8D3E6">
+      <w:numFmt w:val="decimal"/>
+      <w:lvlText w:val=""/>
+      <w:lvlJc w:val="left"/>
+    </w:lvl>
+  </w:abstractNum>
+  <w:abstractNum w:abstractNumId="3" w15:restartNumberingAfterBreak="0">
+    <w:nsid w:val="58032D3D"/>
+    <w:multiLevelType w:val="hybridMultilevel"/>
+    <w:tmpl w:val="5ECE8DF6"/>
+    <w:lvl w:ilvl="0" w:tplc="A39C2DB0">
       <w:start w:val="1"/>
       <w:numFmt w:val="bullet"/>
       <w:lvlText w:val="●"/>
@@ -26174,7 +26267,7 @@
         <w:ind w:left="720" w:hanging="360"/>
       </w:pPr>
     </w:lvl>
-    <w:lvl w:ilvl="1" w:tplc="C15EE79A">
+    <w:lvl w:ilvl="1" w:tplc="41C48EEC">
       <w:start w:val="1"/>
       <w:numFmt w:val="bullet"/>
       <w:lvlText w:val="○"/>
@@ -26183,7 +26276,7 @@
         <w:ind w:left="1440" w:hanging="360"/>
       </w:pPr>
     </w:lvl>
-    <w:lvl w:ilvl="2" w:tplc="9A1A55D6">
+    <w:lvl w:ilvl="2" w:tplc="7D7218D2">
       <w:start w:val="1"/>
       <w:numFmt w:val="bullet"/>
       <w:lvlText w:val="■"/>
@@ -26192,7 +26285,7 @@
         <w:ind w:left="2160" w:hanging="360"/>
       </w:pPr>
     </w:lvl>
-    <w:lvl w:ilvl="3" w:tplc="4E3E1AAA">
+    <w:lvl w:ilvl="3" w:tplc="96AE384A">
       <w:start w:val="1"/>
       <w:numFmt w:val="bullet"/>
       <w:lvlText w:val="●"/>
@@ -26201,7 +26294,7 @@
         <w:ind w:left="2880" w:hanging="360"/>
       </w:pPr>
     </w:lvl>
-    <w:lvl w:ilvl="4" w:tplc="2AE4B388">
+    <w:lvl w:ilvl="4" w:tplc="BD7A82FC">
       <w:start w:val="1"/>
       <w:numFmt w:val="bullet"/>
       <w:lvlText w:val="○"/>
@@ -26210,7 +26303,7 @@
         <w:ind w:left="3600" w:hanging="360"/>
       </w:pPr>
     </w:lvl>
-    <w:lvl w:ilvl="5" w:tplc="F3F21D22">
+    <w:lvl w:ilvl="5" w:tplc="7B34F046">
       <w:start w:val="1"/>
       <w:numFmt w:val="bullet"/>
       <w:lvlText w:val="■"/>
@@ -26219,7 +26312,7 @@
         <w:ind w:left="4320" w:hanging="360"/>
       </w:pPr>
     </w:lvl>
-    <w:lvl w:ilvl="6" w:tplc="1EDC5116">
+    <w:lvl w:ilvl="6" w:tplc="7556EE38">
       <w:start w:val="1"/>
       <w:numFmt w:val="bullet"/>
       <w:lvlText w:val="●"/>
@@ -26228,7 +26321,7 @@
         <w:ind w:left="5040" w:hanging="360"/>
       </w:pPr>
     </w:lvl>
-    <w:lvl w:ilvl="7" w:tplc="46B4BB3A">
+    <w:lvl w:ilvl="7" w:tplc="780A9A32">
       <w:start w:val="1"/>
       <w:numFmt w:val="bullet"/>
       <w:lvlText w:val="●"/>
@@ -26237,7 +26330,7 @@
         <w:ind w:left="5760" w:hanging="360"/>
       </w:pPr>
     </w:lvl>
-    <w:lvl w:ilvl="8" w:tplc="19DECF2C">
+    <w:lvl w:ilvl="8" w:tplc="E5349BEC">
       <w:start w:val="1"/>
       <w:numFmt w:val="bullet"/>
       <w:lvlText w:val="●"/>
@@ -26247,80 +26340,26 @@
       </w:pPr>
     </w:lvl>
   </w:abstractNum>
-  <w:abstractNum w:abstractNumId="3" w15:restartNumberingAfterBreak="0">
-    <w:nsid w:val="6C857E9F"/>
-    <w:multiLevelType w:val="hybridMultilevel"/>
-    <w:tmpl w:val="FC7E055A"/>
-    <w:lvl w:ilvl="0" w:tplc="A51EFBEA">
-      <w:start w:val="1"/>
-      <w:numFmt w:val="decimal"/>
-      <w:lvlText w:val="%1."/>
-      <w:lvlJc w:val="left"/>
-      <w:pPr>
-        <w:ind w:left="540" w:hanging="360"/>
-      </w:pPr>
-    </w:lvl>
-    <w:lvl w:ilvl="1" w:tplc="DA9C2C3A">
-      <w:numFmt w:val="decimal"/>
-      <w:lvlText w:val=""/>
-      <w:lvlJc w:val="left"/>
-    </w:lvl>
-    <w:lvl w:ilvl="2" w:tplc="0D20CDD2">
-      <w:numFmt w:val="decimal"/>
-      <w:lvlText w:val=""/>
-      <w:lvlJc w:val="left"/>
-    </w:lvl>
-    <w:lvl w:ilvl="3" w:tplc="A13E56EE">
-      <w:numFmt w:val="decimal"/>
-      <w:lvlText w:val=""/>
-      <w:lvlJc w:val="left"/>
-    </w:lvl>
-    <w:lvl w:ilvl="4" w:tplc="6BA660E6">
-      <w:numFmt w:val="decimal"/>
-      <w:lvlText w:val=""/>
-      <w:lvlJc w:val="left"/>
-    </w:lvl>
-    <w:lvl w:ilvl="5" w:tplc="F14C9BD6">
-      <w:numFmt w:val="decimal"/>
-      <w:lvlText w:val=""/>
-      <w:lvlJc w:val="left"/>
-    </w:lvl>
-    <w:lvl w:ilvl="6" w:tplc="DAA23C30">
-      <w:numFmt w:val="decimal"/>
-      <w:lvlText w:val=""/>
-      <w:lvlJc w:val="left"/>
-    </w:lvl>
-    <w:lvl w:ilvl="7" w:tplc="7E481406">
-      <w:numFmt w:val="decimal"/>
-      <w:lvlText w:val=""/>
-      <w:lvlJc w:val="left"/>
-    </w:lvl>
-    <w:lvl w:ilvl="8" w:tplc="9B102CBE">
-      <w:numFmt w:val="decimal"/>
-      <w:lvlText w:val=""/>
-      <w:lvlJc w:val="left"/>
-    </w:lvl>
-  </w:abstractNum>
   <w:num w:numId="1">
-    <w:abstractNumId w:val="2"/>
+    <w:abstractNumId w:val="3"/>
     <w:lvlOverride w:ilvl="0">
       <w:startOverride w:val="1"/>
     </w:lvlOverride>
   </w:num>
   <w:num w:numId="2">
+    <w:abstractNumId w:val="0"/>
+    <w:lvlOverride w:ilvl="0">
+      <w:startOverride w:val="1"/>
+    </w:lvlOverride>
+  </w:num>
+  <w:num w:numId="3">
     <w:abstractNumId w:val="1"/>
     <w:lvlOverride w:ilvl="0">
       <w:startOverride w:val="1"/>
     </w:lvlOverride>
   </w:num>
-  <w:num w:numId="3">
-    <w:abstractNumId w:val="0"/>
-    <w:lvlOverride w:ilvl="0">
-      <w:startOverride w:val="1"/>
-    </w:lvlOverride>
-  </w:num>
   <w:num w:numId="4">
-    <w:abstractNumId w:val="3"/>
+    <w:abstractNumId w:val="2"/>
     <w:lvlOverride w:ilvl="0">
       <w:startOverride w:val="1"/>
     </w:lvlOverride>
@@ -26923,7 +26962,7 @@
     <w:autoRedefine/>
     <w:uiPriority w:val="39"/>
     <w:unhideWhenUsed/>
-    <w:rsid w:val="0030090B"/>
+    <w:rsid w:val="009F429D"/>
     <w:pPr>
       <w:spacing w:after="100"/>
     </w:pPr>
@@ -26935,7 +26974,7 @@
     <w:autoRedefine/>
     <w:uiPriority w:val="39"/>
     <w:unhideWhenUsed/>
-    <w:rsid w:val="0030090B"/>
+    <w:rsid w:val="009F429D"/>
     <w:pPr>
       <w:spacing w:after="100"/>
       <w:ind w:left="220"/>

</xml_diff>